<commit_message>
Update James Fan - Assessment 3_ Major Project.docx
For report changes
</commit_message>
<xml_diff>
--- a/James Fan - Assessment 3_ Major Project.docx
+++ b/James Fan - Assessment 3_ Major Project.docx
@@ -1,6 +1,6 @@
 
 <file path=word/document.xml><?xml version="1.0" encoding="utf-8"?>
-<w:document xmlns:wpc="http://schemas.microsoft.com/office/word/2010/wordprocessingCanvas" xmlns:cx="http://schemas.microsoft.com/office/drawing/2014/chartex" xmlns:cx1="http://schemas.microsoft.com/office/drawing/2015/9/8/chartex" xmlns:cx2="http://schemas.microsoft.com/office/drawing/2015/10/21/chartex" xmlns:cx3="http://schemas.microsoft.com/office/drawing/2016/5/9/chartex" xmlns:cx4="http://schemas.microsoft.com/office/drawing/2016/5/10/chartex" xmlns:cx5="http://schemas.microsoft.com/office/drawing/2016/5/11/chartex" xmlns:cx6="http://schemas.microsoft.com/office/drawing/2016/5/12/chartex" xmlns:cx7="http://schemas.microsoft.com/office/drawing/2016/5/13/chartex" xmlns:cx8="http://schemas.microsoft.com/office/drawing/2016/5/14/chartex" xmlns:mc="http://schemas.openxmlformats.org/markup-compatibility/2006" xmlns:aink="http://schemas.microsoft.com/office/drawing/2016/ink" xmlns:am3d="http://schemas.microsoft.com/office/drawing/2017/model3d" xmlns:o="urn:schemas-microsoft-com:office:office" xmlns:oel="http://schemas.microsoft.com/office/2019/extlst" xmlns:r="http://schemas.openxmlformats.org/officeDocument/2006/relationships" xmlns:m="http://schemas.openxmlformats.org/officeDocument/2006/math" xmlns:v="urn:schemas-microsoft-com:vml" xmlns:wp14="http://schemas.microsoft.com/office/word/2010/wordprocessingDrawing" xmlns:wp="http://schemas.openxmlformats.org/drawingml/2006/wordprocessingDrawing" xmlns:w10="urn:schemas-microsoft-com:office:word" xmlns:w="http://schemas.openxmlformats.org/wordprocessingml/2006/main" xmlns:w14="http://schemas.microsoft.com/office/word/2010/wordml" xmlns:w15="http://schemas.microsoft.com/office/word/2012/wordml" xmlns:w16cex="http://schemas.microsoft.com/office/word/2018/wordml/cex" xmlns:w16cid="http://schemas.microsoft.com/office/word/2016/wordml/cid" xmlns:w16="http://schemas.microsoft.com/office/word/2018/wordml" xmlns:w16sdtdh="http://schemas.microsoft.com/office/word/2020/wordml/sdtdatahash" xmlns:w16se="http://schemas.microsoft.com/office/word/2015/wordml/symex" xmlns:wpg="http://schemas.microsoft.com/office/word/2010/wordprocessingGroup" xmlns:wpi="http://schemas.microsoft.com/office/word/2010/wordprocessingInk" xmlns:wne="http://schemas.microsoft.com/office/word/2006/wordml" xmlns:wps="http://schemas.microsoft.com/office/word/2010/wordprocessingShape" xmlns:a="http://schemas.openxmlformats.org/drawingml/2006/main" xmlns:a14="http://schemas.microsoft.com/office/drawing/2010/main" xmlns:pic="http://schemas.openxmlformats.org/drawingml/2006/picture" xmlns:asvg="http://schemas.microsoft.com/office/drawing/2016/SVG/main" mc:Ignorable="w14 w15 w16se w16cid w16 w16cex w16sdtdh wp14">
+<w:document xmlns:wpc="http://schemas.microsoft.com/office/word/2010/wordprocessingCanvas" xmlns:cx="http://schemas.microsoft.com/office/drawing/2014/chartex" xmlns:cx1="http://schemas.microsoft.com/office/drawing/2015/9/8/chartex" xmlns:cx2="http://schemas.microsoft.com/office/drawing/2015/10/21/chartex" xmlns:cx3="http://schemas.microsoft.com/office/drawing/2016/5/9/chartex" xmlns:cx4="http://schemas.microsoft.com/office/drawing/2016/5/10/chartex" xmlns:cx5="http://schemas.microsoft.com/office/drawing/2016/5/11/chartex" xmlns:cx6="http://schemas.microsoft.com/office/drawing/2016/5/12/chartex" xmlns:cx7="http://schemas.microsoft.com/office/drawing/2016/5/13/chartex" xmlns:cx8="http://schemas.microsoft.com/office/drawing/2016/5/14/chartex" xmlns:mc="http://schemas.openxmlformats.org/markup-compatibility/2006" xmlns:aink="http://schemas.microsoft.com/office/drawing/2016/ink" xmlns:am3d="http://schemas.microsoft.com/office/drawing/2017/model3d" xmlns:o="urn:schemas-microsoft-com:office:office" xmlns:oel="http://schemas.microsoft.com/office/2019/extlst" xmlns:r="http://schemas.openxmlformats.org/officeDocument/2006/relationships" xmlns:m="http://schemas.openxmlformats.org/officeDocument/2006/math" xmlns:v="urn:schemas-microsoft-com:vml" xmlns:wp14="http://schemas.microsoft.com/office/word/2010/wordprocessingDrawing" xmlns:wp="http://schemas.openxmlformats.org/drawingml/2006/wordprocessingDrawing" xmlns:w10="urn:schemas-microsoft-com:office:word" xmlns:w="http://schemas.openxmlformats.org/wordprocessingml/2006/main" xmlns:w14="http://schemas.microsoft.com/office/word/2010/wordml" xmlns:w15="http://schemas.microsoft.com/office/word/2012/wordml" xmlns:w16cex="http://schemas.microsoft.com/office/word/2018/wordml/cex" xmlns:w16cid="http://schemas.microsoft.com/office/word/2016/wordml/cid" xmlns:w16="http://schemas.microsoft.com/office/word/2018/wordml" xmlns:w16du="http://schemas.microsoft.com/office/word/2023/wordml/word16du" xmlns:w16sdtdh="http://schemas.microsoft.com/office/word/2020/wordml/sdtdatahash" xmlns:w16se="http://schemas.microsoft.com/office/word/2015/wordml/symex" xmlns:wpg="http://schemas.microsoft.com/office/word/2010/wordprocessingGroup" xmlns:wpi="http://schemas.microsoft.com/office/word/2010/wordprocessingInk" xmlns:wne="http://schemas.microsoft.com/office/word/2006/wordml" xmlns:wps="http://schemas.microsoft.com/office/word/2010/wordprocessingShape" mc:Ignorable="w14 w15 w16se w16cid w16 w16cex w16sdtdh w16du wp14">
   <w:body>
     <w:p>
       <w:pPr>
@@ -11,7 +11,7 @@
     <w:p>
       <w:pPr>
         <w:rPr>
-          <w:rFonts w:asciiTheme="majorHAnsi" w:hAnsiTheme="majorHAnsi" w:eastAsiaTheme="majorEastAsia" w:cstheme="majorBidi"/>
+          <w:rFonts w:asciiTheme="majorHAnsi" w:eastAsiaTheme="majorEastAsia" w:hAnsiTheme="majorHAnsi" w:cstheme="majorBidi"/>
           <w:color w:val="365F91" w:themeColor="accent1" w:themeShade="BF"/>
           <w:sz w:val="32"/>
           <w:szCs w:val="32"/>
@@ -64,7 +64,7 @@
               </wp:anchor>
             </w:drawing>
           </mc:Choice>
-          <mc:Fallback>
+          <mc:Fallback xmlns:asvg="http://schemas.microsoft.com/office/drawing/2016/SVG/main" xmlns:pic="http://schemas.openxmlformats.org/drawingml/2006/picture" xmlns:a14="http://schemas.microsoft.com/office/drawing/2010/main" xmlns:a="http://schemas.openxmlformats.org/drawingml/2006/main">
             <w:pict w14:anchorId="7F9F4323">
               <v:shapetype id="_x0000_t75" coordsize="21600,21600" filled="f" stroked="f" o:spt="75" o:preferrelative="t" path="m@4@5l@4@11@9@11@9@5xe" w14:anchorId="0E0A4256">
                 <v:stroke joinstyle="miter"/>
@@ -165,7 +165,7 @@
           <w:noProof/>
         </w:rPr>
         <w:drawing>
-          <wp:anchor distT="0" distB="0" distL="114300" distR="114300" simplePos="0" relativeHeight="251662336" behindDoc="0" locked="0" layoutInCell="1" allowOverlap="1" wp14:anchorId="2E5C3EA8" wp14:editId="398EA10F">
+          <wp:anchor distT="0" distB="0" distL="114300" distR="114300" simplePos="0" relativeHeight="251662336" behindDoc="0" locked="0" layoutInCell="1" allowOverlap="1" wp14:anchorId="2E5C3EA8" wp14:editId="04E8B9EF">
             <wp:simplePos x="0" y="0"/>
             <wp:positionH relativeFrom="column">
               <wp:posOffset>1417320</wp:posOffset>
@@ -344,12 +344,12 @@
             </w:drawing>
           </mc:Choice>
           <mc:Fallback>
-            <w:pict w14:anchorId="40845E32">
-              <v:shapetype id="_x0000_t202" coordsize="21600,21600" o:spt="202" path="m,l,21600r21600,l21600,xe" w14:anchorId="5BDE295F">
+            <w:pict>
+              <v:shapetype w14:anchorId="5BDE295F" id="_x0000_t202" coordsize="21600,21600" o:spt="202" path="m,l,21600r21600,l21600,xe">
                 <v:stroke joinstyle="miter"/>
                 <v:path gradientshapeok="t" o:connecttype="rect"/>
               </v:shapetype>
-              <v:shape id="Text Box 3" style="position:absolute;margin-left:0;margin-top:133.1pt;width:442.2pt;height:313.8pt;z-index:251659264;visibility:visible;mso-wrap-style:square;mso-width-percent:0;mso-height-percent:0;mso-wrap-distance-left:9pt;mso-wrap-distance-top:0;mso-wrap-distance-right:9pt;mso-wrap-distance-bottom:0;mso-position-horizontal:center;mso-position-horizontal-relative:margin;mso-position-vertical:absolute;mso-position-vertical-relative:text;mso-width-percent:0;mso-height-percent:0;mso-width-relative:margin;mso-height-relative:margin;v-text-anchor:top" o:spid="_x0000_s1026" fillcolor="white [3201]" strokecolor="white [3212]" strokeweight=".5pt" type="#_x0000_t202" o:gfxdata="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">
+              <v:shape id="Text Box 3" o:spid="_x0000_s1026" type="#_x0000_t202" style="position:absolute;margin-left:0;margin-top:133.1pt;width:442.2pt;height:313.8pt;z-index:251659264;visibility:visible;mso-wrap-style:square;mso-width-percent:0;mso-height-percent:0;mso-wrap-distance-left:9pt;mso-wrap-distance-top:0;mso-wrap-distance-right:9pt;mso-wrap-distance-bottom:0;mso-position-horizontal:center;mso-position-horizontal-relative:margin;mso-position-vertical:absolute;mso-position-vertical-relative:text;mso-width-percent:0;mso-height-percent:0;mso-width-relative:margin;mso-height-relative:margin;v-text-anchor:top" o:gfxdata="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" fillcolor="white [3201]" strokecolor="white [3212]" strokeweight=".5pt">
                 <v:path arrowok="t"/>
                 <v:textbox>
                   <w:txbxContent>
@@ -417,7 +417,7 @@
     <w:sdt>
       <w:sdtPr>
         <w:rPr>
-          <w:rFonts w:ascii="Arial" w:hAnsi="Arial" w:eastAsia="Arial" w:cs="Arial"/>
+          <w:rFonts w:ascii="Arial" w:eastAsia="Arial" w:hAnsi="Arial" w:cs="Arial"/>
           <w:color w:val="auto"/>
           <w:sz w:val="22"/>
           <w:szCs w:val="22"/>
@@ -431,14 +431,9 @@
       </w:sdtPr>
       <w:sdtEndPr>
         <w:rPr>
-          <w:rFonts w:ascii="Arial" w:hAnsi="Arial" w:eastAsia="Arial" w:cs="Arial"/>
-          <w:b w:val="1"/>
-          <w:bCs w:val="1"/>
+          <w:b/>
+          <w:bCs/>
           <w:noProof/>
-          <w:color w:val="auto"/>
-          <w:sz w:val="22"/>
-          <w:szCs w:val="22"/>
-          <w:lang w:val="en" w:eastAsia="en-AU"/>
         </w:rPr>
       </w:sdtEndPr>
       <w:sdtContent>
@@ -475,7 +470,7 @@
           <w:r>
             <w:fldChar w:fldCharType="separate"/>
           </w:r>
-          <w:hyperlink w:history="1" w:anchor="_Toc169689617">
+          <w:hyperlink w:anchor="_Toc169689617" w:history="1">
             <w:r>
               <w:rPr>
                 <w:rStyle w:val="Hyperlink"/>
@@ -549,7 +544,7 @@
               <w14:ligatures w14:val="standardContextual"/>
             </w:rPr>
           </w:pPr>
-          <w:hyperlink w:history="1" w:anchor="_Toc169689618">
+          <w:hyperlink w:anchor="_Toc169689618" w:history="1">
             <w:r>
               <w:rPr>
                 <w:rStyle w:val="Hyperlink"/>
@@ -623,7 +618,7 @@
               <w14:ligatures w14:val="standardContextual"/>
             </w:rPr>
           </w:pPr>
-          <w:hyperlink w:history="1" w:anchor="_Toc169689619">
+          <w:hyperlink w:anchor="_Toc169689619" w:history="1">
             <w:r>
               <w:rPr>
                 <w:rStyle w:val="Hyperlink"/>
@@ -697,7 +692,7 @@
               <w14:ligatures w14:val="standardContextual"/>
             </w:rPr>
           </w:pPr>
-          <w:hyperlink w:history="1" w:anchor="_Toc169689620">
+          <w:hyperlink w:anchor="_Toc169689620" w:history="1">
             <w:r>
               <w:rPr>
                 <w:rStyle w:val="Hyperlink"/>
@@ -771,7 +766,7 @@
               <w14:ligatures w14:val="standardContextual"/>
             </w:rPr>
           </w:pPr>
-          <w:hyperlink w:history="1" w:anchor="_Toc169689621">
+          <w:hyperlink w:anchor="_Toc169689621" w:history="1">
             <w:r>
               <w:rPr>
                 <w:rStyle w:val="Hyperlink"/>
@@ -845,7 +840,7 @@
               <w14:ligatures w14:val="standardContextual"/>
             </w:rPr>
           </w:pPr>
-          <w:hyperlink w:history="1" w:anchor="_Toc169689622">
+          <w:hyperlink w:anchor="_Toc169689622" w:history="1">
             <w:r>
               <w:rPr>
                 <w:rStyle w:val="Hyperlink"/>
@@ -919,7 +914,7 @@
               <w14:ligatures w14:val="standardContextual"/>
             </w:rPr>
           </w:pPr>
-          <w:hyperlink w:history="1" w:anchor="_Toc169689623">
+          <w:hyperlink w:anchor="_Toc169689623" w:history="1">
             <w:r>
               <w:rPr>
                 <w:rStyle w:val="Hyperlink"/>
@@ -993,7 +988,7 @@
               <w14:ligatures w14:val="standardContextual"/>
             </w:rPr>
           </w:pPr>
-          <w:hyperlink w:history="1" w:anchor="_Toc169689624">
+          <w:hyperlink w:anchor="_Toc169689624" w:history="1">
             <w:r>
               <w:rPr>
                 <w:rStyle w:val="Hyperlink"/>
@@ -1067,7 +1062,7 @@
               <w14:ligatures w14:val="standardContextual"/>
             </w:rPr>
           </w:pPr>
-          <w:hyperlink w:history="1" w:anchor="_Toc169689625">
+          <w:hyperlink w:anchor="_Toc169689625" w:history="1">
             <w:r>
               <w:rPr>
                 <w:rStyle w:val="Hyperlink"/>
@@ -1141,7 +1136,7 @@
               <w14:ligatures w14:val="standardContextual"/>
             </w:rPr>
           </w:pPr>
-          <w:hyperlink w:history="1" w:anchor="_Toc169689626">
+          <w:hyperlink w:anchor="_Toc169689626" w:history="1">
             <w:r>
               <w:rPr>
                 <w:rStyle w:val="Hyperlink"/>
@@ -1215,7 +1210,7 @@
               <w14:ligatures w14:val="standardContextual"/>
             </w:rPr>
           </w:pPr>
-          <w:hyperlink w:history="1" w:anchor="_Toc169689627">
+          <w:hyperlink w:anchor="_Toc169689627" w:history="1">
             <w:r>
               <w:rPr>
                 <w:rStyle w:val="Hyperlink"/>
@@ -1289,7 +1284,7 @@
               <w14:ligatures w14:val="standardContextual"/>
             </w:rPr>
           </w:pPr>
-          <w:hyperlink w:history="1" w:anchor="_Toc169689628">
+          <w:hyperlink w:anchor="_Toc169689628" w:history="1">
             <w:r>
               <w:rPr>
                 <w:rStyle w:val="Hyperlink"/>
@@ -1363,7 +1358,7 @@
               <w14:ligatures w14:val="standardContextual"/>
             </w:rPr>
           </w:pPr>
-          <w:hyperlink w:history="1" w:anchor="_Toc169689629">
+          <w:hyperlink w:anchor="_Toc169689629" w:history="1">
             <w:r>
               <w:rPr>
                 <w:rStyle w:val="Hyperlink"/>
@@ -1437,7 +1432,7 @@
               <w14:ligatures w14:val="standardContextual"/>
             </w:rPr>
           </w:pPr>
-          <w:hyperlink w:history="1" w:anchor="_Toc169689630">
+          <w:hyperlink w:anchor="_Toc169689630" w:history="1">
             <w:r>
               <w:rPr>
                 <w:rStyle w:val="Hyperlink"/>
@@ -1511,7 +1506,7 @@
               <w14:ligatures w14:val="standardContextual"/>
             </w:rPr>
           </w:pPr>
-          <w:hyperlink w:history="1" w:anchor="_Toc169689631">
+          <w:hyperlink w:anchor="_Toc169689631" w:history="1">
             <w:r>
               <w:rPr>
                 <w:rStyle w:val="Hyperlink"/>
@@ -1585,7 +1580,7 @@
               <w14:ligatures w14:val="standardContextual"/>
             </w:rPr>
           </w:pPr>
-          <w:hyperlink w:history="1" w:anchor="_Toc169689632">
+          <w:hyperlink w:anchor="_Toc169689632" w:history="1">
             <w:r>
               <w:rPr>
                 <w:rStyle w:val="Hyperlink"/>
@@ -1659,7 +1654,7 @@
               <w14:ligatures w14:val="standardContextual"/>
             </w:rPr>
           </w:pPr>
-          <w:hyperlink w:history="1" w:anchor="_Toc169689633">
+          <w:hyperlink w:anchor="_Toc169689633" w:history="1">
             <w:r>
               <w:rPr>
                 <w:rStyle w:val="Hyperlink"/>
@@ -1733,7 +1728,7 @@
               <w14:ligatures w14:val="standardContextual"/>
             </w:rPr>
           </w:pPr>
-          <w:hyperlink w:history="1" w:anchor="_Toc169689634">
+          <w:hyperlink w:anchor="_Toc169689634" w:history="1">
             <w:r>
               <w:rPr>
                 <w:rStyle w:val="Hyperlink"/>
@@ -1807,7 +1802,7 @@
               <w14:ligatures w14:val="standardContextual"/>
             </w:rPr>
           </w:pPr>
-          <w:hyperlink w:history="1" w:anchor="_Toc169689635">
+          <w:hyperlink w:anchor="_Toc169689635" w:history="1">
             <w:r>
               <w:rPr>
                 <w:rStyle w:val="Hyperlink"/>
@@ -1881,7 +1876,7 @@
               <w14:ligatures w14:val="standardContextual"/>
             </w:rPr>
           </w:pPr>
-          <w:hyperlink w:history="1" w:anchor="_Toc169689636">
+          <w:hyperlink w:anchor="_Toc169689636" w:history="1">
             <w:r>
               <w:rPr>
                 <w:rStyle w:val="Hyperlink"/>
@@ -1955,7 +1950,7 @@
               <w14:ligatures w14:val="standardContextual"/>
             </w:rPr>
           </w:pPr>
-          <w:hyperlink w:history="1" w:anchor="_Toc169689637">
+          <w:hyperlink w:anchor="_Toc169689637" w:history="1">
             <w:r>
               <w:rPr>
                 <w:rStyle w:val="Hyperlink"/>
@@ -2029,7 +2024,7 @@
               <w14:ligatures w14:val="standardContextual"/>
             </w:rPr>
           </w:pPr>
-          <w:hyperlink w:history="1" w:anchor="_Toc169689638">
+          <w:hyperlink w:anchor="_Toc169689638" w:history="1">
             <w:r>
               <w:rPr>
                 <w:rStyle w:val="Hyperlink"/>
@@ -2103,7 +2098,7 @@
               <w14:ligatures w14:val="standardContextual"/>
             </w:rPr>
           </w:pPr>
-          <w:hyperlink w:history="1" w:anchor="_Toc169689639">
+          <w:hyperlink w:anchor="_Toc169689639" w:history="1">
             <w:r>
               <w:rPr>
                 <w:rStyle w:val="Hyperlink"/>
@@ -2177,7 +2172,7 @@
               <w14:ligatures w14:val="standardContextual"/>
             </w:rPr>
           </w:pPr>
-          <w:hyperlink w:history="1" w:anchor="_Toc169689640">
+          <w:hyperlink w:anchor="_Toc169689640" w:history="1">
             <w:r>
               <w:rPr>
                 <w:rStyle w:val="Hyperlink"/>
@@ -2251,7 +2246,7 @@
               <w14:ligatures w14:val="standardContextual"/>
             </w:rPr>
           </w:pPr>
-          <w:hyperlink w:history="1" w:anchor="_Toc169689641">
+          <w:hyperlink w:anchor="_Toc169689641" w:history="1">
             <w:r>
               <w:rPr>
                 <w:rStyle w:val="Hyperlink"/>
@@ -2325,7 +2320,7 @@
               <w14:ligatures w14:val="standardContextual"/>
             </w:rPr>
           </w:pPr>
-          <w:hyperlink w:history="1" w:anchor="_Toc169689642">
+          <w:hyperlink w:anchor="_Toc169689642" w:history="1">
             <w:r>
               <w:rPr>
                 <w:rStyle w:val="Hyperlink"/>
@@ -2399,7 +2394,7 @@
               <w14:ligatures w14:val="standardContextual"/>
             </w:rPr>
           </w:pPr>
-          <w:hyperlink w:history="1" w:anchor="_Toc169689643">
+          <w:hyperlink w:anchor="_Toc169689643" w:history="1">
             <w:r>
               <w:rPr>
                 <w:rStyle w:val="Hyperlink"/>
@@ -2473,7 +2468,7 @@
               <w14:ligatures w14:val="standardContextual"/>
             </w:rPr>
           </w:pPr>
-          <w:hyperlink w:history="1" w:anchor="_Toc169689644">
+          <w:hyperlink w:anchor="_Toc169689644" w:history="1">
             <w:r>
               <w:rPr>
                 <w:rStyle w:val="Hyperlink"/>
@@ -2547,7 +2542,7 @@
               <w14:ligatures w14:val="standardContextual"/>
             </w:rPr>
           </w:pPr>
-          <w:hyperlink w:history="1" w:anchor="_Toc169689645">
+          <w:hyperlink w:anchor="_Toc169689645" w:history="1">
             <w:r>
               <w:rPr>
                 <w:rStyle w:val="Hyperlink"/>
@@ -2621,7 +2616,7 @@
               <w14:ligatures w14:val="standardContextual"/>
             </w:rPr>
           </w:pPr>
-          <w:hyperlink w:history="1" w:anchor="_Toc169689646">
+          <w:hyperlink w:anchor="_Toc169689646" w:history="1">
             <w:r>
               <w:rPr>
                 <w:rStyle w:val="Hyperlink"/>
@@ -2695,7 +2690,7 @@
               <w14:ligatures w14:val="standardContextual"/>
             </w:rPr>
           </w:pPr>
-          <w:hyperlink w:history="1" w:anchor="_Toc169689647">
+          <w:hyperlink w:anchor="_Toc169689647" w:history="1">
             <w:r>
               <w:rPr>
                 <w:rStyle w:val="Hyperlink"/>
@@ -2769,7 +2764,7 @@
               <w14:ligatures w14:val="standardContextual"/>
             </w:rPr>
           </w:pPr>
-          <w:hyperlink w:history="1" w:anchor="_Toc169689648">
+          <w:hyperlink w:anchor="_Toc169689648" w:history="1">
             <w:r>
               <w:rPr>
                 <w:rStyle w:val="Hyperlink"/>
@@ -2843,7 +2838,7 @@
               <w14:ligatures w14:val="standardContextual"/>
             </w:rPr>
           </w:pPr>
-          <w:hyperlink w:history="1" w:anchor="_Toc169689649">
+          <w:hyperlink w:anchor="_Toc169689649" w:history="1">
             <w:r>
               <w:rPr>
                 <w:rStyle w:val="Hyperlink"/>
@@ -2917,7 +2912,7 @@
               <w14:ligatures w14:val="standardContextual"/>
             </w:rPr>
           </w:pPr>
-          <w:hyperlink w:history="1" w:anchor="_Toc169689650">
+          <w:hyperlink w:anchor="_Toc169689650" w:history="1">
             <w:r>
               <w:rPr>
                 <w:rStyle w:val="Hyperlink"/>
@@ -2991,7 +2986,7 @@
               <w14:ligatures w14:val="standardContextual"/>
             </w:rPr>
           </w:pPr>
-          <w:hyperlink w:history="1" w:anchor="_Toc169689651">
+          <w:hyperlink w:anchor="_Toc169689651" w:history="1">
             <w:r>
               <w:rPr>
                 <w:rStyle w:val="Hyperlink"/>
@@ -3065,7 +3060,7 @@
               <w14:ligatures w14:val="standardContextual"/>
             </w:rPr>
           </w:pPr>
-          <w:hyperlink w:history="1" w:anchor="_Toc169689652">
+          <w:hyperlink w:anchor="_Toc169689652" w:history="1">
             <w:r>
               <w:rPr>
                 <w:rStyle w:val="Hyperlink"/>
@@ -3139,7 +3134,7 @@
               <w14:ligatures w14:val="standardContextual"/>
             </w:rPr>
           </w:pPr>
-          <w:hyperlink w:history="1" w:anchor="_Toc169689653">
+          <w:hyperlink w:anchor="_Toc169689653" w:history="1">
             <w:r>
               <w:rPr>
                 <w:rStyle w:val="Hyperlink"/>
@@ -3213,7 +3208,7 @@
               <w14:ligatures w14:val="standardContextual"/>
             </w:rPr>
           </w:pPr>
-          <w:hyperlink w:history="1" w:anchor="_Toc169689654">
+          <w:hyperlink w:anchor="_Toc169689654" w:history="1">
             <w:r>
               <w:rPr>
                 <w:rStyle w:val="Hyperlink"/>
@@ -3287,7 +3282,7 @@
               <w14:ligatures w14:val="standardContextual"/>
             </w:rPr>
           </w:pPr>
-          <w:hyperlink w:history="1" w:anchor="_Toc169689655">
+          <w:hyperlink w:anchor="_Toc169689655" w:history="1">
             <w:r>
               <w:rPr>
                 <w:rStyle w:val="Hyperlink"/>
@@ -3361,7 +3356,7 @@
               <w14:ligatures w14:val="standardContextual"/>
             </w:rPr>
           </w:pPr>
-          <w:hyperlink w:history="1" w:anchor="_Toc169689656">
+          <w:hyperlink w:anchor="_Toc169689656" w:history="1">
             <w:r>
               <w:rPr>
                 <w:rStyle w:val="Hyperlink"/>
@@ -3435,7 +3430,7 @@
               <w14:ligatures w14:val="standardContextual"/>
             </w:rPr>
           </w:pPr>
-          <w:hyperlink w:history="1" w:anchor="_Toc169689657">
+          <w:hyperlink w:anchor="_Toc169689657" w:history="1">
             <w:r>
               <w:rPr>
                 <w:rStyle w:val="Hyperlink"/>
@@ -3509,7 +3504,7 @@
               <w14:ligatures w14:val="standardContextual"/>
             </w:rPr>
           </w:pPr>
-          <w:hyperlink w:history="1" w:anchor="_Toc169689658">
+          <w:hyperlink w:anchor="_Toc169689658" w:history="1">
             <w:r>
               <w:rPr>
                 <w:rStyle w:val="Hyperlink"/>
@@ -3583,7 +3578,7 @@
       <w:pPr>
         <w:pStyle w:val="Heading1"/>
       </w:pPr>
-      <w:bookmarkStart w:name="_Toc169689617" w:id="0"/>
+      <w:bookmarkStart w:id="0" w:name="_Toc169689617"/>
       <w:r>
         <w:t>Design Brief</w:t>
       </w:r>
@@ -3594,8 +3589,8 @@
         <w:pStyle w:val="Heading2"/>
         <w:jc w:val="center"/>
       </w:pPr>
-      <w:bookmarkStart w:name="_569sxpfirk3u" w:colFirst="0" w:colLast="0" w:id="1"/>
-      <w:bookmarkStart w:name="_Toc169689618" w:id="2"/>
+      <w:bookmarkStart w:id="1" w:name="_569sxpfirk3u" w:colFirst="0" w:colLast="0"/>
+      <w:bookmarkStart w:id="2" w:name="_Toc169689618"/>
       <w:bookmarkEnd w:id="1"/>
       <w:r>
         <w:t>Aim</w:t>
@@ -3657,8 +3652,8 @@
         <w:pStyle w:val="Heading2"/>
         <w:jc w:val="center"/>
       </w:pPr>
-      <w:bookmarkStart w:name="_3j0ghk43pax3" w:colFirst="0" w:colLast="0" w:id="3"/>
-      <w:bookmarkStart w:name="_Toc169689619" w:id="4"/>
+      <w:bookmarkStart w:id="3" w:name="_3j0ghk43pax3" w:colFirst="0" w:colLast="0"/>
+      <w:bookmarkStart w:id="4" w:name="_Toc169689619"/>
       <w:bookmarkEnd w:id="3"/>
       <w:r>
         <w:t>Objectives</w:t>
@@ -3709,7 +3704,14 @@
         <w:rPr>
           <w:lang w:val="en-US"/>
         </w:rPr>
-        <w:t xml:space="preserve"> functionality of placing down ships in valid tiles. When that is finished, coding of the modules unique to this game such as calculating explosion radius, score handling and destructions of ship parts will be completed next. After that, testing will be done to find errors and bugs that will be patched out as soon as they are discovered before the game is published for people to play. The object of this game for the user is to clear out endless levels of auto generated mines while making sure that if a mine were to explode it does not end up damaging the ships that they placed</w:t>
+        <w:t xml:space="preserve"> functionality of placing down ships in valid tiles. When that is finished, coding of the modules unique to this game such as calculating explosion radius, score handling and destructions of ship parts will be completed next. After that, testing will be done to find errors and bugs that will be patched out as soon as they are discovered before the game is published for </w:t>
+      </w:r>
+      <w:r>
+        <w:rPr>
+          <w:lang w:val="en-US"/>
+        </w:rPr>
+        <w:lastRenderedPageBreak/>
+        <w:t>people to play. The object of this game for the user is to clear out endless levels of auto generated mines while making sure that if a mine were to explode it does not end up damaging the ships that they placed</w:t>
       </w:r>
     </w:p>
     <w:p>
@@ -3722,8 +3724,8 @@
       <w:pPr>
         <w:pStyle w:val="Heading1"/>
       </w:pPr>
-      <w:bookmarkStart w:name="_v62aiqrokj0b" w:colFirst="0" w:colLast="0" w:id="5"/>
-      <w:bookmarkStart w:name="_Toc169689620" w:id="6"/>
+      <w:bookmarkStart w:id="5" w:name="_v62aiqrokj0b" w:colFirst="0" w:colLast="0"/>
+      <w:bookmarkStart w:id="6" w:name="_Toc169689620"/>
       <w:bookmarkEnd w:id="5"/>
       <w:r>
         <w:t>Detailed Design</w:t>
@@ -3739,8 +3741,8 @@
           <w:szCs w:val="22"/>
         </w:rPr>
       </w:pPr>
-      <w:bookmarkStart w:name="_5giizrpnpkwk" w:colFirst="0" w:colLast="0" w:id="7"/>
-      <w:bookmarkStart w:name="_Toc169689621" w:id="8"/>
+      <w:bookmarkStart w:id="7" w:name="_5giizrpnpkwk" w:colFirst="0" w:colLast="0"/>
+      <w:bookmarkStart w:id="8" w:name="_Toc169689621"/>
       <w:bookmarkEnd w:id="7"/>
       <w:r>
         <w:t>Sketch of all the screens that will appear</w:t>
@@ -3851,6 +3853,7 @@
         <w:rPr>
           <w:noProof/>
         </w:rPr>
+        <w:lastRenderedPageBreak/>
         <w:drawing>
           <wp:inline distT="0" distB="0" distL="0" distR="0" wp14:anchorId="6DC33D4A" wp14:editId="1EF4178C">
             <wp:extent cx="5943600" cy="2065020"/>
@@ -3944,7 +3947,7 @@
       <w:pPr>
         <w:jc w:val="both"/>
       </w:pPr>
-      <w:bookmarkStart w:name="_swaovabkcd35" w:colFirst="0" w:colLast="0" w:id="9"/>
+      <w:bookmarkStart w:id="9" w:name="_swaovabkcd35" w:colFirst="0" w:colLast="0"/>
       <w:bookmarkEnd w:id="9"/>
     </w:p>
     <w:p>
@@ -3952,8 +3955,8 @@
         <w:pStyle w:val="Heading2"/>
         <w:jc w:val="center"/>
       </w:pPr>
-      <w:bookmarkStart w:name="_wq33ccefzikw" w:colFirst="0" w:colLast="0" w:id="10"/>
-      <w:bookmarkStart w:name="_Toc169689622" w:id="11"/>
+      <w:bookmarkStart w:id="10" w:name="_wq33ccefzikw" w:colFirst="0" w:colLast="0"/>
+      <w:bookmarkStart w:id="11" w:name="_Toc169689622"/>
       <w:bookmarkEnd w:id="10"/>
       <w:r>
         <w:t>Specifications</w:t>
@@ -3964,8 +3967,8 @@
       <w:pPr>
         <w:pStyle w:val="Heading3"/>
       </w:pPr>
-      <w:bookmarkStart w:name="_7u8acoib12tk" w:colFirst="0" w:colLast="0" w:id="12"/>
-      <w:bookmarkStart w:name="_Toc169689623" w:id="13"/>
+      <w:bookmarkStart w:id="12" w:name="_7u8acoib12tk" w:colFirst="0" w:colLast="0"/>
+      <w:bookmarkStart w:id="13" w:name="_Toc169689623"/>
       <w:bookmarkEnd w:id="12"/>
       <w:r>
         <w:t>Basic Functionality</w:t>
@@ -3997,10 +4000,11 @@
       <w:pPr>
         <w:pStyle w:val="Heading3"/>
       </w:pPr>
-      <w:bookmarkStart w:name="_cdksdwqx8wbt" w:colFirst="0" w:colLast="0" w:id="14"/>
-      <w:bookmarkStart w:name="_Toc169689624" w:id="15"/>
+      <w:bookmarkStart w:id="14" w:name="_cdksdwqx8wbt" w:colFirst="0" w:colLast="0"/>
+      <w:bookmarkStart w:id="15" w:name="_Toc169689624"/>
       <w:bookmarkEnd w:id="14"/>
       <w:r>
+        <w:lastRenderedPageBreak/>
         <w:t>Limitations</w:t>
       </w:r>
       <w:bookmarkEnd w:id="15"/>
@@ -4102,8 +4106,8 @@
         <w:pStyle w:val="Heading2"/>
         <w:jc w:val="center"/>
       </w:pPr>
-      <w:bookmarkStart w:name="_jqe6afgy1vep" w:colFirst="0" w:colLast="0" w:id="16"/>
-      <w:bookmarkStart w:name="_Toc169689625" w:id="17"/>
+      <w:bookmarkStart w:id="16" w:name="_jqe6afgy1vep" w:colFirst="0" w:colLast="0"/>
+      <w:bookmarkStart w:id="17" w:name="_Toc169689625"/>
       <w:bookmarkEnd w:id="16"/>
       <w:r>
         <w:t>Input,</w:t>
@@ -4128,12 +4132,12 @@
         <w:tblStyle w:val="1"/>
         <w:tblW w:w="9360" w:type="dxa"/>
         <w:tblBorders>
-          <w:top w:val="single" w:color="000000" w:sz="8" w:space="0"/>
-          <w:left w:val="single" w:color="000000" w:sz="8" w:space="0"/>
-          <w:bottom w:val="single" w:color="000000" w:sz="8" w:space="0"/>
-          <w:right w:val="single" w:color="000000" w:sz="8" w:space="0"/>
-          <w:insideH w:val="single" w:color="000000" w:sz="8" w:space="0"/>
-          <w:insideV w:val="single" w:color="000000" w:sz="8" w:space="0"/>
+          <w:top w:val="single" w:sz="8" w:space="0" w:color="000000"/>
+          <w:left w:val="single" w:sz="8" w:space="0" w:color="000000"/>
+          <w:bottom w:val="single" w:sz="8" w:space="0" w:color="000000"/>
+          <w:right w:val="single" w:sz="8" w:space="0" w:color="000000"/>
+          <w:insideH w:val="single" w:sz="8" w:space="0" w:color="000000"/>
+          <w:insideV w:val="single" w:sz="8" w:space="0" w:color="000000"/>
         </w:tblBorders>
         <w:tblLayout w:type="fixed"/>
         <w:tblLook w:val="0600" w:firstRow="0" w:lastRow="0" w:firstColumn="0" w:lastColumn="0" w:noHBand="1" w:noVBand="1"/>
@@ -4160,8 +4164,8 @@
               <w:pStyle w:val="Heading2"/>
               <w:jc w:val="center"/>
             </w:pPr>
-            <w:bookmarkStart w:name="_8dl3ltxqxbxj" w:colFirst="0" w:colLast="0" w:id="18"/>
-            <w:bookmarkStart w:name="_Toc169689626" w:id="19"/>
+            <w:bookmarkStart w:id="18" w:name="_8dl3ltxqxbxj" w:colFirst="0" w:colLast="0"/>
+            <w:bookmarkStart w:id="19" w:name="_Toc169689626"/>
             <w:bookmarkEnd w:id="18"/>
             <w:r>
               <w:t>Input</w:t>
@@ -4185,8 +4189,8 @@
               <w:pStyle w:val="Heading2"/>
               <w:jc w:val="center"/>
             </w:pPr>
-            <w:bookmarkStart w:name="_ko7bq95i81kj" w:colFirst="0" w:colLast="0" w:id="20"/>
-            <w:bookmarkStart w:name="_Toc169689627" w:id="21"/>
+            <w:bookmarkStart w:id="20" w:name="_ko7bq95i81kj" w:colFirst="0" w:colLast="0"/>
+            <w:bookmarkStart w:id="21" w:name="_Toc169689627"/>
             <w:bookmarkEnd w:id="20"/>
             <w:r>
               <w:t>Process</w:t>
@@ -4210,8 +4214,8 @@
               <w:pStyle w:val="Heading2"/>
               <w:jc w:val="center"/>
             </w:pPr>
-            <w:bookmarkStart w:name="_ky1bt25qkhde" w:colFirst="0" w:colLast="0" w:id="22"/>
-            <w:bookmarkStart w:name="_Toc169689628" w:id="23"/>
+            <w:bookmarkStart w:id="22" w:name="_ky1bt25qkhde" w:colFirst="0" w:colLast="0"/>
+            <w:bookmarkStart w:id="23" w:name="_Toc169689628"/>
             <w:bookmarkEnd w:id="22"/>
             <w:r>
               <w:t>Output</w:t>
@@ -4396,8 +4400,6 @@
             </w:r>
             <w:r>
               <w:br/>
-            </w:r>
-            <w:r>
               <w:t>“Left click to place &lt;ship name&gt; ship</w:t>
             </w:r>
           </w:p>
@@ -4602,14 +4604,10 @@
             </w:r>
             <w:r>
               <w:tab/>
-            </w:r>
-            <w:r>
               <w:t>Play “error” sound</w:t>
             </w:r>
             <w:r>
               <w:br/>
-            </w:r>
-            <w:r>
               <w:t>Else</w:t>
             </w:r>
           </w:p>
@@ -4837,14 +4835,10 @@
             </w:r>
             <w:r>
               <w:tab/>
-            </w:r>
-            <w:r>
               <w:t>Play “error” sound</w:t>
             </w:r>
             <w:r>
               <w:br/>
-            </w:r>
-            <w:r>
               <w:t>Else</w:t>
             </w:r>
           </w:p>
@@ -5008,12 +5002,11 @@
               <w:jc w:val="center"/>
             </w:pPr>
             <w:r>
+              <w:lastRenderedPageBreak/>
               <w:t>Right click to rotate”</w:t>
             </w:r>
             <w:r>
               <w:br/>
-            </w:r>
-            <w:r>
               <w:t>“Assigning mines....”</w:t>
             </w:r>
           </w:p>
@@ -5071,6 +5064,7 @@
               <w:spacing w:line="240" w:lineRule="auto"/>
             </w:pPr>
             <w:r>
+              <w:lastRenderedPageBreak/>
               <w:t>Revealing a non-mine tile</w:t>
             </w:r>
           </w:p>
@@ -5129,8 +5123,6 @@
             </w:r>
             <w:r>
               <w:tab/>
-            </w:r>
-            <w:r>
               <w:t>Reveal tile</w:t>
             </w:r>
             <w:r>
@@ -5138,8 +5130,6 @@
             </w:r>
             <w:r>
               <w:tab/>
-            </w:r>
-            <w:r>
               <w:t>Repeat until tile with number   is revealed</w:t>
             </w:r>
           </w:p>
@@ -5173,8 +5163,6 @@
             </w:r>
             <w:r>
               <w:tab/>
-            </w:r>
-            <w:r>
               <w:t xml:space="preserve">Display “Level complete!!”  </w:t>
             </w:r>
           </w:p>
@@ -5462,8 +5450,6 @@
             </w:r>
             <w:r>
               <w:tab/>
-            </w:r>
-            <w:r>
               <w:t>set ship part for affected ship as “destroyed”</w:t>
             </w:r>
             <w:r>
@@ -5471,8 +5457,6 @@
             </w:r>
             <w:r>
               <w:tab/>
-            </w:r>
-            <w:r>
               <w:t xml:space="preserve">display part destroyed decal </w:t>
             </w:r>
           </w:p>
@@ -5696,8 +5680,6 @@
             </w:r>
             <w:r>
               <w:br/>
-            </w:r>
-            <w:r>
               <w:t>Score 2</w:t>
             </w:r>
           </w:p>
@@ -5764,10 +5746,11 @@
         <w:pStyle w:val="Heading2"/>
         <w:jc w:val="center"/>
       </w:pPr>
-      <w:bookmarkStart w:name="_9ik34z78r0a7" w:colFirst="0" w:colLast="0" w:id="24"/>
-      <w:bookmarkStart w:name="_Toc169689629" w:id="25"/>
+      <w:bookmarkStart w:id="24" w:name="_9ik34z78r0a7" w:colFirst="0" w:colLast="0"/>
+      <w:bookmarkStart w:id="25" w:name="_Toc169689629"/>
       <w:bookmarkEnd w:id="24"/>
       <w:r>
+        <w:lastRenderedPageBreak/>
         <w:t>Context diagram</w:t>
       </w:r>
       <w:bookmarkEnd w:id="25"/>
@@ -5825,8 +5808,8 @@
         <w:pStyle w:val="Heading2"/>
         <w:jc w:val="center"/>
       </w:pPr>
-      <w:bookmarkStart w:name="_ka87bclkt72u" w:colFirst="0" w:colLast="0" w:id="26"/>
-      <w:bookmarkStart w:name="_Toc169689630" w:id="27"/>
+      <w:bookmarkStart w:id="26" w:name="_ka87bclkt72u" w:colFirst="0" w:colLast="0"/>
+      <w:bookmarkStart w:id="27" w:name="_Toc169689630"/>
       <w:bookmarkEnd w:id="26"/>
       <w:r>
         <w:t>Data flow diagram</w:t>
@@ -5887,10 +5870,11 @@
         <w:pStyle w:val="Heading2"/>
         <w:jc w:val="center"/>
       </w:pPr>
-      <w:bookmarkStart w:name="_mdtgga2tujg3" w:colFirst="0" w:colLast="0" w:id="28"/>
-      <w:bookmarkStart w:name="_Toc169689631" w:id="29"/>
+      <w:bookmarkStart w:id="28" w:name="_mdtgga2tujg3" w:colFirst="0" w:colLast="0"/>
+      <w:bookmarkStart w:id="29" w:name="_Toc169689631"/>
       <w:bookmarkEnd w:id="28"/>
       <w:r>
+        <w:lastRenderedPageBreak/>
         <w:t>System Flowchart</w:t>
       </w:r>
       <w:bookmarkEnd w:id="29"/>
@@ -5948,8 +5932,8 @@
         <w:pStyle w:val="Heading2"/>
         <w:jc w:val="center"/>
       </w:pPr>
-      <w:bookmarkStart w:name="_pm02pjywrugk" w:colFirst="0" w:colLast="0" w:id="30"/>
-      <w:bookmarkStart w:name="_Toc169689632" w:id="31"/>
+      <w:bookmarkStart w:id="30" w:name="_pm02pjywrugk" w:colFirst="0" w:colLast="0"/>
+      <w:bookmarkStart w:id="31" w:name="_Toc169689632"/>
       <w:bookmarkEnd w:id="30"/>
       <w:r>
         <w:t>Structure chart</w:t>
@@ -6005,21 +5989,45 @@
           </wp:inline>
         </w:drawing>
       </w:r>
-      <w:bookmarkStart w:name="_qnfd9kn5ka18" w:colFirst="0" w:colLast="0" w:id="32"/>
+      <w:bookmarkStart w:id="32" w:name="_qnfd9kn5ka18" w:colFirst="0" w:colLast="0"/>
       <w:bookmarkEnd w:id="32"/>
     </w:p>
     <w:p>
       <w:pPr>
         <w:pStyle w:val="Heading1"/>
       </w:pPr>
-      <w:bookmarkStart w:name="_cdo2crgnqyga" w:colFirst="0" w:colLast="0" w:id="33"/>
-      <w:bookmarkStart w:name="_Toc169689633" w:id="34"/>
+      <w:bookmarkStart w:id="33" w:name="_cdo2crgnqyga" w:colFirst="0" w:colLast="0"/>
+      <w:bookmarkStart w:id="34" w:name="_Toc169689633"/>
       <w:bookmarkEnd w:id="33"/>
       <w:r>
+        <w:lastRenderedPageBreak/>
         <w:t>A</w:t>
       </w:r>
       <w:r>
         <w:t xml:space="preserve">lgorithm </w:t>
+      </w:r>
+    </w:p>
+    <w:p>
+      <w:pPr>
+        <w:pStyle w:val="Heading1"/>
+      </w:pPr>
+      <w:r>
+        <w:t>User Manual</w:t>
+      </w:r>
+    </w:p>
+    <w:p>
+      <w:pPr>
+        <w:pStyle w:val="ListParagraph"/>
+        <w:numPr>
+          <w:ilvl w:val="0"/>
+          <w:numId w:val="23"/>
+        </w:numPr>
+      </w:pPr>
+      <w:r>
+        <w:t xml:space="preserve">Please head to </w:t>
+      </w:r>
+      <w:r>
+        <w:t>google class and download BattleSweeper.rar</w:t>
       </w:r>
     </w:p>
     <w:p/>
@@ -6037,8 +6045,8 @@
         <w:pStyle w:val="Heading2"/>
         <w:jc w:val="center"/>
       </w:pPr>
-      <w:bookmarkStart w:name="_ejy7ktsijtkv" w:colFirst="0" w:colLast="0" w:id="35"/>
-      <w:bookmarkStart w:name="_Toc169689634" w:id="36"/>
+      <w:bookmarkStart w:id="35" w:name="_ejy7ktsijtkv" w:colFirst="0" w:colLast="0"/>
+      <w:bookmarkStart w:id="36" w:name="_Toc169689634"/>
       <w:bookmarkEnd w:id="35"/>
       <w:r>
         <w:t>Logbook</w:t>
@@ -6050,8 +6058,8 @@
         <w:pStyle w:val="Heading3"/>
         <w:ind w:left="360"/>
       </w:pPr>
-      <w:bookmarkStart w:name="_y8enwl6u1i6r" w:colFirst="0" w:colLast="0" w:id="37"/>
-      <w:bookmarkStart w:name="_Toc169689635" w:id="38"/>
+      <w:bookmarkStart w:id="37" w:name="_y8enwl6u1i6r" w:colFirst="0" w:colLast="0"/>
+      <w:bookmarkStart w:id="38" w:name="_Toc169689635"/>
       <w:bookmarkEnd w:id="37"/>
       <w:r>
         <w:t>14th of May</w:t>
@@ -6255,8 +6263,8 @@
         <w:pStyle w:val="Heading3"/>
         <w:ind w:left="360"/>
       </w:pPr>
-      <w:bookmarkStart w:name="_b42jir3i1w53" w:colFirst="0" w:colLast="0" w:id="39"/>
-      <w:bookmarkStart w:name="_Toc169689636" w:id="40"/>
+      <w:bookmarkStart w:id="39" w:name="_b42jir3i1w53" w:colFirst="0" w:colLast="0"/>
+      <w:bookmarkStart w:id="40" w:name="_Toc169689636"/>
       <w:bookmarkEnd w:id="39"/>
       <w:r>
         <w:t>15th of May</w:t>
@@ -6395,6 +6403,7 @@
         </w:numPr>
       </w:pPr>
       <w:r>
+        <w:lastRenderedPageBreak/>
         <w:t>Specifications</w:t>
       </w:r>
     </w:p>
@@ -6490,8 +6499,8 @@
         <w:pStyle w:val="Heading3"/>
         <w:ind w:left="360"/>
       </w:pPr>
-      <w:bookmarkStart w:name="_e96pwivm66jw" w:colFirst="0" w:colLast="0" w:id="41"/>
-      <w:bookmarkStart w:name="_Toc169689637" w:id="42"/>
+      <w:bookmarkStart w:id="41" w:name="_e96pwivm66jw" w:colFirst="0" w:colLast="0"/>
+      <w:bookmarkStart w:id="42" w:name="_Toc169689637"/>
       <w:bookmarkEnd w:id="41"/>
       <w:r>
         <w:t>17th of May</w:t>
@@ -6912,6 +6921,7 @@
         <w:rPr>
           <w:lang w:val="en-US"/>
         </w:rPr>
+        <w:lastRenderedPageBreak/>
         <w:t>Additional task for tomorrow</w:t>
       </w:r>
     </w:p>
@@ -6920,8 +6930,8 @@
         <w:pStyle w:val="Heading3"/>
         <w:ind w:left="360"/>
       </w:pPr>
-      <w:bookmarkStart w:name="_32nuc25fnd52" w:colFirst="0" w:colLast="0" w:id="43"/>
-      <w:bookmarkStart w:name="_Toc169689638" w:id="44"/>
+      <w:bookmarkStart w:id="43" w:name="_32nuc25fnd52" w:colFirst="0" w:colLast="0"/>
+      <w:bookmarkStart w:id="44" w:name="_Toc169689638"/>
       <w:bookmarkEnd w:id="43"/>
       <w:r>
         <w:t>19th of May</w:t>
@@ -7119,8 +7129,8 @@
         <w:pStyle w:val="Heading3"/>
         <w:ind w:left="360"/>
       </w:pPr>
-      <w:bookmarkStart w:name="_lx4rdstakn8y" w:colFirst="0" w:colLast="0" w:id="45"/>
-      <w:bookmarkStart w:name="_Toc169689639" w:id="46"/>
+      <w:bookmarkStart w:id="45" w:name="_lx4rdstakn8y" w:colFirst="0" w:colLast="0"/>
+      <w:bookmarkStart w:id="46" w:name="_Toc169689639"/>
       <w:bookmarkEnd w:id="45"/>
       <w:r>
         <w:t>20th of May</w:t>
@@ -7430,6 +7440,7 @@
         </w:numPr>
       </w:pPr>
       <w:r>
+        <w:lastRenderedPageBreak/>
         <w:t>Documentation</w:t>
       </w:r>
     </w:p>
@@ -7504,8 +7515,8 @@
         <w:pStyle w:val="Heading3"/>
         <w:ind w:left="360"/>
       </w:pPr>
-      <w:bookmarkStart w:name="_iy8vwpcklf82" w:colFirst="0" w:colLast="0" w:id="47"/>
-      <w:bookmarkStart w:name="_Toc169689640" w:id="48"/>
+      <w:bookmarkStart w:id="47" w:name="_iy8vwpcklf82" w:colFirst="0" w:colLast="0"/>
+      <w:bookmarkStart w:id="48" w:name="_Toc169689640"/>
       <w:bookmarkEnd w:id="47"/>
       <w:r>
         <w:t>22nd of May</w:t>
@@ -7802,8 +7813,8 @@
         <w:pStyle w:val="Heading3"/>
         <w:ind w:left="360"/>
       </w:pPr>
-      <w:bookmarkStart w:name="_qdx3ep1kzehu" w:colFirst="0" w:colLast="0" w:id="49"/>
-      <w:bookmarkStart w:name="_Toc169689641" w:id="50"/>
+      <w:bookmarkStart w:id="49" w:name="_qdx3ep1kzehu" w:colFirst="0" w:colLast="0"/>
+      <w:bookmarkStart w:id="50" w:name="_Toc169689641"/>
       <w:bookmarkEnd w:id="49"/>
       <w:r>
         <w:t>23rd of May</w:t>
@@ -7969,6 +7980,7 @@
         <w:rPr>
           <w:lang w:val="en-US"/>
         </w:rPr>
+        <w:lastRenderedPageBreak/>
         <w:t>Clear documentation like PyGame</w:t>
       </w:r>
     </w:p>
@@ -8154,8 +8166,8 @@
         <w:pStyle w:val="Heading3"/>
         <w:ind w:left="360"/>
       </w:pPr>
-      <w:bookmarkStart w:name="_ilfjkfr7sa2u" w:colFirst="0" w:colLast="0" w:id="51"/>
-      <w:bookmarkStart w:name="_Toc169689642" w:id="52"/>
+      <w:bookmarkStart w:id="51" w:name="_ilfjkfr7sa2u" w:colFirst="0" w:colLast="0"/>
+      <w:bookmarkStart w:id="52" w:name="_Toc169689642"/>
       <w:bookmarkEnd w:id="51"/>
       <w:r>
         <w:t>26th of May</w:t>
@@ -8329,8 +8341,8 @@
         <w:pStyle w:val="Heading3"/>
         <w:ind w:left="360"/>
       </w:pPr>
-      <w:bookmarkStart w:name="_ros5b13n07z9" w:colFirst="0" w:colLast="0" w:id="53"/>
-      <w:bookmarkStart w:name="_Toc169689643" w:id="54"/>
+      <w:bookmarkStart w:id="53" w:name="_ros5b13n07z9" w:colFirst="0" w:colLast="0"/>
+      <w:bookmarkStart w:id="54" w:name="_Toc169689643"/>
       <w:bookmarkEnd w:id="53"/>
       <w:r>
         <w:t>27th of May</w:t>
@@ -8472,6 +8484,7 @@
         </w:numPr>
       </w:pPr>
       <w:r>
+        <w:lastRenderedPageBreak/>
         <w:t>Charts</w:t>
       </w:r>
     </w:p>
@@ -8555,8 +8568,8 @@
         <w:pStyle w:val="Heading3"/>
         <w:ind w:left="360"/>
       </w:pPr>
-      <w:bookmarkStart w:name="_qyvupq6x3wre" w:colFirst="0" w:colLast="0" w:id="55"/>
-      <w:bookmarkStart w:name="_Toc169689644" w:id="56"/>
+      <w:bookmarkStart w:id="55" w:name="_qyvupq6x3wre" w:colFirst="0" w:colLast="0"/>
+      <w:bookmarkStart w:id="56" w:name="_Toc169689644"/>
       <w:bookmarkEnd w:id="55"/>
       <w:r>
         <w:t>28th of May</w:t>
@@ -8819,8 +8832,8 @@
         <w:pStyle w:val="Heading3"/>
         <w:ind w:left="360"/>
       </w:pPr>
-      <w:bookmarkStart w:name="_tqp7qkek3sxx" w:colFirst="0" w:colLast="0" w:id="57"/>
-      <w:bookmarkStart w:name="_Toc169689645" w:id="58"/>
+      <w:bookmarkStart w:id="57" w:name="_tqp7qkek3sxx" w:colFirst="0" w:colLast="0"/>
+      <w:bookmarkStart w:id="58" w:name="_Toc169689645"/>
       <w:bookmarkEnd w:id="57"/>
       <w:r>
         <w:t>29th of May</w:t>
@@ -8980,6 +8993,7 @@
         </w:numPr>
       </w:pPr>
       <w:r>
+        <w:lastRenderedPageBreak/>
         <w:t>Documentation</w:t>
       </w:r>
     </w:p>
@@ -9039,8 +9053,8 @@
         <w:pStyle w:val="Heading3"/>
         <w:ind w:left="360"/>
       </w:pPr>
-      <w:bookmarkStart w:name="_boq32pdyk7vt" w:colFirst="0" w:colLast="0" w:id="59"/>
-      <w:bookmarkStart w:name="_Toc169689646" w:id="60"/>
+      <w:bookmarkStart w:id="59" w:name="_boq32pdyk7vt" w:colFirst="0" w:colLast="0"/>
+      <w:bookmarkStart w:id="60" w:name="_Toc169689646"/>
       <w:bookmarkEnd w:id="59"/>
       <w:r>
         <w:t>30th of May</w:t>
@@ -9319,8 +9333,8 @@
         <w:pStyle w:val="Heading3"/>
         <w:ind w:left="360"/>
       </w:pPr>
-      <w:bookmarkStart w:name="_1eknjex55i83" w:colFirst="0" w:colLast="0" w:id="61"/>
-      <w:bookmarkStart w:name="_Toc169689647" w:id="62"/>
+      <w:bookmarkStart w:id="61" w:name="_1eknjex55i83" w:colFirst="0" w:colLast="0"/>
+      <w:bookmarkStart w:id="62" w:name="_Toc169689647"/>
       <w:bookmarkEnd w:id="61"/>
       <w:r>
         <w:t>31st of May</w:t>
@@ -9480,6 +9494,7 @@
         </w:numPr>
       </w:pPr>
       <w:r>
+        <w:lastRenderedPageBreak/>
         <w:t>Completed</w:t>
       </w:r>
     </w:p>
@@ -9563,8 +9578,8 @@
         <w:pStyle w:val="Heading3"/>
         <w:ind w:left="360"/>
       </w:pPr>
-      <w:bookmarkStart w:name="_8h4dg5rfcrko" w:colFirst="0" w:colLast="0" w:id="63"/>
-      <w:bookmarkStart w:name="_Toc169689648" w:id="64"/>
+      <w:bookmarkStart w:id="63" w:name="_8h4dg5rfcrko" w:colFirst="0" w:colLast="0"/>
+      <w:bookmarkStart w:id="64" w:name="_Toc169689648"/>
       <w:bookmarkEnd w:id="63"/>
       <w:r>
         <w:t>3rd of June</w:t>
@@ -9738,8 +9753,8 @@
         <w:pStyle w:val="Heading3"/>
         <w:ind w:left="360"/>
       </w:pPr>
-      <w:bookmarkStart w:name="_m8tmi6sc6uty" w:colFirst="0" w:colLast="0" w:id="65"/>
-      <w:bookmarkStart w:name="_Toc169689649" w:id="66"/>
+      <w:bookmarkStart w:id="65" w:name="_m8tmi6sc6uty" w:colFirst="0" w:colLast="0"/>
+      <w:bookmarkStart w:id="66" w:name="_Toc169689649"/>
       <w:bookmarkEnd w:id="65"/>
       <w:r>
         <w:t>4th of June</w:t>
@@ -9913,8 +9928,8 @@
         <w:pStyle w:val="Heading3"/>
         <w:ind w:left="360"/>
       </w:pPr>
-      <w:bookmarkStart w:name="_n21s8u89tei4" w:colFirst="0" w:colLast="0" w:id="67"/>
-      <w:bookmarkStart w:name="_Toc169689650" w:id="68"/>
+      <w:bookmarkStart w:id="67" w:name="_n21s8u89tei4" w:colFirst="0" w:colLast="0"/>
+      <w:bookmarkStart w:id="68" w:name="_Toc169689650"/>
       <w:bookmarkEnd w:id="67"/>
       <w:r>
         <w:t>5th of June</w:t>
@@ -10008,6 +10023,7 @@
         </w:numPr>
       </w:pPr>
       <w:r>
+        <w:lastRenderedPageBreak/>
         <w:t>Gantt Chart Progress check</w:t>
       </w:r>
     </w:p>
@@ -10103,8 +10119,8 @@
         <w:pStyle w:val="Heading3"/>
         <w:ind w:left="360"/>
       </w:pPr>
-      <w:bookmarkStart w:name="_g3dtqtlo3pgl" w:colFirst="0" w:colLast="0" w:id="69"/>
-      <w:bookmarkStart w:name="_Toc169689651" w:id="70"/>
+      <w:bookmarkStart w:id="69" w:name="_g3dtqtlo3pgl" w:colFirst="0" w:colLast="0"/>
+      <w:bookmarkStart w:id="70" w:name="_Toc169689651"/>
       <w:bookmarkEnd w:id="69"/>
       <w:r>
         <w:t>6th of June</w:t>
@@ -10290,8 +10306,8 @@
         <w:pStyle w:val="Heading3"/>
         <w:ind w:left="360"/>
       </w:pPr>
-      <w:bookmarkStart w:name="_53mbsk1yjlrw" w:colFirst="0" w:colLast="0" w:id="71"/>
-      <w:bookmarkStart w:name="_Toc169689652" w:id="72"/>
+      <w:bookmarkStart w:id="71" w:name="_53mbsk1yjlrw" w:colFirst="0" w:colLast="0"/>
+      <w:bookmarkStart w:id="72" w:name="_Toc169689652"/>
       <w:bookmarkEnd w:id="71"/>
       <w:r>
         <w:t>7th of June</w:t>
@@ -10520,6 +10536,7 @@
         </w:numPr>
       </w:pPr>
       <w:r>
+        <w:lastRenderedPageBreak/>
         <w:t>Documentation</w:t>
       </w:r>
     </w:p>
@@ -10579,7 +10596,7 @@
         <w:pStyle w:val="Heading3"/>
         <w:ind w:left="360"/>
       </w:pPr>
-      <w:bookmarkStart w:name="_Toc169689653" w:id="73"/>
+      <w:bookmarkStart w:id="73" w:name="_Toc169689653"/>
       <w:r>
         <w:t>9th of June</w:t>
       </w:r>
@@ -10764,7 +10781,7 @@
         <w:pStyle w:val="Heading3"/>
         <w:ind w:left="360"/>
       </w:pPr>
-      <w:bookmarkStart w:name="_Toc169689654" w:id="74"/>
+      <w:bookmarkStart w:id="74" w:name="_Toc169689654"/>
       <w:r>
         <w:t>10th of June</w:t>
       </w:r>
@@ -10829,7 +10846,7 @@
       <w:r>
         <w:t xml:space="preserve">Learnt more modern uses of signals through this </w:t>
       </w:r>
-      <w:hyperlink w:history="1" r:id="rId35">
+      <w:hyperlink r:id="rId35" w:history="1">
         <w:r>
           <w:rPr>
             <w:rStyle w:val="Hyperlink"/>
@@ -10867,7 +10884,7 @@
       <w:r>
         <w:t xml:space="preserve">Learnt about the “await” function from this </w:t>
       </w:r>
-      <w:hyperlink w:history="1" r:id="rId36">
+      <w:hyperlink r:id="rId36" w:history="1">
         <w:r>
           <w:rPr>
             <w:rStyle w:val="Hyperlink"/>
@@ -10995,7 +11012,7 @@
         <w:pStyle w:val="Heading3"/>
         <w:ind w:left="360"/>
       </w:pPr>
-      <w:bookmarkStart w:name="_Toc169689655" w:id="75"/>
+      <w:bookmarkStart w:id="75" w:name="_Toc169689655"/>
       <w:r>
         <w:t>13th of June</w:t>
       </w:r>
@@ -11058,6 +11075,7 @@
         </w:numPr>
       </w:pPr>
       <w:r>
+        <w:lastRenderedPageBreak/>
         <w:t>Gantt Chart Progress check</w:t>
       </w:r>
     </w:p>
@@ -11165,7 +11183,7 @@
         <w:pStyle w:val="Heading3"/>
         <w:ind w:left="360"/>
       </w:pPr>
-      <w:bookmarkStart w:name="_Toc169689656" w:id="76"/>
+      <w:bookmarkStart w:id="76" w:name="_Toc169689656"/>
       <w:r>
         <w:t>14th of June</w:t>
       </w:r>
@@ -11380,7 +11398,7 @@
         <w:pStyle w:val="Heading3"/>
         <w:ind w:left="360"/>
       </w:pPr>
-      <w:bookmarkStart w:name="_Toc169689657" w:id="77"/>
+      <w:bookmarkStart w:id="77" w:name="_Toc169689657"/>
       <w:r>
         <w:t>15th of June</w:t>
       </w:r>
@@ -11587,6 +11605,7 @@
         </w:numPr>
       </w:pPr>
       <w:r>
+        <w:lastRenderedPageBreak/>
         <w:t>Continue learning</w:t>
       </w:r>
     </w:p>
@@ -11595,7 +11614,7 @@
         <w:pStyle w:val="Heading3"/>
         <w:ind w:left="360"/>
       </w:pPr>
-      <w:bookmarkStart w:name="_Toc169689658" w:id="78"/>
+      <w:bookmarkStart w:id="78" w:name="_Toc169689658"/>
       <w:r>
         <w:t>18th of June</w:t>
       </w:r>
@@ -11905,7 +11924,7 @@
       <w:r>
         <w:t xml:space="preserve">From </w:t>
       </w:r>
-      <w:hyperlink w:history="1" r:id="rId42">
+      <w:hyperlink r:id="rId42" w:history="1">
         <w:r>
           <w:rPr>
             <w:rStyle w:val="Hyperlink"/>
@@ -11952,7 +11971,7 @@
       <w:r>
         <w:t xml:space="preserve">From </w:t>
       </w:r>
-      <w:hyperlink w:history="1" r:id="rId43">
+      <w:hyperlink r:id="rId43" w:history="1">
         <w:r>
           <w:rPr>
             <w:rStyle w:val="Hyperlink"/>
@@ -12010,10 +12029,8 @@
           <w:ilvl w:val="2"/>
           <w:numId w:val="22"/>
         </w:numPr>
-        <w:rPr/>
-      </w:pPr>
-      <w:r>
-        <w:rPr/>
+      </w:pPr>
+      <w:r>
         <w:t>Added title of game</w:t>
       </w:r>
     </w:p>
@@ -12024,10 +12041,8 @@
           <w:ilvl w:val="0"/>
           <w:numId w:val="22"/>
         </w:numPr>
-        <w:rPr/>
-      </w:pPr>
-      <w:r>
-        <w:rPr/>
+      </w:pPr>
+      <w:r>
         <w:t>Begin working on Algorithm</w:t>
       </w:r>
     </w:p>
@@ -12050,10 +12065,8 @@
           <w:ilvl w:val="1"/>
           <w:numId w:val="22"/>
         </w:numPr>
-        <w:rPr/>
-      </w:pPr>
-      <w:r>
-        <w:rPr/>
+      </w:pPr>
+      <w:r>
         <w:t>Algorithm</w:t>
       </w:r>
     </w:p>
@@ -12064,15 +12077,8 @@
           <w:ilvl w:val="2"/>
           <w:numId w:val="22"/>
         </w:numPr>
-        <w:suppressLineNumbers w:val="0"/>
-        <w:bidi w:val="0"/>
-        <w:spacing w:before="0" w:beforeAutospacing="off" w:after="0" w:afterAutospacing="off" w:line="276" w:lineRule="auto"/>
-        <w:ind w:left="2160" w:right="0" w:hanging="360"/>
-        <w:jc w:val="left"/>
-        <w:rPr/>
-      </w:pPr>
-      <w:r>
-        <w:rPr/>
+      </w:pPr>
+      <w:r>
         <w:t>On course</w:t>
       </w:r>
     </w:p>
@@ -12121,6 +12127,7 @@
         </w:numPr>
       </w:pPr>
       <w:r>
+        <w:lastRenderedPageBreak/>
         <w:t>On Course</w:t>
       </w:r>
     </w:p>
@@ -12154,10 +12161,184 @@
         <w:tab/>
       </w:r>
     </w:p>
+    <w:p>
+      <w:pPr>
+        <w:pStyle w:val="Heading3"/>
+        <w:ind w:left="360"/>
+      </w:pPr>
+      <w:r>
+        <w:t>19th of June</w:t>
+      </w:r>
+    </w:p>
+    <w:p>
+      <w:pPr>
+        <w:pStyle w:val="ListParagraph"/>
+        <w:numPr>
+          <w:ilvl w:val="0"/>
+          <w:numId w:val="22"/>
+        </w:numPr>
+      </w:pPr>
+      <w:r>
+        <w:t>Started development on main game</w:t>
+      </w:r>
+    </w:p>
+    <w:p>
+      <w:pPr>
+        <w:pStyle w:val="ListParagraph"/>
+        <w:numPr>
+          <w:ilvl w:val="1"/>
+          <w:numId w:val="22"/>
+        </w:numPr>
+      </w:pPr>
+      <w:r>
+        <w:t>Continued to</w:t>
+      </w:r>
+      <w:r>
+        <w:t xml:space="preserve"> design HUD</w:t>
+      </w:r>
+    </w:p>
+    <w:p>
+      <w:pPr>
+        <w:pStyle w:val="ListParagraph"/>
+        <w:numPr>
+          <w:ilvl w:val="0"/>
+          <w:numId w:val="22"/>
+        </w:numPr>
+      </w:pPr>
+      <w:r>
+        <w:t>Begin working on Algorithm</w:t>
+      </w:r>
+    </w:p>
+    <w:p>
+      <w:pPr>
+        <w:pStyle w:val="ListParagraph"/>
+        <w:numPr>
+          <w:ilvl w:val="0"/>
+          <w:numId w:val="22"/>
+        </w:numPr>
+      </w:pPr>
+      <w:r>
+        <w:t>Gantt Chart Progress check</w:t>
+      </w:r>
+    </w:p>
+    <w:p>
+      <w:pPr>
+        <w:pStyle w:val="ListParagraph"/>
+        <w:numPr>
+          <w:ilvl w:val="1"/>
+          <w:numId w:val="22"/>
+        </w:numPr>
+      </w:pPr>
+      <w:r>
+        <w:t>Algorithm</w:t>
+      </w:r>
+    </w:p>
+    <w:p>
+      <w:pPr>
+        <w:pStyle w:val="ListParagraph"/>
+        <w:numPr>
+          <w:ilvl w:val="2"/>
+          <w:numId w:val="22"/>
+        </w:numPr>
+      </w:pPr>
+      <w:r>
+        <w:t>On course</w:t>
+      </w:r>
+    </w:p>
+    <w:p>
+      <w:pPr>
+        <w:pStyle w:val="ListParagraph"/>
+        <w:numPr>
+          <w:ilvl w:val="1"/>
+          <w:numId w:val="22"/>
+        </w:numPr>
+      </w:pPr>
+      <w:r>
+        <w:t>Documentation</w:t>
+      </w:r>
+    </w:p>
+    <w:p>
+      <w:pPr>
+        <w:pStyle w:val="ListParagraph"/>
+        <w:numPr>
+          <w:ilvl w:val="2"/>
+          <w:numId w:val="22"/>
+        </w:numPr>
+      </w:pPr>
+      <w:r>
+        <w:t>User Manual</w:t>
+      </w:r>
+    </w:p>
+    <w:p>
+      <w:pPr>
+        <w:pStyle w:val="ListParagraph"/>
+        <w:numPr>
+          <w:ilvl w:val="3"/>
+          <w:numId w:val="22"/>
+        </w:numPr>
+      </w:pPr>
+      <w:r>
+        <w:t>On Course</w:t>
+      </w:r>
+    </w:p>
+    <w:p>
+      <w:pPr>
+        <w:pStyle w:val="ListParagraph"/>
+        <w:numPr>
+          <w:ilvl w:val="1"/>
+          <w:numId w:val="22"/>
+        </w:numPr>
+      </w:pPr>
+      <w:r>
+        <w:t>Coding</w:t>
+      </w:r>
+    </w:p>
+    <w:p>
+      <w:pPr>
+        <w:pStyle w:val="ListParagraph"/>
+        <w:numPr>
+          <w:ilvl w:val="2"/>
+          <w:numId w:val="22"/>
+        </w:numPr>
+      </w:pPr>
+      <w:r>
+        <w:t>On Course</w:t>
+      </w:r>
+    </w:p>
+    <w:p>
+      <w:pPr>
+        <w:pStyle w:val="ListParagraph"/>
+        <w:numPr>
+          <w:ilvl w:val="0"/>
+          <w:numId w:val="22"/>
+        </w:numPr>
+      </w:pPr>
+      <w:r>
+        <w:rPr>
+          <w:lang w:val="en-US"/>
+        </w:rPr>
+        <w:t>Additional task tomorrow</w:t>
+      </w:r>
+    </w:p>
+    <w:p>
+      <w:pPr>
+        <w:pStyle w:val="ListParagraph"/>
+        <w:numPr>
+          <w:ilvl w:val="1"/>
+          <w:numId w:val="22"/>
+        </w:numPr>
+      </w:pPr>
+      <w:r>
+        <w:t xml:space="preserve">Continue learning </w:t>
+      </w:r>
+      <w:r>
+        <w:tab/>
+      </w:r>
+    </w:p>
     <w:p/>
     <w:sectPr>
       <w:footerReference w:type="default" r:id="rId44"/>
-      <w:pgSz w:w="12240" w:h="15840" w:orient="portrait"/>
+      <w:pgSz w:w="12240" w:h="15840"/>
       <w:pgMar w:top="1440" w:right="1440" w:bottom="1440" w:left="1440" w:header="720" w:footer="720" w:gutter="0"/>
       <w:pgNumType w:start="1"/>
       <w:cols w:space="720"/>
@@ -12169,7 +12350,7 @@
 </file>
 
 <file path=word/endnotes.xml><?xml version="1.0" encoding="utf-8"?>
-<w:endnotes xmlns:wpc="http://schemas.microsoft.com/office/word/2010/wordprocessingCanvas" xmlns:cx="http://schemas.microsoft.com/office/drawing/2014/chartex" xmlns:cx1="http://schemas.microsoft.com/office/drawing/2015/9/8/chartex" xmlns:cx2="http://schemas.microsoft.com/office/drawing/2015/10/21/chartex" xmlns:cx3="http://schemas.microsoft.com/office/drawing/2016/5/9/chartex" xmlns:cx4="http://schemas.microsoft.com/office/drawing/2016/5/10/chartex" xmlns:cx5="http://schemas.microsoft.com/office/drawing/2016/5/11/chartex" xmlns:cx6="http://schemas.microsoft.com/office/drawing/2016/5/12/chartex" xmlns:cx7="http://schemas.microsoft.com/office/drawing/2016/5/13/chartex" xmlns:cx8="http://schemas.microsoft.com/office/drawing/2016/5/14/chartex" xmlns:mc="http://schemas.openxmlformats.org/markup-compatibility/2006" xmlns:aink="http://schemas.microsoft.com/office/drawing/2016/ink" xmlns:am3d="http://schemas.microsoft.com/office/drawing/2017/model3d" xmlns:o="urn:schemas-microsoft-com:office:office" xmlns:oel="http://schemas.microsoft.com/office/2019/extlst" xmlns:r="http://schemas.openxmlformats.org/officeDocument/2006/relationships" xmlns:m="http://schemas.openxmlformats.org/officeDocument/2006/math" xmlns:v="urn:schemas-microsoft-com:vml" xmlns:wp14="http://schemas.microsoft.com/office/word/2010/wordprocessingDrawing" xmlns:wp="http://schemas.openxmlformats.org/drawingml/2006/wordprocessingDrawing" xmlns:w10="urn:schemas-microsoft-com:office:word" xmlns:w="http://schemas.openxmlformats.org/wordprocessingml/2006/main" xmlns:w14="http://schemas.microsoft.com/office/word/2010/wordml" xmlns:w15="http://schemas.microsoft.com/office/word/2012/wordml" xmlns:w16cex="http://schemas.microsoft.com/office/word/2018/wordml/cex" xmlns:w16cid="http://schemas.microsoft.com/office/word/2016/wordml/cid" xmlns:w16="http://schemas.microsoft.com/office/word/2018/wordml" xmlns:w16sdtdh="http://schemas.microsoft.com/office/word/2020/wordml/sdtdatahash" xmlns:w16se="http://schemas.microsoft.com/office/word/2015/wordml/symex" xmlns:wpg="http://schemas.microsoft.com/office/word/2010/wordprocessingGroup" xmlns:wpi="http://schemas.microsoft.com/office/word/2010/wordprocessingInk" xmlns:wne="http://schemas.microsoft.com/office/word/2006/wordml" xmlns:wps="http://schemas.microsoft.com/office/word/2010/wordprocessingShape" mc:Ignorable="w14 w15 w16se w16cid w16 w16cex w16sdtdh wp14">
+<w:endnotes xmlns:wpc="http://schemas.microsoft.com/office/word/2010/wordprocessingCanvas" xmlns:cx="http://schemas.microsoft.com/office/drawing/2014/chartex" xmlns:cx1="http://schemas.microsoft.com/office/drawing/2015/9/8/chartex" xmlns:cx2="http://schemas.microsoft.com/office/drawing/2015/10/21/chartex" xmlns:cx3="http://schemas.microsoft.com/office/drawing/2016/5/9/chartex" xmlns:cx4="http://schemas.microsoft.com/office/drawing/2016/5/10/chartex" xmlns:cx5="http://schemas.microsoft.com/office/drawing/2016/5/11/chartex" xmlns:cx6="http://schemas.microsoft.com/office/drawing/2016/5/12/chartex" xmlns:cx7="http://schemas.microsoft.com/office/drawing/2016/5/13/chartex" xmlns:cx8="http://schemas.microsoft.com/office/drawing/2016/5/14/chartex" xmlns:mc="http://schemas.openxmlformats.org/markup-compatibility/2006" xmlns:aink="http://schemas.microsoft.com/office/drawing/2016/ink" xmlns:am3d="http://schemas.microsoft.com/office/drawing/2017/model3d" xmlns:o="urn:schemas-microsoft-com:office:office" xmlns:oel="http://schemas.microsoft.com/office/2019/extlst" xmlns:r="http://schemas.openxmlformats.org/officeDocument/2006/relationships" xmlns:m="http://schemas.openxmlformats.org/officeDocument/2006/math" xmlns:v="urn:schemas-microsoft-com:vml" xmlns:wp14="http://schemas.microsoft.com/office/word/2010/wordprocessingDrawing" xmlns:wp="http://schemas.openxmlformats.org/drawingml/2006/wordprocessingDrawing" xmlns:w10="urn:schemas-microsoft-com:office:word" xmlns:w="http://schemas.openxmlformats.org/wordprocessingml/2006/main" xmlns:w14="http://schemas.microsoft.com/office/word/2010/wordml" xmlns:w15="http://schemas.microsoft.com/office/word/2012/wordml" xmlns:w16cex="http://schemas.microsoft.com/office/word/2018/wordml/cex" xmlns:w16cid="http://schemas.microsoft.com/office/word/2016/wordml/cid" xmlns:w16="http://schemas.microsoft.com/office/word/2018/wordml" xmlns:w16du="http://schemas.microsoft.com/office/word/2023/wordml/word16du" xmlns:w16sdtdh="http://schemas.microsoft.com/office/word/2020/wordml/sdtdatahash" xmlns:w16se="http://schemas.microsoft.com/office/word/2015/wordml/symex" xmlns:wpg="http://schemas.microsoft.com/office/word/2010/wordprocessingGroup" xmlns:wpi="http://schemas.microsoft.com/office/word/2010/wordprocessingInk" xmlns:wne="http://schemas.microsoft.com/office/word/2006/wordml" xmlns:wps="http://schemas.microsoft.com/office/word/2010/wordprocessingShape" mc:Ignorable="w14 w15 w16se w16cid w16 w16cex w16sdtdh w16du wp14">
   <w:endnote w:type="separator" w:id="-1">
     <w:p>
       <w:pPr>
@@ -12194,7 +12375,7 @@
 </file>
 
 <file path=word/footer1.xml><?xml version="1.0" encoding="utf-8"?>
-<w:ftr xmlns:wpc="http://schemas.microsoft.com/office/word/2010/wordprocessingCanvas" xmlns:cx="http://schemas.microsoft.com/office/drawing/2014/chartex" xmlns:cx1="http://schemas.microsoft.com/office/drawing/2015/9/8/chartex" xmlns:cx2="http://schemas.microsoft.com/office/drawing/2015/10/21/chartex" xmlns:cx3="http://schemas.microsoft.com/office/drawing/2016/5/9/chartex" xmlns:cx4="http://schemas.microsoft.com/office/drawing/2016/5/10/chartex" xmlns:cx5="http://schemas.microsoft.com/office/drawing/2016/5/11/chartex" xmlns:cx6="http://schemas.microsoft.com/office/drawing/2016/5/12/chartex" xmlns:cx7="http://schemas.microsoft.com/office/drawing/2016/5/13/chartex" xmlns:cx8="http://schemas.microsoft.com/office/drawing/2016/5/14/chartex" xmlns:mc="http://schemas.openxmlformats.org/markup-compatibility/2006" xmlns:aink="http://schemas.microsoft.com/office/drawing/2016/ink" xmlns:am3d="http://schemas.microsoft.com/office/drawing/2017/model3d" xmlns:o="urn:schemas-microsoft-com:office:office" xmlns:oel="http://schemas.microsoft.com/office/2019/extlst" xmlns:r="http://schemas.openxmlformats.org/officeDocument/2006/relationships" xmlns:m="http://schemas.openxmlformats.org/officeDocument/2006/math" xmlns:v="urn:schemas-microsoft-com:vml" xmlns:wp14="http://schemas.microsoft.com/office/word/2010/wordprocessingDrawing" xmlns:wp="http://schemas.openxmlformats.org/drawingml/2006/wordprocessingDrawing" xmlns:w10="urn:schemas-microsoft-com:office:word" xmlns:w="http://schemas.openxmlformats.org/wordprocessingml/2006/main" xmlns:w14="http://schemas.microsoft.com/office/word/2010/wordml" xmlns:w15="http://schemas.microsoft.com/office/word/2012/wordml" xmlns:w16cex="http://schemas.microsoft.com/office/word/2018/wordml/cex" xmlns:w16cid="http://schemas.microsoft.com/office/word/2016/wordml/cid" xmlns:w16="http://schemas.microsoft.com/office/word/2018/wordml" xmlns:w16sdtdh="http://schemas.microsoft.com/office/word/2020/wordml/sdtdatahash" xmlns:w16se="http://schemas.microsoft.com/office/word/2015/wordml/symex" xmlns:wpg="http://schemas.microsoft.com/office/word/2010/wordprocessingGroup" xmlns:wpi="http://schemas.microsoft.com/office/word/2010/wordprocessingInk" xmlns:wne="http://schemas.microsoft.com/office/word/2006/wordml" xmlns:wps="http://schemas.microsoft.com/office/word/2010/wordprocessingShape" mc:Ignorable="w14 w15 w16se w16cid w16 w16cex w16sdtdh wp14">
+<w:ftr xmlns:wpc="http://schemas.microsoft.com/office/word/2010/wordprocessingCanvas" xmlns:cx="http://schemas.microsoft.com/office/drawing/2014/chartex" xmlns:cx1="http://schemas.microsoft.com/office/drawing/2015/9/8/chartex" xmlns:cx2="http://schemas.microsoft.com/office/drawing/2015/10/21/chartex" xmlns:cx3="http://schemas.microsoft.com/office/drawing/2016/5/9/chartex" xmlns:cx4="http://schemas.microsoft.com/office/drawing/2016/5/10/chartex" xmlns:cx5="http://schemas.microsoft.com/office/drawing/2016/5/11/chartex" xmlns:cx6="http://schemas.microsoft.com/office/drawing/2016/5/12/chartex" xmlns:cx7="http://schemas.microsoft.com/office/drawing/2016/5/13/chartex" xmlns:cx8="http://schemas.microsoft.com/office/drawing/2016/5/14/chartex" xmlns:mc="http://schemas.openxmlformats.org/markup-compatibility/2006" xmlns:aink="http://schemas.microsoft.com/office/drawing/2016/ink" xmlns:am3d="http://schemas.microsoft.com/office/drawing/2017/model3d" xmlns:o="urn:schemas-microsoft-com:office:office" xmlns:oel="http://schemas.microsoft.com/office/2019/extlst" xmlns:r="http://schemas.openxmlformats.org/officeDocument/2006/relationships" xmlns:m="http://schemas.openxmlformats.org/officeDocument/2006/math" xmlns:v="urn:schemas-microsoft-com:vml" xmlns:wp14="http://schemas.microsoft.com/office/word/2010/wordprocessingDrawing" xmlns:wp="http://schemas.openxmlformats.org/drawingml/2006/wordprocessingDrawing" xmlns:w10="urn:schemas-microsoft-com:office:word" xmlns:w="http://schemas.openxmlformats.org/wordprocessingml/2006/main" xmlns:w14="http://schemas.microsoft.com/office/word/2010/wordml" xmlns:w15="http://schemas.microsoft.com/office/word/2012/wordml" xmlns:w16cex="http://schemas.microsoft.com/office/word/2018/wordml/cex" xmlns:w16cid="http://schemas.microsoft.com/office/word/2016/wordml/cid" xmlns:w16="http://schemas.microsoft.com/office/word/2018/wordml" xmlns:w16du="http://schemas.microsoft.com/office/word/2023/wordml/word16du" xmlns:w16sdtdh="http://schemas.microsoft.com/office/word/2020/wordml/sdtdatahash" xmlns:w16se="http://schemas.microsoft.com/office/word/2015/wordml/symex" xmlns:wpg="http://schemas.microsoft.com/office/word/2010/wordprocessingGroup" xmlns:wpi="http://schemas.microsoft.com/office/word/2010/wordprocessingInk" xmlns:wne="http://schemas.microsoft.com/office/word/2006/wordml" xmlns:wps="http://schemas.microsoft.com/office/word/2010/wordprocessingShape" mc:Ignorable="w14 w15 w16se w16cid w16 w16cex w16sdtdh w16du wp14">
   <w:sdt>
     <w:sdtPr>
       <w:id w:val="229504265"/>
@@ -12249,7 +12430,7 @@
 </file>
 
 <file path=word/footnotes.xml><?xml version="1.0" encoding="utf-8"?>
-<w:footnotes xmlns:wpc="http://schemas.microsoft.com/office/word/2010/wordprocessingCanvas" xmlns:cx="http://schemas.microsoft.com/office/drawing/2014/chartex" xmlns:cx1="http://schemas.microsoft.com/office/drawing/2015/9/8/chartex" xmlns:cx2="http://schemas.microsoft.com/office/drawing/2015/10/21/chartex" xmlns:cx3="http://schemas.microsoft.com/office/drawing/2016/5/9/chartex" xmlns:cx4="http://schemas.microsoft.com/office/drawing/2016/5/10/chartex" xmlns:cx5="http://schemas.microsoft.com/office/drawing/2016/5/11/chartex" xmlns:cx6="http://schemas.microsoft.com/office/drawing/2016/5/12/chartex" xmlns:cx7="http://schemas.microsoft.com/office/drawing/2016/5/13/chartex" xmlns:cx8="http://schemas.microsoft.com/office/drawing/2016/5/14/chartex" xmlns:mc="http://schemas.openxmlformats.org/markup-compatibility/2006" xmlns:aink="http://schemas.microsoft.com/office/drawing/2016/ink" xmlns:am3d="http://schemas.microsoft.com/office/drawing/2017/model3d" xmlns:o="urn:schemas-microsoft-com:office:office" xmlns:oel="http://schemas.microsoft.com/office/2019/extlst" xmlns:r="http://schemas.openxmlformats.org/officeDocument/2006/relationships" xmlns:m="http://schemas.openxmlformats.org/officeDocument/2006/math" xmlns:v="urn:schemas-microsoft-com:vml" xmlns:wp14="http://schemas.microsoft.com/office/word/2010/wordprocessingDrawing" xmlns:wp="http://schemas.openxmlformats.org/drawingml/2006/wordprocessingDrawing" xmlns:w10="urn:schemas-microsoft-com:office:word" xmlns:w="http://schemas.openxmlformats.org/wordprocessingml/2006/main" xmlns:w14="http://schemas.microsoft.com/office/word/2010/wordml" xmlns:w15="http://schemas.microsoft.com/office/word/2012/wordml" xmlns:w16cex="http://schemas.microsoft.com/office/word/2018/wordml/cex" xmlns:w16cid="http://schemas.microsoft.com/office/word/2016/wordml/cid" xmlns:w16="http://schemas.microsoft.com/office/word/2018/wordml" xmlns:w16sdtdh="http://schemas.microsoft.com/office/word/2020/wordml/sdtdatahash" xmlns:w16se="http://schemas.microsoft.com/office/word/2015/wordml/symex" xmlns:wpg="http://schemas.microsoft.com/office/word/2010/wordprocessingGroup" xmlns:wpi="http://schemas.microsoft.com/office/word/2010/wordprocessingInk" xmlns:wne="http://schemas.microsoft.com/office/word/2006/wordml" xmlns:wps="http://schemas.microsoft.com/office/word/2010/wordprocessingShape" mc:Ignorable="w14 w15 w16se w16cid w16 w16cex w16sdtdh wp14">
+<w:footnotes xmlns:wpc="http://schemas.microsoft.com/office/word/2010/wordprocessingCanvas" xmlns:cx="http://schemas.microsoft.com/office/drawing/2014/chartex" xmlns:cx1="http://schemas.microsoft.com/office/drawing/2015/9/8/chartex" xmlns:cx2="http://schemas.microsoft.com/office/drawing/2015/10/21/chartex" xmlns:cx3="http://schemas.microsoft.com/office/drawing/2016/5/9/chartex" xmlns:cx4="http://schemas.microsoft.com/office/drawing/2016/5/10/chartex" xmlns:cx5="http://schemas.microsoft.com/office/drawing/2016/5/11/chartex" xmlns:cx6="http://schemas.microsoft.com/office/drawing/2016/5/12/chartex" xmlns:cx7="http://schemas.microsoft.com/office/drawing/2016/5/13/chartex" xmlns:cx8="http://schemas.microsoft.com/office/drawing/2016/5/14/chartex" xmlns:mc="http://schemas.openxmlformats.org/markup-compatibility/2006" xmlns:aink="http://schemas.microsoft.com/office/drawing/2016/ink" xmlns:am3d="http://schemas.microsoft.com/office/drawing/2017/model3d" xmlns:o="urn:schemas-microsoft-com:office:office" xmlns:oel="http://schemas.microsoft.com/office/2019/extlst" xmlns:r="http://schemas.openxmlformats.org/officeDocument/2006/relationships" xmlns:m="http://schemas.openxmlformats.org/officeDocument/2006/math" xmlns:v="urn:schemas-microsoft-com:vml" xmlns:wp14="http://schemas.microsoft.com/office/word/2010/wordprocessingDrawing" xmlns:wp="http://schemas.openxmlformats.org/drawingml/2006/wordprocessingDrawing" xmlns:w10="urn:schemas-microsoft-com:office:word" xmlns:w="http://schemas.openxmlformats.org/wordprocessingml/2006/main" xmlns:w14="http://schemas.microsoft.com/office/word/2010/wordml" xmlns:w15="http://schemas.microsoft.com/office/word/2012/wordml" xmlns:w16cex="http://schemas.microsoft.com/office/word/2018/wordml/cex" xmlns:w16cid="http://schemas.microsoft.com/office/word/2016/wordml/cid" xmlns:w16="http://schemas.microsoft.com/office/word/2018/wordml" xmlns:w16du="http://schemas.microsoft.com/office/word/2023/wordml/word16du" xmlns:w16sdtdh="http://schemas.microsoft.com/office/word/2020/wordml/sdtdatahash" xmlns:w16se="http://schemas.microsoft.com/office/word/2015/wordml/symex" xmlns:wpg="http://schemas.microsoft.com/office/word/2010/wordprocessingGroup" xmlns:wpi="http://schemas.microsoft.com/office/word/2010/wordprocessingInk" xmlns:wne="http://schemas.microsoft.com/office/word/2006/wordml" xmlns:wps="http://schemas.microsoft.com/office/word/2010/wordprocessingShape" mc:Ignorable="w14 w15 w16se w16cid w16 w16cex w16sdtdh w16du wp14">
   <w:footnote w:type="separator" w:id="-1">
     <w:p>
       <w:pPr>
@@ -12274,7 +12455,7 @@
 </file>
 
 <file path=word/numbering.xml><?xml version="1.0" encoding="utf-8"?>
-<w:numbering xmlns:wpc="http://schemas.microsoft.com/office/word/2010/wordprocessingCanvas" xmlns:cx="http://schemas.microsoft.com/office/drawing/2014/chartex" xmlns:cx1="http://schemas.microsoft.com/office/drawing/2015/9/8/chartex" xmlns:cx2="http://schemas.microsoft.com/office/drawing/2015/10/21/chartex" xmlns:cx3="http://schemas.microsoft.com/office/drawing/2016/5/9/chartex" xmlns:cx4="http://schemas.microsoft.com/office/drawing/2016/5/10/chartex" xmlns:cx5="http://schemas.microsoft.com/office/drawing/2016/5/11/chartex" xmlns:cx6="http://schemas.microsoft.com/office/drawing/2016/5/12/chartex" xmlns:cx7="http://schemas.microsoft.com/office/drawing/2016/5/13/chartex" xmlns:cx8="http://schemas.microsoft.com/office/drawing/2016/5/14/chartex" xmlns:mc="http://schemas.openxmlformats.org/markup-compatibility/2006" xmlns:aink="http://schemas.microsoft.com/office/drawing/2016/ink" xmlns:am3d="http://schemas.microsoft.com/office/drawing/2017/model3d" xmlns:o="urn:schemas-microsoft-com:office:office" xmlns:oel="http://schemas.microsoft.com/office/2019/extlst" xmlns:r="http://schemas.openxmlformats.org/officeDocument/2006/relationships" xmlns:m="http://schemas.openxmlformats.org/officeDocument/2006/math" xmlns:v="urn:schemas-microsoft-com:vml" xmlns:wp14="http://schemas.microsoft.com/office/word/2010/wordprocessingDrawing" xmlns:wp="http://schemas.openxmlformats.org/drawingml/2006/wordprocessingDrawing" xmlns:w10="urn:schemas-microsoft-com:office:word" xmlns:w="http://schemas.openxmlformats.org/wordprocessingml/2006/main" xmlns:w14="http://schemas.microsoft.com/office/word/2010/wordml" xmlns:w15="http://schemas.microsoft.com/office/word/2012/wordml" xmlns:w16cex="http://schemas.microsoft.com/office/word/2018/wordml/cex" xmlns:w16cid="http://schemas.microsoft.com/office/word/2016/wordml/cid" xmlns:w16="http://schemas.microsoft.com/office/word/2018/wordml" xmlns:w16sdtdh="http://schemas.microsoft.com/office/word/2020/wordml/sdtdatahash" xmlns:w16se="http://schemas.microsoft.com/office/word/2015/wordml/symex" xmlns:wpg="http://schemas.microsoft.com/office/word/2010/wordprocessingGroup" xmlns:wpi="http://schemas.microsoft.com/office/word/2010/wordprocessingInk" xmlns:wne="http://schemas.microsoft.com/office/word/2006/wordml" xmlns:wps="http://schemas.microsoft.com/office/word/2010/wordprocessingShape" mc:Ignorable="w14 w15 w16se w16cid w16 w16cex w16sdtdh wp14">
+<w:numbering xmlns:wpc="http://schemas.microsoft.com/office/word/2010/wordprocessingCanvas" xmlns:cx="http://schemas.microsoft.com/office/drawing/2014/chartex" xmlns:cx1="http://schemas.microsoft.com/office/drawing/2015/9/8/chartex" xmlns:cx2="http://schemas.microsoft.com/office/drawing/2015/10/21/chartex" xmlns:cx3="http://schemas.microsoft.com/office/drawing/2016/5/9/chartex" xmlns:cx4="http://schemas.microsoft.com/office/drawing/2016/5/10/chartex" xmlns:cx5="http://schemas.microsoft.com/office/drawing/2016/5/11/chartex" xmlns:cx6="http://schemas.microsoft.com/office/drawing/2016/5/12/chartex" xmlns:cx7="http://schemas.microsoft.com/office/drawing/2016/5/13/chartex" xmlns:cx8="http://schemas.microsoft.com/office/drawing/2016/5/14/chartex" xmlns:mc="http://schemas.openxmlformats.org/markup-compatibility/2006" xmlns:aink="http://schemas.microsoft.com/office/drawing/2016/ink" xmlns:am3d="http://schemas.microsoft.com/office/drawing/2017/model3d" xmlns:o="urn:schemas-microsoft-com:office:office" xmlns:oel="http://schemas.microsoft.com/office/2019/extlst" xmlns:r="http://schemas.openxmlformats.org/officeDocument/2006/relationships" xmlns:m="http://schemas.openxmlformats.org/officeDocument/2006/math" xmlns:v="urn:schemas-microsoft-com:vml" xmlns:wp14="http://schemas.microsoft.com/office/word/2010/wordprocessingDrawing" xmlns:wp="http://schemas.openxmlformats.org/drawingml/2006/wordprocessingDrawing" xmlns:w10="urn:schemas-microsoft-com:office:word" xmlns:w="http://schemas.openxmlformats.org/wordprocessingml/2006/main" xmlns:w14="http://schemas.microsoft.com/office/word/2010/wordml" xmlns:w15="http://schemas.microsoft.com/office/word/2012/wordml" xmlns:w16cex="http://schemas.microsoft.com/office/word/2018/wordml/cex" xmlns:w16cid="http://schemas.microsoft.com/office/word/2016/wordml/cid" xmlns:w16="http://schemas.microsoft.com/office/word/2018/wordml" xmlns:w16du="http://schemas.microsoft.com/office/word/2023/wordml/word16du" xmlns:w16sdtdh="http://schemas.microsoft.com/office/word/2020/wordml/sdtdatahash" xmlns:w16se="http://schemas.microsoft.com/office/word/2015/wordml/symex" xmlns:wpg="http://schemas.microsoft.com/office/word/2010/wordprocessingGroup" xmlns:wpi="http://schemas.microsoft.com/office/word/2010/wordprocessingInk" xmlns:wne="http://schemas.microsoft.com/office/word/2006/wordml" xmlns:wps="http://schemas.microsoft.com/office/word/2010/wordprocessingShape" mc:Ignorable="w14 w15 w16se w16cid w16 w16cex w16sdtdh w16du wp14">
   <w:abstractNum w:abstractNumId="0" w15:restartNumberingAfterBreak="0">
     <w:nsid w:val="039F1BC4"/>
     <w:multiLevelType w:val="multilevel"/>
@@ -12400,7 +12581,7 @@
         <w:ind w:left="720" w:hanging="360"/>
       </w:pPr>
       <w:rPr>
-        <w:rFonts w:hint="default" w:ascii="Symbol" w:hAnsi="Symbol" w:eastAsia="Arial" w:cs="Arial"/>
+        <w:rFonts w:ascii="Symbol" w:eastAsia="Arial" w:hAnsi="Symbol" w:cs="Arial" w:hint="default"/>
       </w:rPr>
     </w:lvl>
     <w:lvl w:ilvl="1" w:tplc="0C090003">
@@ -12412,7 +12593,7 @@
         <w:ind w:left="1440" w:hanging="360"/>
       </w:pPr>
       <w:rPr>
-        <w:rFonts w:hint="default" w:ascii="Courier New" w:hAnsi="Courier New" w:cs="Courier New"/>
+        <w:rFonts w:ascii="Courier New" w:hAnsi="Courier New" w:cs="Courier New" w:hint="default"/>
       </w:rPr>
     </w:lvl>
     <w:lvl w:ilvl="2" w:tplc="0C090005">
@@ -12424,7 +12605,7 @@
         <w:ind w:left="2160" w:hanging="360"/>
       </w:pPr>
       <w:rPr>
-        <w:rFonts w:hint="default" w:ascii="Wingdings" w:hAnsi="Wingdings"/>
+        <w:rFonts w:ascii="Wingdings" w:hAnsi="Wingdings" w:hint="default"/>
       </w:rPr>
     </w:lvl>
     <w:lvl w:ilvl="3" w:tplc="0C090001">
@@ -12436,7 +12617,7 @@
         <w:ind w:left="2880" w:hanging="360"/>
       </w:pPr>
       <w:rPr>
-        <w:rFonts w:hint="default" w:ascii="Symbol" w:hAnsi="Symbol"/>
+        <w:rFonts w:ascii="Symbol" w:hAnsi="Symbol" w:hint="default"/>
       </w:rPr>
     </w:lvl>
     <w:lvl w:ilvl="4" w:tplc="0C090003" w:tentative="1">
@@ -12448,7 +12629,7 @@
         <w:ind w:left="3600" w:hanging="360"/>
       </w:pPr>
       <w:rPr>
-        <w:rFonts w:hint="default" w:ascii="Courier New" w:hAnsi="Courier New" w:cs="Courier New"/>
+        <w:rFonts w:ascii="Courier New" w:hAnsi="Courier New" w:cs="Courier New" w:hint="default"/>
       </w:rPr>
     </w:lvl>
     <w:lvl w:ilvl="5" w:tplc="0C090005" w:tentative="1">
@@ -12460,7 +12641,7 @@
         <w:ind w:left="4320" w:hanging="360"/>
       </w:pPr>
       <w:rPr>
-        <w:rFonts w:hint="default" w:ascii="Wingdings" w:hAnsi="Wingdings"/>
+        <w:rFonts w:ascii="Wingdings" w:hAnsi="Wingdings" w:hint="default"/>
       </w:rPr>
     </w:lvl>
     <w:lvl w:ilvl="6" w:tplc="0C090001" w:tentative="1">
@@ -12472,7 +12653,7 @@
         <w:ind w:left="5040" w:hanging="360"/>
       </w:pPr>
       <w:rPr>
-        <w:rFonts w:hint="default" w:ascii="Symbol" w:hAnsi="Symbol"/>
+        <w:rFonts w:ascii="Symbol" w:hAnsi="Symbol" w:hint="default"/>
       </w:rPr>
     </w:lvl>
     <w:lvl w:ilvl="7" w:tplc="0C090003" w:tentative="1">
@@ -12484,7 +12665,7 @@
         <w:ind w:left="5760" w:hanging="360"/>
       </w:pPr>
       <w:rPr>
-        <w:rFonts w:hint="default" w:ascii="Courier New" w:hAnsi="Courier New" w:cs="Courier New"/>
+        <w:rFonts w:ascii="Courier New" w:hAnsi="Courier New" w:cs="Courier New" w:hint="default"/>
       </w:rPr>
     </w:lvl>
     <w:lvl w:ilvl="8" w:tplc="0C090005" w:tentative="1">
@@ -12496,7 +12677,7 @@
         <w:ind w:left="6480" w:hanging="360"/>
       </w:pPr>
       <w:rPr>
-        <w:rFonts w:hint="default" w:ascii="Wingdings" w:hAnsi="Wingdings"/>
+        <w:rFonts w:ascii="Wingdings" w:hAnsi="Wingdings" w:hint="default"/>
       </w:rPr>
     </w:lvl>
   </w:abstractNum>
@@ -12738,7 +12919,7 @@
         <w:ind w:left="720" w:hanging="360"/>
       </w:pPr>
       <w:rPr>
-        <w:rFonts w:hint="default" w:ascii="Symbol" w:hAnsi="Symbol" w:eastAsia="Arial" w:cs="Arial"/>
+        <w:rFonts w:ascii="Symbol" w:eastAsia="Arial" w:hAnsi="Symbol" w:cs="Arial" w:hint="default"/>
       </w:rPr>
     </w:lvl>
     <w:lvl w:ilvl="1" w:tplc="0C090003" w:tentative="1">
@@ -12750,7 +12931,7 @@
         <w:ind w:left="1440" w:hanging="360"/>
       </w:pPr>
       <w:rPr>
-        <w:rFonts w:hint="default" w:ascii="Courier New" w:hAnsi="Courier New" w:cs="Courier New"/>
+        <w:rFonts w:ascii="Courier New" w:hAnsi="Courier New" w:cs="Courier New" w:hint="default"/>
       </w:rPr>
     </w:lvl>
     <w:lvl w:ilvl="2" w:tplc="0C090005" w:tentative="1">
@@ -12762,7 +12943,7 @@
         <w:ind w:left="2160" w:hanging="360"/>
       </w:pPr>
       <w:rPr>
-        <w:rFonts w:hint="default" w:ascii="Wingdings" w:hAnsi="Wingdings"/>
+        <w:rFonts w:ascii="Wingdings" w:hAnsi="Wingdings" w:hint="default"/>
       </w:rPr>
     </w:lvl>
     <w:lvl w:ilvl="3" w:tplc="0C090001" w:tentative="1">
@@ -12774,7 +12955,7 @@
         <w:ind w:left="2880" w:hanging="360"/>
       </w:pPr>
       <w:rPr>
-        <w:rFonts w:hint="default" w:ascii="Symbol" w:hAnsi="Symbol"/>
+        <w:rFonts w:ascii="Symbol" w:hAnsi="Symbol" w:hint="default"/>
       </w:rPr>
     </w:lvl>
     <w:lvl w:ilvl="4" w:tplc="0C090003" w:tentative="1">
@@ -12786,7 +12967,7 @@
         <w:ind w:left="3600" w:hanging="360"/>
       </w:pPr>
       <w:rPr>
-        <w:rFonts w:hint="default" w:ascii="Courier New" w:hAnsi="Courier New" w:cs="Courier New"/>
+        <w:rFonts w:ascii="Courier New" w:hAnsi="Courier New" w:cs="Courier New" w:hint="default"/>
       </w:rPr>
     </w:lvl>
     <w:lvl w:ilvl="5" w:tplc="0C090005" w:tentative="1">
@@ -12798,7 +12979,7 @@
         <w:ind w:left="4320" w:hanging="360"/>
       </w:pPr>
       <w:rPr>
-        <w:rFonts w:hint="default" w:ascii="Wingdings" w:hAnsi="Wingdings"/>
+        <w:rFonts w:ascii="Wingdings" w:hAnsi="Wingdings" w:hint="default"/>
       </w:rPr>
     </w:lvl>
     <w:lvl w:ilvl="6" w:tplc="0C090001" w:tentative="1">
@@ -12810,7 +12991,7 @@
         <w:ind w:left="5040" w:hanging="360"/>
       </w:pPr>
       <w:rPr>
-        <w:rFonts w:hint="default" w:ascii="Symbol" w:hAnsi="Symbol"/>
+        <w:rFonts w:ascii="Symbol" w:hAnsi="Symbol" w:hint="default"/>
       </w:rPr>
     </w:lvl>
     <w:lvl w:ilvl="7" w:tplc="0C090003" w:tentative="1">
@@ -12822,7 +13003,7 @@
         <w:ind w:left="5760" w:hanging="360"/>
       </w:pPr>
       <w:rPr>
-        <w:rFonts w:hint="default" w:ascii="Courier New" w:hAnsi="Courier New" w:cs="Courier New"/>
+        <w:rFonts w:ascii="Courier New" w:hAnsi="Courier New" w:cs="Courier New" w:hint="default"/>
       </w:rPr>
     </w:lvl>
     <w:lvl w:ilvl="8" w:tplc="0C090005" w:tentative="1">
@@ -12834,7 +13015,7 @@
         <w:ind w:left="6480" w:hanging="360"/>
       </w:pPr>
       <w:rPr>
-        <w:rFonts w:hint="default" w:ascii="Wingdings" w:hAnsi="Wingdings"/>
+        <w:rFonts w:ascii="Wingdings" w:hAnsi="Wingdings" w:hint="default"/>
       </w:rPr>
     </w:lvl>
   </w:abstractNum>
@@ -13517,6 +13698,92 @@
     </w:lvl>
   </w:abstractNum>
   <w:abstractNum w:abstractNumId="11" w15:restartNumberingAfterBreak="0">
+    <w:nsid w:val="458B212A"/>
+    <w:multiLevelType w:val="hybridMultilevel"/>
+    <w:tmpl w:val="15C47B12"/>
+    <w:lvl w:ilvl="0" w:tplc="0C09000F">
+      <w:start w:val="1"/>
+      <w:numFmt w:val="decimal"/>
+      <w:lvlText w:val="%1."/>
+      <w:lvlJc w:val="left"/>
+      <w:pPr>
+        <w:ind w:left="720" w:hanging="360"/>
+      </w:pPr>
+    </w:lvl>
+    <w:lvl w:ilvl="1" w:tplc="0C090019" w:tentative="1">
+      <w:start w:val="1"/>
+      <w:numFmt w:val="lowerLetter"/>
+      <w:lvlText w:val="%2."/>
+      <w:lvlJc w:val="left"/>
+      <w:pPr>
+        <w:ind w:left="1440" w:hanging="360"/>
+      </w:pPr>
+    </w:lvl>
+    <w:lvl w:ilvl="2" w:tplc="0C09001B" w:tentative="1">
+      <w:start w:val="1"/>
+      <w:numFmt w:val="lowerRoman"/>
+      <w:lvlText w:val="%3."/>
+      <w:lvlJc w:val="right"/>
+      <w:pPr>
+        <w:ind w:left="2160" w:hanging="180"/>
+      </w:pPr>
+    </w:lvl>
+    <w:lvl w:ilvl="3" w:tplc="0C09000F" w:tentative="1">
+      <w:start w:val="1"/>
+      <w:numFmt w:val="decimal"/>
+      <w:lvlText w:val="%4."/>
+      <w:lvlJc w:val="left"/>
+      <w:pPr>
+        <w:ind w:left="2880" w:hanging="360"/>
+      </w:pPr>
+    </w:lvl>
+    <w:lvl w:ilvl="4" w:tplc="0C090019" w:tentative="1">
+      <w:start w:val="1"/>
+      <w:numFmt w:val="lowerLetter"/>
+      <w:lvlText w:val="%5."/>
+      <w:lvlJc w:val="left"/>
+      <w:pPr>
+        <w:ind w:left="3600" w:hanging="360"/>
+      </w:pPr>
+    </w:lvl>
+    <w:lvl w:ilvl="5" w:tplc="0C09001B" w:tentative="1">
+      <w:start w:val="1"/>
+      <w:numFmt w:val="lowerRoman"/>
+      <w:lvlText w:val="%6."/>
+      <w:lvlJc w:val="right"/>
+      <w:pPr>
+        <w:ind w:left="4320" w:hanging="180"/>
+      </w:pPr>
+    </w:lvl>
+    <w:lvl w:ilvl="6" w:tplc="0C09000F" w:tentative="1">
+      <w:start w:val="1"/>
+      <w:numFmt w:val="decimal"/>
+      <w:lvlText w:val="%7."/>
+      <w:lvlJc w:val="left"/>
+      <w:pPr>
+        <w:ind w:left="5040" w:hanging="360"/>
+      </w:pPr>
+    </w:lvl>
+    <w:lvl w:ilvl="7" w:tplc="0C090019" w:tentative="1">
+      <w:start w:val="1"/>
+      <w:numFmt w:val="lowerLetter"/>
+      <w:lvlText w:val="%8."/>
+      <w:lvlJc w:val="left"/>
+      <w:pPr>
+        <w:ind w:left="5760" w:hanging="360"/>
+      </w:pPr>
+    </w:lvl>
+    <w:lvl w:ilvl="8" w:tplc="0C09001B" w:tentative="1">
+      <w:start w:val="1"/>
+      <w:numFmt w:val="lowerRoman"/>
+      <w:lvlText w:val="%9."/>
+      <w:lvlJc w:val="right"/>
+      <w:pPr>
+        <w:ind w:left="6480" w:hanging="180"/>
+      </w:pPr>
+    </w:lvl>
+  </w:abstractNum>
+  <w:abstractNum w:abstractNumId="12" w15:restartNumberingAfterBreak="0">
     <w:nsid w:val="46863AB3"/>
     <w:multiLevelType w:val="multilevel"/>
     <w:tmpl w:val="6EBCC356"/>
@@ -13629,7 +13896,7 @@
       </w:rPr>
     </w:lvl>
   </w:abstractNum>
-  <w:abstractNum w:abstractNumId="12" w15:restartNumberingAfterBreak="0">
+  <w:abstractNum w:abstractNumId="13" w15:restartNumberingAfterBreak="0">
     <w:nsid w:val="46C11695"/>
     <w:multiLevelType w:val="multilevel"/>
     <w:tmpl w:val="F3BE4E7E"/>
@@ -13742,7 +14009,7 @@
       </w:rPr>
     </w:lvl>
   </w:abstractNum>
-  <w:abstractNum w:abstractNumId="13" w15:restartNumberingAfterBreak="0">
+  <w:abstractNum w:abstractNumId="14" w15:restartNumberingAfterBreak="0">
     <w:nsid w:val="525A0FF4"/>
     <w:multiLevelType w:val="multilevel"/>
     <w:tmpl w:val="8C96C89E"/>
@@ -13855,7 +14122,7 @@
       </w:rPr>
     </w:lvl>
   </w:abstractNum>
-  <w:abstractNum w:abstractNumId="14" w15:restartNumberingAfterBreak="0">
+  <w:abstractNum w:abstractNumId="15" w15:restartNumberingAfterBreak="0">
     <w:nsid w:val="52E27C4E"/>
     <w:multiLevelType w:val="multilevel"/>
     <w:tmpl w:val="1F1E4868"/>
@@ -13968,7 +14235,7 @@
       </w:rPr>
     </w:lvl>
   </w:abstractNum>
-  <w:abstractNum w:abstractNumId="15" w15:restartNumberingAfterBreak="0">
+  <w:abstractNum w:abstractNumId="16" w15:restartNumberingAfterBreak="0">
     <w:nsid w:val="57DB4735"/>
     <w:multiLevelType w:val="multilevel"/>
     <w:tmpl w:val="1C34640C"/>
@@ -14081,7 +14348,7 @@
       </w:rPr>
     </w:lvl>
   </w:abstractNum>
-  <w:abstractNum w:abstractNumId="16" w15:restartNumberingAfterBreak="0">
+  <w:abstractNum w:abstractNumId="17" w15:restartNumberingAfterBreak="0">
     <w:nsid w:val="62CF7895"/>
     <w:multiLevelType w:val="multilevel"/>
     <w:tmpl w:val="895E722C"/>
@@ -14194,7 +14461,7 @@
       </w:rPr>
     </w:lvl>
   </w:abstractNum>
-  <w:abstractNum w:abstractNumId="17" w15:restartNumberingAfterBreak="0">
+  <w:abstractNum w:abstractNumId="18" w15:restartNumberingAfterBreak="0">
     <w:nsid w:val="6A952F0A"/>
     <w:multiLevelType w:val="hybridMultilevel"/>
     <w:tmpl w:val="B85E69FA"/>
@@ -14206,7 +14473,7 @@
         <w:ind w:left="720" w:hanging="360"/>
       </w:pPr>
       <w:rPr>
-        <w:rFonts w:hint="default" w:ascii="Symbol" w:hAnsi="Symbol" w:eastAsia="Arial" w:cs="Arial"/>
+        <w:rFonts w:ascii="Symbol" w:eastAsia="Arial" w:hAnsi="Symbol" w:cs="Arial" w:hint="default"/>
       </w:rPr>
     </w:lvl>
     <w:lvl w:ilvl="1" w:tplc="0C090003">
@@ -14218,7 +14485,7 @@
         <w:ind w:left="1440" w:hanging="360"/>
       </w:pPr>
       <w:rPr>
-        <w:rFonts w:hint="default" w:ascii="Courier New" w:hAnsi="Courier New" w:cs="Courier New"/>
+        <w:rFonts w:ascii="Courier New" w:hAnsi="Courier New" w:cs="Courier New" w:hint="default"/>
       </w:rPr>
     </w:lvl>
     <w:lvl w:ilvl="2" w:tplc="0C090005">
@@ -14230,7 +14497,7 @@
         <w:ind w:left="2160" w:hanging="360"/>
       </w:pPr>
       <w:rPr>
-        <w:rFonts w:hint="default" w:ascii="Wingdings" w:hAnsi="Wingdings"/>
+        <w:rFonts w:ascii="Wingdings" w:hAnsi="Wingdings" w:hint="default"/>
       </w:rPr>
     </w:lvl>
     <w:lvl w:ilvl="3" w:tplc="0C090001">
@@ -14242,7 +14509,7 @@
         <w:ind w:left="2880" w:hanging="360"/>
       </w:pPr>
       <w:rPr>
-        <w:rFonts w:hint="default" w:ascii="Symbol" w:hAnsi="Symbol"/>
+        <w:rFonts w:ascii="Symbol" w:hAnsi="Symbol" w:hint="default"/>
       </w:rPr>
     </w:lvl>
     <w:lvl w:ilvl="4" w:tplc="0C090003">
@@ -14254,7 +14521,7 @@
         <w:ind w:left="3600" w:hanging="360"/>
       </w:pPr>
       <w:rPr>
-        <w:rFonts w:hint="default" w:ascii="Courier New" w:hAnsi="Courier New" w:cs="Courier New"/>
+        <w:rFonts w:ascii="Courier New" w:hAnsi="Courier New" w:cs="Courier New" w:hint="default"/>
       </w:rPr>
     </w:lvl>
     <w:lvl w:ilvl="5" w:tplc="0C090005" w:tentative="1">
@@ -14266,7 +14533,7 @@
         <w:ind w:left="4320" w:hanging="360"/>
       </w:pPr>
       <w:rPr>
-        <w:rFonts w:hint="default" w:ascii="Wingdings" w:hAnsi="Wingdings"/>
+        <w:rFonts w:ascii="Wingdings" w:hAnsi="Wingdings" w:hint="default"/>
       </w:rPr>
     </w:lvl>
     <w:lvl w:ilvl="6" w:tplc="0C090001" w:tentative="1">
@@ -14278,7 +14545,7 @@
         <w:ind w:left="5040" w:hanging="360"/>
       </w:pPr>
       <w:rPr>
-        <w:rFonts w:hint="default" w:ascii="Symbol" w:hAnsi="Symbol"/>
+        <w:rFonts w:ascii="Symbol" w:hAnsi="Symbol" w:hint="default"/>
       </w:rPr>
     </w:lvl>
     <w:lvl w:ilvl="7" w:tplc="0C090003" w:tentative="1">
@@ -14290,7 +14557,7 @@
         <w:ind w:left="5760" w:hanging="360"/>
       </w:pPr>
       <w:rPr>
-        <w:rFonts w:hint="default" w:ascii="Courier New" w:hAnsi="Courier New" w:cs="Courier New"/>
+        <w:rFonts w:ascii="Courier New" w:hAnsi="Courier New" w:cs="Courier New" w:hint="default"/>
       </w:rPr>
     </w:lvl>
     <w:lvl w:ilvl="8" w:tplc="0C090005" w:tentative="1">
@@ -14302,11 +14569,11 @@
         <w:ind w:left="6480" w:hanging="360"/>
       </w:pPr>
       <w:rPr>
-        <w:rFonts w:hint="default" w:ascii="Wingdings" w:hAnsi="Wingdings"/>
+        <w:rFonts w:ascii="Wingdings" w:hAnsi="Wingdings" w:hint="default"/>
       </w:rPr>
     </w:lvl>
   </w:abstractNum>
-  <w:abstractNum w:abstractNumId="18" w15:restartNumberingAfterBreak="0">
+  <w:abstractNum w:abstractNumId="19" w15:restartNumberingAfterBreak="0">
     <w:nsid w:val="6DCB5EBC"/>
     <w:multiLevelType w:val="multilevel"/>
     <w:tmpl w:val="2F9E40A0"/>
@@ -14419,7 +14686,7 @@
       </w:rPr>
     </w:lvl>
   </w:abstractNum>
-  <w:abstractNum w:abstractNumId="19" w15:restartNumberingAfterBreak="0">
+  <w:abstractNum w:abstractNumId="20" w15:restartNumberingAfterBreak="0">
     <w:nsid w:val="74066A41"/>
     <w:multiLevelType w:val="multilevel"/>
     <w:tmpl w:val="05EA2874"/>
@@ -14532,7 +14799,7 @@
       </w:rPr>
     </w:lvl>
   </w:abstractNum>
-  <w:abstractNum w:abstractNumId="20" w15:restartNumberingAfterBreak="0">
+  <w:abstractNum w:abstractNumId="21" w15:restartNumberingAfterBreak="0">
     <w:nsid w:val="748B537A"/>
     <w:multiLevelType w:val="hybridMultilevel"/>
     <w:tmpl w:val="B0F641E8"/>
@@ -14544,7 +14811,7 @@
         <w:ind w:left="720" w:hanging="360"/>
       </w:pPr>
       <w:rPr>
-        <w:rFonts w:hint="default" w:ascii="Symbol" w:hAnsi="Symbol" w:eastAsia="Arial" w:cs="Arial"/>
+        <w:rFonts w:ascii="Symbol" w:eastAsia="Arial" w:hAnsi="Symbol" w:cs="Arial" w:hint="default"/>
       </w:rPr>
     </w:lvl>
     <w:lvl w:ilvl="1" w:tplc="0C090003" w:tentative="1">
@@ -14556,7 +14823,7 @@
         <w:ind w:left="1440" w:hanging="360"/>
       </w:pPr>
       <w:rPr>
-        <w:rFonts w:hint="default" w:ascii="Courier New" w:hAnsi="Courier New" w:cs="Courier New"/>
+        <w:rFonts w:ascii="Courier New" w:hAnsi="Courier New" w:cs="Courier New" w:hint="default"/>
       </w:rPr>
     </w:lvl>
     <w:lvl w:ilvl="2" w:tplc="0C090005" w:tentative="1">
@@ -14568,7 +14835,7 @@
         <w:ind w:left="2160" w:hanging="360"/>
       </w:pPr>
       <w:rPr>
-        <w:rFonts w:hint="default" w:ascii="Wingdings" w:hAnsi="Wingdings"/>
+        <w:rFonts w:ascii="Wingdings" w:hAnsi="Wingdings" w:hint="default"/>
       </w:rPr>
     </w:lvl>
     <w:lvl w:ilvl="3" w:tplc="0C090001" w:tentative="1">
@@ -14580,7 +14847,7 @@
         <w:ind w:left="2880" w:hanging="360"/>
       </w:pPr>
       <w:rPr>
-        <w:rFonts w:hint="default" w:ascii="Symbol" w:hAnsi="Symbol"/>
+        <w:rFonts w:ascii="Symbol" w:hAnsi="Symbol" w:hint="default"/>
       </w:rPr>
     </w:lvl>
     <w:lvl w:ilvl="4" w:tplc="0C090003" w:tentative="1">
@@ -14592,7 +14859,7 @@
         <w:ind w:left="3600" w:hanging="360"/>
       </w:pPr>
       <w:rPr>
-        <w:rFonts w:hint="default" w:ascii="Courier New" w:hAnsi="Courier New" w:cs="Courier New"/>
+        <w:rFonts w:ascii="Courier New" w:hAnsi="Courier New" w:cs="Courier New" w:hint="default"/>
       </w:rPr>
     </w:lvl>
     <w:lvl w:ilvl="5" w:tplc="0C090005" w:tentative="1">
@@ -14604,7 +14871,7 @@
         <w:ind w:left="4320" w:hanging="360"/>
       </w:pPr>
       <w:rPr>
-        <w:rFonts w:hint="default" w:ascii="Wingdings" w:hAnsi="Wingdings"/>
+        <w:rFonts w:ascii="Wingdings" w:hAnsi="Wingdings" w:hint="default"/>
       </w:rPr>
     </w:lvl>
     <w:lvl w:ilvl="6" w:tplc="0C090001" w:tentative="1">
@@ -14616,7 +14883,7 @@
         <w:ind w:left="5040" w:hanging="360"/>
       </w:pPr>
       <w:rPr>
-        <w:rFonts w:hint="default" w:ascii="Symbol" w:hAnsi="Symbol"/>
+        <w:rFonts w:ascii="Symbol" w:hAnsi="Symbol" w:hint="default"/>
       </w:rPr>
     </w:lvl>
     <w:lvl w:ilvl="7" w:tplc="0C090003" w:tentative="1">
@@ -14628,7 +14895,7 @@
         <w:ind w:left="5760" w:hanging="360"/>
       </w:pPr>
       <w:rPr>
-        <w:rFonts w:hint="default" w:ascii="Courier New" w:hAnsi="Courier New" w:cs="Courier New"/>
+        <w:rFonts w:ascii="Courier New" w:hAnsi="Courier New" w:cs="Courier New" w:hint="default"/>
       </w:rPr>
     </w:lvl>
     <w:lvl w:ilvl="8" w:tplc="0C090005" w:tentative="1">
@@ -14640,11 +14907,11 @@
         <w:ind w:left="6480" w:hanging="360"/>
       </w:pPr>
       <w:rPr>
-        <w:rFonts w:hint="default" w:ascii="Wingdings" w:hAnsi="Wingdings"/>
+        <w:rFonts w:ascii="Wingdings" w:hAnsi="Wingdings" w:hint="default"/>
       </w:rPr>
     </w:lvl>
   </w:abstractNum>
-  <w:abstractNum w:abstractNumId="21" w15:restartNumberingAfterBreak="0">
+  <w:abstractNum w:abstractNumId="22" w15:restartNumberingAfterBreak="0">
     <w:nsid w:val="7A975108"/>
     <w:multiLevelType w:val="multilevel"/>
     <w:tmpl w:val="B9B01E46"/>
@@ -14761,22 +15028,22 @@
     <w:abstractNumId w:val="10"/>
   </w:num>
   <w:num w:numId="2" w16cid:durableId="2064674119">
-    <w:abstractNumId w:val="13"/>
+    <w:abstractNumId w:val="14"/>
   </w:num>
   <w:num w:numId="3" w16cid:durableId="122844948">
     <w:abstractNumId w:val="2"/>
   </w:num>
   <w:num w:numId="4" w16cid:durableId="2131126743">
+    <w:abstractNumId w:val="16"/>
+  </w:num>
+  <w:num w:numId="5" w16cid:durableId="1705977216">
+    <w:abstractNumId w:val="22"/>
+  </w:num>
+  <w:num w:numId="6" w16cid:durableId="132842241">
     <w:abstractNumId w:val="15"/>
   </w:num>
-  <w:num w:numId="5" w16cid:durableId="1705977216">
-    <w:abstractNumId w:val="21"/>
-  </w:num>
-  <w:num w:numId="6" w16cid:durableId="132842241">
-    <w:abstractNumId w:val="14"/>
-  </w:num>
   <w:num w:numId="7" w16cid:durableId="1596472574">
-    <w:abstractNumId w:val="12"/>
+    <w:abstractNumId w:val="13"/>
   </w:num>
   <w:num w:numId="8" w16cid:durableId="1119646204">
     <w:abstractNumId w:val="6"/>
@@ -14794,13 +15061,13 @@
     <w:abstractNumId w:val="3"/>
   </w:num>
   <w:num w:numId="13" w16cid:durableId="783231217">
-    <w:abstractNumId w:val="16"/>
+    <w:abstractNumId w:val="17"/>
   </w:num>
   <w:num w:numId="14" w16cid:durableId="1615595320">
-    <w:abstractNumId w:val="11"/>
+    <w:abstractNumId w:val="12"/>
   </w:num>
   <w:num w:numId="15" w16cid:durableId="953441835">
-    <w:abstractNumId w:val="18"/>
+    <w:abstractNumId w:val="19"/>
   </w:num>
   <w:num w:numId="16" w16cid:durableId="1561474489">
     <w:abstractNumId w:val="5"/>
@@ -14809,10 +15076,10 @@
     <w:abstractNumId w:val="9"/>
   </w:num>
   <w:num w:numId="18" w16cid:durableId="1259870921">
-    <w:abstractNumId w:val="19"/>
+    <w:abstractNumId w:val="20"/>
   </w:num>
   <w:num w:numId="19" w16cid:durableId="761871948">
-    <w:abstractNumId w:val="20"/>
+    <w:abstractNumId w:val="21"/>
   </w:num>
   <w:num w:numId="20" w16cid:durableId="1795178476">
     <w:abstractNumId w:val="4"/>
@@ -14821,17 +15088,20 @@
     <w:abstractNumId w:val="1"/>
   </w:num>
   <w:num w:numId="22" w16cid:durableId="720324992">
-    <w:abstractNumId w:val="17"/>
+    <w:abstractNumId w:val="18"/>
+  </w:num>
+  <w:num w:numId="23" w16cid:durableId="255673960">
+    <w:abstractNumId w:val="11"/>
   </w:num>
 </w:numbering>
 </file>
 
 <file path=word/styles.xml><?xml version="1.0" encoding="utf-8"?>
-<w:styles xmlns:wp14="http://schemas.microsoft.com/office/word/2010/wordprocessingDrawing" xmlns:mc="http://schemas.openxmlformats.org/markup-compatibility/2006" xmlns:r="http://schemas.openxmlformats.org/officeDocument/2006/relationships" xmlns:w="http://schemas.openxmlformats.org/wordprocessingml/2006/main" xmlns:w14="http://schemas.microsoft.com/office/word/2010/wordml" xmlns:w15="http://schemas.microsoft.com/office/word/2012/wordml" xmlns:w16cex="http://schemas.microsoft.com/office/word/2018/wordml/cex" xmlns:w16cid="http://schemas.microsoft.com/office/word/2016/wordml/cid" xmlns:w16="http://schemas.microsoft.com/office/word/2018/wordml" xmlns:w16sdtdh="http://schemas.microsoft.com/office/word/2020/wordml/sdtdatahash" xmlns:w16se="http://schemas.microsoft.com/office/word/2015/wordml/symex" mc:Ignorable="w14 w15 w16se w16cid w16 w16cex w16sdtdh wp14">
+<w:styles xmlns:mc="http://schemas.openxmlformats.org/markup-compatibility/2006" xmlns:r="http://schemas.openxmlformats.org/officeDocument/2006/relationships" xmlns:w="http://schemas.openxmlformats.org/wordprocessingml/2006/main" xmlns:w14="http://schemas.microsoft.com/office/word/2010/wordml" xmlns:w15="http://schemas.microsoft.com/office/word/2012/wordml" xmlns:w16cex="http://schemas.microsoft.com/office/word/2018/wordml/cex" xmlns:w16cid="http://schemas.microsoft.com/office/word/2016/wordml/cid" xmlns:w16="http://schemas.microsoft.com/office/word/2018/wordml" xmlns:w16du="http://schemas.microsoft.com/office/word/2023/wordml/word16du" xmlns:w16sdtdh="http://schemas.microsoft.com/office/word/2020/wordml/sdtdatahash" xmlns:w16se="http://schemas.microsoft.com/office/word/2015/wordml/symex" mc:Ignorable="w14 w15 w16se w16cid w16 w16cex w16sdtdh w16du">
   <w:docDefaults>
     <w:rPrDefault>
       <w:rPr>
-        <w:rFonts w:ascii="Arial" w:hAnsi="Arial" w:eastAsia="Arial" w:cs="Arial"/>
+        <w:rFonts w:ascii="Arial" w:eastAsia="Arial" w:hAnsi="Arial" w:cs="Arial"/>
         <w:sz w:val="22"/>
         <w:szCs w:val="22"/>
         <w:lang w:val="en" w:eastAsia="en-AU" w:bidi="ar-SA"/>
@@ -14846,14 +15116,14 @@
   <w:latentStyles w:defLockedState="0" w:defUIPriority="99" w:defSemiHidden="0" w:defUnhideWhenUsed="0" w:defQFormat="0" w:count="376">
     <w:lsdException w:name="Normal" w:uiPriority="0" w:qFormat="1"/>
     <w:lsdException w:name="heading 1" w:uiPriority="9" w:qFormat="1"/>
-    <w:lsdException w:name="heading 2" w:uiPriority="9" w:semiHidden="1" w:unhideWhenUsed="1" w:qFormat="1"/>
-    <w:lsdException w:name="heading 3" w:uiPriority="9" w:semiHidden="1" w:unhideWhenUsed="1" w:qFormat="1"/>
-    <w:lsdException w:name="heading 4" w:uiPriority="9" w:semiHidden="1" w:unhideWhenUsed="1" w:qFormat="1"/>
-    <w:lsdException w:name="heading 5" w:uiPriority="9" w:semiHidden="1" w:unhideWhenUsed="1" w:qFormat="1"/>
-    <w:lsdException w:name="heading 6" w:uiPriority="9" w:semiHidden="1" w:unhideWhenUsed="1" w:qFormat="1"/>
-    <w:lsdException w:name="heading 7" w:uiPriority="9" w:semiHidden="1" w:unhideWhenUsed="1" w:qFormat="1"/>
-    <w:lsdException w:name="heading 8" w:uiPriority="9" w:semiHidden="1" w:unhideWhenUsed="1" w:qFormat="1"/>
-    <w:lsdException w:name="heading 9" w:uiPriority="9" w:semiHidden="1" w:unhideWhenUsed="1" w:qFormat="1"/>
+    <w:lsdException w:name="heading 2" w:semiHidden="1" w:uiPriority="9" w:unhideWhenUsed="1" w:qFormat="1"/>
+    <w:lsdException w:name="heading 3" w:semiHidden="1" w:uiPriority="9" w:unhideWhenUsed="1" w:qFormat="1"/>
+    <w:lsdException w:name="heading 4" w:semiHidden="1" w:uiPriority="9" w:unhideWhenUsed="1" w:qFormat="1"/>
+    <w:lsdException w:name="heading 5" w:semiHidden="1" w:uiPriority="9" w:unhideWhenUsed="1" w:qFormat="1"/>
+    <w:lsdException w:name="heading 6" w:semiHidden="1" w:uiPriority="9" w:unhideWhenUsed="1" w:qFormat="1"/>
+    <w:lsdException w:name="heading 7" w:semiHidden="1" w:uiPriority="9" w:unhideWhenUsed="1" w:qFormat="1"/>
+    <w:lsdException w:name="heading 8" w:semiHidden="1" w:uiPriority="9" w:unhideWhenUsed="1" w:qFormat="1"/>
+    <w:lsdException w:name="heading 9" w:semiHidden="1" w:uiPriority="9" w:unhideWhenUsed="1" w:qFormat="1"/>
     <w:lsdException w:name="index 1" w:semiHidden="1" w:unhideWhenUsed="1"/>
     <w:lsdException w:name="index 2" w:semiHidden="1" w:unhideWhenUsed="1"/>
     <w:lsdException w:name="index 3" w:semiHidden="1" w:unhideWhenUsed="1"/>
@@ -14863,22 +15133,22 @@
     <w:lsdException w:name="index 7" w:semiHidden="1" w:unhideWhenUsed="1"/>
     <w:lsdException w:name="index 8" w:semiHidden="1" w:unhideWhenUsed="1"/>
     <w:lsdException w:name="index 9" w:semiHidden="1" w:unhideWhenUsed="1"/>
-    <w:lsdException w:name="toc 1" w:uiPriority="39" w:semiHidden="1" w:unhideWhenUsed="1"/>
-    <w:lsdException w:name="toc 2" w:uiPriority="39" w:semiHidden="1" w:unhideWhenUsed="1"/>
-    <w:lsdException w:name="toc 3" w:uiPriority="39" w:semiHidden="1" w:unhideWhenUsed="1"/>
-    <w:lsdException w:name="toc 4" w:uiPriority="39" w:semiHidden="1" w:unhideWhenUsed="1"/>
-    <w:lsdException w:name="toc 5" w:uiPriority="39" w:semiHidden="1" w:unhideWhenUsed="1"/>
-    <w:lsdException w:name="toc 6" w:uiPriority="39" w:semiHidden="1" w:unhideWhenUsed="1"/>
-    <w:lsdException w:name="toc 7" w:uiPriority="39" w:semiHidden="1" w:unhideWhenUsed="1"/>
-    <w:lsdException w:name="toc 8" w:uiPriority="39" w:semiHidden="1" w:unhideWhenUsed="1"/>
-    <w:lsdException w:name="toc 9" w:uiPriority="39" w:semiHidden="1" w:unhideWhenUsed="1"/>
+    <w:lsdException w:name="toc 1" w:semiHidden="1" w:uiPriority="39" w:unhideWhenUsed="1"/>
+    <w:lsdException w:name="toc 2" w:semiHidden="1" w:uiPriority="39" w:unhideWhenUsed="1"/>
+    <w:lsdException w:name="toc 3" w:semiHidden="1" w:uiPriority="39" w:unhideWhenUsed="1"/>
+    <w:lsdException w:name="toc 4" w:semiHidden="1" w:uiPriority="39" w:unhideWhenUsed="1"/>
+    <w:lsdException w:name="toc 5" w:semiHidden="1" w:uiPriority="39" w:unhideWhenUsed="1"/>
+    <w:lsdException w:name="toc 6" w:semiHidden="1" w:uiPriority="39" w:unhideWhenUsed="1"/>
+    <w:lsdException w:name="toc 7" w:semiHidden="1" w:uiPriority="39" w:unhideWhenUsed="1"/>
+    <w:lsdException w:name="toc 8" w:semiHidden="1" w:uiPriority="39" w:unhideWhenUsed="1"/>
+    <w:lsdException w:name="toc 9" w:semiHidden="1" w:uiPriority="39" w:unhideWhenUsed="1"/>
     <w:lsdException w:name="Normal Indent" w:semiHidden="1" w:unhideWhenUsed="1"/>
     <w:lsdException w:name="footnote text" w:semiHidden="1" w:unhideWhenUsed="1"/>
     <w:lsdException w:name="annotation text" w:semiHidden="1" w:unhideWhenUsed="1"/>
     <w:lsdException w:name="header" w:semiHidden="1" w:unhideWhenUsed="1"/>
     <w:lsdException w:name="footer" w:semiHidden="1" w:unhideWhenUsed="1"/>
     <w:lsdException w:name="index heading" w:semiHidden="1" w:unhideWhenUsed="1"/>
-    <w:lsdException w:name="caption" w:uiPriority="35" w:semiHidden="1" w:unhideWhenUsed="1" w:qFormat="1"/>
+    <w:lsdException w:name="caption" w:semiHidden="1" w:uiPriority="35" w:unhideWhenUsed="1" w:qFormat="1"/>
     <w:lsdException w:name="table of figures" w:semiHidden="1" w:unhideWhenUsed="1"/>
     <w:lsdException w:name="envelope address" w:semiHidden="1" w:unhideWhenUsed="1"/>
     <w:lsdException w:name="envelope return" w:semiHidden="1" w:unhideWhenUsed="1"/>
@@ -14909,7 +15179,7 @@
     <w:lsdException w:name="Title" w:uiPriority="10" w:qFormat="1"/>
     <w:lsdException w:name="Closing" w:semiHidden="1" w:unhideWhenUsed="1"/>
     <w:lsdException w:name="Signature" w:semiHidden="1" w:unhideWhenUsed="1"/>
-    <w:lsdException w:name="Default Paragraph Font" w:uiPriority="1" w:semiHidden="1" w:unhideWhenUsed="1"/>
+    <w:lsdException w:name="Default Paragraph Font" w:semiHidden="1" w:uiPriority="1" w:unhideWhenUsed="1"/>
     <w:lsdException w:name="Body Text" w:semiHidden="1" w:unhideWhenUsed="1"/>
     <w:lsdException w:name="Body Text Indent" w:semiHidden="1" w:unhideWhenUsed="1"/>
     <w:lsdException w:name="List Continue" w:semiHidden="1" w:unhideWhenUsed="1"/>
@@ -15109,8 +15379,8 @@
     <w:lsdException w:name="Subtle Reference" w:uiPriority="31" w:qFormat="1"/>
     <w:lsdException w:name="Intense Reference" w:uiPriority="32" w:qFormat="1"/>
     <w:lsdException w:name="Book Title" w:uiPriority="33" w:qFormat="1"/>
-    <w:lsdException w:name="Bibliography" w:uiPriority="37" w:semiHidden="1" w:unhideWhenUsed="1"/>
-    <w:lsdException w:name="TOC Heading" w:uiPriority="39" w:semiHidden="1" w:unhideWhenUsed="1" w:qFormat="1"/>
+    <w:lsdException w:name="Bibliography" w:semiHidden="1" w:uiPriority="37" w:unhideWhenUsed="1"/>
+    <w:lsdException w:name="TOC Heading" w:semiHidden="1" w:uiPriority="39" w:unhideWhenUsed="1" w:qFormat="1"/>
     <w:lsdException w:name="Plain Table 1" w:uiPriority="41"/>
     <w:lsdException w:name="Plain Table 2" w:uiPriority="42"/>
     <w:lsdException w:name="Plain Table 3" w:uiPriority="43"/>
@@ -15221,7 +15491,7 @@
     <w:lsdException w:name="Unresolved Mention" w:semiHidden="1" w:unhideWhenUsed="1"/>
     <w:lsdException w:name="Smart Link" w:semiHidden="1" w:unhideWhenUsed="1"/>
   </w:latentStyles>
-  <w:style w:type="paragraph" w:styleId="Normal" w:default="1">
+  <w:style w:type="paragraph" w:default="1" w:styleId="Normal">
     <w:name w:val="Normal"/>
     <w:qFormat/>
   </w:style>
@@ -15336,13 +15606,13 @@
       <w:color w:val="666666"/>
     </w:rPr>
   </w:style>
-  <w:style w:type="character" w:styleId="DefaultParagraphFont" w:default="1">
+  <w:style w:type="character" w:default="1" w:styleId="DefaultParagraphFont">
     <w:name w:val="Default Paragraph Font"/>
     <w:uiPriority w:val="1"/>
     <w:semiHidden/>
     <w:unhideWhenUsed/>
   </w:style>
-  <w:style w:type="table" w:styleId="TableNormal" w:default="1">
+  <w:style w:type="table" w:default="1" w:styleId="TableNormal">
     <w:name w:val="Normal Table"/>
     <w:uiPriority w:val="99"/>
     <w:semiHidden/>
@@ -15357,7 +15627,7 @@
       </w:tblCellMar>
     </w:tblPr>
   </w:style>
-  <w:style w:type="numbering" w:styleId="NoList" w:default="1">
+  <w:style w:type="numbering" w:default="1" w:styleId="NoList">
     <w:name w:val="No List"/>
     <w:uiPriority w:val="99"/>
     <w:semiHidden/>
@@ -15396,7 +15666,7 @@
       <w:szCs w:val="30"/>
     </w:rPr>
   </w:style>
-  <w:style w:type="table" w:styleId="1" w:customStyle="1">
+  <w:style w:type="table" w:customStyle="1" w:styleId="1">
     <w:name w:val="1"/>
     <w:basedOn w:val="TableNormal"/>
     <w:tblPr>
@@ -15425,7 +15695,7 @@
       <w:spacing w:line="240" w:lineRule="auto"/>
     </w:pPr>
   </w:style>
-  <w:style w:type="character" w:styleId="HeaderChar" w:customStyle="1">
+  <w:style w:type="character" w:customStyle="1" w:styleId="HeaderChar">
     <w:name w:val="Header Char"/>
     <w:basedOn w:val="DefaultParagraphFont"/>
     <w:link w:val="Header"/>
@@ -15447,7 +15717,7 @@
       <w:spacing w:line="240" w:lineRule="auto"/>
     </w:pPr>
   </w:style>
-  <w:style w:type="character" w:styleId="FooterChar" w:customStyle="1">
+  <w:style w:type="character" w:customStyle="1" w:styleId="FooterChar">
     <w:name w:val="Footer Char"/>
     <w:basedOn w:val="DefaultParagraphFont"/>
     <w:link w:val="Footer"/>
@@ -15467,7 +15737,7 @@
       <w:outlineLvl w:val="9"/>
     </w:pPr>
     <w:rPr>
-      <w:rFonts w:asciiTheme="majorHAnsi" w:hAnsiTheme="majorHAnsi" w:eastAsiaTheme="majorEastAsia" w:cstheme="majorBidi"/>
+      <w:rFonts w:asciiTheme="majorHAnsi" w:eastAsiaTheme="majorEastAsia" w:hAnsiTheme="majorHAnsi" w:cstheme="majorBidi"/>
       <w:color w:val="365F91" w:themeColor="accent1" w:themeShade="BF"/>
       <w:sz w:val="32"/>
       <w:szCs w:val="32"/>
@@ -15487,7 +15757,7 @@
       <w:ind w:left="220"/>
     </w:pPr>
     <w:rPr>
-      <w:rFonts w:cs="Times New Roman" w:asciiTheme="minorHAnsi" w:hAnsiTheme="minorHAnsi" w:eastAsiaTheme="minorEastAsia"/>
+      <w:rFonts w:asciiTheme="minorHAnsi" w:eastAsiaTheme="minorEastAsia" w:hAnsiTheme="minorHAnsi" w:cs="Times New Roman"/>
       <w:lang w:val="en-US" w:eastAsia="en-US"/>
     </w:rPr>
   </w:style>
@@ -15503,7 +15773,7 @@
       <w:spacing w:after="100" w:line="259" w:lineRule="auto"/>
     </w:pPr>
     <w:rPr>
-      <w:rFonts w:cs="Times New Roman" w:asciiTheme="minorHAnsi" w:hAnsiTheme="minorHAnsi" w:eastAsiaTheme="minorEastAsia"/>
+      <w:rFonts w:asciiTheme="minorHAnsi" w:eastAsiaTheme="minorEastAsia" w:hAnsiTheme="minorHAnsi" w:cs="Times New Roman"/>
       <w:lang w:val="en-US" w:eastAsia="en-US"/>
     </w:rPr>
   </w:style>
@@ -15520,7 +15790,7 @@
       <w:ind w:left="440"/>
     </w:pPr>
     <w:rPr>
-      <w:rFonts w:cs="Times New Roman" w:asciiTheme="minorHAnsi" w:hAnsiTheme="minorHAnsi" w:eastAsiaTheme="minorEastAsia"/>
+      <w:rFonts w:asciiTheme="minorHAnsi" w:eastAsiaTheme="minorEastAsia" w:hAnsiTheme="minorHAnsi" w:cs="Times New Roman"/>
       <w:lang w:val="en-US" w:eastAsia="en-US"/>
     </w:rPr>
   </w:style>
@@ -15596,7 +15866,7 @@
       <inkml:brushProperty name="height" value="0.035" units="cm"/>
     </inkml:brush>
   </inkml:definitions>
-  <inkml:trace contextRef="#ctx0" brushRef="#br0">0 841 24575,'22'-35'0,"-2"2"0,1 0 0,2 1 0,1 1 0,40-39 0,-56 61 0,21-18 0,0 0 0,64-41 0,13-13 0,-73 56 0,0 2 0,66-35 0,2-1 0,-64 38 0,1 2 0,0 1 0,60-18 0,-56 24 0,-29 9 0,0-1 0,1-1 0,13-6 0,-12 5 0,-1 1 0,1 0 0,0 1 0,27-3 0,20-6 0,-17-1 0,-26 7 0,0 1 0,1 1 0,0 1 0,0 1 0,26-2 0,-40 5-170,1 0-1,0-1 0,0 0 1,0-1-1,-1 0 0,1 0 1,6-3-1,-3 1-6655</inkml:trace>
+  <inkml:trace contextRef="#ctx0" brushRef="#br0">0 876 24575,'23'-36'0,"-3"1"0,2 1 0,1 0 0,2 2 0,40-41 0,-56 64 0,20-19 0,1 0 0,65-43 0,14-14 0,-75 59 0,0 2 0,67-36 0,3-1 0,-67 39 0,2 2 0,0 1 0,62-18 0,-58 24 0,-30 10 0,0-1 0,2-1 0,12-7 0,-11 6 0,-2 1 0,2 0 0,-1 0 0,28-2 0,21-6 0,-18-2 0,-27 8 0,1 0 0,0 2 0,1 1 0,-1 1 0,27-2 0,-41 5-170,2 0-1,-1-1 0,0 0 1,0-1-1,-1-1 0,1 1 1,7-3-1,-4 1-6655</inkml:trace>
 </inkml:ink>
 </file>
 

</xml_diff>

<commit_message>
Added new Scenes and Scripts
</commit_message>
<xml_diff>
--- a/James Fan - Assessment 3_ Major Project.docx
+++ b/James Fan - Assessment 3_ Major Project.docx
@@ -23,7 +23,7 @@
           <w:noProof/>
         </w:rPr>
         <w:pict w14:anchorId="1963DF64">
-          <v:rect id="Ink 15" o:spid="_x0000_s1027" style="position:absolute;margin-left:243.35pt;margin-top:254.4pt;width:43pt;height:25.8pt;z-index:251663360;visibility:visible;mso-wrap-style:square;mso-width-percent:0;mso-height-percent:0;mso-wrap-distance-left:9pt;mso-wrap-distance-top:0;mso-wrap-distance-right:9pt;mso-wrap-distance-bottom:0;mso-position-horizontal:absolute;mso-position-horizontal-relative:text;mso-position-vertical:absolute;mso-position-vertical-relative:text;mso-width-percent:0;mso-height-percent:0;mso-width-relative:page;mso-height-relative:page" coordsize="1484,877" filled="f" strokeweight=".35mm">
+          <v:rect id="Ink 15" o:spid="_x0000_s1027" style="position:absolute;margin-left:243.35pt;margin-top:254.4pt;width:43pt;height:25.8pt;z-index:251663360;visibility:visible;mso-wrap-style:square;mso-width-percent:0;mso-height-percent:0;mso-wrap-distance-left:9pt;mso-wrap-distance-top:0;mso-wrap-distance-right:9pt;mso-wrap-distance-bottom:0;mso-position-horizontal:absolute;mso-position-horizontal-relative:text;mso-position-vertical:absolute;mso-position-vertical-relative:text;mso-width-percent:0;mso-height-percent:0;mso-width-relative:page;mso-height-relative:page" filled="f" strokeweight=".35mm">
             <v:stroke endcap="round"/>
             <v:path shadowok="f" o:extrusionok="f" fillok="f" insetpenok="f"/>
             <o:lock v:ext="edit" rotation="t" aspectratio="t" verticies="t" text="t" shapetype="t"/>
@@ -103,7 +103,7 @@
           <w:noProof/>
         </w:rPr>
         <w:drawing>
-          <wp:anchor distT="0" distB="0" distL="114300" distR="114300" simplePos="0" relativeHeight="251662336" behindDoc="0" locked="0" layoutInCell="1" allowOverlap="1" wp14:anchorId="2E5C3EA8" wp14:editId="1A32EE32">
+          <wp:anchor distT="0" distB="0" distL="114300" distR="114300" simplePos="0" relativeHeight="251662336" behindDoc="0" locked="0" layoutInCell="1" allowOverlap="1" wp14:anchorId="2E5C3EA8" wp14:editId="444228A5">
             <wp:simplePos x="0" y="0"/>
             <wp:positionH relativeFrom="column">
               <wp:posOffset>1417320</wp:posOffset>
@@ -5820,6 +5820,9 @@
         <w:br/>
       </w:r>
       <w:r>
+        <w:rPr>
+          <w:noProof/>
+        </w:rPr>
         <w:drawing>
           <wp:inline distT="0" distB="0" distL="0" distR="0" wp14:anchorId="01C7D710" wp14:editId="6A9CBCD0">
             <wp:extent cx="5943600" cy="1391920"/>
@@ -5869,6 +5872,9 @@
         <w:t>A prompt will open, Select a the location that you want the game to be (in this example the desktop) and then hit extract</w:t>
       </w:r>
       <w:r>
+        <w:rPr>
+          <w:noProof/>
+        </w:rPr>
         <w:drawing>
           <wp:inline distT="0" distB="0" distL="0" distR="0" wp14:anchorId="54813D53" wp14:editId="7D1A8EC9">
             <wp:extent cx="5380186" cy="4618120"/>
@@ -5922,6 +5928,9 @@
         <w:br/>
       </w:r>
       <w:r>
+        <w:rPr>
+          <w:noProof/>
+        </w:rPr>
         <w:drawing>
           <wp:inline distT="0" distB="0" distL="0" distR="0" wp14:anchorId="76153250" wp14:editId="6D99B07E">
             <wp:extent cx="5943600" cy="928370"/>
@@ -12168,6 +12177,240 @@
         </w:numPr>
       </w:pPr>
       <w:r>
+        <w:t>Begin work</w:t>
+      </w:r>
+      <w:r>
+        <w:t xml:space="preserve"> drafting</w:t>
+      </w:r>
+      <w:r>
+        <w:t xml:space="preserve"> </w:t>
+      </w:r>
+      <w:r>
+        <w:t>a</w:t>
+      </w:r>
+      <w:r>
+        <w:t xml:space="preserve"> installation guide</w:t>
+      </w:r>
+    </w:p>
+    <w:p>
+      <w:pPr>
+        <w:pStyle w:val="ListParagraph"/>
+        <w:numPr>
+          <w:ilvl w:val="1"/>
+          <w:numId w:val="22"/>
+        </w:numPr>
+      </w:pPr>
+      <w:r>
+        <w:t>Finished</w:t>
+      </w:r>
+      <w:r>
+        <w:t xml:space="preserve"> drafting</w:t>
+      </w:r>
+      <w:r>
+        <w:t xml:space="preserve"> installation guide</w:t>
+      </w:r>
+    </w:p>
+    <w:p>
+      <w:pPr>
+        <w:pStyle w:val="ListParagraph"/>
+        <w:numPr>
+          <w:ilvl w:val="0"/>
+          <w:numId w:val="22"/>
+        </w:numPr>
+      </w:pPr>
+      <w:r>
+        <w:t>Learnt how to export the project as a .exe file</w:t>
+      </w:r>
+    </w:p>
+    <w:p>
+      <w:pPr>
+        <w:pStyle w:val="ListParagraph"/>
+        <w:numPr>
+          <w:ilvl w:val="0"/>
+          <w:numId w:val="22"/>
+        </w:numPr>
+      </w:pPr>
+      <w:r>
+        <w:t>Gantt Chart Progress check</w:t>
+      </w:r>
+    </w:p>
+    <w:p>
+      <w:pPr>
+        <w:pStyle w:val="ListParagraph"/>
+        <w:numPr>
+          <w:ilvl w:val="1"/>
+          <w:numId w:val="22"/>
+        </w:numPr>
+      </w:pPr>
+      <w:r>
+        <w:t>Algorithm</w:t>
+      </w:r>
+    </w:p>
+    <w:p>
+      <w:pPr>
+        <w:pStyle w:val="ListParagraph"/>
+        <w:numPr>
+          <w:ilvl w:val="2"/>
+          <w:numId w:val="22"/>
+        </w:numPr>
+      </w:pPr>
+      <w:r>
+        <w:t>On course</w:t>
+      </w:r>
+    </w:p>
+    <w:p>
+      <w:pPr>
+        <w:pStyle w:val="ListParagraph"/>
+        <w:numPr>
+          <w:ilvl w:val="1"/>
+          <w:numId w:val="22"/>
+        </w:numPr>
+      </w:pPr>
+      <w:r>
+        <w:t>Documentation</w:t>
+      </w:r>
+    </w:p>
+    <w:p>
+      <w:pPr>
+        <w:pStyle w:val="ListParagraph"/>
+        <w:numPr>
+          <w:ilvl w:val="2"/>
+          <w:numId w:val="22"/>
+        </w:numPr>
+      </w:pPr>
+      <w:r>
+        <w:t>User Manual</w:t>
+      </w:r>
+    </w:p>
+    <w:p>
+      <w:pPr>
+        <w:pStyle w:val="ListParagraph"/>
+        <w:numPr>
+          <w:ilvl w:val="3"/>
+          <w:numId w:val="22"/>
+        </w:numPr>
+      </w:pPr>
+      <w:r>
+        <w:t>Completed</w:t>
+      </w:r>
+    </w:p>
+    <w:p>
+      <w:pPr>
+        <w:pStyle w:val="ListParagraph"/>
+        <w:numPr>
+          <w:ilvl w:val="1"/>
+          <w:numId w:val="22"/>
+        </w:numPr>
+      </w:pPr>
+      <w:r>
+        <w:t>Coding</w:t>
+      </w:r>
+    </w:p>
+    <w:p>
+      <w:pPr>
+        <w:pStyle w:val="ListParagraph"/>
+        <w:numPr>
+          <w:ilvl w:val="2"/>
+          <w:numId w:val="22"/>
+        </w:numPr>
+      </w:pPr>
+      <w:r>
+        <w:t>On Course</w:t>
+      </w:r>
+    </w:p>
+    <w:p>
+      <w:pPr>
+        <w:pStyle w:val="ListParagraph"/>
+        <w:numPr>
+          <w:ilvl w:val="0"/>
+          <w:numId w:val="22"/>
+        </w:numPr>
+      </w:pPr>
+      <w:r>
+        <w:rPr>
+          <w:lang w:val="en-US"/>
+        </w:rPr>
+        <w:t>Additional task tomorrow</w:t>
+      </w:r>
+    </w:p>
+    <w:p>
+      <w:pPr>
+        <w:pStyle w:val="Heading3"/>
+        <w:ind w:firstLine="360"/>
+      </w:pPr>
+      <w:r>
+        <w:t>20th of June</w:t>
+      </w:r>
+    </w:p>
+    <w:p>
+      <w:pPr>
+        <w:pStyle w:val="ListParagraph"/>
+        <w:numPr>
+          <w:ilvl w:val="0"/>
+          <w:numId w:val="22"/>
+        </w:numPr>
+      </w:pPr>
+      <w:r>
+        <w:t>Continued development on main game</w:t>
+      </w:r>
+    </w:p>
+    <w:p>
+      <w:pPr>
+        <w:pStyle w:val="ListParagraph"/>
+        <w:numPr>
+          <w:ilvl w:val="1"/>
+          <w:numId w:val="22"/>
+        </w:numPr>
+      </w:pPr>
+      <w:r>
+        <w:t>Continued to design HUD</w:t>
+      </w:r>
+    </w:p>
+    <w:p>
+      <w:pPr>
+        <w:pStyle w:val="ListParagraph"/>
+        <w:numPr>
+          <w:ilvl w:val="2"/>
+          <w:numId w:val="22"/>
+        </w:numPr>
+      </w:pPr>
+      <w:r>
+        <w:t>Made a working start button</w:t>
+      </w:r>
+    </w:p>
+    <w:p>
+      <w:pPr>
+        <w:pStyle w:val="ListParagraph"/>
+        <w:numPr>
+          <w:ilvl w:val="0"/>
+          <w:numId w:val="22"/>
+        </w:numPr>
+      </w:pPr>
+      <w:r>
+        <w:t>Continued work on Algorithm</w:t>
+      </w:r>
+    </w:p>
+    <w:p>
+      <w:pPr>
+        <w:pStyle w:val="ListParagraph"/>
+        <w:numPr>
+          <w:ilvl w:val="1"/>
+          <w:numId w:val="22"/>
+        </w:numPr>
+      </w:pPr>
+      <w:r>
+        <w:t xml:space="preserve">Added new parts </w:t>
+      </w:r>
+    </w:p>
+    <w:p>
+      <w:pPr>
+        <w:pStyle w:val="ListParagraph"/>
+        <w:numPr>
+          <w:ilvl w:val="0"/>
+          <w:numId w:val="22"/>
+        </w:numPr>
+      </w:pPr>
+      <w:r>
         <w:t>Begin work on installation guide</w:t>
       </w:r>
     </w:p>
@@ -12192,18 +12435,6 @@
         </w:numPr>
       </w:pPr>
       <w:r>
-        <w:t>Learnt how to export the project as a .exe file</w:t>
-      </w:r>
-    </w:p>
-    <w:p>
-      <w:pPr>
-        <w:pStyle w:val="ListParagraph"/>
-        <w:numPr>
-          <w:ilvl w:val="0"/>
-          <w:numId w:val="22"/>
-        </w:numPr>
-      </w:pPr>
-      <w:r>
         <w:t>Gantt Chart Progress check</w:t>
       </w:r>
     </w:p>
@@ -12241,30 +12472,6 @@
       </w:pPr>
       <w:r>
         <w:t>Documentation</w:t>
-      </w:r>
-    </w:p>
-    <w:p>
-      <w:pPr>
-        <w:pStyle w:val="ListParagraph"/>
-        <w:numPr>
-          <w:ilvl w:val="2"/>
-          <w:numId w:val="22"/>
-        </w:numPr>
-      </w:pPr>
-      <w:r>
-        <w:t>User Manual</w:t>
-      </w:r>
-    </w:p>
-    <w:p>
-      <w:pPr>
-        <w:pStyle w:val="ListParagraph"/>
-        <w:numPr>
-          <w:ilvl w:val="3"/>
-          <w:numId w:val="22"/>
-        </w:numPr>
-      </w:pPr>
-      <w:r>
-        <w:t>On Course</w:t>
       </w:r>
     </w:p>
     <w:p>

</xml_diff>

<commit_message>
New script, slight changes
Slight changes to other scripts and new tile.gd script
</commit_message>
<xml_diff>
--- a/James Fan - Assessment 3_ Major Project.docx
+++ b/James Fan - Assessment 3_ Major Project.docx
@@ -3425,15 +3425,7 @@
         <w:t>game.</w:t>
       </w:r>
       <w:r>
-        <w:t xml:space="preserve"> BattleSweeper aims to follow </w:t>
-      </w:r>
-      <w:proofErr w:type="gramStart"/>
-      <w:r>
-        <w:t>an</w:t>
-      </w:r>
-      <w:proofErr w:type="gramEnd"/>
-      <w:r>
-        <w:t xml:space="preserve"> </w:t>
+        <w:t xml:space="preserve"> BattleSweeper aims to follow an </w:t>
       </w:r>
       <w:r>
         <w:t>Rapid Application Development</w:t>
@@ -12586,13 +12578,8 @@
         </w:numPr>
       </w:pPr>
       <w:r>
-        <w:t xml:space="preserve">Added mention on software </w:t>
-      </w:r>
-      <w:proofErr w:type="spellStart"/>
-      <w:r>
-        <w:t>apporach</w:t>
-      </w:r>
-      <w:proofErr w:type="spellEnd"/>
+        <w:t>Added mention on software apporach</w:t>
+      </w:r>
     </w:p>
     <w:p>
       <w:pPr>
@@ -12650,11 +12637,9 @@
           <w:numId w:val="22"/>
         </w:numPr>
       </w:pPr>
-      <w:proofErr w:type="spellStart"/>
       <w:r>
         <w:t>HUDGame</w:t>
       </w:r>
-      <w:proofErr w:type="spellEnd"/>
     </w:p>
     <w:p>
       <w:pPr>
@@ -12664,22 +12649,20 @@
           <w:numId w:val="22"/>
         </w:numPr>
       </w:pPr>
-      <w:proofErr w:type="spellStart"/>
       <w:r>
         <w:t>MainGame</w:t>
       </w:r>
-      <w:proofErr w:type="spellEnd"/>
-    </w:p>
-    <w:p>
-      <w:pPr>
-        <w:pStyle w:val="ListParagraph"/>
-        <w:numPr>
-          <w:ilvl w:val="1"/>
-          <w:numId w:val="22"/>
-        </w:numPr>
-      </w:pPr>
-      <w:r>
-        <w:t>Made new Global Variable and function script</w:t>
+    </w:p>
+    <w:p>
+      <w:pPr>
+        <w:pStyle w:val="ListParagraph"/>
+        <w:numPr>
+          <w:ilvl w:val="1"/>
+          <w:numId w:val="22"/>
+        </w:numPr>
+      </w:pPr>
+      <w:r>
+        <w:t>Made function script</w:t>
       </w:r>
     </w:p>
     <w:p>
@@ -12691,7 +12674,58 @@
         </w:numPr>
       </w:pPr>
       <w:r>
+        <w:t>Globral function</w:t>
+      </w:r>
+    </w:p>
+    <w:p>
+      <w:pPr>
+        <w:pStyle w:val="ListParagraph"/>
+        <w:numPr>
+          <w:ilvl w:val="3"/>
+          <w:numId w:val="22"/>
+        </w:numPr>
+      </w:pPr>
+      <w:r>
         <w:t>StandAlone.gd</w:t>
+      </w:r>
+    </w:p>
+    <w:p>
+      <w:pPr>
+        <w:pStyle w:val="ListParagraph"/>
+        <w:numPr>
+          <w:ilvl w:val="2"/>
+          <w:numId w:val="22"/>
+        </w:numPr>
+      </w:pPr>
+      <w:r>
+        <w:t>Functions</w:t>
+      </w:r>
+    </w:p>
+    <w:p>
+      <w:pPr>
+        <w:pStyle w:val="ListParagraph"/>
+        <w:numPr>
+          <w:ilvl w:val="3"/>
+          <w:numId w:val="22"/>
+        </w:numPr>
+      </w:pPr>
+      <w:r>
+        <w:t>MainGame.</w:t>
+      </w:r>
+      <w:r>
+        <w:t>gd</w:t>
+      </w:r>
+    </w:p>
+    <w:p>
+      <w:pPr>
+        <w:pStyle w:val="ListParagraph"/>
+        <w:numPr>
+          <w:ilvl w:val="3"/>
+          <w:numId w:val="22"/>
+        </w:numPr>
+      </w:pPr>
+      <w:r>
+        <w:t>Tile.gd</w:t>
       </w:r>
     </w:p>
     <w:p>
@@ -12774,6 +12808,7 @@
         </w:numPr>
       </w:pPr>
       <w:r>
+        <w:lastRenderedPageBreak/>
         <w:t>Continued work on Algorithm</w:t>
       </w:r>
     </w:p>
@@ -12828,7 +12863,6 @@
         </w:numPr>
       </w:pPr>
       <w:r>
-        <w:lastRenderedPageBreak/>
         <w:t>Begin work on installation guide</w:t>
       </w:r>
     </w:p>

</xml_diff>

<commit_message>
Removed elements from groups
</commit_message>
<xml_diff>
--- a/James Fan - Assessment 3_ Major Project.docx
+++ b/James Fan - Assessment 3_ Major Project.docx
@@ -103,7 +103,7 @@
           <w:noProof/>
         </w:rPr>
         <w:drawing>
-          <wp:anchor distT="0" distB="0" distL="114300" distR="114300" simplePos="0" relativeHeight="251662336" behindDoc="0" locked="0" layoutInCell="1" allowOverlap="1" wp14:anchorId="2E5C3EA8" wp14:editId="74F449B0">
+          <wp:anchor distT="0" distB="0" distL="114300" distR="114300" simplePos="0" relativeHeight="251662336" behindDoc="0" locked="0" layoutInCell="1" allowOverlap="1" wp14:anchorId="2E5C3EA8" wp14:editId="4F0A3400">
             <wp:simplePos x="0" y="0"/>
             <wp:positionH relativeFrom="column">
               <wp:posOffset>1417320</wp:posOffset>
@@ -3452,7 +3452,15 @@
         <w:t xml:space="preserve"> Battlesweeper</w:t>
       </w:r>
       <w:r>
-        <w:t xml:space="preserve"> is a suitable project that is complex in nature but can be completed within the development period where it educational endeavor can help me learn how to tackle integrating two separate game functionalities into a whole functioning game and also how to create an efficient UI and create documentation such as user and technical manual  without confusing the user and/or future developers</w:t>
+        <w:t xml:space="preserve"> is a suitable project that is complex in nature but can be completed within the development period where it educational endeavor can help me learn how to tackle integrating two separate game functionalities into a whole functioning game </w:t>
+      </w:r>
+      <w:proofErr w:type="gramStart"/>
+      <w:r>
+        <w:t>and also</w:t>
+      </w:r>
+      <w:proofErr w:type="gramEnd"/>
+      <w:r>
+        <w:t xml:space="preserve"> how to create an efficient UI and create documentation such as user and technical manual  without confusing the user and/or future developers</w:t>
       </w:r>
     </w:p>
     <w:p>
@@ -6045,31 +6053,24 @@
     <w:tbl>
       <w:tblPr>
         <w:tblStyle w:val="TableGrid"/>
-        <w:tblW w:w="0" w:type="auto"/>
+        <w:tblW w:w="9576" w:type="dxa"/>
+        <w:tblLayout w:type="fixed"/>
         <w:tblLook w:val="04A0" w:firstRow="1" w:lastRow="0" w:firstColumn="1" w:lastColumn="0" w:noHBand="0" w:noVBand="1"/>
       </w:tblPr>
       <w:tblGrid>
-        <w:gridCol w:w="1635"/>
-        <w:gridCol w:w="1024"/>
-        <w:gridCol w:w="986"/>
-        <w:gridCol w:w="1108"/>
-        <w:gridCol w:w="999"/>
-        <w:gridCol w:w="1427"/>
-        <w:gridCol w:w="1129"/>
-        <w:gridCol w:w="1268"/>
+        <w:gridCol w:w="1951"/>
+        <w:gridCol w:w="1241"/>
+        <w:gridCol w:w="1027"/>
+        <w:gridCol w:w="2552"/>
+        <w:gridCol w:w="1134"/>
+        <w:gridCol w:w="1671"/>
       </w:tblGrid>
       <w:tr>
         <w:tc>
           <w:tcPr>
-            <w:tcW w:w="1635" w:type="dxa"/>
+            <w:tcW w:w="1951" w:type="dxa"/>
           </w:tcPr>
           <w:p>
-            <w:pPr>
-              <w:rPr>
-                <w:b/>
-                <w:bCs/>
-              </w:rPr>
-            </w:pPr>
             <w:r>
               <w:rPr>
                 <w:b/>
@@ -6081,15 +6082,9 @@
         </w:tc>
         <w:tc>
           <w:tcPr>
-            <w:tcW w:w="1024" w:type="dxa"/>
+            <w:tcW w:w="1241" w:type="dxa"/>
           </w:tcPr>
           <w:p>
-            <w:pPr>
-              <w:rPr>
-                <w:b/>
-                <w:bCs/>
-              </w:rPr>
-            </w:pPr>
             <w:r>
               <w:rPr>
                 <w:b/>
@@ -6101,15 +6096,9 @@
         </w:tc>
         <w:tc>
           <w:tcPr>
-            <w:tcW w:w="986" w:type="dxa"/>
+            <w:tcW w:w="1027" w:type="dxa"/>
           </w:tcPr>
           <w:p>
-            <w:pPr>
-              <w:rPr>
-                <w:b/>
-                <w:bCs/>
-              </w:rPr>
-            </w:pPr>
             <w:r>
               <w:rPr>
                 <w:b/>
@@ -6121,155 +6110,37 @@
         </w:tc>
         <w:tc>
           <w:tcPr>
-            <w:tcW w:w="1108" w:type="dxa"/>
+            <w:tcW w:w="2552" w:type="dxa"/>
           </w:tcPr>
           <w:p>
-            <w:pPr>
+            <w:r>
               <w:rPr>
                 <w:b/>
                 <w:bCs/>
               </w:rPr>
-            </w:pPr>
-            <w:r>
-              <w:rPr>
-                <w:b/>
-                <w:bCs/>
-              </w:rPr>
-              <w:t>Number of</w:t>
-            </w:r>
-          </w:p>
-          <w:p>
-            <w:pPr>
-              <w:rPr>
-                <w:b/>
-                <w:bCs/>
-              </w:rPr>
-            </w:pPr>
-            <w:r>
-              <w:rPr>
-                <w:b/>
-                <w:bCs/>
-              </w:rPr>
-              <w:t>bytes</w:t>
-            </w:r>
-          </w:p>
-          <w:p>
-            <w:pPr>
-              <w:rPr>
-                <w:b/>
-                <w:bCs/>
-              </w:rPr>
-            </w:pPr>
-            <w:r>
-              <w:rPr>
-                <w:b/>
-                <w:bCs/>
-              </w:rPr>
-              <w:t>required</w:t>
-            </w:r>
-          </w:p>
-          <w:p>
-            <w:pPr>
-              <w:rPr>
-                <w:b/>
-                <w:bCs/>
-              </w:rPr>
-            </w:pPr>
-            <w:r>
-              <w:rPr>
-                <w:b/>
-                <w:bCs/>
-              </w:rPr>
-              <w:t>for storage</w:t>
+              <w:t>Description</w:t>
             </w:r>
           </w:p>
         </w:tc>
         <w:tc>
           <w:tcPr>
-            <w:tcW w:w="999" w:type="dxa"/>
+            <w:tcW w:w="1134" w:type="dxa"/>
           </w:tcPr>
           <w:p>
-            <w:pPr>
+            <w:r>
               <w:rPr>
                 <w:b/>
                 <w:bCs/>
               </w:rPr>
-            </w:pPr>
-            <w:r>
-              <w:rPr>
-                <w:b/>
-                <w:bCs/>
-              </w:rPr>
-              <w:t>Size for</w:t>
-            </w:r>
-          </w:p>
-          <w:p>
-            <w:pPr>
-              <w:rPr>
-                <w:b/>
-                <w:bCs/>
-              </w:rPr>
-            </w:pPr>
-            <w:r>
-              <w:rPr>
-                <w:b/>
-                <w:bCs/>
-              </w:rPr>
-              <w:t>display</w:t>
+              <w:t>Example</w:t>
             </w:r>
           </w:p>
         </w:tc>
         <w:tc>
           <w:tcPr>
-            <w:tcW w:w="1427" w:type="dxa"/>
+            <w:tcW w:w="1671" w:type="dxa"/>
           </w:tcPr>
           <w:p>
-            <w:pPr>
-              <w:rPr>
-                <w:b/>
-                <w:bCs/>
-              </w:rPr>
-            </w:pPr>
-            <w:r>
-              <w:rPr>
-                <w:b/>
-                <w:bCs/>
-              </w:rPr>
-              <w:t>Description</w:t>
-            </w:r>
-          </w:p>
-        </w:tc>
-        <w:tc>
-          <w:tcPr>
-            <w:tcW w:w="1129" w:type="dxa"/>
-          </w:tcPr>
-          <w:p>
-            <w:pPr>
-              <w:rPr>
-                <w:b/>
-                <w:bCs/>
-              </w:rPr>
-            </w:pPr>
-            <w:r>
-              <w:rPr>
-                <w:b/>
-                <w:bCs/>
-              </w:rPr>
-              <w:t>Example</w:t>
-            </w:r>
-          </w:p>
-        </w:tc>
-        <w:tc>
-          <w:tcPr>
-            <w:tcW w:w="1268" w:type="dxa"/>
-          </w:tcPr>
-          <w:p>
-            <w:pPr>
-              <w:rPr>
-                <w:b/>
-                <w:bCs/>
-              </w:rPr>
-            </w:pPr>
             <w:r>
               <w:rPr>
                 <w:b/>
@@ -6283,18 +6154,17 @@
       <w:tr>
         <w:tc>
           <w:tcPr>
-            <w:tcW w:w="1635" w:type="dxa"/>
+            <w:tcW w:w="1951" w:type="dxa"/>
           </w:tcPr>
           <w:p>
             <w:r>
-              <w:lastRenderedPageBreak/>
               <w:t>Complete</w:t>
             </w:r>
           </w:p>
         </w:tc>
         <w:tc>
           <w:tcPr>
-            <w:tcW w:w="1024" w:type="dxa"/>
+            <w:tcW w:w="1241" w:type="dxa"/>
           </w:tcPr>
           <w:p>
             <w:r>
@@ -6304,7 +6174,7 @@
         </w:tc>
         <w:tc>
           <w:tcPr>
-            <w:tcW w:w="986" w:type="dxa"/>
+            <w:tcW w:w="1027" w:type="dxa"/>
           </w:tcPr>
           <w:p>
             <w:r>
@@ -6314,19 +6184,7 @@
         </w:tc>
         <w:tc>
           <w:tcPr>
-            <w:tcW w:w="1108" w:type="dxa"/>
-          </w:tcPr>
-          <w:p/>
-        </w:tc>
-        <w:tc>
-          <w:tcPr>
-            <w:tcW w:w="999" w:type="dxa"/>
-          </w:tcPr>
-          <w:p/>
-        </w:tc>
-        <w:tc>
-          <w:tcPr>
-            <w:tcW w:w="1427" w:type="dxa"/>
+            <w:tcW w:w="2552" w:type="dxa"/>
           </w:tcPr>
           <w:p>
             <w:r>
@@ -6336,7 +6194,7 @@
         </w:tc>
         <w:tc>
           <w:tcPr>
-            <w:tcW w:w="1129" w:type="dxa"/>
+            <w:tcW w:w="1134" w:type="dxa"/>
           </w:tcPr>
           <w:p>
             <w:r>
@@ -6346,7 +6204,7 @@
         </w:tc>
         <w:tc>
           <w:tcPr>
-            <w:tcW w:w="1268" w:type="dxa"/>
+            <w:tcW w:w="1671" w:type="dxa"/>
           </w:tcPr>
           <w:p/>
         </w:tc>
@@ -6354,17 +6212,19 @@
       <w:tr>
         <w:tc>
           <w:tcPr>
-            <w:tcW w:w="1635" w:type="dxa"/>
+            <w:tcW w:w="1951" w:type="dxa"/>
           </w:tcPr>
           <w:p>
+            <w:proofErr w:type="spellStart"/>
             <w:r>
               <w:t>GameOver</w:t>
             </w:r>
+            <w:proofErr w:type="spellEnd"/>
           </w:p>
         </w:tc>
         <w:tc>
           <w:tcPr>
-            <w:tcW w:w="1024" w:type="dxa"/>
+            <w:tcW w:w="1241" w:type="dxa"/>
           </w:tcPr>
           <w:p>
             <w:r>
@@ -6374,7 +6234,7 @@
         </w:tc>
         <w:tc>
           <w:tcPr>
-            <w:tcW w:w="986" w:type="dxa"/>
+            <w:tcW w:w="1027" w:type="dxa"/>
           </w:tcPr>
           <w:p>
             <w:r>
@@ -6384,19 +6244,7 @@
         </w:tc>
         <w:tc>
           <w:tcPr>
-            <w:tcW w:w="1108" w:type="dxa"/>
-          </w:tcPr>
-          <w:p/>
-        </w:tc>
-        <w:tc>
-          <w:tcPr>
-            <w:tcW w:w="999" w:type="dxa"/>
-          </w:tcPr>
-          <w:p/>
-        </w:tc>
-        <w:tc>
-          <w:tcPr>
-            <w:tcW w:w="1427" w:type="dxa"/>
+            <w:tcW w:w="2552" w:type="dxa"/>
           </w:tcPr>
           <w:p>
             <w:r>
@@ -6406,7 +6254,7 @@
         </w:tc>
         <w:tc>
           <w:tcPr>
-            <w:tcW w:w="1129" w:type="dxa"/>
+            <w:tcW w:w="1134" w:type="dxa"/>
           </w:tcPr>
           <w:p>
             <w:r>
@@ -6416,7 +6264,7 @@
         </w:tc>
         <w:tc>
           <w:tcPr>
-            <w:tcW w:w="1268" w:type="dxa"/>
+            <w:tcW w:w="1671" w:type="dxa"/>
           </w:tcPr>
           <w:p/>
         </w:tc>
@@ -6424,7 +6272,7 @@
       <w:tr>
         <w:tc>
           <w:tcPr>
-            <w:tcW w:w="1635" w:type="dxa"/>
+            <w:tcW w:w="1951" w:type="dxa"/>
           </w:tcPr>
           <w:p>
             <w:r>
@@ -6437,7 +6285,7 @@
         </w:tc>
         <w:tc>
           <w:tcPr>
-            <w:tcW w:w="1024" w:type="dxa"/>
+            <w:tcW w:w="1241" w:type="dxa"/>
           </w:tcPr>
           <w:p>
             <w:r>
@@ -6447,25 +6295,13 @@
         </w:tc>
         <w:tc>
           <w:tcPr>
-            <w:tcW w:w="986" w:type="dxa"/>
+            <w:tcW w:w="1027" w:type="dxa"/>
           </w:tcPr>
           <w:p/>
         </w:tc>
         <w:tc>
           <w:tcPr>
-            <w:tcW w:w="1108" w:type="dxa"/>
-          </w:tcPr>
-          <w:p/>
-        </w:tc>
-        <w:tc>
-          <w:tcPr>
-            <w:tcW w:w="999" w:type="dxa"/>
-          </w:tcPr>
-          <w:p/>
-        </w:tc>
-        <w:tc>
-          <w:tcPr>
-            <w:tcW w:w="1427" w:type="dxa"/>
+            <w:tcW w:w="2552" w:type="dxa"/>
           </w:tcPr>
           <w:p>
             <w:r>
@@ -6475,7 +6311,7 @@
         </w:tc>
         <w:tc>
           <w:tcPr>
-            <w:tcW w:w="1129" w:type="dxa"/>
+            <w:tcW w:w="1134" w:type="dxa"/>
           </w:tcPr>
           <w:p>
             <w:r>
@@ -6485,7 +6321,7 @@
         </w:tc>
         <w:tc>
           <w:tcPr>
-            <w:tcW w:w="1268" w:type="dxa"/>
+            <w:tcW w:w="1671" w:type="dxa"/>
           </w:tcPr>
           <w:p/>
         </w:tc>
@@ -6493,7 +6329,7 @@
       <w:tr>
         <w:tc>
           <w:tcPr>
-            <w:tcW w:w="1635" w:type="dxa"/>
+            <w:tcW w:w="1951" w:type="dxa"/>
           </w:tcPr>
           <w:p>
             <w:r>
@@ -6506,7 +6342,7 @@
         </w:tc>
         <w:tc>
           <w:tcPr>
-            <w:tcW w:w="1024" w:type="dxa"/>
+            <w:tcW w:w="1241" w:type="dxa"/>
           </w:tcPr>
           <w:p>
             <w:r>
@@ -6516,45 +6352,38 @@
         </w:tc>
         <w:tc>
           <w:tcPr>
-            <w:tcW w:w="986" w:type="dxa"/>
+            <w:tcW w:w="1027" w:type="dxa"/>
           </w:tcPr>
           <w:p/>
         </w:tc>
         <w:tc>
           <w:tcPr>
-            <w:tcW w:w="1108" w:type="dxa"/>
-          </w:tcPr>
-          <w:p/>
-        </w:tc>
-        <w:tc>
-          <w:tcPr>
-            <w:tcW w:w="999" w:type="dxa"/>
-          </w:tcPr>
-          <w:p/>
-        </w:tc>
-        <w:tc>
-          <w:tcPr>
-            <w:tcW w:w="1427" w:type="dxa"/>
+            <w:tcW w:w="2552" w:type="dxa"/>
           </w:tcPr>
           <w:p>
             <w:r>
-              <w:t>Decides the number of tiles in a column</w:t>
+              <w:t xml:space="preserve">Decides the number of </w:t>
+            </w:r>
+            <w:r>
+              <w:lastRenderedPageBreak/>
+              <w:t>tiles in a column</w:t>
             </w:r>
           </w:p>
         </w:tc>
         <w:tc>
           <w:tcPr>
-            <w:tcW w:w="1129" w:type="dxa"/>
+            <w:tcW w:w="1134" w:type="dxa"/>
           </w:tcPr>
           <w:p>
             <w:r>
+              <w:lastRenderedPageBreak/>
               <w:t>4</w:t>
             </w:r>
           </w:p>
         </w:tc>
         <w:tc>
           <w:tcPr>
-            <w:tcW w:w="1268" w:type="dxa"/>
+            <w:tcW w:w="1671" w:type="dxa"/>
           </w:tcPr>
           <w:p/>
         </w:tc>
@@ -6562,17 +6391,19 @@
       <w:tr>
         <w:tc>
           <w:tcPr>
-            <w:tcW w:w="1635" w:type="dxa"/>
+            <w:tcW w:w="1951" w:type="dxa"/>
           </w:tcPr>
           <w:p>
+            <w:proofErr w:type="spellStart"/>
             <w:r>
               <w:t>MineNumber</w:t>
             </w:r>
+            <w:proofErr w:type="spellEnd"/>
           </w:p>
         </w:tc>
         <w:tc>
           <w:tcPr>
-            <w:tcW w:w="1024" w:type="dxa"/>
+            <w:tcW w:w="1241" w:type="dxa"/>
           </w:tcPr>
           <w:p>
             <w:r>
@@ -6582,25 +6413,13 @@
         </w:tc>
         <w:tc>
           <w:tcPr>
-            <w:tcW w:w="986" w:type="dxa"/>
+            <w:tcW w:w="1027" w:type="dxa"/>
           </w:tcPr>
           <w:p/>
         </w:tc>
         <w:tc>
           <w:tcPr>
-            <w:tcW w:w="1108" w:type="dxa"/>
-          </w:tcPr>
-          <w:p/>
-        </w:tc>
-        <w:tc>
-          <w:tcPr>
-            <w:tcW w:w="999" w:type="dxa"/>
-          </w:tcPr>
-          <w:p/>
-        </w:tc>
-        <w:tc>
-          <w:tcPr>
-            <w:tcW w:w="1427" w:type="dxa"/>
+            <w:tcW w:w="2552" w:type="dxa"/>
           </w:tcPr>
           <w:p>
             <w:r>
@@ -6610,7 +6429,7 @@
         </w:tc>
         <w:tc>
           <w:tcPr>
-            <w:tcW w:w="1129" w:type="dxa"/>
+            <w:tcW w:w="1134" w:type="dxa"/>
           </w:tcPr>
           <w:p>
             <w:r>
@@ -6620,7 +6439,7 @@
         </w:tc>
         <w:tc>
           <w:tcPr>
-            <w:tcW w:w="1268" w:type="dxa"/>
+            <w:tcW w:w="1671" w:type="dxa"/>
           </w:tcPr>
           <w:p/>
         </w:tc>
@@ -6628,17 +6447,19 @@
       <w:tr>
         <w:tc>
           <w:tcPr>
-            <w:tcW w:w="1635" w:type="dxa"/>
+            <w:tcW w:w="1951" w:type="dxa"/>
           </w:tcPr>
           <w:p>
+            <w:proofErr w:type="spellStart"/>
             <w:r>
               <w:t>ShipParts</w:t>
             </w:r>
+            <w:proofErr w:type="spellEnd"/>
           </w:p>
         </w:tc>
         <w:tc>
           <w:tcPr>
-            <w:tcW w:w="1024" w:type="dxa"/>
+            <w:tcW w:w="1241" w:type="dxa"/>
           </w:tcPr>
           <w:p>
             <w:r>
@@ -6648,25 +6469,13 @@
         </w:tc>
         <w:tc>
           <w:tcPr>
-            <w:tcW w:w="986" w:type="dxa"/>
+            <w:tcW w:w="1027" w:type="dxa"/>
           </w:tcPr>
           <w:p/>
         </w:tc>
         <w:tc>
           <w:tcPr>
-            <w:tcW w:w="1108" w:type="dxa"/>
-          </w:tcPr>
-          <w:p/>
-        </w:tc>
-        <w:tc>
-          <w:tcPr>
-            <w:tcW w:w="999" w:type="dxa"/>
-          </w:tcPr>
-          <w:p/>
-        </w:tc>
-        <w:tc>
-          <w:tcPr>
-            <w:tcW w:w="1427" w:type="dxa"/>
+            <w:tcW w:w="2552" w:type="dxa"/>
           </w:tcPr>
           <w:p>
             <w:r>
@@ -6676,7 +6485,7 @@
         </w:tc>
         <w:tc>
           <w:tcPr>
-            <w:tcW w:w="1129" w:type="dxa"/>
+            <w:tcW w:w="1134" w:type="dxa"/>
           </w:tcPr>
           <w:p>
             <w:r>
@@ -6686,7 +6495,7 @@
         </w:tc>
         <w:tc>
           <w:tcPr>
-            <w:tcW w:w="1268" w:type="dxa"/>
+            <w:tcW w:w="1671" w:type="dxa"/>
           </w:tcPr>
           <w:p>
             <w:r>
@@ -6698,17 +6507,19 @@
       <w:tr>
         <w:tc>
           <w:tcPr>
-            <w:tcW w:w="1635" w:type="dxa"/>
+            <w:tcW w:w="1951" w:type="dxa"/>
           </w:tcPr>
           <w:p>
+            <w:proofErr w:type="spellStart"/>
             <w:r>
               <w:t>MineFlagged</w:t>
             </w:r>
+            <w:proofErr w:type="spellEnd"/>
           </w:p>
         </w:tc>
         <w:tc>
           <w:tcPr>
-            <w:tcW w:w="1024" w:type="dxa"/>
+            <w:tcW w:w="1241" w:type="dxa"/>
           </w:tcPr>
           <w:p>
             <w:r>
@@ -6718,25 +6529,13 @@
         </w:tc>
         <w:tc>
           <w:tcPr>
-            <w:tcW w:w="986" w:type="dxa"/>
+            <w:tcW w:w="1027" w:type="dxa"/>
           </w:tcPr>
           <w:p/>
         </w:tc>
         <w:tc>
           <w:tcPr>
-            <w:tcW w:w="1108" w:type="dxa"/>
-          </w:tcPr>
-          <w:p/>
-        </w:tc>
-        <w:tc>
-          <w:tcPr>
-            <w:tcW w:w="999" w:type="dxa"/>
-          </w:tcPr>
-          <w:p/>
-        </w:tc>
-        <w:tc>
-          <w:tcPr>
-            <w:tcW w:w="1427" w:type="dxa"/>
+            <w:tcW w:w="2552" w:type="dxa"/>
           </w:tcPr>
           <w:p>
             <w:r>
@@ -6746,7 +6545,7 @@
         </w:tc>
         <w:tc>
           <w:tcPr>
-            <w:tcW w:w="1129" w:type="dxa"/>
+            <w:tcW w:w="1134" w:type="dxa"/>
           </w:tcPr>
           <w:p>
             <w:r>
@@ -6756,7 +6555,7 @@
         </w:tc>
         <w:tc>
           <w:tcPr>
-            <w:tcW w:w="1268" w:type="dxa"/>
+            <w:tcW w:w="1671" w:type="dxa"/>
           </w:tcPr>
           <w:p/>
         </w:tc>
@@ -6764,17 +6563,19 @@
       <w:tr>
         <w:tc>
           <w:tcPr>
-            <w:tcW w:w="1635" w:type="dxa"/>
+            <w:tcW w:w="1951" w:type="dxa"/>
           </w:tcPr>
           <w:p>
+            <w:proofErr w:type="spellStart"/>
             <w:r>
               <w:t>TileUncovered</w:t>
             </w:r>
+            <w:proofErr w:type="spellEnd"/>
           </w:p>
         </w:tc>
         <w:tc>
           <w:tcPr>
-            <w:tcW w:w="1024" w:type="dxa"/>
+            <w:tcW w:w="1241" w:type="dxa"/>
           </w:tcPr>
           <w:p>
             <w:r>
@@ -6784,25 +6585,13 @@
         </w:tc>
         <w:tc>
           <w:tcPr>
-            <w:tcW w:w="986" w:type="dxa"/>
+            <w:tcW w:w="1027" w:type="dxa"/>
           </w:tcPr>
           <w:p/>
         </w:tc>
         <w:tc>
           <w:tcPr>
-            <w:tcW w:w="1108" w:type="dxa"/>
-          </w:tcPr>
-          <w:p/>
-        </w:tc>
-        <w:tc>
-          <w:tcPr>
-            <w:tcW w:w="999" w:type="dxa"/>
-          </w:tcPr>
-          <w:p/>
-        </w:tc>
-        <w:tc>
-          <w:tcPr>
-            <w:tcW w:w="1427" w:type="dxa"/>
+            <w:tcW w:w="2552" w:type="dxa"/>
           </w:tcPr>
           <w:p>
             <w:r>
@@ -6812,7 +6601,7 @@
         </w:tc>
         <w:tc>
           <w:tcPr>
-            <w:tcW w:w="1129" w:type="dxa"/>
+            <w:tcW w:w="1134" w:type="dxa"/>
           </w:tcPr>
           <w:p>
             <w:r>
@@ -6822,7 +6611,7 @@
         </w:tc>
         <w:tc>
           <w:tcPr>
-            <w:tcW w:w="1268" w:type="dxa"/>
+            <w:tcW w:w="1671" w:type="dxa"/>
           </w:tcPr>
           <w:p>
             <w:r>
@@ -6834,17 +6623,19 @@
       <w:tr>
         <w:tc>
           <w:tcPr>
-            <w:tcW w:w="1635" w:type="dxa"/>
+            <w:tcW w:w="1951" w:type="dxa"/>
           </w:tcPr>
           <w:p>
+            <w:proofErr w:type="spellStart"/>
             <w:r>
               <w:t>TilesRemain</w:t>
             </w:r>
+            <w:proofErr w:type="spellEnd"/>
           </w:p>
         </w:tc>
         <w:tc>
           <w:tcPr>
-            <w:tcW w:w="1024" w:type="dxa"/>
+            <w:tcW w:w="1241" w:type="dxa"/>
           </w:tcPr>
           <w:p>
             <w:r>
@@ -6854,25 +6645,13 @@
         </w:tc>
         <w:tc>
           <w:tcPr>
-            <w:tcW w:w="986" w:type="dxa"/>
+            <w:tcW w:w="1027" w:type="dxa"/>
           </w:tcPr>
           <w:p/>
         </w:tc>
         <w:tc>
           <w:tcPr>
-            <w:tcW w:w="1108" w:type="dxa"/>
-          </w:tcPr>
-          <w:p/>
-        </w:tc>
-        <w:tc>
-          <w:tcPr>
-            <w:tcW w:w="999" w:type="dxa"/>
-          </w:tcPr>
-          <w:p/>
-        </w:tc>
-        <w:tc>
-          <w:tcPr>
-            <w:tcW w:w="1427" w:type="dxa"/>
+            <w:tcW w:w="2552" w:type="dxa"/>
           </w:tcPr>
           <w:p>
             <w:r>
@@ -6882,7 +6661,7 @@
         </w:tc>
         <w:tc>
           <w:tcPr>
-            <w:tcW w:w="1129" w:type="dxa"/>
+            <w:tcW w:w="1134" w:type="dxa"/>
           </w:tcPr>
           <w:p>
             <w:r>
@@ -6892,7 +6671,7 @@
         </w:tc>
         <w:tc>
           <w:tcPr>
-            <w:tcW w:w="1268" w:type="dxa"/>
+            <w:tcW w:w="1671" w:type="dxa"/>
           </w:tcPr>
           <w:p>
             <w:r>
@@ -6904,17 +6683,19 @@
       <w:tr>
         <w:tc>
           <w:tcPr>
-            <w:tcW w:w="1635" w:type="dxa"/>
+            <w:tcW w:w="1951" w:type="dxa"/>
           </w:tcPr>
           <w:p>
+            <w:proofErr w:type="spellStart"/>
             <w:r>
               <w:t>PlayerScore</w:t>
             </w:r>
+            <w:proofErr w:type="spellEnd"/>
           </w:p>
         </w:tc>
         <w:tc>
           <w:tcPr>
-            <w:tcW w:w="1024" w:type="dxa"/>
+            <w:tcW w:w="1241" w:type="dxa"/>
           </w:tcPr>
           <w:p>
             <w:r>
@@ -6924,38 +6705,23 @@
         </w:tc>
         <w:tc>
           <w:tcPr>
-            <w:tcW w:w="986" w:type="dxa"/>
+            <w:tcW w:w="1027" w:type="dxa"/>
           </w:tcPr>
           <w:p/>
         </w:tc>
         <w:tc>
           <w:tcPr>
-            <w:tcW w:w="1108" w:type="dxa"/>
-          </w:tcPr>
-          <w:p/>
-        </w:tc>
-        <w:tc>
-          <w:tcPr>
-            <w:tcW w:w="999" w:type="dxa"/>
-          </w:tcPr>
-          <w:p/>
-        </w:tc>
-        <w:tc>
-          <w:tcPr>
-            <w:tcW w:w="1427" w:type="dxa"/>
+            <w:tcW w:w="2552" w:type="dxa"/>
           </w:tcPr>
           <w:p>
             <w:r>
-              <w:t xml:space="preserve">Used to write the final score of </w:t>
-            </w:r>
-            <w:r>
-              <w:t>players</w:t>
+              <w:t>Used to write the final score of players</w:t>
             </w:r>
           </w:p>
         </w:tc>
         <w:tc>
           <w:tcPr>
-            <w:tcW w:w="1129" w:type="dxa"/>
+            <w:tcW w:w="1134" w:type="dxa"/>
           </w:tcPr>
           <w:p>
             <w:r>
@@ -6965,7 +6731,7 @@
         </w:tc>
         <w:tc>
           <w:tcPr>
-            <w:tcW w:w="1268" w:type="dxa"/>
+            <w:tcW w:w="1671" w:type="dxa"/>
           </w:tcPr>
           <w:p/>
         </w:tc>
@@ -6973,17 +6739,19 @@
       <w:tr>
         <w:tc>
           <w:tcPr>
-            <w:tcW w:w="1635" w:type="dxa"/>
+            <w:tcW w:w="1951" w:type="dxa"/>
           </w:tcPr>
           <w:p>
+            <w:proofErr w:type="spellStart"/>
             <w:r>
               <w:t>CoverdDebug</w:t>
             </w:r>
+            <w:proofErr w:type="spellEnd"/>
           </w:p>
         </w:tc>
         <w:tc>
           <w:tcPr>
-            <w:tcW w:w="1024" w:type="dxa"/>
+            <w:tcW w:w="1241" w:type="dxa"/>
           </w:tcPr>
           <w:p>
             <w:r>
@@ -6993,7 +6761,7 @@
         </w:tc>
         <w:tc>
           <w:tcPr>
-            <w:tcW w:w="986" w:type="dxa"/>
+            <w:tcW w:w="1027" w:type="dxa"/>
           </w:tcPr>
           <w:p>
             <w:r>
@@ -7003,19 +6771,7 @@
         </w:tc>
         <w:tc>
           <w:tcPr>
-            <w:tcW w:w="1108" w:type="dxa"/>
-          </w:tcPr>
-          <w:p/>
-        </w:tc>
-        <w:tc>
-          <w:tcPr>
-            <w:tcW w:w="999" w:type="dxa"/>
-          </w:tcPr>
-          <w:p/>
-        </w:tc>
-        <w:tc>
-          <w:tcPr>
-            <w:tcW w:w="1427" w:type="dxa"/>
+            <w:tcW w:w="2552" w:type="dxa"/>
           </w:tcPr>
           <w:p>
             <w:r>
@@ -7025,7 +6781,7 @@
         </w:tc>
         <w:tc>
           <w:tcPr>
-            <w:tcW w:w="1129" w:type="dxa"/>
+            <w:tcW w:w="1134" w:type="dxa"/>
           </w:tcPr>
           <w:p>
             <w:r>
@@ -7035,7 +6791,7 @@
         </w:tc>
         <w:tc>
           <w:tcPr>
-            <w:tcW w:w="1268" w:type="dxa"/>
+            <w:tcW w:w="1671" w:type="dxa"/>
           </w:tcPr>
           <w:p/>
         </w:tc>
@@ -7043,7 +6799,7 @@
       <w:tr>
         <w:tc>
           <w:tcPr>
-            <w:tcW w:w="1635" w:type="dxa"/>
+            <w:tcW w:w="1951" w:type="dxa"/>
           </w:tcPr>
           <w:p>
             <w:r>
@@ -7053,7 +6809,7 @@
         </w:tc>
         <w:tc>
           <w:tcPr>
-            <w:tcW w:w="1024" w:type="dxa"/>
+            <w:tcW w:w="1241" w:type="dxa"/>
           </w:tcPr>
           <w:p>
             <w:r>
@@ -7063,7 +6819,7 @@
         </w:tc>
         <w:tc>
           <w:tcPr>
-            <w:tcW w:w="986" w:type="dxa"/>
+            <w:tcW w:w="1027" w:type="dxa"/>
           </w:tcPr>
           <w:p>
             <w:r>
@@ -7073,47 +6829,27 @@
         </w:tc>
         <w:tc>
           <w:tcPr>
-            <w:tcW w:w="1108" w:type="dxa"/>
-          </w:tcPr>
-          <w:p/>
-        </w:tc>
-        <w:tc>
-          <w:tcPr>
-            <w:tcW w:w="999" w:type="dxa"/>
-          </w:tcPr>
-          <w:p/>
-        </w:tc>
-        <w:tc>
-          <w:tcPr>
-            <w:tcW w:w="1427" w:type="dxa"/>
+            <w:tcW w:w="2552" w:type="dxa"/>
           </w:tcPr>
           <w:p>
             <w:r>
-              <w:t>Used as an if statement parameter</w:t>
-            </w:r>
-            <w:r>
-              <w:t xml:space="preserve"> for if the </w:t>
-            </w:r>
-            <w:r>
-              <w:lastRenderedPageBreak/>
-              <w:t>sprite is currently /not currently being clicked on</w:t>
+              <w:t>Used as an if statement parameter for if the sprite is currently /not currently being clicked on</w:t>
             </w:r>
           </w:p>
         </w:tc>
         <w:tc>
           <w:tcPr>
-            <w:tcW w:w="1129" w:type="dxa"/>
+            <w:tcW w:w="1134" w:type="dxa"/>
           </w:tcPr>
           <w:p>
             <w:r>
-              <w:lastRenderedPageBreak/>
               <w:t>False</w:t>
             </w:r>
           </w:p>
         </w:tc>
         <w:tc>
           <w:tcPr>
-            <w:tcW w:w="1268" w:type="dxa"/>
+            <w:tcW w:w="1671" w:type="dxa"/>
           </w:tcPr>
           <w:p/>
         </w:tc>
@@ -7121,17 +6857,19 @@
       <w:tr>
         <w:tc>
           <w:tcPr>
-            <w:tcW w:w="1635" w:type="dxa"/>
+            <w:tcW w:w="1951" w:type="dxa"/>
           </w:tcPr>
           <w:p>
+            <w:proofErr w:type="spellStart"/>
             <w:r>
               <w:t>IsMine</w:t>
             </w:r>
+            <w:proofErr w:type="spellEnd"/>
           </w:p>
         </w:tc>
         <w:tc>
           <w:tcPr>
-            <w:tcW w:w="1024" w:type="dxa"/>
+            <w:tcW w:w="1241" w:type="dxa"/>
           </w:tcPr>
           <w:p>
             <w:r>
@@ -7141,7 +6879,7 @@
         </w:tc>
         <w:tc>
           <w:tcPr>
-            <w:tcW w:w="986" w:type="dxa"/>
+            <w:tcW w:w="1027" w:type="dxa"/>
           </w:tcPr>
           <w:p>
             <w:r>
@@ -7151,19 +6889,7 @@
         </w:tc>
         <w:tc>
           <w:tcPr>
-            <w:tcW w:w="1108" w:type="dxa"/>
-          </w:tcPr>
-          <w:p/>
-        </w:tc>
-        <w:tc>
-          <w:tcPr>
-            <w:tcW w:w="999" w:type="dxa"/>
-          </w:tcPr>
-          <w:p/>
-        </w:tc>
-        <w:tc>
-          <w:tcPr>
-            <w:tcW w:w="1427" w:type="dxa"/>
+            <w:tcW w:w="2552" w:type="dxa"/>
           </w:tcPr>
           <w:p>
             <w:r>
@@ -7173,7 +6899,7 @@
         </w:tc>
         <w:tc>
           <w:tcPr>
-            <w:tcW w:w="1129" w:type="dxa"/>
+            <w:tcW w:w="1134" w:type="dxa"/>
           </w:tcPr>
           <w:p>
             <w:r>
@@ -7183,7 +6909,7 @@
         </w:tc>
         <w:tc>
           <w:tcPr>
-            <w:tcW w:w="1268" w:type="dxa"/>
+            <w:tcW w:w="1671" w:type="dxa"/>
           </w:tcPr>
           <w:p/>
         </w:tc>
@@ -7191,7 +6917,7 @@
       <w:tr>
         <w:tc>
           <w:tcPr>
-            <w:tcW w:w="1635" w:type="dxa"/>
+            <w:tcW w:w="1951" w:type="dxa"/>
           </w:tcPr>
           <w:p>
             <w:proofErr w:type="spellStart"/>
@@ -7203,7 +6929,7 @@
         </w:tc>
         <w:tc>
           <w:tcPr>
-            <w:tcW w:w="1024" w:type="dxa"/>
+            <w:tcW w:w="1241" w:type="dxa"/>
           </w:tcPr>
           <w:p>
             <w:r>
@@ -7213,7 +6939,7 @@
         </w:tc>
         <w:tc>
           <w:tcPr>
-            <w:tcW w:w="986" w:type="dxa"/>
+            <w:tcW w:w="1027" w:type="dxa"/>
           </w:tcPr>
           <w:p>
             <w:r>
@@ -7223,35 +6949,454 @@
         </w:tc>
         <w:tc>
           <w:tcPr>
-            <w:tcW w:w="1108" w:type="dxa"/>
+            <w:tcW w:w="2552" w:type="dxa"/>
+          </w:tcPr>
+          <w:p>
+            <w:r>
+              <w:t xml:space="preserve">Indicates if the tile has a ship part </w:t>
+            </w:r>
+          </w:p>
+        </w:tc>
+        <w:tc>
+          <w:tcPr>
+            <w:tcW w:w="1134" w:type="dxa"/>
           </w:tcPr>
           <w:p/>
         </w:tc>
         <w:tc>
           <w:tcPr>
-            <w:tcW w:w="999" w:type="dxa"/>
+            <w:tcW w:w="1671" w:type="dxa"/>
+          </w:tcPr>
+          <w:p/>
+        </w:tc>
+      </w:tr>
+      <w:tr>
+        <w:tc>
+          <w:tcPr>
+            <w:tcW w:w="1951" w:type="dxa"/>
+          </w:tcPr>
+          <w:p>
+            <w:proofErr w:type="spellStart"/>
+            <w:r>
+              <w:t>SurroundMine</w:t>
+            </w:r>
+            <w:proofErr w:type="spellEnd"/>
+            <w:r>
+              <w:t>-</w:t>
+            </w:r>
+            <w:r>
+              <w:t>Count</w:t>
+            </w:r>
+          </w:p>
+        </w:tc>
+        <w:tc>
+          <w:tcPr>
+            <w:tcW w:w="1241" w:type="dxa"/>
+          </w:tcPr>
+          <w:p>
+            <w:r>
+              <w:t>Integer</w:t>
+            </w:r>
+          </w:p>
+        </w:tc>
+        <w:tc>
+          <w:tcPr>
+            <w:tcW w:w="1027" w:type="dxa"/>
           </w:tcPr>
           <w:p/>
         </w:tc>
         <w:tc>
           <w:tcPr>
-            <w:tcW w:w="1427" w:type="dxa"/>
+            <w:tcW w:w="2552" w:type="dxa"/>
           </w:tcPr>
           <w:p>
             <w:r>
-              <w:t xml:space="preserve">Indicates if the tile has a ship part </w:t>
+              <w:t xml:space="preserve">Keeps track the </w:t>
+            </w:r>
+            <w:r>
+              <w:t>number</w:t>
+            </w:r>
+            <w:r>
+              <w:t xml:space="preserve"> of mines around the tile</w:t>
             </w:r>
           </w:p>
         </w:tc>
         <w:tc>
           <w:tcPr>
-            <w:tcW w:w="1129" w:type="dxa"/>
+            <w:tcW w:w="1134" w:type="dxa"/>
+          </w:tcPr>
+          <w:p>
+            <w:r>
+              <w:t>3</w:t>
+            </w:r>
+          </w:p>
+        </w:tc>
+        <w:tc>
+          <w:tcPr>
+            <w:tcW w:w="1671" w:type="dxa"/>
+          </w:tcPr>
+          <w:p/>
+        </w:tc>
+      </w:tr>
+      <w:tr>
+        <w:tc>
+          <w:tcPr>
+            <w:tcW w:w="1951" w:type="dxa"/>
+          </w:tcPr>
+          <w:p>
+            <w:r>
+              <w:t>surrounds</w:t>
+            </w:r>
+          </w:p>
+        </w:tc>
+        <w:tc>
+          <w:tcPr>
+            <w:tcW w:w="1241" w:type="dxa"/>
+          </w:tcPr>
+          <w:p>
+            <w:r>
+              <w:t xml:space="preserve">Array of </w:t>
+            </w:r>
+            <w:r>
+              <w:t>nodes</w:t>
+            </w:r>
+          </w:p>
+        </w:tc>
+        <w:tc>
+          <w:tcPr>
+            <w:tcW w:w="1027" w:type="dxa"/>
           </w:tcPr>
           <w:p/>
         </w:tc>
         <w:tc>
           <w:tcPr>
-            <w:tcW w:w="1268" w:type="dxa"/>
+            <w:tcW w:w="2552" w:type="dxa"/>
+          </w:tcPr>
+          <w:p>
+            <w:r>
+              <w:t xml:space="preserve">A </w:t>
+            </w:r>
+            <w:r>
+              <w:t>list</w:t>
+            </w:r>
+            <w:r>
+              <w:t xml:space="preserve"> of tile nodes append</w:t>
+            </w:r>
+            <w:r>
+              <w:t>ed</w:t>
+            </w:r>
+            <w:r>
+              <w:t xml:space="preserve"> by into the array after the code founds that they are surrounding the selected tile node</w:t>
+            </w:r>
+          </w:p>
+        </w:tc>
+        <w:tc>
+          <w:tcPr>
+            <w:tcW w:w="1134" w:type="dxa"/>
+          </w:tcPr>
+          <w:p>
+            <w:r>
+              <w:t>&lt;node id&gt;</w:t>
+            </w:r>
+          </w:p>
+        </w:tc>
+        <w:tc>
+          <w:tcPr>
+            <w:tcW w:w="1671" w:type="dxa"/>
+          </w:tcPr>
+          <w:p/>
+        </w:tc>
+      </w:tr>
+      <w:tr>
+        <w:tc>
+          <w:tcPr>
+            <w:tcW w:w="1951" w:type="dxa"/>
+          </w:tcPr>
+          <w:p>
+            <w:r>
+              <w:t>offsets</w:t>
+            </w:r>
+          </w:p>
+        </w:tc>
+        <w:tc>
+          <w:tcPr>
+            <w:tcW w:w="1241" w:type="dxa"/>
+          </w:tcPr>
+          <w:p>
+            <w:r>
+              <w:t>Array of integers</w:t>
+            </w:r>
+          </w:p>
+        </w:tc>
+        <w:tc>
+          <w:tcPr>
+            <w:tcW w:w="1027" w:type="dxa"/>
+          </w:tcPr>
+          <w:p/>
+        </w:tc>
+        <w:tc>
+          <w:tcPr>
+            <w:tcW w:w="2552" w:type="dxa"/>
+          </w:tcPr>
+          <w:p>
+            <w:r>
+              <w:t xml:space="preserve">A </w:t>
+            </w:r>
+            <w:r>
+              <w:t>list</w:t>
+            </w:r>
+            <w:r>
+              <w:t xml:space="preserve"> of offset integers for the code to use to found surrounding tile nodes</w:t>
+            </w:r>
+          </w:p>
+        </w:tc>
+        <w:tc>
+          <w:tcPr>
+            <w:tcW w:w="1134" w:type="dxa"/>
+          </w:tcPr>
+          <w:p>
+            <w:r>
+              <w:t xml:space="preserve">(Vector2.UP) </w:t>
+            </w:r>
+            <w:r>
+              <w:t xml:space="preserve">x </w:t>
+            </w:r>
+            <w:r>
+              <w:t>65</w:t>
+            </w:r>
+          </w:p>
+        </w:tc>
+        <w:tc>
+          <w:tcPr>
+            <w:tcW w:w="1671" w:type="dxa"/>
+          </w:tcPr>
+          <w:p/>
+        </w:tc>
+      </w:tr>
+      <w:tr>
+        <w:tc>
+          <w:tcPr>
+            <w:tcW w:w="1951" w:type="dxa"/>
+          </w:tcPr>
+          <w:p>
+            <w:r>
+              <w:t>Tile</w:t>
+            </w:r>
+          </w:p>
+        </w:tc>
+        <w:tc>
+          <w:tcPr>
+            <w:tcW w:w="1241" w:type="dxa"/>
+          </w:tcPr>
+          <w:p>
+            <w:r>
+              <w:t xml:space="preserve">File </w:t>
+            </w:r>
+            <w:r>
+              <w:t>(Sequential)</w:t>
+            </w:r>
+          </w:p>
+        </w:tc>
+        <w:tc>
+          <w:tcPr>
+            <w:tcW w:w="1027" w:type="dxa"/>
+          </w:tcPr>
+          <w:p/>
+        </w:tc>
+        <w:tc>
+          <w:tcPr>
+            <w:tcW w:w="2552" w:type="dxa"/>
+          </w:tcPr>
+          <w:p>
+            <w:r>
+              <w:t xml:space="preserve">A scene that contains data for one interactive tile </w:t>
+            </w:r>
+          </w:p>
+        </w:tc>
+        <w:tc>
+          <w:tcPr>
+            <w:tcW w:w="1134" w:type="dxa"/>
+          </w:tcPr>
+          <w:p/>
+        </w:tc>
+        <w:tc>
+          <w:tcPr>
+            <w:tcW w:w="1671" w:type="dxa"/>
+          </w:tcPr>
+          <w:p/>
+        </w:tc>
+      </w:tr>
+      <w:tr>
+        <w:tc>
+          <w:tcPr>
+            <w:tcW w:w="1951" w:type="dxa"/>
+          </w:tcPr>
+          <w:p>
+            <w:r>
+              <w:t>tiles</w:t>
+            </w:r>
+          </w:p>
+        </w:tc>
+        <w:tc>
+          <w:tcPr>
+            <w:tcW w:w="1241" w:type="dxa"/>
+          </w:tcPr>
+          <w:p>
+            <w:r>
+              <w:t>Array of nodes</w:t>
+            </w:r>
+          </w:p>
+        </w:tc>
+        <w:tc>
+          <w:tcPr>
+            <w:tcW w:w="1027" w:type="dxa"/>
+          </w:tcPr>
+          <w:p/>
+        </w:tc>
+        <w:tc>
+          <w:tcPr>
+            <w:tcW w:w="2552" w:type="dxa"/>
+          </w:tcPr>
+          <w:p>
+            <w:r>
+              <w:t>A list of append child tile nodes that have been created by the code</w:t>
+            </w:r>
+          </w:p>
+        </w:tc>
+        <w:tc>
+          <w:tcPr>
+            <w:tcW w:w="1134" w:type="dxa"/>
+          </w:tcPr>
+          <w:p>
+            <w:r>
+              <w:t>&lt;node id&gt;</w:t>
+            </w:r>
+          </w:p>
+        </w:tc>
+        <w:tc>
+          <w:tcPr>
+            <w:tcW w:w="1671" w:type="dxa"/>
+          </w:tcPr>
+          <w:p/>
+        </w:tc>
+      </w:tr>
+      <w:tr>
+        <w:tc>
+          <w:tcPr>
+            <w:tcW w:w="1951" w:type="dxa"/>
+          </w:tcPr>
+          <w:p>
+            <w:r>
+              <w:t>n</w:t>
+            </w:r>
+          </w:p>
+        </w:tc>
+        <w:tc>
+          <w:tcPr>
+            <w:tcW w:w="1241" w:type="dxa"/>
+          </w:tcPr>
+          <w:p>
+            <w:r>
+              <w:t xml:space="preserve">Integer </w:t>
+            </w:r>
+          </w:p>
+        </w:tc>
+        <w:tc>
+          <w:tcPr>
+            <w:tcW w:w="1027" w:type="dxa"/>
+          </w:tcPr>
+          <w:p/>
+        </w:tc>
+        <w:tc>
+          <w:tcPr>
+            <w:tcW w:w="2552" w:type="dxa"/>
+          </w:tcPr>
+          <w:p>
+            <w:r>
+              <w:t xml:space="preserve">A parameter that allows to code to check if the </w:t>
+            </w:r>
+            <w:proofErr w:type="gramStart"/>
+            <w:r>
+              <w:t>amount</w:t>
+            </w:r>
+            <w:proofErr w:type="gramEnd"/>
+            <w:r>
+              <w:t xml:space="preserve"> of existing </w:t>
+            </w:r>
+            <w:r>
+              <w:lastRenderedPageBreak/>
+              <w:t>mines does not go over a set amount</w:t>
+            </w:r>
+          </w:p>
+        </w:tc>
+        <w:tc>
+          <w:tcPr>
+            <w:tcW w:w="1134" w:type="dxa"/>
+          </w:tcPr>
+          <w:p>
+            <w:r>
+              <w:lastRenderedPageBreak/>
+              <w:t>4</w:t>
+            </w:r>
+          </w:p>
+        </w:tc>
+        <w:tc>
+          <w:tcPr>
+            <w:tcW w:w="1671" w:type="dxa"/>
+          </w:tcPr>
+          <w:p/>
+        </w:tc>
+      </w:tr>
+      <w:tr>
+        <w:tc>
+          <w:tcPr>
+            <w:tcW w:w="1951" w:type="dxa"/>
+          </w:tcPr>
+          <w:p>
+            <w:r>
+              <w:t>tile</w:t>
+            </w:r>
+          </w:p>
+        </w:tc>
+        <w:tc>
+          <w:tcPr>
+            <w:tcW w:w="1241" w:type="dxa"/>
+          </w:tcPr>
+          <w:p>
+            <w:r>
+              <w:t>node</w:t>
+            </w:r>
+          </w:p>
+        </w:tc>
+        <w:tc>
+          <w:tcPr>
+            <w:tcW w:w="1027" w:type="dxa"/>
+          </w:tcPr>
+          <w:p/>
+        </w:tc>
+        <w:tc>
+          <w:tcPr>
+            <w:tcW w:w="2552" w:type="dxa"/>
+          </w:tcPr>
+          <w:p>
+            <w:r>
+              <w:t>A randomly selected node that was selected to become a mind</w:t>
+            </w:r>
+          </w:p>
+        </w:tc>
+        <w:tc>
+          <w:tcPr>
+            <w:tcW w:w="1134" w:type="dxa"/>
+          </w:tcPr>
+          <w:p>
+            <w:r>
+              <w:t>&lt;node id&gt;</w:t>
+            </w:r>
+          </w:p>
+        </w:tc>
+        <w:tc>
+          <w:tcPr>
+            <w:tcW w:w="1671" w:type="dxa"/>
           </w:tcPr>
           <w:p/>
         </w:tc>
@@ -7266,6 +7411,70 @@
         <w:t>Procedure Lists</w:t>
       </w:r>
     </w:p>
+    <w:tbl>
+      <w:tblPr>
+        <w:tblStyle w:val="TableGrid"/>
+        <w:tblW w:w="0" w:type="auto"/>
+        <w:tblLook w:val="04A0" w:firstRow="1" w:lastRow="0" w:firstColumn="1" w:lastColumn="0" w:noHBand="0" w:noVBand="1"/>
+      </w:tblPr>
+      <w:tblGrid>
+        <w:gridCol w:w="1525"/>
+        <w:gridCol w:w="8051"/>
+      </w:tblGrid>
+      <w:tr>
+        <w:tc>
+          <w:tcPr>
+            <w:tcW w:w="1384" w:type="dxa"/>
+          </w:tcPr>
+          <w:p>
+            <w:r>
+              <w:t xml:space="preserve">Procedures </w:t>
+            </w:r>
+          </w:p>
+        </w:tc>
+        <w:tc>
+          <w:tcPr>
+            <w:tcW w:w="8192" w:type="dxa"/>
+          </w:tcPr>
+          <w:p>
+            <w:r>
+              <w:t>Description</w:t>
+            </w:r>
+          </w:p>
+        </w:tc>
+      </w:tr>
+      <w:tr>
+        <w:tc>
+          <w:tcPr>
+            <w:tcW w:w="1384" w:type="dxa"/>
+          </w:tcPr>
+          <w:p>
+            <w:proofErr w:type="spellStart"/>
+            <w:r>
+              <w:t>BeginGame</w:t>
+            </w:r>
+            <w:proofErr w:type="spellEnd"/>
+            <w:r>
+              <w:t>()</w:t>
+            </w:r>
+          </w:p>
+        </w:tc>
+        <w:tc>
+          <w:tcPr>
+            <w:tcW w:w="8192" w:type="dxa"/>
+          </w:tcPr>
+          <w:p>
+            <w:r>
+              <w:t xml:space="preserve">Sets starting </w:t>
+            </w:r>
+            <w:r>
+              <w:t xml:space="preserve">variable </w:t>
+            </w:r>
+          </w:p>
+        </w:tc>
+      </w:tr>
+    </w:tbl>
+    <w:p/>
     <w:p/>
     <w:p>
       <w:pPr>
@@ -7546,43 +7755,43 @@
         </w:numPr>
       </w:pPr>
       <w:r>
+        <w:t>Refined:</w:t>
+      </w:r>
+    </w:p>
+    <w:p>
+      <w:pPr>
+        <w:pStyle w:val="ListParagraph"/>
+        <w:numPr>
+          <w:ilvl w:val="2"/>
+          <w:numId w:val="22"/>
+        </w:numPr>
+      </w:pPr>
+      <w:r>
+        <w:t>Sketch of all screens</w:t>
+      </w:r>
+    </w:p>
+    <w:p>
+      <w:pPr>
+        <w:pStyle w:val="ListParagraph"/>
+        <w:numPr>
+          <w:ilvl w:val="3"/>
+          <w:numId w:val="22"/>
+        </w:numPr>
+      </w:pPr>
+      <w:r>
+        <w:t>Added “submitting name for final score” screen</w:t>
+      </w:r>
+    </w:p>
+    <w:p>
+      <w:pPr>
+        <w:pStyle w:val="ListParagraph"/>
+        <w:numPr>
+          <w:ilvl w:val="0"/>
+          <w:numId w:val="22"/>
+        </w:numPr>
+      </w:pPr>
+      <w:r>
         <w:lastRenderedPageBreak/>
-        <w:t>Refined:</w:t>
-      </w:r>
-    </w:p>
-    <w:p>
-      <w:pPr>
-        <w:pStyle w:val="ListParagraph"/>
-        <w:numPr>
-          <w:ilvl w:val="2"/>
-          <w:numId w:val="22"/>
-        </w:numPr>
-      </w:pPr>
-      <w:r>
-        <w:t>Sketch of all screens</w:t>
-      </w:r>
-    </w:p>
-    <w:p>
-      <w:pPr>
-        <w:pStyle w:val="ListParagraph"/>
-        <w:numPr>
-          <w:ilvl w:val="3"/>
-          <w:numId w:val="22"/>
-        </w:numPr>
-      </w:pPr>
-      <w:r>
-        <w:t>Added “submitting name for final score” screen</w:t>
-      </w:r>
-    </w:p>
-    <w:p>
-      <w:pPr>
-        <w:pStyle w:val="ListParagraph"/>
-        <w:numPr>
-          <w:ilvl w:val="0"/>
-          <w:numId w:val="22"/>
-        </w:numPr>
-      </w:pPr>
-      <w:r>
         <w:t xml:space="preserve">Started creating </w:t>
       </w:r>
       <w:r>
@@ -8070,43 +8279,43 @@
         </w:numPr>
       </w:pPr>
       <w:r>
+        <w:t>Gantt Chart Progress check</w:t>
+      </w:r>
+    </w:p>
+    <w:p>
+      <w:pPr>
+        <w:pStyle w:val="ListParagraph"/>
+        <w:numPr>
+          <w:ilvl w:val="1"/>
+          <w:numId w:val="22"/>
+        </w:numPr>
+      </w:pPr>
+      <w:r>
+        <w:t>Design Brief</w:t>
+      </w:r>
+    </w:p>
+    <w:p>
+      <w:pPr>
+        <w:pStyle w:val="ListParagraph"/>
+        <w:numPr>
+          <w:ilvl w:val="2"/>
+          <w:numId w:val="22"/>
+        </w:numPr>
+      </w:pPr>
+      <w:r>
+        <w:t>On Course</w:t>
+      </w:r>
+    </w:p>
+    <w:p>
+      <w:pPr>
+        <w:pStyle w:val="ListParagraph"/>
+        <w:numPr>
+          <w:ilvl w:val="2"/>
+          <w:numId w:val="22"/>
+        </w:numPr>
+      </w:pPr>
+      <w:r>
         <w:lastRenderedPageBreak/>
-        <w:t>Gantt Chart Progress check</w:t>
-      </w:r>
-    </w:p>
-    <w:p>
-      <w:pPr>
-        <w:pStyle w:val="ListParagraph"/>
-        <w:numPr>
-          <w:ilvl w:val="1"/>
-          <w:numId w:val="22"/>
-        </w:numPr>
-      </w:pPr>
-      <w:r>
-        <w:t>Design Brief</w:t>
-      </w:r>
-    </w:p>
-    <w:p>
-      <w:pPr>
-        <w:pStyle w:val="ListParagraph"/>
-        <w:numPr>
-          <w:ilvl w:val="2"/>
-          <w:numId w:val="22"/>
-        </w:numPr>
-      </w:pPr>
-      <w:r>
-        <w:t>On Course</w:t>
-      </w:r>
-    </w:p>
-    <w:p>
-      <w:pPr>
-        <w:pStyle w:val="ListParagraph"/>
-        <w:numPr>
-          <w:ilvl w:val="2"/>
-          <w:numId w:val="22"/>
-        </w:numPr>
-      </w:pPr>
-      <w:r>
         <w:t>Specifications</w:t>
       </w:r>
     </w:p>
@@ -8601,43 +8810,43 @@
         </w:numPr>
       </w:pPr>
       <w:r>
+        <w:t>Begin drafting specifications</w:t>
+      </w:r>
+    </w:p>
+    <w:p>
+      <w:pPr>
+        <w:pStyle w:val="ListParagraph"/>
+        <w:numPr>
+          <w:ilvl w:val="1"/>
+          <w:numId w:val="22"/>
+        </w:numPr>
+      </w:pPr>
+      <w:r>
+        <w:t>Complete draft of Basic Functionality of game</w:t>
+      </w:r>
+    </w:p>
+    <w:p>
+      <w:pPr>
+        <w:pStyle w:val="ListParagraph"/>
+        <w:numPr>
+          <w:ilvl w:val="1"/>
+          <w:numId w:val="22"/>
+        </w:numPr>
+      </w:pPr>
+      <w:r>
+        <w:t>Completed draft of Limitation</w:t>
+      </w:r>
+    </w:p>
+    <w:p>
+      <w:pPr>
+        <w:pStyle w:val="ListParagraph"/>
+        <w:numPr>
+          <w:ilvl w:val="2"/>
+          <w:numId w:val="22"/>
+        </w:numPr>
+      </w:pPr>
+      <w:r>
         <w:lastRenderedPageBreak/>
-        <w:t>Begin drafting specifications</w:t>
-      </w:r>
-    </w:p>
-    <w:p>
-      <w:pPr>
-        <w:pStyle w:val="ListParagraph"/>
-        <w:numPr>
-          <w:ilvl w:val="1"/>
-          <w:numId w:val="22"/>
-        </w:numPr>
-      </w:pPr>
-      <w:r>
-        <w:t>Complete draft of Basic Functionality of game</w:t>
-      </w:r>
-    </w:p>
-    <w:p>
-      <w:pPr>
-        <w:pStyle w:val="ListParagraph"/>
-        <w:numPr>
-          <w:ilvl w:val="1"/>
-          <w:numId w:val="22"/>
-        </w:numPr>
-      </w:pPr>
-      <w:r>
-        <w:t>Completed draft of Limitation</w:t>
-      </w:r>
-    </w:p>
-    <w:p>
-      <w:pPr>
-        <w:pStyle w:val="ListParagraph"/>
-        <w:numPr>
-          <w:ilvl w:val="2"/>
-          <w:numId w:val="22"/>
-        </w:numPr>
-      </w:pPr>
-      <w:r>
         <w:t>Researched points of limitation with ChatGPT</w:t>
       </w:r>
     </w:p>
@@ -9110,7 +9319,6 @@
       <w:bookmarkStart w:id="50" w:name="_Toc169689641"/>
       <w:bookmarkEnd w:id="49"/>
       <w:r>
-        <w:lastRenderedPageBreak/>
         <w:t>23rd of May</w:t>
       </w:r>
       <w:bookmarkEnd w:id="50"/>
@@ -9163,6 +9371,7 @@
         <w:rPr>
           <w:lang w:val="en-US"/>
         </w:rPr>
+        <w:lastRenderedPageBreak/>
         <w:t>Added additional information about the source code being converting into object code</w:t>
       </w:r>
     </w:p>
@@ -9638,38 +9847,38 @@
       <w:bookmarkStart w:id="54" w:name="_Toc169689643"/>
       <w:bookmarkEnd w:id="53"/>
       <w:r>
+        <w:t>27th of May</w:t>
+      </w:r>
+      <w:bookmarkEnd w:id="54"/>
+    </w:p>
+    <w:p>
+      <w:pPr>
+        <w:pStyle w:val="ListParagraph"/>
+        <w:numPr>
+          <w:ilvl w:val="0"/>
+          <w:numId w:val="22"/>
+        </w:numPr>
+      </w:pPr>
+      <w:r>
+        <w:t>Refining Data flow,</w:t>
+      </w:r>
+      <w:r>
+        <w:t xml:space="preserve"> </w:t>
+      </w:r>
+      <w:r>
+        <w:t>IPO table</w:t>
+      </w:r>
+    </w:p>
+    <w:p>
+      <w:pPr>
+        <w:pStyle w:val="ListParagraph"/>
+        <w:numPr>
+          <w:ilvl w:val="1"/>
+          <w:numId w:val="22"/>
+        </w:numPr>
+      </w:pPr>
+      <w:r>
         <w:lastRenderedPageBreak/>
-        <w:t>27th of May</w:t>
-      </w:r>
-      <w:bookmarkEnd w:id="54"/>
-    </w:p>
-    <w:p>
-      <w:pPr>
-        <w:pStyle w:val="ListParagraph"/>
-        <w:numPr>
-          <w:ilvl w:val="0"/>
-          <w:numId w:val="22"/>
-        </w:numPr>
-      </w:pPr>
-      <w:r>
-        <w:t>Refining Data flow,</w:t>
-      </w:r>
-      <w:r>
-        <w:t xml:space="preserve"> </w:t>
-      </w:r>
-      <w:r>
-        <w:t>IPO table</w:t>
-      </w:r>
-    </w:p>
-    <w:p>
-      <w:pPr>
-        <w:pStyle w:val="ListParagraph"/>
-        <w:numPr>
-          <w:ilvl w:val="1"/>
-          <w:numId w:val="22"/>
-        </w:numPr>
-      </w:pPr>
-      <w:r>
         <w:t>Data flow</w:t>
       </w:r>
     </w:p>
@@ -10129,56 +10338,56 @@
       <w:bookmarkStart w:id="58" w:name="_Toc169689645"/>
       <w:bookmarkEnd w:id="57"/>
       <w:r>
+        <w:t>29th of May</w:t>
+      </w:r>
+      <w:bookmarkEnd w:id="58"/>
+    </w:p>
+    <w:p>
+      <w:pPr>
+        <w:pStyle w:val="ListParagraph"/>
+        <w:numPr>
+          <w:ilvl w:val="0"/>
+          <w:numId w:val="22"/>
+        </w:numPr>
+      </w:pPr>
+      <w:r>
+        <w:t>Refining Data flow</w:t>
+      </w:r>
+    </w:p>
+    <w:p>
+      <w:pPr>
+        <w:pStyle w:val="ListParagraph"/>
+        <w:numPr>
+          <w:ilvl w:val="1"/>
+          <w:numId w:val="22"/>
+        </w:numPr>
+      </w:pPr>
+      <w:r>
+        <w:t>Data flow</w:t>
+      </w:r>
+    </w:p>
+    <w:p>
+      <w:pPr>
+        <w:pStyle w:val="ListParagraph"/>
+        <w:numPr>
+          <w:ilvl w:val="2"/>
+          <w:numId w:val="22"/>
+        </w:numPr>
+      </w:pPr>
+      <w:r>
+        <w:t>Removed process</w:t>
+      </w:r>
+    </w:p>
+    <w:p>
+      <w:pPr>
+        <w:pStyle w:val="ListParagraph"/>
+        <w:numPr>
+          <w:ilvl w:val="2"/>
+          <w:numId w:val="22"/>
+        </w:numPr>
+      </w:pPr>
+      <w:r>
         <w:lastRenderedPageBreak/>
-        <w:t>29th of May</w:t>
-      </w:r>
-      <w:bookmarkEnd w:id="58"/>
-    </w:p>
-    <w:p>
-      <w:pPr>
-        <w:pStyle w:val="ListParagraph"/>
-        <w:numPr>
-          <w:ilvl w:val="0"/>
-          <w:numId w:val="22"/>
-        </w:numPr>
-      </w:pPr>
-      <w:r>
-        <w:t>Refining Data flow</w:t>
-      </w:r>
-    </w:p>
-    <w:p>
-      <w:pPr>
-        <w:pStyle w:val="ListParagraph"/>
-        <w:numPr>
-          <w:ilvl w:val="1"/>
-          <w:numId w:val="22"/>
-        </w:numPr>
-      </w:pPr>
-      <w:r>
-        <w:t>Data flow</w:t>
-      </w:r>
-    </w:p>
-    <w:p>
-      <w:pPr>
-        <w:pStyle w:val="ListParagraph"/>
-        <w:numPr>
-          <w:ilvl w:val="2"/>
-          <w:numId w:val="22"/>
-        </w:numPr>
-      </w:pPr>
-      <w:r>
-        <w:t>Removed process</w:t>
-      </w:r>
-    </w:p>
-    <w:p>
-      <w:pPr>
-        <w:pStyle w:val="ListParagraph"/>
-        <w:numPr>
-          <w:ilvl w:val="2"/>
-          <w:numId w:val="22"/>
-        </w:numPr>
-      </w:pPr>
-      <w:r>
         <w:t>Added data arrows</w:t>
       </w:r>
     </w:p>
@@ -10630,44 +10839,44 @@
       <w:bookmarkStart w:id="62" w:name="_Toc169689647"/>
       <w:bookmarkEnd w:id="61"/>
       <w:r>
+        <w:t>31st of May</w:t>
+      </w:r>
+      <w:bookmarkEnd w:id="62"/>
+    </w:p>
+    <w:p>
+      <w:pPr>
+        <w:pStyle w:val="ListParagraph"/>
+        <w:numPr>
+          <w:ilvl w:val="0"/>
+          <w:numId w:val="22"/>
+        </w:numPr>
+      </w:pPr>
+      <w:r>
+        <w:t>Refining Structure chart</w:t>
+      </w:r>
+    </w:p>
+    <w:p>
+      <w:pPr>
+        <w:pStyle w:val="ListParagraph"/>
+        <w:numPr>
+          <w:ilvl w:val="1"/>
+          <w:numId w:val="22"/>
+        </w:numPr>
+      </w:pPr>
+      <w:r>
+        <w:t>Change format</w:t>
+      </w:r>
+    </w:p>
+    <w:p>
+      <w:pPr>
+        <w:pStyle w:val="ListParagraph"/>
+        <w:numPr>
+          <w:ilvl w:val="1"/>
+          <w:numId w:val="22"/>
+        </w:numPr>
+      </w:pPr>
+      <w:r>
         <w:lastRenderedPageBreak/>
-        <w:t>31st of May</w:t>
-      </w:r>
-      <w:bookmarkEnd w:id="62"/>
-    </w:p>
-    <w:p>
-      <w:pPr>
-        <w:pStyle w:val="ListParagraph"/>
-        <w:numPr>
-          <w:ilvl w:val="0"/>
-          <w:numId w:val="22"/>
-        </w:numPr>
-      </w:pPr>
-      <w:r>
-        <w:t>Refining Structure chart</w:t>
-      </w:r>
-    </w:p>
-    <w:p>
-      <w:pPr>
-        <w:pStyle w:val="ListParagraph"/>
-        <w:numPr>
-          <w:ilvl w:val="1"/>
-          <w:numId w:val="22"/>
-        </w:numPr>
-      </w:pPr>
-      <w:r>
-        <w:t>Change format</w:t>
-      </w:r>
-    </w:p>
-    <w:p>
-      <w:pPr>
-        <w:pStyle w:val="ListParagraph"/>
-        <w:numPr>
-          <w:ilvl w:val="1"/>
-          <w:numId w:val="22"/>
-        </w:numPr>
-      </w:pPr>
-      <w:r>
         <w:t xml:space="preserve">Decide to do it after the code is </w:t>
       </w:r>
       <w:r>
@@ -11162,43 +11371,43 @@
         </w:numPr>
       </w:pPr>
       <w:r>
+        <w:t>Documentation</w:t>
+      </w:r>
+    </w:p>
+    <w:p>
+      <w:pPr>
+        <w:pStyle w:val="ListParagraph"/>
+        <w:numPr>
+          <w:ilvl w:val="2"/>
+          <w:numId w:val="22"/>
+        </w:numPr>
+      </w:pPr>
+      <w:r>
+        <w:t>On Course</w:t>
+      </w:r>
+    </w:p>
+    <w:p>
+      <w:pPr>
+        <w:pStyle w:val="ListParagraph"/>
+        <w:numPr>
+          <w:ilvl w:val="1"/>
+          <w:numId w:val="22"/>
+        </w:numPr>
+      </w:pPr>
+      <w:r>
+        <w:t>Coding</w:t>
+      </w:r>
+    </w:p>
+    <w:p>
+      <w:pPr>
+        <w:pStyle w:val="ListParagraph"/>
+        <w:numPr>
+          <w:ilvl w:val="2"/>
+          <w:numId w:val="22"/>
+        </w:numPr>
+      </w:pPr>
+      <w:r>
         <w:lastRenderedPageBreak/>
-        <w:t>Documentation</w:t>
-      </w:r>
-    </w:p>
-    <w:p>
-      <w:pPr>
-        <w:pStyle w:val="ListParagraph"/>
-        <w:numPr>
-          <w:ilvl w:val="2"/>
-          <w:numId w:val="22"/>
-        </w:numPr>
-      </w:pPr>
-      <w:r>
-        <w:t>On Course</w:t>
-      </w:r>
-    </w:p>
-    <w:p>
-      <w:pPr>
-        <w:pStyle w:val="ListParagraph"/>
-        <w:numPr>
-          <w:ilvl w:val="1"/>
-          <w:numId w:val="22"/>
-        </w:numPr>
-      </w:pPr>
-      <w:r>
-        <w:t>Coding</w:t>
-      </w:r>
-    </w:p>
-    <w:p>
-      <w:pPr>
-        <w:pStyle w:val="ListParagraph"/>
-        <w:numPr>
-          <w:ilvl w:val="2"/>
-          <w:numId w:val="22"/>
-        </w:numPr>
-      </w:pPr>
-      <w:r>
         <w:t>On Course</w:t>
       </w:r>
     </w:p>
@@ -11676,43 +11885,43 @@
         </w:numPr>
       </w:pPr>
       <w:r>
+        <w:t>Aims</w:t>
+      </w:r>
+    </w:p>
+    <w:p>
+      <w:pPr>
+        <w:pStyle w:val="ListParagraph"/>
+        <w:numPr>
+          <w:ilvl w:val="2"/>
+          <w:numId w:val="22"/>
+        </w:numPr>
+      </w:pPr>
+      <w:r>
+        <w:t>Added more specific elaboration</w:t>
+      </w:r>
+    </w:p>
+    <w:p>
+      <w:pPr>
+        <w:pStyle w:val="ListParagraph"/>
+        <w:numPr>
+          <w:ilvl w:val="1"/>
+          <w:numId w:val="22"/>
+        </w:numPr>
+      </w:pPr>
+      <w:r>
+        <w:t>Objectives</w:t>
+      </w:r>
+    </w:p>
+    <w:p>
+      <w:pPr>
+        <w:pStyle w:val="ListParagraph"/>
+        <w:numPr>
+          <w:ilvl w:val="2"/>
+          <w:numId w:val="22"/>
+        </w:numPr>
+      </w:pPr>
+      <w:r>
         <w:lastRenderedPageBreak/>
-        <w:t>Aims</w:t>
-      </w:r>
-    </w:p>
-    <w:p>
-      <w:pPr>
-        <w:pStyle w:val="ListParagraph"/>
-        <w:numPr>
-          <w:ilvl w:val="2"/>
-          <w:numId w:val="22"/>
-        </w:numPr>
-      </w:pPr>
-      <w:r>
-        <w:t>Added more specific elaboration</w:t>
-      </w:r>
-    </w:p>
-    <w:p>
-      <w:pPr>
-        <w:pStyle w:val="ListParagraph"/>
-        <w:numPr>
-          <w:ilvl w:val="1"/>
-          <w:numId w:val="22"/>
-        </w:numPr>
-      </w:pPr>
-      <w:r>
-        <w:t>Objectives</w:t>
-      </w:r>
-    </w:p>
-    <w:p>
-      <w:pPr>
-        <w:pStyle w:val="ListParagraph"/>
-        <w:numPr>
-          <w:ilvl w:val="2"/>
-          <w:numId w:val="22"/>
-        </w:numPr>
-      </w:pPr>
-      <w:r>
         <w:t xml:space="preserve">Replace flask with </w:t>
       </w:r>
       <w:r>
@@ -12219,43 +12428,43 @@
         </w:numPr>
       </w:pPr>
       <w:r>
+        <w:t xml:space="preserve">Behind on schedule </w:t>
+      </w:r>
+    </w:p>
+    <w:p>
+      <w:pPr>
+        <w:pStyle w:val="ListParagraph"/>
+        <w:numPr>
+          <w:ilvl w:val="1"/>
+          <w:numId w:val="22"/>
+        </w:numPr>
+      </w:pPr>
+      <w:r>
+        <w:t>Documentation</w:t>
+      </w:r>
+    </w:p>
+    <w:p>
+      <w:pPr>
+        <w:pStyle w:val="ListParagraph"/>
+        <w:numPr>
+          <w:ilvl w:val="2"/>
+          <w:numId w:val="22"/>
+        </w:numPr>
+      </w:pPr>
+      <w:r>
+        <w:t>On Course</w:t>
+      </w:r>
+    </w:p>
+    <w:p>
+      <w:pPr>
+        <w:pStyle w:val="ListParagraph"/>
+        <w:numPr>
+          <w:ilvl w:val="1"/>
+          <w:numId w:val="22"/>
+        </w:numPr>
+      </w:pPr>
+      <w:r>
         <w:lastRenderedPageBreak/>
-        <w:t xml:space="preserve">Behind on schedule </w:t>
-      </w:r>
-    </w:p>
-    <w:p>
-      <w:pPr>
-        <w:pStyle w:val="ListParagraph"/>
-        <w:numPr>
-          <w:ilvl w:val="1"/>
-          <w:numId w:val="22"/>
-        </w:numPr>
-      </w:pPr>
-      <w:r>
-        <w:t>Documentation</w:t>
-      </w:r>
-    </w:p>
-    <w:p>
-      <w:pPr>
-        <w:pStyle w:val="ListParagraph"/>
-        <w:numPr>
-          <w:ilvl w:val="2"/>
-          <w:numId w:val="22"/>
-        </w:numPr>
-      </w:pPr>
-      <w:r>
-        <w:t>On Course</w:t>
-      </w:r>
-    </w:p>
-    <w:p>
-      <w:pPr>
-        <w:pStyle w:val="ListParagraph"/>
-        <w:numPr>
-          <w:ilvl w:val="1"/>
-          <w:numId w:val="22"/>
-        </w:numPr>
-      </w:pPr>
-      <w:r>
         <w:t>Coding</w:t>
       </w:r>
     </w:p>
@@ -12714,7 +12923,6 @@
       </w:pPr>
       <w:bookmarkStart w:id="77" w:name="_Toc169689657"/>
       <w:r>
-        <w:lastRenderedPageBreak/>
         <w:t>15th of June</w:t>
       </w:r>
       <w:bookmarkEnd w:id="77"/>
@@ -12779,6 +12987,7 @@
         <w:rPr>
           <w:lang w:val="en-US"/>
         </w:rPr>
+        <w:lastRenderedPageBreak/>
         <w:t>% x.size()</w:t>
       </w:r>
     </w:p>
@@ -13284,7 +13493,6 @@
         </w:numPr>
       </w:pPr>
       <w:r>
-        <w:lastRenderedPageBreak/>
         <w:t>Website says it is free for commercial use</w:t>
       </w:r>
     </w:p>
@@ -13335,6 +13543,7 @@
         </w:numPr>
       </w:pPr>
       <w:r>
+        <w:lastRenderedPageBreak/>
         <w:t>Started design HUD</w:t>
       </w:r>
     </w:p>
@@ -13790,58 +13999,58 @@
         </w:numPr>
       </w:pPr>
       <w:r>
+        <w:t>Aim</w:t>
+      </w:r>
+    </w:p>
+    <w:p>
+      <w:pPr>
+        <w:pStyle w:val="ListParagraph"/>
+        <w:numPr>
+          <w:ilvl w:val="2"/>
+          <w:numId w:val="22"/>
+        </w:numPr>
+      </w:pPr>
+      <w:r>
+        <w:t xml:space="preserve">Added mention on software </w:t>
+      </w:r>
+      <w:r>
+        <w:t>approach</w:t>
+      </w:r>
+    </w:p>
+    <w:p>
+      <w:pPr>
+        <w:pStyle w:val="ListParagraph"/>
+        <w:numPr>
+          <w:ilvl w:val="0"/>
+          <w:numId w:val="22"/>
+        </w:numPr>
+      </w:pPr>
+      <w:r>
+        <w:t>Continued development on main game</w:t>
+      </w:r>
+    </w:p>
+    <w:p>
+      <w:pPr>
+        <w:pStyle w:val="ListParagraph"/>
+        <w:numPr>
+          <w:ilvl w:val="1"/>
+          <w:numId w:val="22"/>
+        </w:numPr>
+      </w:pPr>
+      <w:r>
+        <w:t>Continued to design HUD</w:t>
+      </w:r>
+    </w:p>
+    <w:p>
+      <w:pPr>
+        <w:pStyle w:val="ListParagraph"/>
+        <w:numPr>
+          <w:ilvl w:val="2"/>
+          <w:numId w:val="22"/>
+        </w:numPr>
+      </w:pPr>
+      <w:r>
         <w:lastRenderedPageBreak/>
-        <w:t>Aim</w:t>
-      </w:r>
-    </w:p>
-    <w:p>
-      <w:pPr>
-        <w:pStyle w:val="ListParagraph"/>
-        <w:numPr>
-          <w:ilvl w:val="2"/>
-          <w:numId w:val="22"/>
-        </w:numPr>
-      </w:pPr>
-      <w:r>
-        <w:t xml:space="preserve">Added mention on software </w:t>
-      </w:r>
-      <w:r>
-        <w:t>approach</w:t>
-      </w:r>
-    </w:p>
-    <w:p>
-      <w:pPr>
-        <w:pStyle w:val="ListParagraph"/>
-        <w:numPr>
-          <w:ilvl w:val="0"/>
-          <w:numId w:val="22"/>
-        </w:numPr>
-      </w:pPr>
-      <w:r>
-        <w:t>Continued development on main game</w:t>
-      </w:r>
-    </w:p>
-    <w:p>
-      <w:pPr>
-        <w:pStyle w:val="ListParagraph"/>
-        <w:numPr>
-          <w:ilvl w:val="1"/>
-          <w:numId w:val="22"/>
-        </w:numPr>
-      </w:pPr>
-      <w:r>
-        <w:t>Continued to design HUD</w:t>
-      </w:r>
-    </w:p>
-    <w:p>
-      <w:pPr>
-        <w:pStyle w:val="ListParagraph"/>
-        <w:numPr>
-          <w:ilvl w:val="2"/>
-          <w:numId w:val="22"/>
-        </w:numPr>
-      </w:pPr>
-      <w:r>
         <w:t>Made a working start button</w:t>
       </w:r>
     </w:p>
@@ -14368,34 +14577,34 @@
         <w:ind w:firstLine="360"/>
       </w:pPr>
       <w:r>
+        <w:t>22nd</w:t>
+      </w:r>
+      <w:r>
+        <w:t xml:space="preserve"> of June</w:t>
+      </w:r>
+    </w:p>
+    <w:p>
+      <w:pPr>
+        <w:pStyle w:val="ListParagraph"/>
+        <w:numPr>
+          <w:ilvl w:val="0"/>
+          <w:numId w:val="22"/>
+        </w:numPr>
+      </w:pPr>
+      <w:r>
+        <w:t>Continued development on main game</w:t>
+      </w:r>
+    </w:p>
+    <w:p>
+      <w:pPr>
+        <w:pStyle w:val="ListParagraph"/>
+        <w:numPr>
+          <w:ilvl w:val="1"/>
+          <w:numId w:val="22"/>
+        </w:numPr>
+      </w:pPr>
+      <w:r>
         <w:lastRenderedPageBreak/>
-        <w:t>22nd</w:t>
-      </w:r>
-      <w:r>
-        <w:t xml:space="preserve"> of June</w:t>
-      </w:r>
-    </w:p>
-    <w:p>
-      <w:pPr>
-        <w:pStyle w:val="ListParagraph"/>
-        <w:numPr>
-          <w:ilvl w:val="0"/>
-          <w:numId w:val="22"/>
-        </w:numPr>
-      </w:pPr>
-      <w:r>
-        <w:t>Continued development on main game</w:t>
-      </w:r>
-    </w:p>
-    <w:p>
-      <w:pPr>
-        <w:pStyle w:val="ListParagraph"/>
-        <w:numPr>
-          <w:ilvl w:val="1"/>
-          <w:numId w:val="22"/>
-        </w:numPr>
-      </w:pPr>
-      <w:r>
         <w:t>Obtained sprite “Mine.png”</w:t>
       </w:r>
     </w:p>
@@ -14901,6 +15110,7 @@
         <w:ind w:firstLine="360"/>
       </w:pPr>
       <w:r>
+        <w:lastRenderedPageBreak/>
         <w:t>25th of June</w:t>
       </w:r>
     </w:p>
@@ -15222,18 +15432,6 @@
         </w:numPr>
       </w:pPr>
       <w:r>
-        <w:t xml:space="preserve">Continued Algorithm </w:t>
-      </w:r>
-    </w:p>
-    <w:p>
-      <w:pPr>
-        <w:pStyle w:val="ListParagraph"/>
-        <w:numPr>
-          <w:ilvl w:val="0"/>
-          <w:numId w:val="22"/>
-        </w:numPr>
-      </w:pPr>
-      <w:r>
         <w:t>Continued Technical Manual</w:t>
       </w:r>
     </w:p>
@@ -15381,7 +15579,6 @@
         <w:rPr>
           <w:lang w:val="en-US"/>
         </w:rPr>
-        <w:lastRenderedPageBreak/>
         <w:t>Additional task tomorrow</w:t>
       </w:r>
     </w:p>
@@ -15391,6 +15588,7 @@
         <w:ind w:firstLine="360"/>
       </w:pPr>
       <w:r>
+        <w:lastRenderedPageBreak/>
         <w:t>27th of June</w:t>
       </w:r>
     </w:p>
@@ -15594,25 +15792,19 @@
         </w:numPr>
       </w:pPr>
       <w:r>
-        <w:t>Added variables from debug.gd and tile.gd</w:t>
-      </w:r>
-      <w:r>
-        <w:t xml:space="preserve"> </w:t>
-      </w:r>
-    </w:p>
-    <w:p>
-      <w:pPr>
-        <w:pStyle w:val="ListParagraph"/>
-        <w:numPr>
-          <w:ilvl w:val="1"/>
-          <w:numId w:val="22"/>
-        </w:numPr>
-      </w:pPr>
-      <w:r>
-        <w:t>Added more process to procedure list</w:t>
-      </w:r>
-      <w:r>
-        <w:t>s</w:t>
+        <w:t xml:space="preserve">Added variables from debug.gd and tile.gd </w:t>
+      </w:r>
+    </w:p>
+    <w:p>
+      <w:pPr>
+        <w:pStyle w:val="ListParagraph"/>
+        <w:numPr>
+          <w:ilvl w:val="1"/>
+          <w:numId w:val="22"/>
+        </w:numPr>
+      </w:pPr>
+      <w:r>
+        <w:t>Added more process to procedure lists</w:t>
       </w:r>
     </w:p>
     <w:p>
@@ -15750,7 +15942,440 @@
         <w:t>Additional task tomorrow</w:t>
       </w:r>
     </w:p>
-    <w:p/>
+    <w:p>
+      <w:pPr>
+        <w:pStyle w:val="Heading3"/>
+        <w:ind w:firstLine="360"/>
+      </w:pPr>
+      <w:r>
+        <w:t>2</w:t>
+      </w:r>
+      <w:r>
+        <w:t>8</w:t>
+      </w:r>
+      <w:r>
+        <w:t>th of June</w:t>
+      </w:r>
+    </w:p>
+    <w:p>
+      <w:pPr>
+        <w:pStyle w:val="ListParagraph"/>
+        <w:numPr>
+          <w:ilvl w:val="0"/>
+          <w:numId w:val="22"/>
+        </w:numPr>
+      </w:pPr>
+      <w:r>
+        <w:t>Continued development on main game</w:t>
+      </w:r>
+    </w:p>
+    <w:p>
+      <w:pPr>
+        <w:pStyle w:val="ListParagraph"/>
+        <w:numPr>
+          <w:ilvl w:val="1"/>
+          <w:numId w:val="22"/>
+        </w:numPr>
+      </w:pPr>
+      <w:proofErr w:type="spellStart"/>
+      <w:r>
+        <w:t>HUDGame</w:t>
+      </w:r>
+      <w:proofErr w:type="spellEnd"/>
+    </w:p>
+    <w:p>
+      <w:pPr>
+        <w:pStyle w:val="ListParagraph"/>
+        <w:numPr>
+          <w:ilvl w:val="2"/>
+          <w:numId w:val="22"/>
+        </w:numPr>
+      </w:pPr>
+      <w:r>
+        <w:t>Added instruction labels</w:t>
+      </w:r>
+    </w:p>
+    <w:p>
+      <w:pPr>
+        <w:pStyle w:val="ListParagraph"/>
+        <w:numPr>
+          <w:ilvl w:val="0"/>
+          <w:numId w:val="22"/>
+        </w:numPr>
+      </w:pPr>
+      <w:r>
+        <w:t>Gantt Chart Progress check</w:t>
+      </w:r>
+    </w:p>
+    <w:p>
+      <w:pPr>
+        <w:pStyle w:val="ListParagraph"/>
+        <w:numPr>
+          <w:ilvl w:val="1"/>
+          <w:numId w:val="22"/>
+        </w:numPr>
+      </w:pPr>
+      <w:r>
+        <w:t>Algorithm</w:t>
+      </w:r>
+    </w:p>
+    <w:p>
+      <w:pPr>
+        <w:pStyle w:val="ListParagraph"/>
+        <w:numPr>
+          <w:ilvl w:val="2"/>
+          <w:numId w:val="22"/>
+        </w:numPr>
+      </w:pPr>
+      <w:r>
+        <w:t>On course</w:t>
+      </w:r>
+    </w:p>
+    <w:p>
+      <w:pPr>
+        <w:pStyle w:val="ListParagraph"/>
+        <w:numPr>
+          <w:ilvl w:val="1"/>
+          <w:numId w:val="22"/>
+        </w:numPr>
+      </w:pPr>
+      <w:r>
+        <w:t>Documentation</w:t>
+      </w:r>
+    </w:p>
+    <w:p>
+      <w:pPr>
+        <w:pStyle w:val="ListParagraph"/>
+        <w:numPr>
+          <w:ilvl w:val="2"/>
+          <w:numId w:val="22"/>
+        </w:numPr>
+      </w:pPr>
+      <w:r>
+        <w:t>On course</w:t>
+      </w:r>
+    </w:p>
+    <w:p>
+      <w:pPr>
+        <w:pStyle w:val="ListParagraph"/>
+        <w:numPr>
+          <w:ilvl w:val="1"/>
+          <w:numId w:val="22"/>
+        </w:numPr>
+      </w:pPr>
+      <w:r>
+        <w:t>Coding</w:t>
+      </w:r>
+    </w:p>
+    <w:p>
+      <w:pPr>
+        <w:pStyle w:val="ListParagraph"/>
+        <w:numPr>
+          <w:ilvl w:val="2"/>
+          <w:numId w:val="22"/>
+        </w:numPr>
+      </w:pPr>
+      <w:r>
+        <w:t>On Course</w:t>
+      </w:r>
+    </w:p>
+    <w:p>
+      <w:pPr>
+        <w:pStyle w:val="ListParagraph"/>
+        <w:numPr>
+          <w:ilvl w:val="1"/>
+          <w:numId w:val="22"/>
+        </w:numPr>
+      </w:pPr>
+      <w:r>
+        <w:t>Testing</w:t>
+      </w:r>
+    </w:p>
+    <w:p>
+      <w:pPr>
+        <w:pStyle w:val="ListParagraph"/>
+        <w:numPr>
+          <w:ilvl w:val="2"/>
+          <w:numId w:val="22"/>
+        </w:numPr>
+      </w:pPr>
+      <w:r>
+        <w:t xml:space="preserve">Behind on schedule </w:t>
+      </w:r>
+    </w:p>
+    <w:p>
+      <w:pPr>
+        <w:pStyle w:val="ListParagraph"/>
+        <w:numPr>
+          <w:ilvl w:val="0"/>
+          <w:numId w:val="22"/>
+        </w:numPr>
+      </w:pPr>
+      <w:r>
+        <w:rPr>
+          <w:lang w:val="en-US"/>
+        </w:rPr>
+        <w:lastRenderedPageBreak/>
+        <w:t>Additional task tomorro</w:t>
+      </w:r>
+      <w:r>
+        <w:rPr>
+          <w:lang w:val="en-US"/>
+        </w:rPr>
+        <w:t>w</w:t>
+      </w:r>
+    </w:p>
+    <w:p>
+      <w:pPr>
+        <w:pStyle w:val="ListParagraph"/>
+        <w:numPr>
+          <w:ilvl w:val="1"/>
+          <w:numId w:val="22"/>
+        </w:numPr>
+      </w:pPr>
+      <w:r>
+        <w:rPr>
+          <w:lang w:val="en-US"/>
+        </w:rPr>
+        <w:t>Update Technical Manual</w:t>
+      </w:r>
+    </w:p>
+    <w:p>
+      <w:pPr>
+        <w:pStyle w:val="ListParagraph"/>
+        <w:numPr>
+          <w:ilvl w:val="1"/>
+          <w:numId w:val="22"/>
+        </w:numPr>
+      </w:pPr>
+      <w:r>
+        <w:rPr>
+          <w:lang w:val="en-US"/>
+        </w:rPr>
+        <w:t>Update Algorithm</w:t>
+      </w:r>
+    </w:p>
+    <w:p>
+      <w:pPr>
+        <w:pStyle w:val="Heading3"/>
+        <w:ind w:firstLine="360"/>
+      </w:pPr>
+      <w:r>
+        <w:t>29</w:t>
+      </w:r>
+      <w:r>
+        <w:t>th of June</w:t>
+      </w:r>
+    </w:p>
+    <w:p>
+      <w:pPr>
+        <w:pStyle w:val="ListParagraph"/>
+        <w:numPr>
+          <w:ilvl w:val="0"/>
+          <w:numId w:val="22"/>
+        </w:numPr>
+      </w:pPr>
+      <w:r>
+        <w:t>Continued Technical Manual</w:t>
+      </w:r>
+    </w:p>
+    <w:p>
+      <w:pPr>
+        <w:pStyle w:val="ListParagraph"/>
+        <w:numPr>
+          <w:ilvl w:val="1"/>
+          <w:numId w:val="22"/>
+        </w:numPr>
+      </w:pPr>
+      <w:r>
+        <w:t xml:space="preserve">Added more variables to data dictionary </w:t>
+      </w:r>
+    </w:p>
+    <w:p>
+      <w:pPr>
+        <w:pStyle w:val="ListParagraph"/>
+        <w:numPr>
+          <w:ilvl w:val="2"/>
+          <w:numId w:val="22"/>
+        </w:numPr>
+      </w:pPr>
+      <w:r>
+        <w:t xml:space="preserve">More variables from </w:t>
+      </w:r>
+      <w:r>
+        <w:t>T</w:t>
+      </w:r>
+      <w:r>
+        <w:t>ile.gd</w:t>
+      </w:r>
+    </w:p>
+    <w:p>
+      <w:pPr>
+        <w:pStyle w:val="ListParagraph"/>
+        <w:numPr>
+          <w:ilvl w:val="2"/>
+          <w:numId w:val="22"/>
+        </w:numPr>
+      </w:pPr>
+      <w:r>
+        <w:t xml:space="preserve">Added variables from </w:t>
+      </w:r>
+      <w:r>
+        <w:t>Mechanics.gd</w:t>
+      </w:r>
+    </w:p>
+    <w:p>
+      <w:pPr>
+        <w:pStyle w:val="ListParagraph"/>
+        <w:numPr>
+          <w:ilvl w:val="1"/>
+          <w:numId w:val="22"/>
+        </w:numPr>
+      </w:pPr>
+      <w:r>
+        <w:t>Added more process to procedure lists</w:t>
+      </w:r>
+    </w:p>
+    <w:p>
+      <w:pPr>
+        <w:pStyle w:val="ListParagraph"/>
+        <w:numPr>
+          <w:ilvl w:val="2"/>
+          <w:numId w:val="22"/>
+        </w:numPr>
+      </w:pPr>
+      <w:r>
+        <w:t>Added procedures from</w:t>
+      </w:r>
+    </w:p>
+    <w:p>
+      <w:pPr>
+        <w:pStyle w:val="ListParagraph"/>
+        <w:numPr>
+          <w:ilvl w:val="3"/>
+          <w:numId w:val="22"/>
+        </w:numPr>
+      </w:pPr>
+      <w:r>
+        <w:t>StandAlone</w:t>
+      </w:r>
+      <w:r>
+        <w:t>.gd</w:t>
+      </w:r>
+    </w:p>
+    <w:p>
+      <w:pPr>
+        <w:pStyle w:val="ListParagraph"/>
+        <w:numPr>
+          <w:ilvl w:val="0"/>
+          <w:numId w:val="22"/>
+        </w:numPr>
+      </w:pPr>
+      <w:r>
+        <w:t>Gantt Chart Progress check</w:t>
+      </w:r>
+    </w:p>
+    <w:p>
+      <w:pPr>
+        <w:pStyle w:val="ListParagraph"/>
+        <w:numPr>
+          <w:ilvl w:val="1"/>
+          <w:numId w:val="22"/>
+        </w:numPr>
+      </w:pPr>
+      <w:r>
+        <w:t>Algorithm</w:t>
+      </w:r>
+    </w:p>
+    <w:p>
+      <w:pPr>
+        <w:pStyle w:val="ListParagraph"/>
+        <w:numPr>
+          <w:ilvl w:val="2"/>
+          <w:numId w:val="22"/>
+        </w:numPr>
+      </w:pPr>
+      <w:r>
+        <w:t>On course</w:t>
+      </w:r>
+    </w:p>
+    <w:p>
+      <w:pPr>
+        <w:pStyle w:val="ListParagraph"/>
+        <w:numPr>
+          <w:ilvl w:val="1"/>
+          <w:numId w:val="22"/>
+        </w:numPr>
+      </w:pPr>
+      <w:r>
+        <w:t>Documentation</w:t>
+      </w:r>
+    </w:p>
+    <w:p>
+      <w:pPr>
+        <w:pStyle w:val="ListParagraph"/>
+        <w:numPr>
+          <w:ilvl w:val="2"/>
+          <w:numId w:val="22"/>
+        </w:numPr>
+      </w:pPr>
+      <w:r>
+        <w:t>On course</w:t>
+      </w:r>
+    </w:p>
+    <w:p>
+      <w:pPr>
+        <w:pStyle w:val="ListParagraph"/>
+        <w:numPr>
+          <w:ilvl w:val="1"/>
+          <w:numId w:val="22"/>
+        </w:numPr>
+      </w:pPr>
+      <w:r>
+        <w:t>Coding</w:t>
+      </w:r>
+    </w:p>
+    <w:p>
+      <w:pPr>
+        <w:pStyle w:val="ListParagraph"/>
+        <w:numPr>
+          <w:ilvl w:val="2"/>
+          <w:numId w:val="22"/>
+        </w:numPr>
+      </w:pPr>
+      <w:r>
+        <w:t>On Course</w:t>
+      </w:r>
+    </w:p>
+    <w:p>
+      <w:pPr>
+        <w:pStyle w:val="ListParagraph"/>
+        <w:numPr>
+          <w:ilvl w:val="1"/>
+          <w:numId w:val="22"/>
+        </w:numPr>
+      </w:pPr>
+      <w:r>
+        <w:t>Testing</w:t>
+      </w:r>
+    </w:p>
+    <w:p>
+      <w:pPr>
+        <w:pStyle w:val="ListParagraph"/>
+        <w:numPr>
+          <w:ilvl w:val="2"/>
+          <w:numId w:val="22"/>
+        </w:numPr>
+      </w:pPr>
+      <w:r>
+        <w:t xml:space="preserve">Behind on schedule </w:t>
+      </w:r>
+    </w:p>
+    <w:p>
+      <w:pPr>
+        <w:pStyle w:val="ListParagraph"/>
+      </w:pPr>
+    </w:p>
     <w:sectPr>
       <w:footerReference w:type="default" r:id="rId49"/>
       <w:pgSz w:w="12240" w:h="15840"/>

</xml_diff>

<commit_message>
Edited Sudo Code and Log book
</commit_message>
<xml_diff>
--- a/James Fan - Assessment 3_ Major Project.docx
+++ b/James Fan - Assessment 3_ Major Project.docx
@@ -27,7 +27,7 @@
             <v:stroke endcap="round"/>
             <v:path shadowok="f" o:extrusionok="f" fillok="f" insetpenok="f"/>
             <o:lock v:ext="edit" rotation="t" aspectratio="t" verticies="t" text="t" shapetype="t"/>
-            <o:ink i="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" annotation="t"/>
+            <o:ink i="AM4BHQJ0RgEQWM9UiuaXxU+PBvi60uGbIgMGSBBFI0YjBQM4C2QZIzIKgcf//w+Ax///DzMKgcf/&#10;/w+Ax///DzgJAP7/AwAAAAAACoMBL4dLILAoBAqdb5NAMARrCrAkEwLAl6uc7QKLRWBwKAzaUSOa&#10;wBAIDNKjAoCQGAQyDoflVuWfgEAQKo36SqrG7pAqPAaZAoBI5dEoDAYbCoAQOFwOHIFAIBA4QgKA&#10;wGAQWACH9XPnq59AAAAAA2nAUAgKAQHxE+gKABEggPmDMHm42gG=&#10;" annotation="t"/>
           </v:rect>
         </w:pict>
       </w:r>
@@ -103,7 +103,7 @@
           <w:noProof/>
         </w:rPr>
         <w:drawing>
-          <wp:anchor distT="0" distB="0" distL="114300" distR="114300" simplePos="0" relativeHeight="251662336" behindDoc="0" locked="0" layoutInCell="1" allowOverlap="1" wp14:anchorId="2E5C3EA8" wp14:editId="67E27185">
+          <wp:anchor distT="0" distB="0" distL="114300" distR="114300" simplePos="0" relativeHeight="251662336" behindDoc="0" locked="0" layoutInCell="1" allowOverlap="1" wp14:anchorId="2E5C3EA8" wp14:editId="79F04933">
             <wp:simplePos x="0" y="0"/>
             <wp:positionH relativeFrom="column">
               <wp:posOffset>1417320</wp:posOffset>
@@ -17267,10 +17267,10 @@
         <w:t>3</w:t>
       </w:r>
       <w:r>
-        <w:t>th of Ju</w:t>
-      </w:r>
-      <w:r>
-        <w:t>ly</w:t>
+        <w:t>rd</w:t>
+      </w:r>
+      <w:r>
+        <w:t xml:space="preserve"> of July</w:t>
       </w:r>
     </w:p>
     <w:p>
@@ -17293,6 +17293,93 @@
           <w:numId w:val="22"/>
         </w:numPr>
       </w:pPr>
+      <w:r>
+        <w:t>Added modules</w:t>
+      </w:r>
+    </w:p>
+    <w:p>
+      <w:pPr>
+        <w:pStyle w:val="ListParagraph"/>
+        <w:numPr>
+          <w:ilvl w:val="2"/>
+          <w:numId w:val="22"/>
+        </w:numPr>
+      </w:pPr>
+      <w:r>
+        <w:t>Debug.gd</w:t>
+      </w:r>
+    </w:p>
+    <w:p>
+      <w:pPr>
+        <w:pStyle w:val="ListParagraph"/>
+        <w:numPr>
+          <w:ilvl w:val="3"/>
+          <w:numId w:val="22"/>
+        </w:numPr>
+        <w:rPr>
+          <w:rStyle w:val="notion-enable-hover"/>
+        </w:rPr>
+      </w:pPr>
+      <w:r>
+        <w:rPr>
+          <w:rStyle w:val="notion-enable-hover"/>
+        </w:rPr>
+        <w:t>_process(delta)</w:t>
+      </w:r>
+    </w:p>
+    <w:p>
+      <w:pPr>
+        <w:pStyle w:val="ListParagraph"/>
+        <w:numPr>
+          <w:ilvl w:val="3"/>
+          <w:numId w:val="22"/>
+        </w:numPr>
+        <w:rPr>
+          <w:rStyle w:val="notion-enable-hover"/>
+        </w:rPr>
+      </w:pPr>
+      <w:r>
+        <w:rPr>
+          <w:rStyle w:val="notion-enable-hover"/>
+        </w:rPr>
+        <w:t>_input(event)</w:t>
+      </w:r>
+    </w:p>
+    <w:p>
+      <w:pPr>
+        <w:pStyle w:val="ListParagraph"/>
+        <w:numPr>
+          <w:ilvl w:val="2"/>
+          <w:numId w:val="22"/>
+        </w:numPr>
+      </w:pPr>
+      <w:r>
+        <w:t>GameText.gd</w:t>
+      </w:r>
+    </w:p>
+    <w:p>
+      <w:pPr>
+        <w:pStyle w:val="ListParagraph"/>
+        <w:numPr>
+          <w:ilvl w:val="2"/>
+          <w:numId w:val="22"/>
+        </w:numPr>
+      </w:pPr>
+      <w:r>
+        <w:t>Mechanics.gd</w:t>
+      </w:r>
+    </w:p>
+    <w:p>
+      <w:pPr>
+        <w:pStyle w:val="ListParagraph"/>
+        <w:numPr>
+          <w:ilvl w:val="3"/>
+          <w:numId w:val="22"/>
+        </w:numPr>
+      </w:pPr>
+      <w:r>
+        <w:t>Started work on _ready()</w:t>
+      </w:r>
     </w:p>
     <w:p>
       <w:pPr>
@@ -20978,6 +21065,11 @@
       </w:tblBorders>
     </w:tblPr>
   </w:style>
+  <w:style w:type="character" w:customStyle="1" w:styleId="notion-enable-hover">
+    <w:name w:val="notion-enable-hover"/>
+    <w:basedOn w:val="DefaultParagraphFont"/>
+    <w:rsid w:val="004E5799"/>
+  </w:style>
 </w:styles>
 </file>
 

</xml_diff>

<commit_message>
Got my actaul laptop back
</commit_message>
<xml_diff>
--- a/James Fan - Assessment 3_ Major Project.docx
+++ b/James Fan - Assessment 3_ Major Project.docx
@@ -23,7 +23,7 @@
           <w:noProof/>
         </w:rPr>
         <w:pict w14:anchorId="1963DF64">
-          <v:rect id="Ink 15" o:spid="_x0000_s2051" style="position:absolute;margin-left:243.35pt;margin-top:254.4pt;width:43pt;height:25.8pt;z-index:251663360;visibility:visible;mso-wrap-style:square;mso-width-percent:0;mso-height-percent:0;mso-wrap-distance-left:9pt;mso-wrap-distance-top:0;mso-wrap-distance-right:9pt;mso-wrap-distance-bottom:0;mso-position-horizontal:absolute;mso-position-horizontal-relative:text;mso-position-vertical:absolute;mso-position-vertical-relative:text;mso-width-percent:0;mso-height-percent:0;mso-width-relative:page;mso-height-relative:page" filled="f" strokeweight=".35mm">
+          <v:rect id="Ink 15" o:spid="_x0000_s2051" style="position:absolute;margin-left:243.35pt;margin-top:254.4pt;width:43pt;height:25.8pt;z-index:251663360;visibility:visible" filled="f" strokeweight=".35mm">
             <v:stroke endcap="round"/>
             <v:path shadowok="f" o:extrusionok="f" fillok="f" insetpenok="f"/>
             <o:lock v:ext="edit" rotation="t" aspectratio="t" verticies="t" text="t" shapetype="t"/>
@@ -103,7 +103,7 @@
           <w:noProof/>
         </w:rPr>
         <w:drawing>
-          <wp:anchor distT="0" distB="0" distL="114300" distR="114300" simplePos="0" relativeHeight="251662336" behindDoc="0" locked="0" layoutInCell="1" allowOverlap="1" wp14:anchorId="2E5C3EA8" wp14:editId="23C04024">
+          <wp:anchor distT="0" distB="0" distL="114300" distR="114300" simplePos="0" relativeHeight="251662336" behindDoc="0" locked="0" layoutInCell="1" allowOverlap="1" wp14:anchorId="2E5C3EA8" wp14:editId="6F473420">
             <wp:simplePos x="0" y="0"/>
             <wp:positionH relativeFrom="column">
               <wp:posOffset>1417320</wp:posOffset>
@@ -174,7 +174,7 @@
             <v:stroke joinstyle="miter"/>
             <v:path gradientshapeok="t" o:connecttype="rect"/>
           </v:shapetype>
-          <v:shape id="Text Box 3" o:spid="_x0000_s2050" type="#_x0000_t202" style="position:absolute;margin-left:0;margin-top:133.1pt;width:442.2pt;height:313.8pt;z-index:251659264;visibility:visible;mso-wrap-style:square;mso-width-percent:0;mso-height-percent:0;mso-wrap-distance-left:9pt;mso-wrap-distance-top:0;mso-wrap-distance-right:9pt;mso-wrap-distance-bottom:0;mso-position-horizontal:center;mso-position-horizontal-relative:margin;mso-position-vertical:absolute;mso-position-vertical-relative:text;mso-width-percent:0;mso-height-percent:0;mso-width-relative:margin;mso-height-relative:margin;v-text-anchor:top" o:gfxdata="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" fillcolor="white [3201]" strokecolor="white [3212]" strokeweight=".5pt">
+          <v:shape id="Text Box 3" o:spid="_x0000_s2050" type="#_x0000_t202" style="position:absolute;margin-left:0;margin-top:133.1pt;width:442.2pt;height:313.8pt;z-index:251659264;visibility:visible;mso-position-horizontal:center;mso-position-horizontal-relative:margin;mso-position-vertical-relative:text;mso-width-relative:margin;mso-height-relative:margin" o:gfxdata="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" fillcolor="white [3201]" strokecolor="white [3212]" strokeweight=".5pt">
             <v:path arrowok="t"/>
             <v:textbox>
               <w:txbxContent>
@@ -5056,7 +5056,15 @@
         <w:t xml:space="preserve"> Battlesweeper</w:t>
       </w:r>
       <w:r>
-        <w:t xml:space="preserve"> is a suitable project that is complex in nature but can be completed within the development period where it educational endeavor can help me learn how to tackle integrating two separate game functionalities into a whole functioning game and also how to create an efficient UI and create documentation such as user and technical manual  without confusing the user and/or future developers</w:t>
+        <w:t xml:space="preserve"> is a suitable project that is complex in nature but can be completed within the development period where it educational endeavor can help me learn how to tackle integrating two separate game functionalities into a whole functioning game </w:t>
+      </w:r>
+      <w:proofErr w:type="gramStart"/>
+      <w:r>
+        <w:t>and also</w:t>
+      </w:r>
+      <w:proofErr w:type="gramEnd"/>
+      <w:r>
+        <w:t xml:space="preserve"> how to create an efficient UI and create documentation such as user and technical manual  without confusing the user and/or future developers</w:t>
       </w:r>
     </w:p>
     <w:p>
@@ -7462,9 +7470,11 @@
       <w:r>
         <w:t xml:space="preserve">Select </w:t>
       </w:r>
+      <w:proofErr w:type="spellStart"/>
       <w:r>
         <w:t>BattleSweeper.rar</w:t>
       </w:r>
+      <w:proofErr w:type="spellEnd"/>
       <w:r>
         <w:t xml:space="preserve"> </w:t>
       </w:r>
@@ -8173,9 +8183,11 @@
             <w:tcW w:w="1951" w:type="dxa"/>
           </w:tcPr>
           <w:p>
+            <w:proofErr w:type="spellStart"/>
             <w:r>
               <w:t>GameOver</w:t>
             </w:r>
+            <w:proofErr w:type="spellEnd"/>
           </w:p>
         </w:tc>
         <w:tc>
@@ -8251,9 +8263,11 @@
             <w:tcW w:w="1951" w:type="dxa"/>
           </w:tcPr>
           <w:p>
+            <w:proofErr w:type="spellStart"/>
             <w:r>
               <w:t>CoverdDebug</w:t>
             </w:r>
+            <w:proofErr w:type="spellEnd"/>
           </w:p>
         </w:tc>
         <w:tc>
@@ -8407,9 +8421,11 @@
             <w:tcW w:w="1951" w:type="dxa"/>
           </w:tcPr>
           <w:p>
+            <w:proofErr w:type="spellStart"/>
             <w:r>
               <w:t>IsMine</w:t>
             </w:r>
+            <w:proofErr w:type="spellEnd"/>
           </w:p>
         </w:tc>
         <w:tc>
@@ -8485,9 +8501,11 @@
             <w:tcW w:w="1951" w:type="dxa"/>
           </w:tcPr>
           <w:p>
+            <w:proofErr w:type="spellStart"/>
             <w:r>
               <w:t>IsOccupied</w:t>
             </w:r>
+            <w:proofErr w:type="spellEnd"/>
           </w:p>
         </w:tc>
         <w:tc>
@@ -8778,9 +8796,11 @@
             <w:tcW w:w="1951" w:type="dxa"/>
           </w:tcPr>
           <w:p>
+            <w:proofErr w:type="spellStart"/>
             <w:r>
               <w:t>MineNumber</w:t>
             </w:r>
+            <w:proofErr w:type="spellEnd"/>
           </w:p>
         </w:tc>
         <w:tc>
@@ -8852,9 +8872,11 @@
             <w:tcW w:w="1951" w:type="dxa"/>
           </w:tcPr>
           <w:p>
+            <w:proofErr w:type="spellStart"/>
             <w:r>
               <w:t>ShipParts</w:t>
             </w:r>
+            <w:proofErr w:type="spellEnd"/>
           </w:p>
         </w:tc>
         <w:tc>
@@ -8930,9 +8952,11 @@
             <w:tcW w:w="1951" w:type="dxa"/>
           </w:tcPr>
           <w:p>
+            <w:proofErr w:type="spellStart"/>
             <w:r>
               <w:t>MineFlagged</w:t>
             </w:r>
+            <w:proofErr w:type="spellEnd"/>
           </w:p>
         </w:tc>
         <w:tc>
@@ -9004,9 +9028,11 @@
             <w:tcW w:w="1951" w:type="dxa"/>
           </w:tcPr>
           <w:p>
+            <w:proofErr w:type="spellStart"/>
             <w:r>
               <w:t>TileUncovered</w:t>
             </w:r>
+            <w:proofErr w:type="spellEnd"/>
           </w:p>
         </w:tc>
         <w:tc>
@@ -9082,9 +9108,11 @@
             <w:tcW w:w="1951" w:type="dxa"/>
           </w:tcPr>
           <w:p>
+            <w:proofErr w:type="spellStart"/>
             <w:r>
               <w:t>TilesRemain</w:t>
             </w:r>
+            <w:proofErr w:type="spellEnd"/>
           </w:p>
         </w:tc>
         <w:tc>
@@ -9156,9 +9184,11 @@
             <w:tcW w:w="1951" w:type="dxa"/>
           </w:tcPr>
           <w:p>
+            <w:proofErr w:type="spellStart"/>
             <w:r>
               <w:t>PlayerScore</w:t>
             </w:r>
+            <w:proofErr w:type="spellEnd"/>
           </w:p>
         </w:tc>
         <w:tc>
@@ -9226,9 +9256,11 @@
             <w:tcW w:w="1951" w:type="dxa"/>
           </w:tcPr>
           <w:p>
+            <w:proofErr w:type="spellStart"/>
             <w:r>
               <w:t>SurroundMine</w:t>
             </w:r>
+            <w:proofErr w:type="spellEnd"/>
             <w:r>
               <w:t>-</w:t>
             </w:r>
@@ -9346,7 +9378,19 @@
           </w:tcPr>
           <w:p>
             <w:r>
-              <w:t>A parameter that allows to code to check if the amount of existing mines does not go over a 1set amount</w:t>
+              <w:t xml:space="preserve">A parameter that allows to code to check if the </w:t>
+            </w:r>
+            <w:r>
+              <w:t>number</w:t>
+            </w:r>
+            <w:r>
+              <w:t xml:space="preserve"> of existing mines does not go over a 1</w:t>
+            </w:r>
+            <w:r>
+              <w:t xml:space="preserve"> </w:t>
+            </w:r>
+            <w:r>
+              <w:t>set amount</w:t>
             </w:r>
           </w:p>
         </w:tc>
@@ -9357,6 +9401,244 @@
           <w:p>
             <w:r>
               <w:t>4</w:t>
+            </w:r>
+          </w:p>
+        </w:tc>
+        <w:tc>
+          <w:tcPr>
+            <w:tcW w:w="1389" w:type="dxa"/>
+          </w:tcPr>
+          <w:p/>
+        </w:tc>
+      </w:tr>
+      <w:tr>
+        <w:tc>
+          <w:tcPr>
+            <w:tcW w:w="1951" w:type="dxa"/>
+          </w:tcPr>
+          <w:p>
+            <w:r>
+              <w:t xml:space="preserve">command </w:t>
+            </w:r>
+          </w:p>
+        </w:tc>
+        <w:tc>
+          <w:tcPr>
+            <w:tcW w:w="1418" w:type="dxa"/>
+          </w:tcPr>
+          <w:p>
+            <w:r>
+              <w:t>string</w:t>
+            </w:r>
+          </w:p>
+        </w:tc>
+        <w:tc>
+          <w:tcPr>
+            <w:tcW w:w="992" w:type="dxa"/>
+          </w:tcPr>
+          <w:p/>
+        </w:tc>
+        <w:tc>
+          <w:tcPr>
+            <w:tcW w:w="1276" w:type="dxa"/>
+          </w:tcPr>
+          <w:p>
+            <w:r>
+              <w:t>20</w:t>
+            </w:r>
+          </w:p>
+        </w:tc>
+        <w:tc>
+          <w:tcPr>
+            <w:tcW w:w="1275" w:type="dxa"/>
+          </w:tcPr>
+          <w:p>
+            <w:r>
+              <w:t>20</w:t>
+            </w:r>
+          </w:p>
+        </w:tc>
+        <w:tc>
+          <w:tcPr>
+            <w:tcW w:w="4820" w:type="dxa"/>
+          </w:tcPr>
+          <w:p>
+            <w:r>
+              <w:t>Used to allow the program to know what type of debug the developer wants to turn on</w:t>
+            </w:r>
+          </w:p>
+        </w:tc>
+        <w:tc>
+          <w:tcPr>
+            <w:tcW w:w="1559" w:type="dxa"/>
+          </w:tcPr>
+          <w:p>
+            <w:r>
+              <w:t>cover</w:t>
+            </w:r>
+          </w:p>
+        </w:tc>
+        <w:tc>
+          <w:tcPr>
+            <w:tcW w:w="1389" w:type="dxa"/>
+          </w:tcPr>
+          <w:p/>
+        </w:tc>
+      </w:tr>
+      <w:tr>
+        <w:tc>
+          <w:tcPr>
+            <w:tcW w:w="1951" w:type="dxa"/>
+          </w:tcPr>
+          <w:p>
+            <w:proofErr w:type="spellStart"/>
+            <w:r>
+              <w:t>ListenerOn</w:t>
+            </w:r>
+            <w:proofErr w:type="spellEnd"/>
+          </w:p>
+        </w:tc>
+        <w:tc>
+          <w:tcPr>
+            <w:tcW w:w="1418" w:type="dxa"/>
+          </w:tcPr>
+          <w:p>
+            <w:r>
+              <w:t>Boolean</w:t>
+            </w:r>
+          </w:p>
+        </w:tc>
+        <w:tc>
+          <w:tcPr>
+            <w:tcW w:w="992" w:type="dxa"/>
+          </w:tcPr>
+          <w:p>
+            <w:r>
+              <w:t>X</w:t>
+            </w:r>
+          </w:p>
+        </w:tc>
+        <w:tc>
+          <w:tcPr>
+            <w:tcW w:w="1276" w:type="dxa"/>
+          </w:tcPr>
+          <w:p>
+            <w:r>
+              <w:t>1</w:t>
+            </w:r>
+          </w:p>
+        </w:tc>
+        <w:tc>
+          <w:tcPr>
+            <w:tcW w:w="1275" w:type="dxa"/>
+          </w:tcPr>
+          <w:p>
+            <w:r>
+              <w:t>1</w:t>
+            </w:r>
+          </w:p>
+        </w:tc>
+        <w:tc>
+          <w:tcPr>
+            <w:tcW w:w="4820" w:type="dxa"/>
+          </w:tcPr>
+          <w:p>
+            <w:r>
+              <w:t xml:space="preserve">A parameter to turn on or off the </w:t>
+            </w:r>
+            <w:r>
+              <w:t>keyboard</w:t>
+            </w:r>
+            <w:r>
+              <w:t xml:space="preserve"> listener</w:t>
+            </w:r>
+          </w:p>
+        </w:tc>
+        <w:tc>
+          <w:tcPr>
+            <w:tcW w:w="1559" w:type="dxa"/>
+          </w:tcPr>
+          <w:p>
+            <w:r>
+              <w:t>False</w:t>
+            </w:r>
+          </w:p>
+        </w:tc>
+        <w:tc>
+          <w:tcPr>
+            <w:tcW w:w="1389" w:type="dxa"/>
+          </w:tcPr>
+          <w:p/>
+        </w:tc>
+      </w:tr>
+      <w:tr>
+        <w:tc>
+          <w:tcPr>
+            <w:tcW w:w="1951" w:type="dxa"/>
+          </w:tcPr>
+          <w:p>
+            <w:r>
+              <w:t>Exploded</w:t>
+            </w:r>
+          </w:p>
+        </w:tc>
+        <w:tc>
+          <w:tcPr>
+            <w:tcW w:w="1418" w:type="dxa"/>
+          </w:tcPr>
+          <w:p>
+            <w:r>
+              <w:t>Boolean</w:t>
+            </w:r>
+          </w:p>
+        </w:tc>
+        <w:tc>
+          <w:tcPr>
+            <w:tcW w:w="992" w:type="dxa"/>
+          </w:tcPr>
+          <w:p>
+            <w:r>
+              <w:t>X</w:t>
+            </w:r>
+          </w:p>
+        </w:tc>
+        <w:tc>
+          <w:tcPr>
+            <w:tcW w:w="1276" w:type="dxa"/>
+          </w:tcPr>
+          <w:p>
+            <w:r>
+              <w:t>1</w:t>
+            </w:r>
+          </w:p>
+        </w:tc>
+        <w:tc>
+          <w:tcPr>
+            <w:tcW w:w="1275" w:type="dxa"/>
+          </w:tcPr>
+          <w:p>
+            <w:r>
+              <w:t>1</w:t>
+            </w:r>
+          </w:p>
+        </w:tc>
+        <w:tc>
+          <w:tcPr>
+            <w:tcW w:w="4820" w:type="dxa"/>
+          </w:tcPr>
+          <w:p>
+            <w:r>
+              <w:t>A parameter that indicates to the program that the tile has a damaging explosion from the mine</w:t>
+            </w:r>
+          </w:p>
+        </w:tc>
+        <w:tc>
+          <w:tcPr>
+            <w:tcW w:w="1559" w:type="dxa"/>
+          </w:tcPr>
+          <w:p>
+            <w:r>
+              <w:t>True</w:t>
             </w:r>
           </w:p>
         </w:tc>
@@ -9499,8 +9781,13 @@
             <w:tcW w:w="1384" w:type="dxa"/>
           </w:tcPr>
           <w:p>
-            <w:r>
-              <w:t>BeginGame()</w:t>
+            <w:proofErr w:type="spellStart"/>
+            <w:r>
+              <w:t>BeginGame</w:t>
+            </w:r>
+            <w:proofErr w:type="spellEnd"/>
+            <w:r>
+              <w:t>()</w:t>
             </w:r>
           </w:p>
         </w:tc>
@@ -9545,9 +9832,11 @@
             <w:tcW w:w="1384" w:type="dxa"/>
           </w:tcPr>
           <w:p>
+            <w:proofErr w:type="spellStart"/>
             <w:r>
               <w:t>LevelReset</w:t>
             </w:r>
+            <w:proofErr w:type="spellEnd"/>
             <w:r>
               <w:t>()</w:t>
             </w:r>
@@ -9559,22 +9848,7 @@
           </w:tcPr>
           <w:p>
             <w:r>
-              <w:t xml:space="preserve">Sets or resets </w:t>
-            </w:r>
-            <w:r>
-              <w:t xml:space="preserve">some </w:t>
-            </w:r>
-            <w:r>
-              <w:t>variable</w:t>
-            </w:r>
-            <w:r>
-              <w:t>s</w:t>
-            </w:r>
-            <w:r>
-              <w:t xml:space="preserve"> for other scripts to use</w:t>
-            </w:r>
-            <w:r>
-              <w:t xml:space="preserve"> when level is completed</w:t>
+              <w:t>Sets or resets some variables for other scripts to use when level is completed</w:t>
             </w:r>
           </w:p>
         </w:tc>
@@ -9671,8 +9945,13 @@
             <w:tcW w:w="1384" w:type="dxa"/>
           </w:tcPr>
           <w:p>
-            <w:r>
-              <w:t>SetMines()</w:t>
+            <w:proofErr w:type="spellStart"/>
+            <w:r>
+              <w:t>SetMines</w:t>
+            </w:r>
+            <w:proofErr w:type="spellEnd"/>
+            <w:r>
+              <w:t>()</w:t>
             </w:r>
           </w:p>
         </w:tc>
@@ -9688,7 +9967,19 @@
               <w:t xml:space="preserve">or resets </w:t>
             </w:r>
             <w:r>
-              <w:t>the mine tiles by randomly generating an integer that acts as a index within the array of nodes which choices one node to be made into a mine tile through the tile’s own method. As a parameter that prevents mines being set on the same tile and continues to set mines until it reaches a integer that is given by a variable from another script</w:t>
+              <w:t xml:space="preserve">the mine tiles by randomly generating an integer that acts as </w:t>
+            </w:r>
+            <w:r>
+              <w:t>an</w:t>
+            </w:r>
+            <w:r>
+              <w:t xml:space="preserve"> index within the array of nodes which choices one node to be made into a mine tile through the tile’s own method. As a parameter that prevents mines being set on the same tile and continues to set mines until it reaches </w:t>
+            </w:r>
+            <w:r>
+              <w:t>an</w:t>
+            </w:r>
+            <w:r>
+              <w:t xml:space="preserve"> integer that is given by a variable from another script</w:t>
             </w:r>
           </w:p>
         </w:tc>
@@ -9888,8 +10179,13 @@
             <w:tcW w:w="1384" w:type="dxa"/>
           </w:tcPr>
           <w:p>
-            <w:r>
-              <w:t>SetMine()</w:t>
+            <w:proofErr w:type="spellStart"/>
+            <w:r>
+              <w:t>SetMine</w:t>
+            </w:r>
+            <w:proofErr w:type="spellEnd"/>
+            <w:r>
+              <w:t>()</w:t>
             </w:r>
           </w:p>
         </w:tc>
@@ -9921,7 +10217,30 @@
           </w:tcPr>
           <w:p>
             <w:r>
-              <w:t xml:space="preserve">Hides the covered texture and sets the tile to uncovered, it assigns the correct texture for the integer of mines touching the revealed texture and reveals adjacent tiles non-mine touching tiles if the revealed tile is not touching any mines  </w:t>
+              <w:t xml:space="preserve">Hides the covered texture and sets the tile to </w:t>
+            </w:r>
+            <w:r>
+              <w:t>“</w:t>
+            </w:r>
+            <w:r>
+              <w:t>uncovered</w:t>
+            </w:r>
+            <w:r>
+              <w:t>”</w:t>
+            </w:r>
+            <w:r>
+              <w:t>, it assigns the correct texture for the integer of mines touching the revealed texture and reveals adjacent tiles non-mine touching tiles if the revealed tile is not touching any mines</w:t>
+            </w:r>
+            <w:r>
+              <w:t xml:space="preserve">. Is also the function that calculated the explosion of </w:t>
+            </w:r>
+            <w:proofErr w:type="gramStart"/>
+            <w:r>
+              <w:t>the a</w:t>
+            </w:r>
+            <w:proofErr w:type="gramEnd"/>
+            <w:r>
+              <w:t xml:space="preserve"> tile mine</w:t>
             </w:r>
           </w:p>
         </w:tc>
@@ -9932,8 +10251,13 @@
             <w:tcW w:w="1384" w:type="dxa"/>
           </w:tcPr>
           <w:p>
-            <w:r>
-              <w:t>GetSurroundings()</w:t>
+            <w:proofErr w:type="spellStart"/>
+            <w:r>
+              <w:t>GetSurroundings</w:t>
+            </w:r>
+            <w:proofErr w:type="spellEnd"/>
+            <w:r>
+              <w:t>()</w:t>
             </w:r>
           </w:p>
         </w:tc>
@@ -9954,8 +10278,13 @@
             <w:tcW w:w="1384" w:type="dxa"/>
           </w:tcPr>
           <w:p>
-            <w:r>
-              <w:t>ToggleFlag()</w:t>
+            <w:proofErr w:type="spellStart"/>
+            <w:r>
+              <w:t>ToggleFlag</w:t>
+            </w:r>
+            <w:proofErr w:type="spellEnd"/>
+            <w:r>
+              <w:t>()</w:t>
             </w:r>
           </w:p>
         </w:tc>
@@ -9977,7 +10306,15 @@
           </w:tcPr>
           <w:p>
             <w:r>
-              <w:t>_on_control_gui_input(event)</w:t>
+              <w:t>_</w:t>
+            </w:r>
+            <w:proofErr w:type="spellStart"/>
+            <w:r>
+              <w:t>on_control_gui_input</w:t>
+            </w:r>
+            <w:proofErr w:type="spellEnd"/>
+            <w:r>
+              <w:t>(event)</w:t>
             </w:r>
           </w:p>
         </w:tc>
@@ -9998,8 +10335,14 @@
             <w:tcW w:w="1384" w:type="dxa"/>
           </w:tcPr>
           <w:p>
-            <w:r>
-              <w:t>DebugCovered():</w:t>
+            <w:proofErr w:type="spellStart"/>
+            <w:r>
+              <w:lastRenderedPageBreak/>
+              <w:t>DebugCovered</w:t>
+            </w:r>
+            <w:proofErr w:type="spellEnd"/>
+            <w:r>
+              <w:t>():</w:t>
             </w:r>
           </w:p>
         </w:tc>
@@ -10453,6 +10796,7 @@
         </w:numPr>
       </w:pPr>
       <w:r>
+        <w:lastRenderedPageBreak/>
         <w:t>On course</w:t>
       </w:r>
     </w:p>
@@ -10465,7 +10809,6 @@
         </w:numPr>
       </w:pPr>
       <w:r>
-        <w:lastRenderedPageBreak/>
         <w:t>Documentation</w:t>
       </w:r>
     </w:p>
@@ -11226,7 +11569,27 @@
         <w:rPr>
           <w:lang w:val="en-US"/>
         </w:rPr>
-        <w:t xml:space="preserve">Considering if pygame should be used to make </w:t>
+        <w:t xml:space="preserve">Considering if </w:t>
+      </w:r>
+      <w:proofErr w:type="spellStart"/>
+      <w:r>
+        <w:rPr>
+          <w:lang w:val="en-US"/>
+        </w:rPr>
+        <w:t>Py</w:t>
+      </w:r>
+      <w:r>
+        <w:rPr>
+          <w:lang w:val="en-US"/>
+        </w:rPr>
+        <w:t>game</w:t>
+      </w:r>
+      <w:proofErr w:type="spellEnd"/>
+      <w:r>
+        <w:rPr>
+          <w:lang w:val="en-US"/>
+        </w:rPr>
+        <w:t xml:space="preserve"> should be used to make </w:t>
       </w:r>
       <w:r>
         <w:rPr>
@@ -11259,76 +11622,98 @@
         <w:rPr>
           <w:lang w:val="en-US"/>
         </w:rPr>
-        <w:t xml:space="preserve">Researched PyGame library </w:t>
-      </w:r>
-    </w:p>
-    <w:p>
-      <w:pPr>
-        <w:pStyle w:val="ListParagraph"/>
-        <w:numPr>
-          <w:ilvl w:val="1"/>
-          <w:numId w:val="22"/>
-        </w:numPr>
-      </w:pPr>
-      <w:r>
-        <w:t>Consider use to create a game since it has</w:t>
-      </w:r>
-    </w:p>
-    <w:p>
-      <w:pPr>
-        <w:pStyle w:val="ListParagraph"/>
-        <w:numPr>
-          <w:ilvl w:val="2"/>
-          <w:numId w:val="22"/>
-        </w:numPr>
-      </w:pPr>
-      <w:r>
-        <w:t xml:space="preserve">Has a </w:t>
-      </w:r>
-      <w:r>
-        <w:t>well-documented</w:t>
-      </w:r>
-      <w:r>
-        <w:t xml:space="preserve"> game development framework</w:t>
-      </w:r>
-    </w:p>
-    <w:p>
-      <w:pPr>
-        <w:pStyle w:val="ListParagraph"/>
-        <w:numPr>
-          <w:ilvl w:val="2"/>
-          <w:numId w:val="22"/>
-        </w:numPr>
-      </w:pPr>
-      <w:r>
-        <w:t>Easy and versatile to make games with GUI with</w:t>
-      </w:r>
-    </w:p>
-    <w:p>
-      <w:pPr>
-        <w:pStyle w:val="ListParagraph"/>
-        <w:numPr>
-          <w:ilvl w:val="3"/>
-          <w:numId w:val="22"/>
-        </w:numPr>
-      </w:pPr>
-      <w:r>
-        <w:t>With chat GPT and internet</w:t>
-      </w:r>
-    </w:p>
-    <w:p>
-      <w:pPr>
-        <w:pStyle w:val="ListParagraph"/>
-        <w:numPr>
-          <w:ilvl w:val="1"/>
-          <w:numId w:val="22"/>
-        </w:numPr>
-      </w:pPr>
+        <w:t xml:space="preserve">Researched </w:t>
+      </w:r>
+      <w:proofErr w:type="spellStart"/>
       <w:r>
         <w:rPr>
           <w:lang w:val="en-US"/>
         </w:rPr>
-        <w:t>PyGame Documentation</w:t>
+        <w:t>PyGame</w:t>
+      </w:r>
+      <w:proofErr w:type="spellEnd"/>
+      <w:r>
+        <w:rPr>
+          <w:lang w:val="en-US"/>
+        </w:rPr>
+        <w:t xml:space="preserve"> library </w:t>
+      </w:r>
+    </w:p>
+    <w:p>
+      <w:pPr>
+        <w:pStyle w:val="ListParagraph"/>
+        <w:numPr>
+          <w:ilvl w:val="1"/>
+          <w:numId w:val="22"/>
+        </w:numPr>
+      </w:pPr>
+      <w:r>
+        <w:t>Consider use to create a game since it has</w:t>
+      </w:r>
+    </w:p>
+    <w:p>
+      <w:pPr>
+        <w:pStyle w:val="ListParagraph"/>
+        <w:numPr>
+          <w:ilvl w:val="2"/>
+          <w:numId w:val="22"/>
+        </w:numPr>
+      </w:pPr>
+      <w:r>
+        <w:t xml:space="preserve">Has a </w:t>
+      </w:r>
+      <w:r>
+        <w:t>well-documented</w:t>
+      </w:r>
+      <w:r>
+        <w:t xml:space="preserve"> game development framework</w:t>
+      </w:r>
+    </w:p>
+    <w:p>
+      <w:pPr>
+        <w:pStyle w:val="ListParagraph"/>
+        <w:numPr>
+          <w:ilvl w:val="2"/>
+          <w:numId w:val="22"/>
+        </w:numPr>
+      </w:pPr>
+      <w:r>
+        <w:t>Easy and versatile to make games with GUI with</w:t>
+      </w:r>
+    </w:p>
+    <w:p>
+      <w:pPr>
+        <w:pStyle w:val="ListParagraph"/>
+        <w:numPr>
+          <w:ilvl w:val="3"/>
+          <w:numId w:val="22"/>
+        </w:numPr>
+      </w:pPr>
+      <w:r>
+        <w:t>With chat GPT and internet</w:t>
+      </w:r>
+    </w:p>
+    <w:p>
+      <w:pPr>
+        <w:pStyle w:val="ListParagraph"/>
+        <w:numPr>
+          <w:ilvl w:val="1"/>
+          <w:numId w:val="22"/>
+        </w:numPr>
+      </w:pPr>
+      <w:proofErr w:type="spellStart"/>
+      <w:r>
+        <w:rPr>
+          <w:lang w:val="en-US"/>
+        </w:rPr>
+        <w:t>PyGame</w:t>
+      </w:r>
+      <w:proofErr w:type="spellEnd"/>
+      <w:r>
+        <w:rPr>
+          <w:lang w:val="en-US"/>
+        </w:rPr>
+        <w:t xml:space="preserve"> Documentation</w:t>
       </w:r>
     </w:p>
     <w:p>
@@ -12034,62 +12419,78 @@
           <w:lang w:val="en-US"/>
         </w:rPr>
         <w:lastRenderedPageBreak/>
-        <w:t>Clear documentation like PyGame</w:t>
-      </w:r>
-    </w:p>
-    <w:p>
-      <w:pPr>
-        <w:pStyle w:val="ListParagraph"/>
-        <w:numPr>
-          <w:ilvl w:val="4"/>
-          <w:numId w:val="22"/>
-        </w:numPr>
-      </w:pPr>
-      <w:r>
-        <w:t xml:space="preserve">A lot better looking and concise </w:t>
-      </w:r>
-    </w:p>
-    <w:p>
-      <w:pPr>
-        <w:pStyle w:val="ListParagraph"/>
-        <w:numPr>
-          <w:ilvl w:val="2"/>
-          <w:numId w:val="22"/>
-        </w:numPr>
-      </w:pPr>
-      <w:r>
-        <w:t>Has an active community</w:t>
-      </w:r>
-    </w:p>
-    <w:p>
-      <w:pPr>
-        <w:pStyle w:val="ListParagraph"/>
-        <w:numPr>
-          <w:ilvl w:val="3"/>
-          <w:numId w:val="22"/>
-        </w:numPr>
-      </w:pPr>
-      <w:r>
-        <w:t>Research form ChatGPT</w:t>
-      </w:r>
-    </w:p>
-    <w:p>
-      <w:pPr>
-        <w:pStyle w:val="ListParagraph"/>
-        <w:numPr>
-          <w:ilvl w:val="1"/>
-          <w:numId w:val="22"/>
-        </w:numPr>
+        <w:t xml:space="preserve">Clear documentation like </w:t>
+      </w:r>
+      <w:proofErr w:type="spellStart"/>
+      <w:r>
         <w:rPr>
           <w:lang w:val="en-US"/>
         </w:rPr>
-      </w:pPr>
-      <w:r>
+        <w:t>PyGame</w:t>
+      </w:r>
+      <w:proofErr w:type="spellEnd"/>
+    </w:p>
+    <w:p>
+      <w:pPr>
+        <w:pStyle w:val="ListParagraph"/>
+        <w:numPr>
+          <w:ilvl w:val="4"/>
+          <w:numId w:val="22"/>
+        </w:numPr>
+      </w:pPr>
+      <w:r>
+        <w:t xml:space="preserve">A lot better looking and concise </w:t>
+      </w:r>
+    </w:p>
+    <w:p>
+      <w:pPr>
+        <w:pStyle w:val="ListParagraph"/>
+        <w:numPr>
+          <w:ilvl w:val="2"/>
+          <w:numId w:val="22"/>
+        </w:numPr>
+      </w:pPr>
+      <w:r>
+        <w:t>Has an active community</w:t>
+      </w:r>
+    </w:p>
+    <w:p>
+      <w:pPr>
+        <w:pStyle w:val="ListParagraph"/>
+        <w:numPr>
+          <w:ilvl w:val="3"/>
+          <w:numId w:val="22"/>
+        </w:numPr>
+      </w:pPr>
+      <w:r>
+        <w:t>Research form ChatGPT</w:t>
+      </w:r>
+    </w:p>
+    <w:p>
+      <w:pPr>
+        <w:pStyle w:val="ListParagraph"/>
+        <w:numPr>
+          <w:ilvl w:val="1"/>
+          <w:numId w:val="22"/>
+        </w:numPr>
         <w:rPr>
           <w:lang w:val="en-US"/>
         </w:rPr>
-        <w:t>Consider use Godot or PyGame</w:t>
-      </w:r>
+      </w:pPr>
+      <w:r>
+        <w:rPr>
+          <w:lang w:val="en-US"/>
+        </w:rPr>
+        <w:t xml:space="preserve">Consider use Godot or </w:t>
+      </w:r>
+      <w:proofErr w:type="spellStart"/>
+      <w:r>
+        <w:rPr>
+          <w:lang w:val="en-US"/>
+        </w:rPr>
+        <w:t>PyGame</w:t>
+      </w:r>
+      <w:proofErr w:type="spellEnd"/>
     </w:p>
     <w:p>
       <w:pPr>
@@ -14541,7 +14942,21 @@
         <w:rPr>
           <w:lang w:val="en-US"/>
         </w:rPr>
-        <w:t xml:space="preserve">Converted all image into scalable .svg images for quality </w:t>
+        <w:t>Converted all image into scalable .</w:t>
+      </w:r>
+      <w:proofErr w:type="spellStart"/>
+      <w:r>
+        <w:rPr>
+          <w:lang w:val="en-US"/>
+        </w:rPr>
+        <w:t>svg</w:t>
+      </w:r>
+      <w:proofErr w:type="spellEnd"/>
+      <w:r>
+        <w:rPr>
+          <w:lang w:val="en-US"/>
+        </w:rPr>
+        <w:t xml:space="preserve"> images for quality </w:t>
       </w:r>
     </w:p>
     <w:p>
@@ -15334,26 +15749,48 @@
           <w:lang w:val="en-US"/>
         </w:rPr>
       </w:pPr>
+      <w:proofErr w:type="spellStart"/>
       <w:r>
         <w:rPr>
           <w:lang w:val="en-US"/>
         </w:rPr>
-        <w:t>get_viewport_rect().size</w:t>
-      </w:r>
-    </w:p>
-    <w:p>
-      <w:pPr>
-        <w:pStyle w:val="ListParagraph"/>
-        <w:numPr>
-          <w:ilvl w:val="3"/>
-          <w:numId w:val="22"/>
-        </w:numPr>
-      </w:pPr>
+        <w:t>get_viewport_rect</w:t>
+      </w:r>
+      <w:proofErr w:type="spellEnd"/>
       <w:r>
         <w:rPr>
           <w:lang w:val="en-US"/>
         </w:rPr>
-        <w:t>clamp (x,y,z)</w:t>
+        <w:t>().size</w:t>
+      </w:r>
+    </w:p>
+    <w:p>
+      <w:pPr>
+        <w:pStyle w:val="ListParagraph"/>
+        <w:numPr>
+          <w:ilvl w:val="3"/>
+          <w:numId w:val="22"/>
+        </w:numPr>
+      </w:pPr>
+      <w:r>
+        <w:rPr>
+          <w:lang w:val="en-US"/>
+        </w:rPr>
+        <w:t>clamp (</w:t>
+      </w:r>
+      <w:proofErr w:type="spellStart"/>
+      <w:r>
+        <w:rPr>
+          <w:lang w:val="en-US"/>
+        </w:rPr>
+        <w:t>x,y,z</w:t>
+      </w:r>
+      <w:proofErr w:type="spellEnd"/>
+      <w:r>
+        <w:rPr>
+          <w:lang w:val="en-US"/>
+        </w:rPr>
+        <w:t>)</w:t>
       </w:r>
     </w:p>
     <w:p>
@@ -15538,22 +15975,58 @@
         <w:rPr>
           <w:lang w:val="en-US"/>
         </w:rPr>
-        <w:t>% x.size()</w:t>
-      </w:r>
-    </w:p>
-    <w:p>
-      <w:pPr>
-        <w:pStyle w:val="ListParagraph"/>
-        <w:numPr>
-          <w:ilvl w:val="3"/>
-          <w:numId w:val="22"/>
-        </w:numPr>
-      </w:pPr>
+        <w:t xml:space="preserve">% </w:t>
+      </w:r>
+      <w:proofErr w:type="spellStart"/>
       <w:r>
         <w:rPr>
           <w:lang w:val="en-US"/>
         </w:rPr>
-        <w:t>randf_range(x,y)</w:t>
+        <w:t>x.size</w:t>
+      </w:r>
+      <w:proofErr w:type="spellEnd"/>
+      <w:r>
+        <w:rPr>
+          <w:lang w:val="en-US"/>
+        </w:rPr>
+        <w:t>()</w:t>
+      </w:r>
+    </w:p>
+    <w:p>
+      <w:pPr>
+        <w:pStyle w:val="ListParagraph"/>
+        <w:numPr>
+          <w:ilvl w:val="3"/>
+          <w:numId w:val="22"/>
+        </w:numPr>
+      </w:pPr>
+      <w:proofErr w:type="spellStart"/>
+      <w:r>
+        <w:rPr>
+          <w:lang w:val="en-US"/>
+        </w:rPr>
+        <w:t>randf_range</w:t>
+      </w:r>
+      <w:proofErr w:type="spellEnd"/>
+      <w:r>
+        <w:rPr>
+          <w:lang w:val="en-US"/>
+        </w:rPr>
+        <w:t>(</w:t>
+      </w:r>
+      <w:proofErr w:type="spellStart"/>
+      <w:r>
+        <w:rPr>
+          <w:lang w:val="en-US"/>
+        </w:rPr>
+        <w:t>x,y</w:t>
+      </w:r>
+      <w:proofErr w:type="spellEnd"/>
+      <w:r>
+        <w:rPr>
+          <w:lang w:val="en-US"/>
+        </w:rPr>
+        <w:t>)</w:t>
       </w:r>
     </w:p>
     <w:p>
@@ -15942,7 +16415,35 @@
         <w:rPr>
           <w:lang w:val="en-US"/>
         </w:rPr>
-        <w:t xml:space="preserve">Added svg “Icon.svg” </w:t>
+        <w:t xml:space="preserve">Added </w:t>
+      </w:r>
+      <w:proofErr w:type="spellStart"/>
+      <w:r>
+        <w:rPr>
+          <w:lang w:val="en-US"/>
+        </w:rPr>
+        <w:t>svg</w:t>
+      </w:r>
+      <w:proofErr w:type="spellEnd"/>
+      <w:r>
+        <w:rPr>
+          <w:lang w:val="en-US"/>
+        </w:rPr>
+        <w:t xml:space="preserve"> “</w:t>
+      </w:r>
+      <w:proofErr w:type="spellStart"/>
+      <w:r>
+        <w:rPr>
+          <w:lang w:val="en-US"/>
+        </w:rPr>
+        <w:t>Icon.svg</w:t>
+      </w:r>
+      <w:proofErr w:type="spellEnd"/>
+      <w:r>
+        <w:rPr>
+          <w:lang w:val="en-US"/>
+        </w:rPr>
+        <w:t xml:space="preserve">” </w:t>
       </w:r>
     </w:p>
     <w:p>
@@ -15960,6 +16461,7 @@
         <w:t xml:space="preserve">obtained from </w:t>
       </w:r>
       <w:hyperlink r:id="rId44">
+        <w:proofErr w:type="spellStart"/>
         <w:r>
           <w:rPr>
             <w:rStyle w:val="Hyperlink"/>
@@ -15967,27 +16469,56 @@
           </w:rPr>
           <w:t>Flaticon</w:t>
         </w:r>
+        <w:proofErr w:type="spellEnd"/>
       </w:hyperlink>
       <w:r>
         <w:rPr>
           <w:lang w:val="en-US"/>
         </w:rPr>
-        <w:t xml:space="preserve"> as a png </w:t>
-      </w:r>
-    </w:p>
-    <w:p>
-      <w:pPr>
-        <w:pStyle w:val="ListParagraph"/>
-        <w:numPr>
-          <w:ilvl w:val="2"/>
-          <w:numId w:val="22"/>
-        </w:numPr>
-      </w:pPr>
+        <w:t xml:space="preserve"> as a </w:t>
+      </w:r>
+      <w:proofErr w:type="spellStart"/>
       <w:r>
         <w:rPr>
           <w:lang w:val="en-US"/>
         </w:rPr>
-        <w:t>Converted svg through word</w:t>
+        <w:t>png</w:t>
+      </w:r>
+      <w:proofErr w:type="spellEnd"/>
+      <w:r>
+        <w:rPr>
+          <w:lang w:val="en-US"/>
+        </w:rPr>
+        <w:t xml:space="preserve"> </w:t>
+      </w:r>
+    </w:p>
+    <w:p>
+      <w:pPr>
+        <w:pStyle w:val="ListParagraph"/>
+        <w:numPr>
+          <w:ilvl w:val="2"/>
+          <w:numId w:val="22"/>
+        </w:numPr>
+      </w:pPr>
+      <w:r>
+        <w:rPr>
+          <w:lang w:val="en-US"/>
+        </w:rPr>
+        <w:t xml:space="preserve">Converted </w:t>
+      </w:r>
+      <w:proofErr w:type="spellStart"/>
+      <w:r>
+        <w:rPr>
+          <w:lang w:val="en-US"/>
+        </w:rPr>
+        <w:t>svg</w:t>
+      </w:r>
+      <w:proofErr w:type="spellEnd"/>
+      <w:r>
+        <w:rPr>
+          <w:lang w:val="en-US"/>
+        </w:rPr>
+        <w:t xml:space="preserve"> through word</w:t>
       </w:r>
     </w:p>
     <w:p>
@@ -16630,21 +17161,25 @@
           <w:numId w:val="22"/>
         </w:numPr>
       </w:pPr>
+      <w:proofErr w:type="spellStart"/>
       <w:r>
         <w:t>HUDGame</w:t>
       </w:r>
-    </w:p>
-    <w:p>
-      <w:pPr>
-        <w:pStyle w:val="ListParagraph"/>
-        <w:numPr>
-          <w:ilvl w:val="2"/>
-          <w:numId w:val="22"/>
-        </w:numPr>
-      </w:pPr>
+      <w:proofErr w:type="spellEnd"/>
+    </w:p>
+    <w:p>
+      <w:pPr>
+        <w:pStyle w:val="ListParagraph"/>
+        <w:numPr>
+          <w:ilvl w:val="2"/>
+          <w:numId w:val="22"/>
+        </w:numPr>
+      </w:pPr>
+      <w:proofErr w:type="spellStart"/>
       <w:r>
         <w:t>MainGame</w:t>
       </w:r>
+      <w:proofErr w:type="spellEnd"/>
     </w:p>
     <w:p>
       <w:pPr>
@@ -17423,9 +17958,11 @@
           <w:numId w:val="22"/>
         </w:numPr>
       </w:pPr>
+      <w:proofErr w:type="spellStart"/>
       <w:r>
         <w:t>Explosion.svg</w:t>
       </w:r>
+      <w:proofErr w:type="spellEnd"/>
     </w:p>
     <w:p>
       <w:pPr>
@@ -18256,7 +18793,15 @@
         </w:numPr>
       </w:pPr>
       <w:r>
-        <w:t>“CoveredDebug()” in tile.gd</w:t>
+        <w:t>“</w:t>
+      </w:r>
+      <w:proofErr w:type="spellStart"/>
+      <w:r>
+        <w:t>CoveredDebug</w:t>
+      </w:r>
+      <w:proofErr w:type="spellEnd"/>
+      <w:r>
+        <w:t>()” in tile.gd</w:t>
       </w:r>
     </w:p>
     <w:p>
@@ -18540,9 +19085,11 @@
           <w:numId w:val="22"/>
         </w:numPr>
       </w:pPr>
+      <w:proofErr w:type="spellStart"/>
       <w:r>
         <w:t>HUDGame</w:t>
       </w:r>
+      <w:proofErr w:type="spellEnd"/>
     </w:p>
     <w:p>
       <w:pPr>
@@ -19026,7 +19573,22 @@
         </w:numPr>
       </w:pPr>
       <w:r>
-        <w:t xml:space="preserve">Tiles will not cover themselves if the are already reveal already </w:t>
+        <w:t xml:space="preserve">Tiles will not cover themselves if </w:t>
+      </w:r>
+      <w:r>
+        <w:t>they</w:t>
+      </w:r>
+      <w:r>
+        <w:t xml:space="preserve"> are already </w:t>
+      </w:r>
+      <w:r>
+        <w:t xml:space="preserve">revealed </w:t>
+      </w:r>
+      <w:r>
+        <w:t>already</w:t>
+      </w:r>
+      <w:r>
+        <w:t xml:space="preserve"> </w:t>
       </w:r>
     </w:p>
     <w:p>
@@ -19684,11 +20246,19 @@
           <w:rStyle w:val="notion-enable-hover"/>
         </w:rPr>
       </w:pPr>
+      <w:proofErr w:type="spellStart"/>
       <w:r>
         <w:rPr>
           <w:rStyle w:val="notion-enable-hover"/>
         </w:rPr>
-        <w:t>SetMine()</w:t>
+        <w:t>SetMine</w:t>
+      </w:r>
+      <w:proofErr w:type="spellEnd"/>
+      <w:r>
+        <w:rPr>
+          <w:rStyle w:val="notion-enable-hover"/>
+        </w:rPr>
+        <w:t>()</w:t>
       </w:r>
     </w:p>
     <w:p>
@@ -19732,11 +20302,19 @@
           <w:rStyle w:val="notion-enable-hover"/>
         </w:rPr>
       </w:pPr>
+      <w:proofErr w:type="spellStart"/>
       <w:r>
         <w:rPr>
           <w:rStyle w:val="notion-enable-hover"/>
         </w:rPr>
-        <w:t>SetMine()</w:t>
+        <w:t>SetMine</w:t>
+      </w:r>
+      <w:proofErr w:type="spellEnd"/>
+      <w:r>
+        <w:rPr>
+          <w:rStyle w:val="notion-enable-hover"/>
+        </w:rPr>
+        <w:t>()</w:t>
       </w:r>
     </w:p>
     <w:p>
@@ -19768,29 +20346,45 @@
           <w:rStyle w:val="notion-enable-hover"/>
         </w:rPr>
       </w:pPr>
+      <w:proofErr w:type="spellStart"/>
       <w:r>
         <w:rPr>
           <w:rStyle w:val="notion-enable-hover"/>
         </w:rPr>
-        <w:t>GetSurroundings()</w:t>
-      </w:r>
-    </w:p>
-    <w:p>
-      <w:pPr>
-        <w:pStyle w:val="ListParagraph"/>
-        <w:numPr>
-          <w:ilvl w:val="3"/>
-          <w:numId w:val="22"/>
-        </w:numPr>
+        <w:t>GetSurroundings</w:t>
+      </w:r>
+      <w:proofErr w:type="spellEnd"/>
+      <w:r>
         <w:rPr>
           <w:rStyle w:val="notion-enable-hover"/>
         </w:rPr>
-      </w:pPr>
-      <w:r>
+        <w:t>()</w:t>
+      </w:r>
+    </w:p>
+    <w:p>
+      <w:pPr>
+        <w:pStyle w:val="ListParagraph"/>
+        <w:numPr>
+          <w:ilvl w:val="3"/>
+          <w:numId w:val="22"/>
+        </w:numPr>
         <w:rPr>
           <w:rStyle w:val="notion-enable-hover"/>
         </w:rPr>
-        <w:t>ToggleFlag()</w:t>
+      </w:pPr>
+      <w:proofErr w:type="spellStart"/>
+      <w:r>
+        <w:rPr>
+          <w:rStyle w:val="notion-enable-hover"/>
+        </w:rPr>
+        <w:t>ToggleFlag</w:t>
+      </w:r>
+      <w:proofErr w:type="spellEnd"/>
+      <w:r>
+        <w:rPr>
+          <w:rStyle w:val="notion-enable-hover"/>
+        </w:rPr>
+        <w:t>()</w:t>
       </w:r>
     </w:p>
     <w:p>
@@ -19802,7 +20396,15 @@
         </w:numPr>
       </w:pPr>
       <w:r>
-        <w:t>_on_control_gui_input(event)</w:t>
+        <w:t>_</w:t>
+      </w:r>
+      <w:proofErr w:type="spellStart"/>
+      <w:r>
+        <w:t>on_control_gui_input</w:t>
+      </w:r>
+      <w:proofErr w:type="spellEnd"/>
+      <w:r>
+        <w:t>(event)</w:t>
       </w:r>
     </w:p>
     <w:p>
@@ -19813,8 +20415,13 @@
           <w:numId w:val="22"/>
         </w:numPr>
       </w:pPr>
-      <w:r>
-        <w:t>DebugCovered()</w:t>
+      <w:proofErr w:type="spellStart"/>
+      <w:r>
+        <w:t>DebugCovered</w:t>
+      </w:r>
+      <w:proofErr w:type="spellEnd"/>
+      <w:r>
+        <w:t>()</w:t>
       </w:r>
     </w:p>
     <w:p>
@@ -19968,6 +20575,54 @@
         </w:numPr>
       </w:pPr>
       <w:r>
+        <w:t>Continued development on main game</w:t>
+      </w:r>
+    </w:p>
+    <w:p>
+      <w:pPr>
+        <w:pStyle w:val="ListParagraph"/>
+        <w:numPr>
+          <w:ilvl w:val="1"/>
+          <w:numId w:val="22"/>
+        </w:numPr>
+      </w:pPr>
+      <w:r>
+        <w:t>Built most of mine handing function in tile.gd</w:t>
+      </w:r>
+    </w:p>
+    <w:p>
+      <w:pPr>
+        <w:pStyle w:val="ListParagraph"/>
+        <w:numPr>
+          <w:ilvl w:val="1"/>
+          <w:numId w:val="22"/>
+        </w:numPr>
+      </w:pPr>
+      <w:r>
+        <w:t>Added new file</w:t>
+      </w:r>
+    </w:p>
+    <w:p>
+      <w:pPr>
+        <w:pStyle w:val="ListParagraph"/>
+        <w:numPr>
+          <w:ilvl w:val="2"/>
+          <w:numId w:val="22"/>
+        </w:numPr>
+      </w:pPr>
+      <w:r>
+        <w:t>EventManager.gd</w:t>
+      </w:r>
+    </w:p>
+    <w:p>
+      <w:pPr>
+        <w:pStyle w:val="ListParagraph"/>
+        <w:numPr>
+          <w:ilvl w:val="0"/>
+          <w:numId w:val="22"/>
+        </w:numPr>
+      </w:pPr>
+      <w:r>
         <w:t>Updated Technical Manual</w:t>
       </w:r>
     </w:p>
@@ -19992,25 +20647,7 @@
         </w:numPr>
       </w:pPr>
       <w:r>
-        <w:t>Number of</w:t>
-      </w:r>
-      <w:r>
-        <w:t xml:space="preserve"> </w:t>
-      </w:r>
-      <w:r>
-        <w:t>bytes</w:t>
-      </w:r>
-      <w:r>
-        <w:t xml:space="preserve"> </w:t>
-      </w:r>
-      <w:r>
-        <w:t>required</w:t>
-      </w:r>
-      <w:r>
-        <w:t xml:space="preserve"> </w:t>
-      </w:r>
-      <w:r>
-        <w:t>for storage</w:t>
+        <w:t>Number of bytes required for storage</w:t>
       </w:r>
       <w:r>
         <w:tab/>
@@ -20025,13 +20662,7 @@
         </w:numPr>
       </w:pPr>
       <w:r>
-        <w:t>Size for</w:t>
-      </w:r>
-      <w:r>
-        <w:t xml:space="preserve"> </w:t>
-      </w:r>
-      <w:r>
-        <w:t>display</w:t>
+        <w:t>Size for display</w:t>
       </w:r>
     </w:p>
     <w:p>
@@ -20090,9 +20721,11 @@
           <w:numId w:val="22"/>
         </w:numPr>
       </w:pPr>
+      <w:proofErr w:type="spellStart"/>
       <w:r>
         <w:t>LevelReset</w:t>
       </w:r>
+      <w:proofErr w:type="spellEnd"/>
       <w:r>
         <w:t xml:space="preserve">() </w:t>
       </w:r>
@@ -20224,6 +20857,1248 @@
           <w:lang w:val="en-US"/>
         </w:rPr>
         <w:t>w</w:t>
+      </w:r>
+    </w:p>
+    <w:p>
+      <w:pPr>
+        <w:pStyle w:val="Heading3"/>
+        <w:ind w:firstLine="360"/>
+      </w:pPr>
+      <w:r>
+        <w:t>6th of July</w:t>
+      </w:r>
+    </w:p>
+    <w:p>
+      <w:pPr>
+        <w:pStyle w:val="ListParagraph"/>
+        <w:numPr>
+          <w:ilvl w:val="0"/>
+          <w:numId w:val="22"/>
+        </w:numPr>
+      </w:pPr>
+      <w:r>
+        <w:t>Updated Technical Manual</w:t>
+      </w:r>
+    </w:p>
+    <w:p>
+      <w:pPr>
+        <w:pStyle w:val="ListParagraph"/>
+        <w:numPr>
+          <w:ilvl w:val="1"/>
+          <w:numId w:val="22"/>
+        </w:numPr>
+      </w:pPr>
+      <w:r>
+        <w:t>Added to data dictionary</w:t>
+      </w:r>
+    </w:p>
+    <w:p>
+      <w:pPr>
+        <w:pStyle w:val="ListParagraph"/>
+        <w:numPr>
+          <w:ilvl w:val="2"/>
+          <w:numId w:val="22"/>
+        </w:numPr>
+      </w:pPr>
+      <w:r>
+        <w:t>Added variables from Debug.GD</w:t>
+      </w:r>
+    </w:p>
+    <w:p>
+      <w:pPr>
+        <w:pStyle w:val="ListParagraph"/>
+        <w:numPr>
+          <w:ilvl w:val="3"/>
+          <w:numId w:val="22"/>
+        </w:numPr>
+      </w:pPr>
+      <w:r>
+        <w:t>“command”</w:t>
+      </w:r>
+    </w:p>
+    <w:p>
+      <w:pPr>
+        <w:pStyle w:val="ListParagraph"/>
+        <w:numPr>
+          <w:ilvl w:val="3"/>
+          <w:numId w:val="22"/>
+        </w:numPr>
+      </w:pPr>
+      <w:r>
+        <w:t>“</w:t>
+      </w:r>
+      <w:proofErr w:type="spellStart"/>
+      <w:r>
+        <w:t>ListenerOn</w:t>
+      </w:r>
+      <w:proofErr w:type="spellEnd"/>
+      <w:r>
+        <w:t>”</w:t>
+      </w:r>
+    </w:p>
+    <w:p>
+      <w:pPr>
+        <w:pStyle w:val="ListParagraph"/>
+        <w:numPr>
+          <w:ilvl w:val="2"/>
+          <w:numId w:val="22"/>
+        </w:numPr>
+      </w:pPr>
+      <w:r>
+        <w:t>Added new variables from.GD</w:t>
+      </w:r>
+    </w:p>
+    <w:p>
+      <w:pPr>
+        <w:pStyle w:val="ListParagraph"/>
+        <w:numPr>
+          <w:ilvl w:val="3"/>
+          <w:numId w:val="22"/>
+        </w:numPr>
+      </w:pPr>
+      <w:r>
+        <w:t>“Exploded”</w:t>
+      </w:r>
+    </w:p>
+    <w:p>
+      <w:pPr>
+        <w:pStyle w:val="ListParagraph"/>
+        <w:numPr>
+          <w:ilvl w:val="0"/>
+          <w:numId w:val="22"/>
+        </w:numPr>
+      </w:pPr>
+      <w:r>
+        <w:t>Updated Algorithm</w:t>
+      </w:r>
+    </w:p>
+    <w:p>
+      <w:pPr>
+        <w:pStyle w:val="ListParagraph"/>
+        <w:numPr>
+          <w:ilvl w:val="1"/>
+          <w:numId w:val="22"/>
+        </w:numPr>
+      </w:pPr>
+      <w:r>
+        <w:t>Added new code within function “_process(delta)”</w:t>
+      </w:r>
+    </w:p>
+    <w:p>
+      <w:pPr>
+        <w:pStyle w:val="ListParagraph"/>
+        <w:numPr>
+          <w:ilvl w:val="0"/>
+          <w:numId w:val="22"/>
+        </w:numPr>
+      </w:pPr>
+      <w:r>
+        <w:lastRenderedPageBreak/>
+        <w:t>Gantt Chart Progress check</w:t>
+      </w:r>
+    </w:p>
+    <w:p>
+      <w:pPr>
+        <w:pStyle w:val="ListParagraph"/>
+        <w:numPr>
+          <w:ilvl w:val="1"/>
+          <w:numId w:val="22"/>
+        </w:numPr>
+      </w:pPr>
+      <w:r>
+        <w:t>Algorithm</w:t>
+      </w:r>
+    </w:p>
+    <w:p>
+      <w:pPr>
+        <w:pStyle w:val="ListParagraph"/>
+        <w:numPr>
+          <w:ilvl w:val="2"/>
+          <w:numId w:val="22"/>
+        </w:numPr>
+      </w:pPr>
+      <w:r>
+        <w:t>On course</w:t>
+      </w:r>
+    </w:p>
+    <w:p>
+      <w:pPr>
+        <w:pStyle w:val="ListParagraph"/>
+        <w:numPr>
+          <w:ilvl w:val="1"/>
+          <w:numId w:val="22"/>
+        </w:numPr>
+      </w:pPr>
+      <w:r>
+        <w:t>Documentation</w:t>
+      </w:r>
+    </w:p>
+    <w:p>
+      <w:pPr>
+        <w:pStyle w:val="ListParagraph"/>
+        <w:numPr>
+          <w:ilvl w:val="2"/>
+          <w:numId w:val="22"/>
+        </w:numPr>
+      </w:pPr>
+      <w:r>
+        <w:t>On course</w:t>
+      </w:r>
+    </w:p>
+    <w:p>
+      <w:pPr>
+        <w:pStyle w:val="ListParagraph"/>
+        <w:numPr>
+          <w:ilvl w:val="1"/>
+          <w:numId w:val="22"/>
+        </w:numPr>
+      </w:pPr>
+      <w:r>
+        <w:t>Coding</w:t>
+      </w:r>
+    </w:p>
+    <w:p>
+      <w:pPr>
+        <w:pStyle w:val="ListParagraph"/>
+        <w:numPr>
+          <w:ilvl w:val="2"/>
+          <w:numId w:val="22"/>
+        </w:numPr>
+      </w:pPr>
+      <w:r>
+        <w:t>On Course</w:t>
+      </w:r>
+    </w:p>
+    <w:p>
+      <w:pPr>
+        <w:pStyle w:val="ListParagraph"/>
+        <w:numPr>
+          <w:ilvl w:val="1"/>
+          <w:numId w:val="22"/>
+        </w:numPr>
+      </w:pPr>
+      <w:r>
+        <w:t>Testing</w:t>
+      </w:r>
+    </w:p>
+    <w:p>
+      <w:pPr>
+        <w:pStyle w:val="ListParagraph"/>
+        <w:numPr>
+          <w:ilvl w:val="2"/>
+          <w:numId w:val="22"/>
+        </w:numPr>
+      </w:pPr>
+      <w:r>
+        <w:t xml:space="preserve">Behind on schedule </w:t>
+      </w:r>
+    </w:p>
+    <w:p>
+      <w:pPr>
+        <w:pStyle w:val="ListParagraph"/>
+        <w:numPr>
+          <w:ilvl w:val="0"/>
+          <w:numId w:val="22"/>
+        </w:numPr>
+      </w:pPr>
+      <w:r>
+        <w:rPr>
+          <w:lang w:val="en-US"/>
+        </w:rPr>
+        <w:t>Additional task tomorro</w:t>
+      </w:r>
+      <w:r>
+        <w:rPr>
+          <w:lang w:val="en-US"/>
+        </w:rPr>
+        <w:t>w</w:t>
+      </w:r>
+    </w:p>
+    <w:p>
+      <w:pPr>
+        <w:pStyle w:val="Heading3"/>
+        <w:ind w:firstLine="360"/>
+      </w:pPr>
+      <w:r>
+        <w:t>7th of July</w:t>
+      </w:r>
+    </w:p>
+    <w:p>
+      <w:pPr>
+        <w:pStyle w:val="ListParagraph"/>
+        <w:numPr>
+          <w:ilvl w:val="0"/>
+          <w:numId w:val="22"/>
+        </w:numPr>
+      </w:pPr>
+      <w:r>
+        <w:t>Continued development on main game</w:t>
+      </w:r>
+    </w:p>
+    <w:p>
+      <w:pPr>
+        <w:pStyle w:val="ListParagraph"/>
+        <w:numPr>
+          <w:ilvl w:val="1"/>
+          <w:numId w:val="22"/>
+        </w:numPr>
+      </w:pPr>
+      <w:r>
+        <w:t xml:space="preserve">Added new script </w:t>
+      </w:r>
+    </w:p>
+    <w:p>
+      <w:pPr>
+        <w:pStyle w:val="ListParagraph"/>
+        <w:numPr>
+          <w:ilvl w:val="2"/>
+          <w:numId w:val="22"/>
+        </w:numPr>
+      </w:pPr>
+      <w:r>
+        <w:t>Event.gd</w:t>
+      </w:r>
+    </w:p>
+    <w:p>
+      <w:pPr>
+        <w:pStyle w:val="ListParagraph"/>
+        <w:numPr>
+          <w:ilvl w:val="3"/>
+          <w:numId w:val="22"/>
+        </w:numPr>
+      </w:pPr>
+      <w:r>
+        <w:t>This script allows global signals</w:t>
+      </w:r>
+    </w:p>
+    <w:p>
+      <w:pPr>
+        <w:pStyle w:val="ListParagraph"/>
+        <w:numPr>
+          <w:ilvl w:val="1"/>
+          <w:numId w:val="22"/>
+        </w:numPr>
+      </w:pPr>
+      <w:r>
+        <w:t>Issue with script not communicating  with other script</w:t>
+      </w:r>
+    </w:p>
+    <w:p>
+      <w:pPr>
+        <w:pStyle w:val="ListParagraph"/>
+        <w:numPr>
+          <w:ilvl w:val="2"/>
+          <w:numId w:val="22"/>
+        </w:numPr>
+      </w:pPr>
+      <w:r>
+        <w:t>Used wrong syntax</w:t>
+      </w:r>
+    </w:p>
+    <w:p>
+      <w:pPr>
+        <w:pStyle w:val="ListParagraph"/>
+        <w:numPr>
+          <w:ilvl w:val="3"/>
+          <w:numId w:val="22"/>
+        </w:numPr>
+      </w:pPr>
+      <w:r>
+        <w:t>Obtained help from Godot discord server</w:t>
+      </w:r>
+    </w:p>
+    <w:p>
+      <w:pPr>
+        <w:pStyle w:val="ListParagraph"/>
+        <w:numPr>
+          <w:ilvl w:val="0"/>
+          <w:numId w:val="22"/>
+        </w:numPr>
+      </w:pPr>
+      <w:r>
+        <w:t>Gantt Chart Progress check</w:t>
+      </w:r>
+    </w:p>
+    <w:p>
+      <w:pPr>
+        <w:pStyle w:val="ListParagraph"/>
+        <w:numPr>
+          <w:ilvl w:val="1"/>
+          <w:numId w:val="22"/>
+        </w:numPr>
+      </w:pPr>
+      <w:r>
+        <w:t>Algorithm</w:t>
+      </w:r>
+    </w:p>
+    <w:p>
+      <w:pPr>
+        <w:pStyle w:val="ListParagraph"/>
+        <w:numPr>
+          <w:ilvl w:val="2"/>
+          <w:numId w:val="22"/>
+        </w:numPr>
+      </w:pPr>
+      <w:r>
+        <w:t>On course</w:t>
+      </w:r>
+    </w:p>
+    <w:p>
+      <w:pPr>
+        <w:pStyle w:val="ListParagraph"/>
+        <w:numPr>
+          <w:ilvl w:val="1"/>
+          <w:numId w:val="22"/>
+        </w:numPr>
+      </w:pPr>
+      <w:r>
+        <w:t>Documentation</w:t>
+      </w:r>
+    </w:p>
+    <w:p>
+      <w:pPr>
+        <w:pStyle w:val="ListParagraph"/>
+        <w:numPr>
+          <w:ilvl w:val="2"/>
+          <w:numId w:val="22"/>
+        </w:numPr>
+      </w:pPr>
+      <w:r>
+        <w:t>On course</w:t>
+      </w:r>
+    </w:p>
+    <w:p>
+      <w:pPr>
+        <w:pStyle w:val="ListParagraph"/>
+        <w:numPr>
+          <w:ilvl w:val="1"/>
+          <w:numId w:val="22"/>
+        </w:numPr>
+      </w:pPr>
+      <w:r>
+        <w:t>Coding</w:t>
+      </w:r>
+    </w:p>
+    <w:p>
+      <w:pPr>
+        <w:pStyle w:val="ListParagraph"/>
+        <w:numPr>
+          <w:ilvl w:val="2"/>
+          <w:numId w:val="22"/>
+        </w:numPr>
+      </w:pPr>
+      <w:r>
+        <w:t>On Course</w:t>
+      </w:r>
+    </w:p>
+    <w:p>
+      <w:pPr>
+        <w:pStyle w:val="ListParagraph"/>
+        <w:numPr>
+          <w:ilvl w:val="1"/>
+          <w:numId w:val="22"/>
+        </w:numPr>
+      </w:pPr>
+      <w:r>
+        <w:t>Testing</w:t>
+      </w:r>
+    </w:p>
+    <w:p>
+      <w:pPr>
+        <w:pStyle w:val="ListParagraph"/>
+        <w:numPr>
+          <w:ilvl w:val="2"/>
+          <w:numId w:val="22"/>
+        </w:numPr>
+      </w:pPr>
+      <w:r>
+        <w:t xml:space="preserve">Behind on schedule </w:t>
+      </w:r>
+    </w:p>
+    <w:p>
+      <w:pPr>
+        <w:pStyle w:val="ListParagraph"/>
+        <w:numPr>
+          <w:ilvl w:val="0"/>
+          <w:numId w:val="22"/>
+        </w:numPr>
+      </w:pPr>
+      <w:r>
+        <w:rPr>
+          <w:lang w:val="en-US"/>
+        </w:rPr>
+        <w:t>Additional task tomorro</w:t>
+      </w:r>
+      <w:r>
+        <w:rPr>
+          <w:lang w:val="en-US"/>
+        </w:rPr>
+        <w:t>w</w:t>
+      </w:r>
+    </w:p>
+    <w:p>
+      <w:pPr>
+        <w:pStyle w:val="ListParagraph"/>
+        <w:numPr>
+          <w:ilvl w:val="1"/>
+          <w:numId w:val="22"/>
+        </w:numPr>
+      </w:pPr>
+      <w:r>
+        <w:rPr>
+          <w:lang w:val="en-US"/>
+        </w:rPr>
+        <w:t>Continue coding</w:t>
+      </w:r>
+    </w:p>
+    <w:p>
+      <w:pPr>
+        <w:pStyle w:val="Heading3"/>
+        <w:ind w:firstLine="360"/>
+      </w:pPr>
+      <w:r>
+        <w:t>8th of July</w:t>
+      </w:r>
+    </w:p>
+    <w:p>
+      <w:pPr>
+        <w:pStyle w:val="ListParagraph"/>
+        <w:numPr>
+          <w:ilvl w:val="0"/>
+          <w:numId w:val="22"/>
+        </w:numPr>
+      </w:pPr>
+      <w:r>
+        <w:t>Continued development on main game</w:t>
+      </w:r>
+    </w:p>
+    <w:p>
+      <w:pPr>
+        <w:pStyle w:val="ListParagraph"/>
+        <w:numPr>
+          <w:ilvl w:val="1"/>
+          <w:numId w:val="22"/>
+        </w:numPr>
+      </w:pPr>
+      <w:r>
+        <w:t>Tweaked tile.gd</w:t>
+      </w:r>
+    </w:p>
+    <w:p>
+      <w:pPr>
+        <w:pStyle w:val="ListParagraph"/>
+        <w:numPr>
+          <w:ilvl w:val="2"/>
+          <w:numId w:val="22"/>
+        </w:numPr>
+      </w:pPr>
+      <w:r>
+        <w:t>Added more to the explode() functio</w:t>
+      </w:r>
+      <w:r>
+        <w:t>n</w:t>
+      </w:r>
+    </w:p>
+    <w:p>
+      <w:pPr>
+        <w:pStyle w:val="ListParagraph"/>
+        <w:numPr>
+          <w:ilvl w:val="1"/>
+          <w:numId w:val="22"/>
+        </w:numPr>
+      </w:pPr>
+      <w:r>
+        <w:t>Added indicator function</w:t>
+      </w:r>
+    </w:p>
+    <w:p>
+      <w:pPr>
+        <w:pStyle w:val="ListParagraph"/>
+        <w:numPr>
+          <w:ilvl w:val="2"/>
+          <w:numId w:val="22"/>
+        </w:numPr>
+      </w:pPr>
+      <w:r>
+        <w:t>Created “</w:t>
+      </w:r>
+      <w:proofErr w:type="spellStart"/>
+      <w:r>
+        <w:t>Tile</w:t>
+      </w:r>
+      <w:r>
+        <w:t>Hover</w:t>
+      </w:r>
+      <w:proofErr w:type="spellEnd"/>
+      <w:r>
+        <w:t>” sprite</w:t>
+      </w:r>
+    </w:p>
+    <w:p>
+      <w:pPr>
+        <w:pStyle w:val="ListParagraph"/>
+        <w:numPr>
+          <w:ilvl w:val="2"/>
+          <w:numId w:val="22"/>
+        </w:numPr>
+      </w:pPr>
+      <w:r>
+        <w:t>Used for indicator when mouse enters a tile</w:t>
+      </w:r>
+    </w:p>
+    <w:p>
+      <w:pPr>
+        <w:pStyle w:val="ListParagraph"/>
+        <w:numPr>
+          <w:ilvl w:val="1"/>
+          <w:numId w:val="22"/>
+        </w:numPr>
+      </w:pPr>
+      <w:r>
+        <w:t>Created “</w:t>
+      </w:r>
+      <w:proofErr w:type="spellStart"/>
+      <w:r>
+        <w:t>UsedMine</w:t>
+      </w:r>
+      <w:proofErr w:type="spellEnd"/>
+      <w:r>
+        <w:t>” sprite</w:t>
+      </w:r>
+    </w:p>
+    <w:p>
+      <w:pPr>
+        <w:pStyle w:val="ListParagraph"/>
+        <w:numPr>
+          <w:ilvl w:val="2"/>
+          <w:numId w:val="22"/>
+        </w:numPr>
+      </w:pPr>
+      <w:r>
+        <w:t>Used to indicate the mine has exploded here</w:t>
+      </w:r>
+    </w:p>
+    <w:p>
+      <w:pPr>
+        <w:pStyle w:val="ListParagraph"/>
+        <w:numPr>
+          <w:ilvl w:val="1"/>
+          <w:numId w:val="22"/>
+        </w:numPr>
+      </w:pPr>
+      <w:r>
+        <w:t>Added level complete screen</w:t>
+      </w:r>
+    </w:p>
+    <w:p>
+      <w:pPr>
+        <w:pStyle w:val="ListParagraph"/>
+        <w:numPr>
+          <w:ilvl w:val="2"/>
+          <w:numId w:val="22"/>
+        </w:numPr>
+      </w:pPr>
+      <w:r>
+        <w:t>Added scripts</w:t>
+      </w:r>
+    </w:p>
+    <w:p>
+      <w:pPr>
+        <w:pStyle w:val="ListParagraph"/>
+        <w:numPr>
+          <w:ilvl w:val="3"/>
+          <w:numId w:val="22"/>
+        </w:numPr>
+      </w:pPr>
+      <w:r>
+        <w:lastRenderedPageBreak/>
+        <w:t>HUDComplete.gd</w:t>
+      </w:r>
+    </w:p>
+    <w:p>
+      <w:pPr>
+        <w:pStyle w:val="ListParagraph"/>
+        <w:numPr>
+          <w:ilvl w:val="2"/>
+          <w:numId w:val="22"/>
+        </w:numPr>
+      </w:pPr>
+      <w:r>
+        <w:t>Added new scenes</w:t>
+      </w:r>
+    </w:p>
+    <w:p>
+      <w:pPr>
+        <w:pStyle w:val="ListParagraph"/>
+        <w:numPr>
+          <w:ilvl w:val="3"/>
+          <w:numId w:val="22"/>
+        </w:numPr>
+      </w:pPr>
+      <w:proofErr w:type="spellStart"/>
+      <w:r>
+        <w:t>HUDComplete.tscn</w:t>
+      </w:r>
+      <w:proofErr w:type="spellEnd"/>
+    </w:p>
+    <w:p>
+      <w:pPr>
+        <w:pStyle w:val="ListParagraph"/>
+        <w:numPr>
+          <w:ilvl w:val="3"/>
+          <w:numId w:val="22"/>
+        </w:numPr>
+      </w:pPr>
+      <w:proofErr w:type="spellStart"/>
+      <w:r>
+        <w:t>CompleteScreen.tscn</w:t>
+      </w:r>
+      <w:proofErr w:type="spellEnd"/>
+    </w:p>
+    <w:p>
+      <w:pPr>
+        <w:pStyle w:val="ListParagraph"/>
+        <w:numPr>
+          <w:ilvl w:val="2"/>
+          <w:numId w:val="22"/>
+        </w:numPr>
+      </w:pPr>
+      <w:r>
+        <w:t xml:space="preserve">Tweaked Debug.gd </w:t>
+      </w:r>
+    </w:p>
+    <w:p>
+      <w:pPr>
+        <w:pStyle w:val="ListParagraph"/>
+        <w:numPr>
+          <w:ilvl w:val="3"/>
+          <w:numId w:val="22"/>
+        </w:numPr>
+      </w:pPr>
+      <w:r>
+        <w:t>Added more debug functions</w:t>
+      </w:r>
+    </w:p>
+    <w:p>
+      <w:pPr>
+        <w:pStyle w:val="ListParagraph"/>
+        <w:numPr>
+          <w:ilvl w:val="4"/>
+          <w:numId w:val="22"/>
+        </w:numPr>
+      </w:pPr>
+      <w:r>
+        <w:t>“LEVEL”</w:t>
+      </w:r>
+    </w:p>
+    <w:p>
+      <w:pPr>
+        <w:pStyle w:val="ListParagraph"/>
+        <w:numPr>
+          <w:ilvl w:val="5"/>
+          <w:numId w:val="22"/>
+        </w:numPr>
+      </w:pPr>
+      <w:r>
+        <w:t>Completes the level</w:t>
+      </w:r>
+    </w:p>
+    <w:p>
+      <w:pPr>
+        <w:pStyle w:val="ListParagraph"/>
+        <w:numPr>
+          <w:ilvl w:val="4"/>
+          <w:numId w:val="22"/>
+        </w:numPr>
+      </w:pPr>
+      <w:r>
+        <w:t>“ADD”</w:t>
+      </w:r>
+    </w:p>
+    <w:p>
+      <w:pPr>
+        <w:pStyle w:val="ListParagraph"/>
+        <w:numPr>
+          <w:ilvl w:val="5"/>
+          <w:numId w:val="22"/>
+        </w:numPr>
+      </w:pPr>
+      <w:r>
+        <w:t>Adds 100 to player score</w:t>
+      </w:r>
+    </w:p>
+    <w:p>
+      <w:pPr>
+        <w:pStyle w:val="ListParagraph"/>
+        <w:numPr>
+          <w:ilvl w:val="0"/>
+          <w:numId w:val="22"/>
+        </w:numPr>
+      </w:pPr>
+      <w:r>
+        <w:t>Gantt Chart Progress check</w:t>
+      </w:r>
+    </w:p>
+    <w:p>
+      <w:pPr>
+        <w:pStyle w:val="ListParagraph"/>
+        <w:numPr>
+          <w:ilvl w:val="1"/>
+          <w:numId w:val="22"/>
+        </w:numPr>
+      </w:pPr>
+      <w:r>
+        <w:t>Algorithm</w:t>
+      </w:r>
+    </w:p>
+    <w:p>
+      <w:pPr>
+        <w:pStyle w:val="ListParagraph"/>
+        <w:numPr>
+          <w:ilvl w:val="2"/>
+          <w:numId w:val="22"/>
+        </w:numPr>
+      </w:pPr>
+      <w:r>
+        <w:t>On course</w:t>
+      </w:r>
+    </w:p>
+    <w:p>
+      <w:pPr>
+        <w:pStyle w:val="ListParagraph"/>
+        <w:numPr>
+          <w:ilvl w:val="1"/>
+          <w:numId w:val="22"/>
+        </w:numPr>
+      </w:pPr>
+      <w:r>
+        <w:t>Documentation</w:t>
+      </w:r>
+    </w:p>
+    <w:p>
+      <w:pPr>
+        <w:pStyle w:val="ListParagraph"/>
+        <w:numPr>
+          <w:ilvl w:val="2"/>
+          <w:numId w:val="22"/>
+        </w:numPr>
+      </w:pPr>
+      <w:r>
+        <w:t>On course</w:t>
+      </w:r>
+    </w:p>
+    <w:p>
+      <w:pPr>
+        <w:pStyle w:val="ListParagraph"/>
+        <w:numPr>
+          <w:ilvl w:val="1"/>
+          <w:numId w:val="22"/>
+        </w:numPr>
+      </w:pPr>
+      <w:r>
+        <w:t>Coding</w:t>
+      </w:r>
+    </w:p>
+    <w:p>
+      <w:pPr>
+        <w:pStyle w:val="ListParagraph"/>
+        <w:numPr>
+          <w:ilvl w:val="2"/>
+          <w:numId w:val="22"/>
+        </w:numPr>
+      </w:pPr>
+      <w:r>
+        <w:t>On Course</w:t>
+      </w:r>
+    </w:p>
+    <w:p>
+      <w:pPr>
+        <w:pStyle w:val="ListParagraph"/>
+        <w:numPr>
+          <w:ilvl w:val="1"/>
+          <w:numId w:val="22"/>
+        </w:numPr>
+      </w:pPr>
+      <w:r>
+        <w:t>Testing</w:t>
+      </w:r>
+    </w:p>
+    <w:p>
+      <w:pPr>
+        <w:pStyle w:val="ListParagraph"/>
+        <w:numPr>
+          <w:ilvl w:val="2"/>
+          <w:numId w:val="22"/>
+        </w:numPr>
+      </w:pPr>
+      <w:r>
+        <w:t xml:space="preserve">Behind on schedule </w:t>
+      </w:r>
+    </w:p>
+    <w:p>
+      <w:pPr>
+        <w:pStyle w:val="ListParagraph"/>
+        <w:numPr>
+          <w:ilvl w:val="0"/>
+          <w:numId w:val="22"/>
+        </w:numPr>
+      </w:pPr>
+      <w:r>
+        <w:rPr>
+          <w:lang w:val="en-US"/>
+        </w:rPr>
+        <w:t>Additional task tomorro</w:t>
+      </w:r>
+      <w:r>
+        <w:rPr>
+          <w:lang w:val="en-US"/>
+        </w:rPr>
+        <w:t>w</w:t>
+      </w:r>
+    </w:p>
+    <w:p>
+      <w:pPr>
+        <w:pStyle w:val="ListParagraph"/>
+        <w:numPr>
+          <w:ilvl w:val="1"/>
+          <w:numId w:val="22"/>
+        </w:numPr>
+      </w:pPr>
+      <w:r>
+        <w:rPr>
+          <w:lang w:val="en-US"/>
+        </w:rPr>
+        <w:t>Continue coding</w:t>
+      </w:r>
+    </w:p>
+    <w:p>
+      <w:pPr>
+        <w:pStyle w:val="Heading3"/>
+        <w:ind w:firstLine="360"/>
+      </w:pPr>
+      <w:r>
+        <w:t>9</w:t>
+      </w:r>
+      <w:r>
+        <w:t>th of July</w:t>
+      </w:r>
+    </w:p>
+    <w:p>
+      <w:pPr>
+        <w:pStyle w:val="ListParagraph"/>
+        <w:numPr>
+          <w:ilvl w:val="0"/>
+          <w:numId w:val="22"/>
+        </w:numPr>
+      </w:pPr>
+      <w:r>
+        <w:t>Continued development on main game</w:t>
+      </w:r>
+    </w:p>
+    <w:p>
+      <w:pPr>
+        <w:pStyle w:val="ListParagraph"/>
+        <w:numPr>
+          <w:ilvl w:val="1"/>
+          <w:numId w:val="22"/>
+        </w:numPr>
+      </w:pPr>
+      <w:r>
+        <w:t>Added Scenes</w:t>
+      </w:r>
+    </w:p>
+    <w:p>
+      <w:pPr>
+        <w:pStyle w:val="ListParagraph"/>
+        <w:numPr>
+          <w:ilvl w:val="2"/>
+          <w:numId w:val="22"/>
+        </w:numPr>
+      </w:pPr>
+      <w:proofErr w:type="spellStart"/>
+      <w:r>
+        <w:t>OverScreen.tscn</w:t>
+      </w:r>
+      <w:proofErr w:type="spellEnd"/>
+    </w:p>
+    <w:p>
+      <w:pPr>
+        <w:pStyle w:val="ListParagraph"/>
+        <w:numPr>
+          <w:ilvl w:val="2"/>
+          <w:numId w:val="22"/>
+        </w:numPr>
+      </w:pPr>
+      <w:proofErr w:type="spellStart"/>
+      <w:r>
+        <w:t>HUDOver.tscn</w:t>
+      </w:r>
+      <w:proofErr w:type="spellEnd"/>
+    </w:p>
+    <w:p>
+      <w:pPr>
+        <w:pStyle w:val="ListParagraph"/>
+        <w:numPr>
+          <w:ilvl w:val="3"/>
+          <w:numId w:val="22"/>
+        </w:numPr>
+      </w:pPr>
+      <w:r>
+        <w:t>Created HUDOver.gd under this scene</w:t>
+      </w:r>
+    </w:p>
+    <w:p>
+      <w:pPr>
+        <w:pStyle w:val="ListParagraph"/>
+        <w:numPr>
+          <w:ilvl w:val="2"/>
+          <w:numId w:val="22"/>
+        </w:numPr>
+      </w:pPr>
+      <w:proofErr w:type="spellStart"/>
+      <w:r>
+        <w:t>ScoreScreen.tscn</w:t>
+      </w:r>
+      <w:proofErr w:type="spellEnd"/>
+    </w:p>
+    <w:p>
+      <w:pPr>
+        <w:pStyle w:val="ListParagraph"/>
+        <w:numPr>
+          <w:ilvl w:val="2"/>
+          <w:numId w:val="22"/>
+        </w:numPr>
+      </w:pPr>
+      <w:proofErr w:type="spellStart"/>
+      <w:r>
+        <w:t>HUDScore.tscn</w:t>
+      </w:r>
+      <w:proofErr w:type="spellEnd"/>
+    </w:p>
+    <w:p>
+      <w:pPr>
+        <w:pStyle w:val="ListParagraph"/>
+        <w:numPr>
+          <w:ilvl w:val="1"/>
+          <w:numId w:val="22"/>
+        </w:numPr>
+      </w:pPr>
+      <w:r>
+        <w:t>Added .</w:t>
+      </w:r>
+      <w:proofErr w:type="spellStart"/>
+      <w:r>
+        <w:t>cfg</w:t>
+      </w:r>
+      <w:proofErr w:type="spellEnd"/>
+      <w:r>
+        <w:t xml:space="preserve"> file</w:t>
+      </w:r>
+    </w:p>
+    <w:p>
+      <w:pPr>
+        <w:pStyle w:val="ListParagraph"/>
+        <w:numPr>
+          <w:ilvl w:val="1"/>
+          <w:numId w:val="22"/>
+        </w:numPr>
+      </w:pPr>
+      <w:r>
+        <w:t>Had trouble sorting scores for leader board</w:t>
+      </w:r>
+    </w:p>
+    <w:p>
+      <w:pPr>
+        <w:pStyle w:val="ListParagraph"/>
+        <w:numPr>
+          <w:ilvl w:val="2"/>
+          <w:numId w:val="22"/>
+        </w:numPr>
+      </w:pPr>
+      <w:r>
+        <w:t>Found online help</w:t>
+      </w:r>
+    </w:p>
+    <w:p>
+      <w:pPr>
+        <w:pStyle w:val="ListParagraph"/>
+        <w:numPr>
+          <w:ilvl w:val="3"/>
+          <w:numId w:val="22"/>
+        </w:numPr>
+      </w:pPr>
+      <w:r>
+        <w:t xml:space="preserve">From </w:t>
+      </w:r>
+      <w:proofErr w:type="spellStart"/>
+      <w:r>
+        <w:t>godot</w:t>
+      </w:r>
+      <w:proofErr w:type="spellEnd"/>
+      <w:r>
+        <w:t xml:space="preserve"> documentation</w:t>
+      </w:r>
+    </w:p>
+    <w:p>
+      <w:pPr>
+        <w:pStyle w:val="ListParagraph"/>
+        <w:numPr>
+          <w:ilvl w:val="3"/>
+          <w:numId w:val="22"/>
+        </w:numPr>
+      </w:pPr>
+      <w:proofErr w:type="spellStart"/>
+      <w:r>
+        <w:t>Github</w:t>
+      </w:r>
+      <w:proofErr w:type="spellEnd"/>
+      <w:r>
+        <w:t xml:space="preserve"> Repository</w:t>
+      </w:r>
+    </w:p>
+    <w:p>
+      <w:pPr>
+        <w:pStyle w:val="ListParagraph"/>
+        <w:numPr>
+          <w:ilvl w:val="0"/>
+          <w:numId w:val="22"/>
+        </w:numPr>
+      </w:pPr>
+      <w:r>
+        <w:t>Gantt Chart Progress check</w:t>
+      </w:r>
+    </w:p>
+    <w:p>
+      <w:pPr>
+        <w:pStyle w:val="ListParagraph"/>
+        <w:numPr>
+          <w:ilvl w:val="1"/>
+          <w:numId w:val="22"/>
+        </w:numPr>
+      </w:pPr>
+      <w:r>
+        <w:t>Algorithm</w:t>
+      </w:r>
+    </w:p>
+    <w:p>
+      <w:pPr>
+        <w:pStyle w:val="ListParagraph"/>
+        <w:numPr>
+          <w:ilvl w:val="2"/>
+          <w:numId w:val="22"/>
+        </w:numPr>
+      </w:pPr>
+      <w:r>
+        <w:t>On course</w:t>
+      </w:r>
+    </w:p>
+    <w:p>
+      <w:pPr>
+        <w:pStyle w:val="ListParagraph"/>
+        <w:numPr>
+          <w:ilvl w:val="1"/>
+          <w:numId w:val="22"/>
+        </w:numPr>
+      </w:pPr>
+      <w:r>
+        <w:t>Documentation</w:t>
+      </w:r>
+    </w:p>
+    <w:p>
+      <w:pPr>
+        <w:pStyle w:val="ListParagraph"/>
+        <w:numPr>
+          <w:ilvl w:val="2"/>
+          <w:numId w:val="22"/>
+        </w:numPr>
+      </w:pPr>
+      <w:r>
+        <w:t>On course</w:t>
+      </w:r>
+    </w:p>
+    <w:p>
+      <w:pPr>
+        <w:pStyle w:val="ListParagraph"/>
+        <w:numPr>
+          <w:ilvl w:val="1"/>
+          <w:numId w:val="22"/>
+        </w:numPr>
+      </w:pPr>
+      <w:r>
+        <w:t>Coding</w:t>
+      </w:r>
+    </w:p>
+    <w:p>
+      <w:pPr>
+        <w:pStyle w:val="ListParagraph"/>
+        <w:numPr>
+          <w:ilvl w:val="2"/>
+          <w:numId w:val="22"/>
+        </w:numPr>
+      </w:pPr>
+      <w:r>
+        <w:t>On Course</w:t>
+      </w:r>
+    </w:p>
+    <w:p>
+      <w:pPr>
+        <w:pStyle w:val="ListParagraph"/>
+        <w:numPr>
+          <w:ilvl w:val="1"/>
+          <w:numId w:val="22"/>
+        </w:numPr>
+      </w:pPr>
+      <w:r>
+        <w:t>Testing</w:t>
+      </w:r>
+    </w:p>
+    <w:p>
+      <w:pPr>
+        <w:pStyle w:val="ListParagraph"/>
+        <w:numPr>
+          <w:ilvl w:val="2"/>
+          <w:numId w:val="22"/>
+        </w:numPr>
+      </w:pPr>
+      <w:r>
+        <w:lastRenderedPageBreak/>
+        <w:t xml:space="preserve">Behind on schedule </w:t>
+      </w:r>
+    </w:p>
+    <w:p>
+      <w:pPr>
+        <w:pStyle w:val="ListParagraph"/>
+        <w:numPr>
+          <w:ilvl w:val="0"/>
+          <w:numId w:val="22"/>
+        </w:numPr>
+      </w:pPr>
+      <w:r>
+        <w:rPr>
+          <w:lang w:val="en-US"/>
+        </w:rPr>
+        <w:t>Additional task tomorro</w:t>
+      </w:r>
+      <w:r>
+        <w:rPr>
+          <w:lang w:val="en-US"/>
+        </w:rPr>
+        <w:t>w</w:t>
+      </w:r>
+    </w:p>
+    <w:p>
+      <w:pPr>
+        <w:pStyle w:val="ListParagraph"/>
+        <w:numPr>
+          <w:ilvl w:val="1"/>
+          <w:numId w:val="22"/>
+        </w:numPr>
+      </w:pPr>
+      <w:r>
+        <w:rPr>
+          <w:lang w:val="en-US"/>
+        </w:rPr>
+        <w:t>Continue coding</w:t>
       </w:r>
     </w:p>
     <w:p/>
@@ -22468,7 +24343,7 @@
         <w:rFonts w:ascii="Courier New" w:hAnsi="Courier New" w:cs="Courier New" w:hint="default"/>
       </w:rPr>
     </w:lvl>
-    <w:lvl w:ilvl="5" w:tplc="0C090005" w:tentative="1">
+    <w:lvl w:ilvl="5" w:tplc="0C090005">
       <w:start w:val="1"/>
       <w:numFmt w:val="bullet"/>
       <w:lvlText w:val=""/>
@@ -23557,6 +25432,7 @@
   <w:style w:type="character" w:default="1" w:styleId="DefaultParagraphFont">
     <w:name w:val="Default Paragraph Font"/>
     <w:uiPriority w:val="1"/>
+    <w:semiHidden/>
     <w:unhideWhenUsed/>
   </w:style>
   <w:style w:type="table" w:default="1" w:styleId="TableNormal">

</xml_diff>

<commit_message>
editing code for clarity,
</commit_message>
<xml_diff>
--- a/James Fan - Assessment 3_ Major Project.docx
+++ b/James Fan - Assessment 3_ Major Project.docx
@@ -103,7 +103,7 @@
           <w:noProof/>
         </w:rPr>
         <w:drawing>
-          <wp:anchor distT="0" distB="0" distL="114300" distR="114300" simplePos="0" relativeHeight="251662336" behindDoc="0" locked="0" layoutInCell="1" allowOverlap="1" wp14:anchorId="2E5C3EA8" wp14:editId="121F6B5C">
+          <wp:anchor distT="0" distB="0" distL="114300" distR="114300" simplePos="0" relativeHeight="251662336" behindDoc="0" locked="0" layoutInCell="1" allowOverlap="1" wp14:anchorId="2E5C3EA8" wp14:editId="41F944BD">
             <wp:simplePos x="0" y="0"/>
             <wp:positionH relativeFrom="column">
               <wp:posOffset>1417320</wp:posOffset>
@@ -10226,7 +10226,13 @@
           </w:tcPr>
           <w:p>
             <w:r>
-              <w:t>offsets</w:t>
+              <w:t>o</w:t>
+            </w:r>
+            <w:r>
+              <w:t>ffsets</w:t>
+            </w:r>
+            <w:r>
+              <w:t xml:space="preserve"> (within Tile.gd)</w:t>
             </w:r>
           </w:p>
         </w:tc>
@@ -10272,7 +10278,19 @@
           </w:tcPr>
           <w:p>
             <w:r>
-              <w:t>A list of offset integers for the code to use to found surrounding tile nodes</w:t>
+              <w:t>A</w:t>
+            </w:r>
+            <w:r>
+              <w:t>n</w:t>
+            </w:r>
+            <w:r>
+              <w:t xml:space="preserve"> </w:t>
+            </w:r>
+            <w:r>
+              <w:t>array</w:t>
+            </w:r>
+            <w:r>
+              <w:t xml:space="preserve"> of offset integers for the code to use to found surrounding tile nodes</w:t>
             </w:r>
           </w:p>
         </w:tc>
@@ -11467,7 +11485,11 @@
           <w:tcPr>
             <w:tcW w:w="1275" w:type="dxa"/>
           </w:tcPr>
-          <w:p/>
+          <w:p>
+            <w:r>
+              <w:t>1</w:t>
+            </w:r>
+          </w:p>
         </w:tc>
         <w:tc>
           <w:tcPr>
@@ -11546,7 +11568,11 @@
           <w:tcPr>
             <w:tcW w:w="1275" w:type="dxa"/>
           </w:tcPr>
-          <w:p/>
+          <w:p>
+            <w:r>
+              <w:t>1</w:t>
+            </w:r>
+          </w:p>
         </w:tc>
         <w:tc>
           <w:tcPr>
@@ -11622,7 +11648,11 @@
           <w:tcPr>
             <w:tcW w:w="1275" w:type="dxa"/>
           </w:tcPr>
-          <w:p/>
+          <w:p>
+            <w:r>
+              <w:t>1</w:t>
+            </w:r>
+          </w:p>
         </w:tc>
         <w:tc>
           <w:tcPr>
@@ -11692,7 +11722,11 @@
           <w:tcPr>
             <w:tcW w:w="1275" w:type="dxa"/>
           </w:tcPr>
-          <w:p/>
+          <w:p>
+            <w:r>
+              <w:t>1</w:t>
+            </w:r>
+          </w:p>
         </w:tc>
         <w:tc>
           <w:tcPr>
@@ -11750,7 +11784,10 @@
           </w:tcPr>
           <w:p>
             <w:r>
-              <w:t>string</w:t>
+              <w:t>S</w:t>
+            </w:r>
+            <w:r>
+              <w:t>tring</w:t>
             </w:r>
           </w:p>
         </w:tc>
@@ -11959,6 +11996,2497 @@
           <w:p>
             <w:r>
               <w:t>True</w:t>
+            </w:r>
+          </w:p>
+        </w:tc>
+        <w:tc>
+          <w:tcPr>
+            <w:tcW w:w="1389" w:type="dxa"/>
+          </w:tcPr>
+          <w:p/>
+        </w:tc>
+      </w:tr>
+      <w:tr>
+        <w:tc>
+          <w:tcPr>
+            <w:tcW w:w="1951" w:type="dxa"/>
+          </w:tcPr>
+          <w:p>
+            <w:r>
+              <w:t>shipleft</w:t>
+            </w:r>
+          </w:p>
+        </w:tc>
+        <w:tc>
+          <w:tcPr>
+            <w:tcW w:w="1418" w:type="dxa"/>
+          </w:tcPr>
+          <w:p>
+            <w:r>
+              <w:t>Integer</w:t>
+            </w:r>
+          </w:p>
+        </w:tc>
+        <w:tc>
+          <w:tcPr>
+            <w:tcW w:w="992" w:type="dxa"/>
+          </w:tcPr>
+          <w:p/>
+        </w:tc>
+        <w:tc>
+          <w:tcPr>
+            <w:tcW w:w="1276" w:type="dxa"/>
+          </w:tcPr>
+          <w:p>
+            <w:r>
+              <w:t>1</w:t>
+            </w:r>
+          </w:p>
+        </w:tc>
+        <w:tc>
+          <w:tcPr>
+            <w:tcW w:w="1275" w:type="dxa"/>
+          </w:tcPr>
+          <w:p>
+            <w:r>
+              <w:t>1</w:t>
+            </w:r>
+          </w:p>
+        </w:tc>
+        <w:tc>
+          <w:tcPr>
+            <w:tcW w:w="4820" w:type="dxa"/>
+          </w:tcPr>
+          <w:p>
+            <w:r>
+              <w:t xml:space="preserve">A temporary </w:t>
+            </w:r>
+            <w:r>
+              <w:t>integer</w:t>
+            </w:r>
+            <w:r>
+              <w:t xml:space="preserve"> that will be used to determine how much ships parts are left and then replace the value the ShipParts variable to be used to calculate how much tiles are left to clear </w:t>
+            </w:r>
+          </w:p>
+        </w:tc>
+        <w:tc>
+          <w:tcPr>
+            <w:tcW w:w="1559" w:type="dxa"/>
+          </w:tcPr>
+          <w:p>
+            <w:r>
+              <w:t>3</w:t>
+            </w:r>
+          </w:p>
+        </w:tc>
+        <w:tc>
+          <w:tcPr>
+            <w:tcW w:w="1389" w:type="dxa"/>
+          </w:tcPr>
+          <w:p>
+            <w:r>
+              <w:t>At or under 17</w:t>
+            </w:r>
+          </w:p>
+        </w:tc>
+      </w:tr>
+      <w:tr>
+        <w:tc>
+          <w:tcPr>
+            <w:tcW w:w="1951" w:type="dxa"/>
+          </w:tcPr>
+          <w:p>
+            <w:r>
+              <w:t>cutoff</w:t>
+            </w:r>
+          </w:p>
+        </w:tc>
+        <w:tc>
+          <w:tcPr>
+            <w:tcW w:w="1418" w:type="dxa"/>
+          </w:tcPr>
+          <w:p>
+            <w:r>
+              <w:t xml:space="preserve">Integer </w:t>
+            </w:r>
+          </w:p>
+        </w:tc>
+        <w:tc>
+          <w:tcPr>
+            <w:tcW w:w="992" w:type="dxa"/>
+          </w:tcPr>
+          <w:p/>
+        </w:tc>
+        <w:tc>
+          <w:tcPr>
+            <w:tcW w:w="1276" w:type="dxa"/>
+          </w:tcPr>
+          <w:p>
+            <w:r>
+              <w:t>1</w:t>
+            </w:r>
+          </w:p>
+        </w:tc>
+        <w:tc>
+          <w:tcPr>
+            <w:tcW w:w="1275" w:type="dxa"/>
+          </w:tcPr>
+          <w:p>
+            <w:r>
+              <w:t>1</w:t>
+            </w:r>
+          </w:p>
+        </w:tc>
+        <w:tc>
+          <w:tcPr>
+            <w:tcW w:w="4820" w:type="dxa"/>
+          </w:tcPr>
+          <w:p>
+            <w:r>
+              <w:t>A</w:t>
+            </w:r>
+            <w:r>
+              <w:t>n</w:t>
+            </w:r>
+            <w:r>
+              <w:t xml:space="preserve"> </w:t>
+            </w:r>
+            <w:r>
+              <w:t xml:space="preserve">integer </w:t>
+            </w:r>
+            <w:r>
+              <w:t>that will allow the game to tell if the score that the player has archived is going to end up on the leaderboard</w:t>
+            </w:r>
+          </w:p>
+        </w:tc>
+        <w:tc>
+          <w:tcPr>
+            <w:tcW w:w="1559" w:type="dxa"/>
+          </w:tcPr>
+          <w:p>
+            <w:r>
+              <w:t>6</w:t>
+            </w:r>
+          </w:p>
+        </w:tc>
+        <w:tc>
+          <w:tcPr>
+            <w:tcW w:w="1389" w:type="dxa"/>
+          </w:tcPr>
+          <w:p/>
+        </w:tc>
+      </w:tr>
+      <w:tr>
+        <w:tc>
+          <w:tcPr>
+            <w:tcW w:w="1951" w:type="dxa"/>
+          </w:tcPr>
+          <w:p>
+            <w:r>
+              <w:t>passed</w:t>
+            </w:r>
+          </w:p>
+        </w:tc>
+        <w:tc>
+          <w:tcPr>
+            <w:tcW w:w="1418" w:type="dxa"/>
+          </w:tcPr>
+          <w:p>
+            <w:r>
+              <w:t>Boolean</w:t>
+            </w:r>
+          </w:p>
+        </w:tc>
+        <w:tc>
+          <w:tcPr>
+            <w:tcW w:w="992" w:type="dxa"/>
+          </w:tcPr>
+          <w:p>
+            <w:r>
+              <w:t>X</w:t>
+            </w:r>
+          </w:p>
+        </w:tc>
+        <w:tc>
+          <w:tcPr>
+            <w:tcW w:w="1276" w:type="dxa"/>
+          </w:tcPr>
+          <w:p>
+            <w:r>
+              <w:t>1</w:t>
+            </w:r>
+          </w:p>
+        </w:tc>
+        <w:tc>
+          <w:tcPr>
+            <w:tcW w:w="1275" w:type="dxa"/>
+          </w:tcPr>
+          <w:p>
+            <w:r>
+              <w:t>1</w:t>
+            </w:r>
+          </w:p>
+        </w:tc>
+        <w:tc>
+          <w:tcPr>
+            <w:tcW w:w="4820" w:type="dxa"/>
+          </w:tcPr>
+          <w:p>
+            <w:r>
+              <w:t>This variable stops the switch scene code to run when the score has not been entered</w:t>
+            </w:r>
+          </w:p>
+        </w:tc>
+        <w:tc>
+          <w:tcPr>
+            <w:tcW w:w="1559" w:type="dxa"/>
+          </w:tcPr>
+          <w:p>
+            <w:r>
+              <w:t>F</w:t>
+            </w:r>
+            <w:r>
+              <w:t>alse</w:t>
+            </w:r>
+          </w:p>
+        </w:tc>
+        <w:tc>
+          <w:tcPr>
+            <w:tcW w:w="1389" w:type="dxa"/>
+          </w:tcPr>
+          <w:p/>
+        </w:tc>
+      </w:tr>
+      <w:tr>
+        <w:tc>
+          <w:tcPr>
+            <w:tcW w:w="1951" w:type="dxa"/>
+          </w:tcPr>
+          <w:p>
+            <w:r>
+              <w:t>username</w:t>
+            </w:r>
+          </w:p>
+        </w:tc>
+        <w:tc>
+          <w:tcPr>
+            <w:tcW w:w="1418" w:type="dxa"/>
+          </w:tcPr>
+          <w:p>
+            <w:r>
+              <w:t>String</w:t>
+            </w:r>
+          </w:p>
+        </w:tc>
+        <w:tc>
+          <w:tcPr>
+            <w:tcW w:w="992" w:type="dxa"/>
+          </w:tcPr>
+          <w:p/>
+        </w:tc>
+        <w:tc>
+          <w:tcPr>
+            <w:tcW w:w="1276" w:type="dxa"/>
+          </w:tcPr>
+          <w:p>
+            <w:r>
+              <w:t>10</w:t>
+            </w:r>
+          </w:p>
+        </w:tc>
+        <w:tc>
+          <w:tcPr>
+            <w:tcW w:w="1275" w:type="dxa"/>
+          </w:tcPr>
+          <w:p>
+            <w:r>
+              <w:t>10</w:t>
+            </w:r>
+          </w:p>
+        </w:tc>
+        <w:tc>
+          <w:tcPr>
+            <w:tcW w:w="4820" w:type="dxa"/>
+          </w:tcPr>
+          <w:p>
+            <w:r>
+              <w:t>Allows the username entered in the LineEdit node to be readable a useable by code to config the score file</w:t>
+            </w:r>
+          </w:p>
+        </w:tc>
+        <w:tc>
+          <w:tcPr>
+            <w:tcW w:w="1559" w:type="dxa"/>
+          </w:tcPr>
+          <w:p>
+            <w:r>
+              <w:t>Jamer</w:t>
+            </w:r>
+          </w:p>
+        </w:tc>
+        <w:tc>
+          <w:tcPr>
+            <w:tcW w:w="1389" w:type="dxa"/>
+          </w:tcPr>
+          <w:p/>
+        </w:tc>
+      </w:tr>
+      <w:tr>
+        <w:tc>
+          <w:tcPr>
+            <w:tcW w:w="1951" w:type="dxa"/>
+          </w:tcPr>
+          <w:p>
+            <w:r>
+              <w:t>I</w:t>
+            </w:r>
+            <w:r>
+              <w:t>nteracted</w:t>
+            </w:r>
+          </w:p>
+        </w:tc>
+        <w:tc>
+          <w:tcPr>
+            <w:tcW w:w="1418" w:type="dxa"/>
+          </w:tcPr>
+          <w:p>
+            <w:r>
+              <w:t>Boolean</w:t>
+            </w:r>
+          </w:p>
+        </w:tc>
+        <w:tc>
+          <w:tcPr>
+            <w:tcW w:w="992" w:type="dxa"/>
+          </w:tcPr>
+          <w:p>
+            <w:r>
+              <w:t>X</w:t>
+            </w:r>
+          </w:p>
+        </w:tc>
+        <w:tc>
+          <w:tcPr>
+            <w:tcW w:w="1276" w:type="dxa"/>
+          </w:tcPr>
+          <w:p>
+            <w:r>
+              <w:t>1</w:t>
+            </w:r>
+          </w:p>
+        </w:tc>
+        <w:tc>
+          <w:tcPr>
+            <w:tcW w:w="1275" w:type="dxa"/>
+          </w:tcPr>
+          <w:p>
+            <w:r>
+              <w:t>1</w:t>
+            </w:r>
+          </w:p>
+        </w:tc>
+        <w:tc>
+          <w:tcPr>
+            <w:tcW w:w="4820" w:type="dxa"/>
+          </w:tcPr>
+          <w:p>
+            <w:r>
+              <w:t>This variable tells the game that the player has never touched LineEdit node which means they haven’t entered a name; stops players from continuing without entering a name</w:t>
+            </w:r>
+          </w:p>
+        </w:tc>
+        <w:tc>
+          <w:tcPr>
+            <w:tcW w:w="1559" w:type="dxa"/>
+          </w:tcPr>
+          <w:p>
+            <w:r>
+              <w:t>True</w:t>
+            </w:r>
+          </w:p>
+        </w:tc>
+        <w:tc>
+          <w:tcPr>
+            <w:tcW w:w="1389" w:type="dxa"/>
+          </w:tcPr>
+          <w:p/>
+        </w:tc>
+      </w:tr>
+      <w:tr>
+        <w:tc>
+          <w:tcPr>
+            <w:tcW w:w="1951" w:type="dxa"/>
+          </w:tcPr>
+          <w:p>
+            <w:r>
+              <w:t>playernum</w:t>
+            </w:r>
+          </w:p>
+        </w:tc>
+        <w:tc>
+          <w:tcPr>
+            <w:tcW w:w="1418" w:type="dxa"/>
+          </w:tcPr>
+          <w:p>
+            <w:r>
+              <w:t>Integer</w:t>
+            </w:r>
+          </w:p>
+        </w:tc>
+        <w:tc>
+          <w:tcPr>
+            <w:tcW w:w="992" w:type="dxa"/>
+          </w:tcPr>
+          <w:p/>
+        </w:tc>
+        <w:tc>
+          <w:tcPr>
+            <w:tcW w:w="1276" w:type="dxa"/>
+          </w:tcPr>
+          <w:p>
+            <w:r>
+              <w:t>1</w:t>
+            </w:r>
+          </w:p>
+        </w:tc>
+        <w:tc>
+          <w:tcPr>
+            <w:tcW w:w="1275" w:type="dxa"/>
+          </w:tcPr>
+          <w:p>
+            <w:r>
+              <w:t>1</w:t>
+            </w:r>
+          </w:p>
+        </w:tc>
+        <w:tc>
+          <w:tcPr>
+            <w:tcW w:w="4820" w:type="dxa"/>
+          </w:tcPr>
+          <w:p>
+            <w:r>
+              <w:t>An integer that is only used to allow the game to update the personal best of a returning player</w:t>
+            </w:r>
+          </w:p>
+        </w:tc>
+        <w:tc>
+          <w:tcPr>
+            <w:tcW w:w="1559" w:type="dxa"/>
+          </w:tcPr>
+          <w:p>
+            <w:r>
+              <w:t>Jamer</w:t>
+            </w:r>
+          </w:p>
+        </w:tc>
+        <w:tc>
+          <w:tcPr>
+            <w:tcW w:w="1389" w:type="dxa"/>
+          </w:tcPr>
+          <w:p/>
+        </w:tc>
+      </w:tr>
+      <w:tr>
+        <w:tc>
+          <w:tcPr>
+            <w:tcW w:w="1951" w:type="dxa"/>
+          </w:tcPr>
+          <w:p>
+            <w:r>
+              <w:t>namenumber</w:t>
+            </w:r>
+          </w:p>
+        </w:tc>
+        <w:tc>
+          <w:tcPr>
+            <w:tcW w:w="1418" w:type="dxa"/>
+          </w:tcPr>
+          <w:p>
+            <w:r>
+              <w:t>Integer</w:t>
+            </w:r>
+          </w:p>
+        </w:tc>
+        <w:tc>
+          <w:tcPr>
+            <w:tcW w:w="992" w:type="dxa"/>
+          </w:tcPr>
+          <w:p/>
+        </w:tc>
+        <w:tc>
+          <w:tcPr>
+            <w:tcW w:w="1276" w:type="dxa"/>
+          </w:tcPr>
+          <w:p>
+            <w:r>
+              <w:t>1</w:t>
+            </w:r>
+          </w:p>
+        </w:tc>
+        <w:tc>
+          <w:tcPr>
+            <w:tcW w:w="1275" w:type="dxa"/>
+          </w:tcPr>
+          <w:p>
+            <w:r>
+              <w:t>1</w:t>
+            </w:r>
+          </w:p>
+        </w:tc>
+        <w:tc>
+          <w:tcPr>
+            <w:tcW w:w="4820" w:type="dxa"/>
+          </w:tcPr>
+          <w:p>
+            <w:r>
+              <w:t xml:space="preserve">A counting variable used to </w:t>
+            </w:r>
+            <w:r>
+              <w:t>count</w:t>
+            </w:r>
+            <w:r>
+              <w:t xml:space="preserve"> so that correct array values are selected</w:t>
+            </w:r>
+          </w:p>
+        </w:tc>
+        <w:tc>
+          <w:tcPr>
+            <w:tcW w:w="1559" w:type="dxa"/>
+          </w:tcPr>
+          <w:p>
+            <w:r>
+              <w:t>2</w:t>
+            </w:r>
+          </w:p>
+        </w:tc>
+        <w:tc>
+          <w:tcPr>
+            <w:tcW w:w="1389" w:type="dxa"/>
+          </w:tcPr>
+          <w:p/>
+        </w:tc>
+      </w:tr>
+      <w:tr>
+        <w:tc>
+          <w:tcPr>
+            <w:tcW w:w="1951" w:type="dxa"/>
+          </w:tcPr>
+          <w:p>
+            <w:r>
+              <w:t>noded</w:t>
+            </w:r>
+          </w:p>
+        </w:tc>
+        <w:tc>
+          <w:tcPr>
+            <w:tcW w:w="1418" w:type="dxa"/>
+          </w:tcPr>
+          <w:p>
+            <w:r>
+              <w:t>String</w:t>
+            </w:r>
+          </w:p>
+        </w:tc>
+        <w:tc>
+          <w:tcPr>
+            <w:tcW w:w="992" w:type="dxa"/>
+          </w:tcPr>
+          <w:p/>
+        </w:tc>
+        <w:tc>
+          <w:tcPr>
+            <w:tcW w:w="1276" w:type="dxa"/>
+          </w:tcPr>
+          <w:p>
+            <w:r>
+              <w:t>1</w:t>
+            </w:r>
+          </w:p>
+        </w:tc>
+        <w:tc>
+          <w:tcPr>
+            <w:tcW w:w="1275" w:type="dxa"/>
+          </w:tcPr>
+          <w:p>
+            <w:r>
+              <w:t>1</w:t>
+            </w:r>
+          </w:p>
+        </w:tc>
+        <w:tc>
+          <w:tcPr>
+            <w:tcW w:w="4820" w:type="dxa"/>
+          </w:tcPr>
+          <w:p>
+            <w:r>
+              <w:t xml:space="preserve">A string that contains a passed id of the node that the mouse is currently on  </w:t>
+            </w:r>
+          </w:p>
+        </w:tc>
+        <w:tc>
+          <w:tcPr>
+            <w:tcW w:w="1559" w:type="dxa"/>
+          </w:tcPr>
+          <w:p>
+            <w:r>
+              <w:t>@</w:t>
+            </w:r>
+            <w:r>
+              <w:t>Node2D@49:&lt;Node2D#79943437521&gt;</w:t>
+            </w:r>
+          </w:p>
+        </w:tc>
+        <w:tc>
+          <w:tcPr>
+            <w:tcW w:w="1389" w:type="dxa"/>
+          </w:tcPr>
+          <w:p/>
+        </w:tc>
+      </w:tr>
+      <w:tr>
+        <w:tc>
+          <w:tcPr>
+            <w:tcW w:w="1951" w:type="dxa"/>
+          </w:tcPr>
+          <w:p>
+            <w:r>
+              <w:lastRenderedPageBreak/>
+              <w:t>postioning</w:t>
+            </w:r>
+          </w:p>
+        </w:tc>
+        <w:tc>
+          <w:tcPr>
+            <w:tcW w:w="1418" w:type="dxa"/>
+          </w:tcPr>
+          <w:p>
+            <w:r>
+              <w:t xml:space="preserve">Array of </w:t>
+            </w:r>
+            <w:r>
+              <w:t>I</w:t>
+            </w:r>
+            <w:r>
+              <w:t>ntegers</w:t>
+            </w:r>
+          </w:p>
+        </w:tc>
+        <w:tc>
+          <w:tcPr>
+            <w:tcW w:w="992" w:type="dxa"/>
+          </w:tcPr>
+          <w:p>
+            <w:r>
+              <w:t>N</w:t>
+            </w:r>
+            <w:r>
+              <w:t>,</w:t>
+            </w:r>
+            <w:r>
+              <w:t>N</w:t>
+            </w:r>
+          </w:p>
+        </w:tc>
+        <w:tc>
+          <w:tcPr>
+            <w:tcW w:w="1276" w:type="dxa"/>
+          </w:tcPr>
+          <w:p>
+            <w:r>
+              <w:t>2</w:t>
+            </w:r>
+          </w:p>
+        </w:tc>
+        <w:tc>
+          <w:tcPr>
+            <w:tcW w:w="1275" w:type="dxa"/>
+          </w:tcPr>
+          <w:p>
+            <w:r>
+              <w:t>2</w:t>
+            </w:r>
+          </w:p>
+        </w:tc>
+        <w:tc>
+          <w:tcPr>
+            <w:tcW w:w="4820" w:type="dxa"/>
+          </w:tcPr>
+          <w:p>
+            <w:r>
+              <w:t>An array that contains the passed position of the node that the mouse is currently to correctly render the indicator</w:t>
+            </w:r>
+          </w:p>
+        </w:tc>
+        <w:tc>
+          <w:tcPr>
+            <w:tcW w:w="1559" w:type="dxa"/>
+          </w:tcPr>
+          <w:p>
+            <w:r>
+              <w:t>[0,0]</w:t>
+            </w:r>
+          </w:p>
+        </w:tc>
+        <w:tc>
+          <w:tcPr>
+            <w:tcW w:w="1389" w:type="dxa"/>
+          </w:tcPr>
+          <w:p/>
+        </w:tc>
+      </w:tr>
+      <w:tr>
+        <w:tc>
+          <w:tcPr>
+            <w:tcW w:w="1951" w:type="dxa"/>
+          </w:tcPr>
+          <w:p>
+            <w:r>
+              <w:t>nodes</w:t>
+            </w:r>
+          </w:p>
+        </w:tc>
+        <w:tc>
+          <w:tcPr>
+            <w:tcW w:w="1418" w:type="dxa"/>
+          </w:tcPr>
+          <w:p>
+            <w:r>
+              <w:t xml:space="preserve">Array of </w:t>
+            </w:r>
+            <w:r>
+              <w:t>N</w:t>
+            </w:r>
+            <w:r>
+              <w:t>odes</w:t>
+            </w:r>
+          </w:p>
+        </w:tc>
+        <w:tc>
+          <w:tcPr>
+            <w:tcW w:w="992" w:type="dxa"/>
+          </w:tcPr>
+          <w:p/>
+        </w:tc>
+        <w:tc>
+          <w:tcPr>
+            <w:tcW w:w="1276" w:type="dxa"/>
+          </w:tcPr>
+          <w:p>
+            <w:r>
+              <w:t>Number of nodes found by offset</w:t>
+            </w:r>
+          </w:p>
+        </w:tc>
+        <w:tc>
+          <w:tcPr>
+            <w:tcW w:w="1275" w:type="dxa"/>
+          </w:tcPr>
+          <w:p>
+            <w:r>
+              <w:t>Number of nodes found by offset</w:t>
+            </w:r>
+          </w:p>
+        </w:tc>
+        <w:tc>
+          <w:tcPr>
+            <w:tcW w:w="4820" w:type="dxa"/>
+          </w:tcPr>
+          <w:p>
+            <w:r>
+              <w:t>A list of tile nodes appended by into the array after the code founds that they are</w:t>
+            </w:r>
+            <w:r>
+              <w:t xml:space="preserve"> within the offsets off the selected tile node </w:t>
+            </w:r>
+          </w:p>
+        </w:tc>
+        <w:tc>
+          <w:tcPr>
+            <w:tcW w:w="1559" w:type="dxa"/>
+          </w:tcPr>
+          <w:p>
+            <w:r>
+              <w:t>[</w:t>
+            </w:r>
+            <w:r>
+              <w:t xml:space="preserve">(Vector2.UP) </w:t>
+            </w:r>
+            <w:r>
+              <w:t xml:space="preserve">* </w:t>
+            </w:r>
+            <w:r>
+              <w:t>65</w:t>
+            </w:r>
+            <w:r>
+              <w:t>]</w:t>
+            </w:r>
+          </w:p>
+        </w:tc>
+        <w:tc>
+          <w:tcPr>
+            <w:tcW w:w="1389" w:type="dxa"/>
+          </w:tcPr>
+          <w:p/>
+        </w:tc>
+      </w:tr>
+      <w:tr>
+        <w:tc>
+          <w:tcPr>
+            <w:tcW w:w="1951" w:type="dxa"/>
+          </w:tcPr>
+          <w:p>
+            <w:r>
+              <w:t>occupied</w:t>
+            </w:r>
+          </w:p>
+        </w:tc>
+        <w:tc>
+          <w:tcPr>
+            <w:tcW w:w="1418" w:type="dxa"/>
+          </w:tcPr>
+          <w:p>
+            <w:r>
+              <w:t>Integer</w:t>
+            </w:r>
+          </w:p>
+        </w:tc>
+        <w:tc>
+          <w:tcPr>
+            <w:tcW w:w="992" w:type="dxa"/>
+          </w:tcPr>
+          <w:p/>
+        </w:tc>
+        <w:tc>
+          <w:tcPr>
+            <w:tcW w:w="1276" w:type="dxa"/>
+          </w:tcPr>
+          <w:p>
+            <w:r>
+              <w:t>1</w:t>
+            </w:r>
+          </w:p>
+        </w:tc>
+        <w:tc>
+          <w:tcPr>
+            <w:tcW w:w="1275" w:type="dxa"/>
+          </w:tcPr>
+          <w:p>
+            <w:r>
+              <w:t>1</w:t>
+            </w:r>
+          </w:p>
+        </w:tc>
+        <w:tc>
+          <w:tcPr>
+            <w:tcW w:w="4820" w:type="dxa"/>
+          </w:tcPr>
+          <w:p>
+            <w:r>
+              <w:t xml:space="preserve">A parameter value that stops players from </w:t>
+            </w:r>
+            <w:r>
+              <w:t>overlapping</w:t>
+            </w:r>
+            <w:r>
+              <w:t xml:space="preserve"> their ships </w:t>
+            </w:r>
+            <w:r>
+              <w:t>when placing them</w:t>
+            </w:r>
+          </w:p>
+        </w:tc>
+        <w:tc>
+          <w:tcPr>
+            <w:tcW w:w="1559" w:type="dxa"/>
+          </w:tcPr>
+          <w:p>
+            <w:r>
+              <w:t>2</w:t>
+            </w:r>
+          </w:p>
+        </w:tc>
+        <w:tc>
+          <w:tcPr>
+            <w:tcW w:w="1389" w:type="dxa"/>
+          </w:tcPr>
+          <w:p/>
+        </w:tc>
+      </w:tr>
+      <w:tr>
+        <w:tc>
+          <w:tcPr>
+            <w:tcW w:w="1951" w:type="dxa"/>
+          </w:tcPr>
+          <w:p>
+            <w:r>
+              <w:t>rotating</w:t>
+            </w:r>
+          </w:p>
+        </w:tc>
+        <w:tc>
+          <w:tcPr>
+            <w:tcW w:w="1418" w:type="dxa"/>
+          </w:tcPr>
+          <w:p>
+            <w:r>
+              <w:t>Boolean</w:t>
+            </w:r>
+          </w:p>
+        </w:tc>
+        <w:tc>
+          <w:tcPr>
+            <w:tcW w:w="992" w:type="dxa"/>
+          </w:tcPr>
+          <w:p>
+            <w:r>
+              <w:t>X</w:t>
+            </w:r>
+          </w:p>
+        </w:tc>
+        <w:tc>
+          <w:tcPr>
+            <w:tcW w:w="1276" w:type="dxa"/>
+          </w:tcPr>
+          <w:p>
+            <w:r>
+              <w:t>1</w:t>
+            </w:r>
+          </w:p>
+        </w:tc>
+        <w:tc>
+          <w:tcPr>
+            <w:tcW w:w="1275" w:type="dxa"/>
+          </w:tcPr>
+          <w:p>
+            <w:r>
+              <w:t>1</w:t>
+            </w:r>
+          </w:p>
+        </w:tc>
+        <w:tc>
+          <w:tcPr>
+            <w:tcW w:w="4820" w:type="dxa"/>
+          </w:tcPr>
+          <w:p>
+            <w:r>
+              <w:t xml:space="preserve">A boolean that tells the game if the ship is currently rotated  </w:t>
+            </w:r>
+          </w:p>
+        </w:tc>
+        <w:tc>
+          <w:tcPr>
+            <w:tcW w:w="1559" w:type="dxa"/>
+          </w:tcPr>
+          <w:p>
+            <w:r>
+              <w:t>True</w:t>
+            </w:r>
+          </w:p>
+        </w:tc>
+        <w:tc>
+          <w:tcPr>
+            <w:tcW w:w="1389" w:type="dxa"/>
+          </w:tcPr>
+          <w:p/>
+        </w:tc>
+      </w:tr>
+      <w:tr>
+        <w:tc>
+          <w:tcPr>
+            <w:tcW w:w="1951" w:type="dxa"/>
+          </w:tcPr>
+          <w:p>
+            <w:r>
+              <w:t>shipnumber</w:t>
+            </w:r>
+          </w:p>
+        </w:tc>
+        <w:tc>
+          <w:tcPr>
+            <w:tcW w:w="1418" w:type="dxa"/>
+          </w:tcPr>
+          <w:p>
+            <w:r>
+              <w:t>Integer</w:t>
+            </w:r>
+          </w:p>
+        </w:tc>
+        <w:tc>
+          <w:tcPr>
+            <w:tcW w:w="992" w:type="dxa"/>
+          </w:tcPr>
+          <w:p/>
+        </w:tc>
+        <w:tc>
+          <w:tcPr>
+            <w:tcW w:w="1276" w:type="dxa"/>
+          </w:tcPr>
+          <w:p>
+            <w:r>
+              <w:t>1</w:t>
+            </w:r>
+          </w:p>
+        </w:tc>
+        <w:tc>
+          <w:tcPr>
+            <w:tcW w:w="1275" w:type="dxa"/>
+          </w:tcPr>
+          <w:p>
+            <w:r>
+              <w:t>1</w:t>
+            </w:r>
+          </w:p>
+        </w:tc>
+        <w:tc>
+          <w:tcPr>
+            <w:tcW w:w="4820" w:type="dxa"/>
+          </w:tcPr>
+          <w:p>
+            <w:r>
+              <w:t xml:space="preserve">A counting variable used to </w:t>
+            </w:r>
+            <w:r>
+              <w:t>count</w:t>
+            </w:r>
+            <w:r>
+              <w:t xml:space="preserve"> so that correct array values are selected</w:t>
+            </w:r>
+          </w:p>
+        </w:tc>
+        <w:tc>
+          <w:tcPr>
+            <w:tcW w:w="1559" w:type="dxa"/>
+          </w:tcPr>
+          <w:p>
+            <w:r>
+              <w:t>3</w:t>
+            </w:r>
+          </w:p>
+        </w:tc>
+        <w:tc>
+          <w:tcPr>
+            <w:tcW w:w="1389" w:type="dxa"/>
+          </w:tcPr>
+          <w:p/>
+        </w:tc>
+      </w:tr>
+      <w:tr>
+        <w:tc>
+          <w:tcPr>
+            <w:tcW w:w="1951" w:type="dxa"/>
+          </w:tcPr>
+          <w:p>
+            <w:r>
+              <w:t>tilenumber</w:t>
+            </w:r>
+          </w:p>
+        </w:tc>
+        <w:tc>
+          <w:tcPr>
+            <w:tcW w:w="1418" w:type="dxa"/>
+          </w:tcPr>
+          <w:p>
+            <w:r>
+              <w:t>Integer</w:t>
+            </w:r>
+          </w:p>
+        </w:tc>
+        <w:tc>
+          <w:tcPr>
+            <w:tcW w:w="992" w:type="dxa"/>
+          </w:tcPr>
+          <w:p/>
+        </w:tc>
+        <w:tc>
+          <w:tcPr>
+            <w:tcW w:w="1276" w:type="dxa"/>
+          </w:tcPr>
+          <w:p>
+            <w:r>
+              <w:t>1</w:t>
+            </w:r>
+          </w:p>
+        </w:tc>
+        <w:tc>
+          <w:tcPr>
+            <w:tcW w:w="1275" w:type="dxa"/>
+          </w:tcPr>
+          <w:p>
+            <w:r>
+              <w:t>1</w:t>
+            </w:r>
+          </w:p>
+        </w:tc>
+        <w:tc>
+          <w:tcPr>
+            <w:tcW w:w="4820" w:type="dxa"/>
+          </w:tcPr>
+          <w:p>
+            <w:r>
+              <w:t xml:space="preserve">A counting variable used to </w:t>
+            </w:r>
+            <w:r>
+              <w:t>count</w:t>
+            </w:r>
+            <w:r>
+              <w:t xml:space="preserve"> so that correct array values are selected</w:t>
+            </w:r>
+          </w:p>
+        </w:tc>
+        <w:tc>
+          <w:tcPr>
+            <w:tcW w:w="1559" w:type="dxa"/>
+          </w:tcPr>
+          <w:p>
+            <w:r>
+              <w:t>2</w:t>
+            </w:r>
+          </w:p>
+        </w:tc>
+        <w:tc>
+          <w:tcPr>
+            <w:tcW w:w="1389" w:type="dxa"/>
+          </w:tcPr>
+          <w:p/>
+        </w:tc>
+      </w:tr>
+      <w:tr>
+        <w:tc>
+          <w:tcPr>
+            <w:tcW w:w="1951" w:type="dxa"/>
+          </w:tcPr>
+          <w:p>
+            <w:r>
+              <w:t>o</w:t>
+            </w:r>
+            <w:r>
+              <w:t>ffsets</w:t>
+            </w:r>
+            <w:r>
+              <w:t xml:space="preserve"> (within </w:t>
+            </w:r>
+            <w:r>
+              <w:t>Mechanics</w:t>
+            </w:r>
+            <w:r>
+              <w:t>.gd)</w:t>
+            </w:r>
+          </w:p>
+        </w:tc>
+        <w:tc>
+          <w:tcPr>
+            <w:tcW w:w="1418" w:type="dxa"/>
+          </w:tcPr>
+          <w:p>
+            <w:r>
+              <w:t>Array of integers</w:t>
+            </w:r>
+          </w:p>
+        </w:tc>
+        <w:tc>
+          <w:tcPr>
+            <w:tcW w:w="992" w:type="dxa"/>
+          </w:tcPr>
+          <w:p/>
+        </w:tc>
+        <w:tc>
+          <w:tcPr>
+            <w:tcW w:w="1276" w:type="dxa"/>
+          </w:tcPr>
+          <w:p>
+            <w:r>
+              <w:t>Number of nodes found by offset</w:t>
+            </w:r>
+          </w:p>
+        </w:tc>
+        <w:tc>
+          <w:tcPr>
+            <w:tcW w:w="1275" w:type="dxa"/>
+          </w:tcPr>
+          <w:p>
+            <w:r>
+              <w:t>Number of nodes found by offset</w:t>
+            </w:r>
+          </w:p>
+        </w:tc>
+        <w:tc>
+          <w:tcPr>
+            <w:tcW w:w="4820" w:type="dxa"/>
+          </w:tcPr>
+          <w:p>
+            <w:r>
+              <w:t>An array of offset integers for the code to use to found tile nodes for the game to use</w:t>
+            </w:r>
+          </w:p>
+        </w:tc>
+        <w:tc>
+          <w:tcPr>
+            <w:tcW w:w="1559" w:type="dxa"/>
+          </w:tcPr>
+          <w:p>
+            <w:r>
+              <w:t>[</w:t>
+            </w:r>
+            <w:r>
+              <w:t xml:space="preserve">(Vector2.UP) </w:t>
+            </w:r>
+            <w:r>
+              <w:t xml:space="preserve">* </w:t>
+            </w:r>
+            <w:r>
+              <w:t>65</w:t>
+            </w:r>
+            <w:r>
+              <w:t>]</w:t>
+            </w:r>
+          </w:p>
+        </w:tc>
+        <w:tc>
+          <w:tcPr>
+            <w:tcW w:w="1389" w:type="dxa"/>
+          </w:tcPr>
+          <w:p/>
+        </w:tc>
+      </w:tr>
+      <w:tr>
+        <w:tc>
+          <w:tcPr>
+            <w:tcW w:w="1951" w:type="dxa"/>
+          </w:tcPr>
+          <w:p>
+            <w:r>
+              <w:t>occupiedchecking</w:t>
+            </w:r>
+          </w:p>
+        </w:tc>
+        <w:tc>
+          <w:tcPr>
+            <w:tcW w:w="1418" w:type="dxa"/>
+          </w:tcPr>
+          <w:p>
+            <w:r>
+              <w:t xml:space="preserve">Array of </w:t>
+            </w:r>
+            <w:r>
+              <w:t>Boolean</w:t>
+            </w:r>
+          </w:p>
+        </w:tc>
+        <w:tc>
+          <w:tcPr>
+            <w:tcW w:w="992" w:type="dxa"/>
+          </w:tcPr>
+          <w:p/>
+        </w:tc>
+        <w:tc>
+          <w:tcPr>
+            <w:tcW w:w="1276" w:type="dxa"/>
+          </w:tcPr>
+          <w:p/>
+        </w:tc>
+        <w:tc>
+          <w:tcPr>
+            <w:tcW w:w="1275" w:type="dxa"/>
+          </w:tcPr>
+          <w:p/>
+        </w:tc>
+        <w:tc>
+          <w:tcPr>
+            <w:tcW w:w="4820" w:type="dxa"/>
+          </w:tcPr>
+          <w:p>
+            <w:r>
+              <w:t xml:space="preserve">An array of </w:t>
+            </w:r>
+            <w:r>
+              <w:t>Booleans</w:t>
+            </w:r>
+            <w:r>
+              <w:t xml:space="preserve"> of all selected nodes, to allow the game to check if one of them is occupied by another ship</w:t>
+            </w:r>
+          </w:p>
+        </w:tc>
+        <w:tc>
+          <w:tcPr>
+            <w:tcW w:w="1559" w:type="dxa"/>
+          </w:tcPr>
+          <w:p>
+            <w:r>
+              <w:t>[False,True]</w:t>
+            </w:r>
+          </w:p>
+        </w:tc>
+        <w:tc>
+          <w:tcPr>
+            <w:tcW w:w="1389" w:type="dxa"/>
+          </w:tcPr>
+          <w:p/>
+        </w:tc>
+      </w:tr>
+      <w:tr>
+        <w:tc>
+          <w:tcPr>
+            <w:tcW w:w="1951" w:type="dxa"/>
+          </w:tcPr>
+          <w:p>
+            <w:r>
+              <w:t>scores</w:t>
+            </w:r>
+          </w:p>
+        </w:tc>
+        <w:tc>
+          <w:tcPr>
+            <w:tcW w:w="1418" w:type="dxa"/>
+          </w:tcPr>
+          <w:p>
+            <w:r>
+              <w:t xml:space="preserve">Array of </w:t>
+            </w:r>
+            <w:r>
+              <w:t>Integer</w:t>
+            </w:r>
+          </w:p>
+        </w:tc>
+        <w:tc>
+          <w:tcPr>
+            <w:tcW w:w="992" w:type="dxa"/>
+          </w:tcPr>
+          <w:p/>
+        </w:tc>
+        <w:tc>
+          <w:tcPr>
+            <w:tcW w:w="1276" w:type="dxa"/>
+          </w:tcPr>
+          <w:p>
+            <w:r>
+              <w:t>5</w:t>
+            </w:r>
+          </w:p>
+        </w:tc>
+        <w:tc>
+          <w:tcPr>
+            <w:tcW w:w="1275" w:type="dxa"/>
+          </w:tcPr>
+          <w:p>
+            <w:r>
+              <w:t>5</w:t>
+            </w:r>
+          </w:p>
+        </w:tc>
+        <w:tc>
+          <w:tcPr>
+            <w:tcW w:w="4820" w:type="dxa"/>
+          </w:tcPr>
+          <w:p>
+            <w:r>
+              <w:t xml:space="preserve">An array of scores obtained from a config file which will be </w:t>
+            </w:r>
+            <w:r>
+              <w:t>utilized</w:t>
+            </w:r>
+            <w:r>
+              <w:t xml:space="preserve"> by the game to generate and change the scores on the leader board</w:t>
+            </w:r>
+          </w:p>
+        </w:tc>
+        <w:tc>
+          <w:tcPr>
+            <w:tcW w:w="1559" w:type="dxa"/>
+          </w:tcPr>
+          <w:p>
+            <w:r>
+              <w:t>[1,2,3,4]</w:t>
+            </w:r>
+          </w:p>
+        </w:tc>
+        <w:tc>
+          <w:tcPr>
+            <w:tcW w:w="1389" w:type="dxa"/>
+          </w:tcPr>
+          <w:p/>
+        </w:tc>
+      </w:tr>
+      <w:tr>
+        <w:tc>
+          <w:tcPr>
+            <w:tcW w:w="1951" w:type="dxa"/>
+          </w:tcPr>
+          <w:p>
+            <w:r>
+              <w:t>usernames</w:t>
+            </w:r>
+          </w:p>
+        </w:tc>
+        <w:tc>
+          <w:tcPr>
+            <w:tcW w:w="1418" w:type="dxa"/>
+          </w:tcPr>
+          <w:p>
+            <w:r>
+              <w:t xml:space="preserve">Array of </w:t>
+            </w:r>
+            <w:r>
+              <w:t>String</w:t>
+            </w:r>
+          </w:p>
+        </w:tc>
+        <w:tc>
+          <w:tcPr>
+            <w:tcW w:w="992" w:type="dxa"/>
+          </w:tcPr>
+          <w:p/>
+        </w:tc>
+        <w:tc>
+          <w:tcPr>
+            <w:tcW w:w="1276" w:type="dxa"/>
+          </w:tcPr>
+          <w:p>
+            <w:r>
+              <w:t>5</w:t>
+            </w:r>
+          </w:p>
+        </w:tc>
+        <w:tc>
+          <w:tcPr>
+            <w:tcW w:w="1275" w:type="dxa"/>
+          </w:tcPr>
+          <w:p>
+            <w:r>
+              <w:t>5</w:t>
+            </w:r>
+          </w:p>
+        </w:tc>
+        <w:tc>
+          <w:tcPr>
+            <w:tcW w:w="4820" w:type="dxa"/>
+          </w:tcPr>
+          <w:p>
+            <w:r>
+              <w:t xml:space="preserve">An array of </w:t>
+            </w:r>
+            <w:r>
+              <w:t>username</w:t>
+            </w:r>
+            <w:r>
+              <w:t xml:space="preserve"> </w:t>
+            </w:r>
+            <w:r>
+              <w:t xml:space="preserve">obtained from a config file which will be utilized by the game to generate and change the </w:t>
+            </w:r>
+            <w:r>
+              <w:t>username</w:t>
+            </w:r>
+            <w:r>
+              <w:t xml:space="preserve"> on the leader board</w:t>
+            </w:r>
+          </w:p>
+        </w:tc>
+        <w:tc>
+          <w:tcPr>
+            <w:tcW w:w="1559" w:type="dxa"/>
+          </w:tcPr>
+          <w:p>
+            <w:r>
+              <w:t>[Jamer,Nib,Oliver]</w:t>
+            </w:r>
+          </w:p>
+        </w:tc>
+        <w:tc>
+          <w:tcPr>
+            <w:tcW w:w="1389" w:type="dxa"/>
+          </w:tcPr>
+          <w:p/>
+        </w:tc>
+      </w:tr>
+      <w:tr>
+        <w:tc>
+          <w:tcPr>
+            <w:tcW w:w="1951" w:type="dxa"/>
+          </w:tcPr>
+          <w:p>
+            <w:r>
+              <w:t>carrier</w:t>
+            </w:r>
+          </w:p>
+        </w:tc>
+        <w:tc>
+          <w:tcPr>
+            <w:tcW w:w="1418" w:type="dxa"/>
+          </w:tcPr>
+          <w:p>
+            <w:r>
+              <w:t>Array of Integer</w:t>
+            </w:r>
+          </w:p>
+        </w:tc>
+        <w:tc>
+          <w:tcPr>
+            <w:tcW w:w="992" w:type="dxa"/>
+          </w:tcPr>
+          <w:p/>
+        </w:tc>
+        <w:tc>
+          <w:tcPr>
+            <w:tcW w:w="1276" w:type="dxa"/>
+          </w:tcPr>
+          <w:p>
+            <w:r>
+              <w:t>5</w:t>
+            </w:r>
+          </w:p>
+        </w:tc>
+        <w:tc>
+          <w:tcPr>
+            <w:tcW w:w="1275" w:type="dxa"/>
+          </w:tcPr>
+          <w:p>
+            <w:r>
+              <w:t>5</w:t>
+            </w:r>
+          </w:p>
+        </w:tc>
+        <w:tc>
+          <w:tcPr>
+            <w:tcW w:w="4820" w:type="dxa"/>
+          </w:tcPr>
+          <w:p>
+            <w:r>
+              <w:t xml:space="preserve">An array to contain binary values that indicate if the ship part is </w:t>
+            </w:r>
+            <w:r>
+              <w:t>alive</w:t>
+            </w:r>
+          </w:p>
+        </w:tc>
+        <w:tc>
+          <w:tcPr>
+            <w:tcW w:w="1559" w:type="dxa"/>
+          </w:tcPr>
+          <w:p>
+            <w:r>
+              <w:t>[1,1,1,1,1]</w:t>
+            </w:r>
+          </w:p>
+        </w:tc>
+        <w:tc>
+          <w:tcPr>
+            <w:tcW w:w="1389" w:type="dxa"/>
+          </w:tcPr>
+          <w:p/>
+        </w:tc>
+      </w:tr>
+      <w:tr>
+        <w:tc>
+          <w:tcPr>
+            <w:tcW w:w="1951" w:type="dxa"/>
+          </w:tcPr>
+          <w:p>
+            <w:r>
+              <w:t>battleship</w:t>
+            </w:r>
+          </w:p>
+        </w:tc>
+        <w:tc>
+          <w:tcPr>
+            <w:tcW w:w="1418" w:type="dxa"/>
+          </w:tcPr>
+          <w:p>
+            <w:r>
+              <w:t>Array of Integer</w:t>
+            </w:r>
+          </w:p>
+        </w:tc>
+        <w:tc>
+          <w:tcPr>
+            <w:tcW w:w="992" w:type="dxa"/>
+          </w:tcPr>
+          <w:p/>
+        </w:tc>
+        <w:tc>
+          <w:tcPr>
+            <w:tcW w:w="1276" w:type="dxa"/>
+          </w:tcPr>
+          <w:p>
+            <w:r>
+              <w:t>4</w:t>
+            </w:r>
+          </w:p>
+        </w:tc>
+        <w:tc>
+          <w:tcPr>
+            <w:tcW w:w="1275" w:type="dxa"/>
+          </w:tcPr>
+          <w:p>
+            <w:r>
+              <w:t>4</w:t>
+            </w:r>
+          </w:p>
+        </w:tc>
+        <w:tc>
+          <w:tcPr>
+            <w:tcW w:w="4820" w:type="dxa"/>
+          </w:tcPr>
+          <w:p>
+            <w:r>
+              <w:t>An array to contain binary values that indicate if the ship part is alive</w:t>
+            </w:r>
+          </w:p>
+        </w:tc>
+        <w:tc>
+          <w:tcPr>
+            <w:tcW w:w="1559" w:type="dxa"/>
+          </w:tcPr>
+          <w:p>
+            <w:r>
+              <w:t>[1,1,1,1]</w:t>
+            </w:r>
+          </w:p>
+        </w:tc>
+        <w:tc>
+          <w:tcPr>
+            <w:tcW w:w="1389" w:type="dxa"/>
+          </w:tcPr>
+          <w:p/>
+        </w:tc>
+      </w:tr>
+      <w:tr>
+        <w:tc>
+          <w:tcPr>
+            <w:tcW w:w="1951" w:type="dxa"/>
+          </w:tcPr>
+          <w:p>
+            <w:r>
+              <w:t>cruiser</w:t>
+            </w:r>
+          </w:p>
+        </w:tc>
+        <w:tc>
+          <w:tcPr>
+            <w:tcW w:w="1418" w:type="dxa"/>
+          </w:tcPr>
+          <w:p>
+            <w:r>
+              <w:t>Array of Integer</w:t>
+            </w:r>
+          </w:p>
+        </w:tc>
+        <w:tc>
+          <w:tcPr>
+            <w:tcW w:w="992" w:type="dxa"/>
+          </w:tcPr>
+          <w:p/>
+        </w:tc>
+        <w:tc>
+          <w:tcPr>
+            <w:tcW w:w="1276" w:type="dxa"/>
+          </w:tcPr>
+          <w:p>
+            <w:r>
+              <w:t>3</w:t>
+            </w:r>
+          </w:p>
+        </w:tc>
+        <w:tc>
+          <w:tcPr>
+            <w:tcW w:w="1275" w:type="dxa"/>
+          </w:tcPr>
+          <w:p>
+            <w:r>
+              <w:t>3</w:t>
+            </w:r>
+          </w:p>
+        </w:tc>
+        <w:tc>
+          <w:tcPr>
+            <w:tcW w:w="4820" w:type="dxa"/>
+          </w:tcPr>
+          <w:p>
+            <w:r>
+              <w:t>An array to contain binary values that indicate if the ship part is alive</w:t>
+            </w:r>
+          </w:p>
+        </w:tc>
+        <w:tc>
+          <w:tcPr>
+            <w:tcW w:w="1559" w:type="dxa"/>
+          </w:tcPr>
+          <w:p>
+            <w:r>
+              <w:t>[1,1,1]</w:t>
+            </w:r>
+          </w:p>
+        </w:tc>
+        <w:tc>
+          <w:tcPr>
+            <w:tcW w:w="1389" w:type="dxa"/>
+          </w:tcPr>
+          <w:p/>
+        </w:tc>
+      </w:tr>
+      <w:tr>
+        <w:tc>
+          <w:tcPr>
+            <w:tcW w:w="1951" w:type="dxa"/>
+          </w:tcPr>
+          <w:p>
+            <w:r>
+              <w:t>submarine</w:t>
+            </w:r>
+          </w:p>
+        </w:tc>
+        <w:tc>
+          <w:tcPr>
+            <w:tcW w:w="1418" w:type="dxa"/>
+          </w:tcPr>
+          <w:p>
+            <w:r>
+              <w:t>Array of Integer</w:t>
+            </w:r>
+          </w:p>
+        </w:tc>
+        <w:tc>
+          <w:tcPr>
+            <w:tcW w:w="992" w:type="dxa"/>
+          </w:tcPr>
+          <w:p/>
+        </w:tc>
+        <w:tc>
+          <w:tcPr>
+            <w:tcW w:w="1276" w:type="dxa"/>
+          </w:tcPr>
+          <w:p>
+            <w:r>
+              <w:t>3</w:t>
+            </w:r>
+          </w:p>
+        </w:tc>
+        <w:tc>
+          <w:tcPr>
+            <w:tcW w:w="1275" w:type="dxa"/>
+          </w:tcPr>
+          <w:p>
+            <w:r>
+              <w:t>3</w:t>
+            </w:r>
+          </w:p>
+        </w:tc>
+        <w:tc>
+          <w:tcPr>
+            <w:tcW w:w="4820" w:type="dxa"/>
+          </w:tcPr>
+          <w:p>
+            <w:r>
+              <w:t>An array to contain binary values that indicate if the ship part is alive</w:t>
+            </w:r>
+          </w:p>
+        </w:tc>
+        <w:tc>
+          <w:tcPr>
+            <w:tcW w:w="1559" w:type="dxa"/>
+          </w:tcPr>
+          <w:p>
+            <w:r>
+              <w:t>[1,1,1]</w:t>
+            </w:r>
+          </w:p>
+        </w:tc>
+        <w:tc>
+          <w:tcPr>
+            <w:tcW w:w="1389" w:type="dxa"/>
+          </w:tcPr>
+          <w:p/>
+        </w:tc>
+      </w:tr>
+      <w:tr>
+        <w:tc>
+          <w:tcPr>
+            <w:tcW w:w="1951" w:type="dxa"/>
+          </w:tcPr>
+          <w:p>
+            <w:r>
+              <w:t>destroyer</w:t>
+            </w:r>
+          </w:p>
+        </w:tc>
+        <w:tc>
+          <w:tcPr>
+            <w:tcW w:w="1418" w:type="dxa"/>
+          </w:tcPr>
+          <w:p>
+            <w:r>
+              <w:t>Array of Integer</w:t>
+            </w:r>
+          </w:p>
+        </w:tc>
+        <w:tc>
+          <w:tcPr>
+            <w:tcW w:w="992" w:type="dxa"/>
+          </w:tcPr>
+          <w:p/>
+        </w:tc>
+        <w:tc>
+          <w:tcPr>
+            <w:tcW w:w="1276" w:type="dxa"/>
+          </w:tcPr>
+          <w:p>
+            <w:r>
+              <w:t>2</w:t>
+            </w:r>
+          </w:p>
+        </w:tc>
+        <w:tc>
+          <w:tcPr>
+            <w:tcW w:w="1275" w:type="dxa"/>
+          </w:tcPr>
+          <w:p>
+            <w:r>
+              <w:t>2</w:t>
+            </w:r>
+          </w:p>
+        </w:tc>
+        <w:tc>
+          <w:tcPr>
+            <w:tcW w:w="4820" w:type="dxa"/>
+          </w:tcPr>
+          <w:p>
+            <w:r>
+              <w:t>An array to contain binary values that indicate if the ship part is alive</w:t>
+            </w:r>
+          </w:p>
+        </w:tc>
+        <w:tc>
+          <w:tcPr>
+            <w:tcW w:w="1559" w:type="dxa"/>
+          </w:tcPr>
+          <w:p>
+            <w:r>
+              <w:t>[1,1]</w:t>
+            </w:r>
+          </w:p>
+        </w:tc>
+        <w:tc>
+          <w:tcPr>
+            <w:tcW w:w="1389" w:type="dxa"/>
+          </w:tcPr>
+          <w:p/>
+        </w:tc>
+      </w:tr>
+      <w:tr>
+        <w:tc>
+          <w:tcPr>
+            <w:tcW w:w="1951" w:type="dxa"/>
+          </w:tcPr>
+          <w:p>
+            <w:r>
+              <w:t>ships</w:t>
+            </w:r>
+          </w:p>
+        </w:tc>
+        <w:tc>
+          <w:tcPr>
+            <w:tcW w:w="1418" w:type="dxa"/>
+          </w:tcPr>
+          <w:p>
+            <w:r>
+              <w:t xml:space="preserve">Array of </w:t>
+            </w:r>
+            <w:r>
+              <w:lastRenderedPageBreak/>
+              <w:t>String</w:t>
+            </w:r>
+          </w:p>
+        </w:tc>
+        <w:tc>
+          <w:tcPr>
+            <w:tcW w:w="992" w:type="dxa"/>
+          </w:tcPr>
+          <w:p/>
+        </w:tc>
+        <w:tc>
+          <w:tcPr>
+            <w:tcW w:w="1276" w:type="dxa"/>
+          </w:tcPr>
+          <w:p>
+            <w:r>
+              <w:t>5</w:t>
+            </w:r>
+          </w:p>
+        </w:tc>
+        <w:tc>
+          <w:tcPr>
+            <w:tcW w:w="1275" w:type="dxa"/>
+          </w:tcPr>
+          <w:p>
+            <w:r>
+              <w:t>5</w:t>
+            </w:r>
+          </w:p>
+        </w:tc>
+        <w:tc>
+          <w:tcPr>
+            <w:tcW w:w="4820" w:type="dxa"/>
+          </w:tcPr>
+          <w:p>
+            <w:r>
+              <w:t xml:space="preserve">An array of ship names to be used as display </w:t>
+            </w:r>
+            <w:r>
+              <w:lastRenderedPageBreak/>
+              <w:t>text during the ship placing phase</w:t>
+            </w:r>
+          </w:p>
+        </w:tc>
+        <w:tc>
+          <w:tcPr>
+            <w:tcW w:w="1559" w:type="dxa"/>
+          </w:tcPr>
+          <w:p>
+            <w:r>
+              <w:lastRenderedPageBreak/>
+              <w:t>["Carrier","Ba</w:t>
+            </w:r>
+            <w:r>
+              <w:lastRenderedPageBreak/>
+              <w:t>ttleShip","Cruiser","Submarine","Destroyer"]</w:t>
+            </w:r>
+          </w:p>
+        </w:tc>
+        <w:tc>
+          <w:tcPr>
+            <w:tcW w:w="1389" w:type="dxa"/>
+          </w:tcPr>
+          <w:p/>
+        </w:tc>
+      </w:tr>
+      <w:tr>
+        <w:tc>
+          <w:tcPr>
+            <w:tcW w:w="1951" w:type="dxa"/>
+          </w:tcPr>
+          <w:p>
+            <w:r>
+              <w:t>arrayShips</w:t>
+            </w:r>
+          </w:p>
+        </w:tc>
+        <w:tc>
+          <w:tcPr>
+            <w:tcW w:w="1418" w:type="dxa"/>
+          </w:tcPr>
+          <w:p>
+            <w:r>
+              <w:t>Array of Arrays</w:t>
+            </w:r>
+          </w:p>
+        </w:tc>
+        <w:tc>
+          <w:tcPr>
+            <w:tcW w:w="992" w:type="dxa"/>
+          </w:tcPr>
+          <w:p/>
+        </w:tc>
+        <w:tc>
+          <w:tcPr>
+            <w:tcW w:w="1276" w:type="dxa"/>
+          </w:tcPr>
+          <w:p>
+            <w:r>
+              <w:t>5</w:t>
+            </w:r>
+          </w:p>
+        </w:tc>
+        <w:tc>
+          <w:tcPr>
+            <w:tcW w:w="1275" w:type="dxa"/>
+          </w:tcPr>
+          <w:p>
+            <w:r>
+              <w:t>5</w:t>
+            </w:r>
+          </w:p>
+        </w:tc>
+        <w:tc>
+          <w:tcPr>
+            <w:tcW w:w="4820" w:type="dxa"/>
+          </w:tcPr>
+          <w:p>
+            <w:r>
+              <w:t xml:space="preserve">An array of ship </w:t>
+            </w:r>
+            <w:r>
+              <w:t>arrays to allow the game to call and modify the contents of the array</w:t>
+            </w:r>
+          </w:p>
+        </w:tc>
+        <w:tc>
+          <w:tcPr>
+            <w:tcW w:w="1559" w:type="dxa"/>
+          </w:tcPr>
+          <w:p>
+            <w:r>
+              <w:t>[carrier,battleship,cruiser,submarine,destroyer]</w:t>
+            </w:r>
+          </w:p>
+        </w:tc>
+        <w:tc>
+          <w:tcPr>
+            <w:tcW w:w="1389" w:type="dxa"/>
+          </w:tcPr>
+          <w:p/>
+        </w:tc>
+      </w:tr>
+      <w:tr>
+        <w:tc>
+          <w:tcPr>
+            <w:tcW w:w="1951" w:type="dxa"/>
+          </w:tcPr>
+          <w:p>
+            <w:r>
+              <w:t>o</w:t>
+            </w:r>
+            <w:r>
+              <w:t>ffsets</w:t>
+            </w:r>
+            <w:r>
+              <w:t xml:space="preserve"> (within </w:t>
+            </w:r>
+            <w:r>
+              <w:t>StandAlone</w:t>
+            </w:r>
+            <w:r>
+              <w:t>.gd)</w:t>
+            </w:r>
+          </w:p>
+        </w:tc>
+        <w:tc>
+          <w:tcPr>
+            <w:tcW w:w="1418" w:type="dxa"/>
+          </w:tcPr>
+          <w:p>
+            <w:r>
+              <w:t>Array of integers</w:t>
+            </w:r>
+          </w:p>
+        </w:tc>
+        <w:tc>
+          <w:tcPr>
+            <w:tcW w:w="992" w:type="dxa"/>
+          </w:tcPr>
+          <w:p/>
+        </w:tc>
+        <w:tc>
+          <w:tcPr>
+            <w:tcW w:w="1276" w:type="dxa"/>
+          </w:tcPr>
+          <w:p/>
+        </w:tc>
+        <w:tc>
+          <w:tcPr>
+            <w:tcW w:w="1275" w:type="dxa"/>
+          </w:tcPr>
+          <w:p/>
+        </w:tc>
+        <w:tc>
+          <w:tcPr>
+            <w:tcW w:w="4820" w:type="dxa"/>
+          </w:tcPr>
+          <w:p>
+            <w:r>
+              <w:t>An array of offset integers for the code to use to found tile nodes</w:t>
+            </w:r>
+            <w:r>
+              <w:t xml:space="preserve"> for the game to use</w:t>
+            </w:r>
+          </w:p>
+        </w:tc>
+        <w:tc>
+          <w:tcPr>
+            <w:tcW w:w="1559" w:type="dxa"/>
+          </w:tcPr>
+          <w:p>
+            <w:r>
+              <w:t>(Vector2.UP) * 65</w:t>
+            </w:r>
+          </w:p>
+        </w:tc>
+        <w:tc>
+          <w:tcPr>
+            <w:tcW w:w="1389" w:type="dxa"/>
+          </w:tcPr>
+          <w:p/>
+        </w:tc>
+      </w:tr>
+      <w:tr>
+        <w:tc>
+          <w:tcPr>
+            <w:tcW w:w="1951" w:type="dxa"/>
+          </w:tcPr>
+          <w:p>
+            <w:r>
+              <w:t>CoveredDebug</w:t>
+            </w:r>
+          </w:p>
+        </w:tc>
+        <w:tc>
+          <w:tcPr>
+            <w:tcW w:w="1418" w:type="dxa"/>
+          </w:tcPr>
+          <w:p>
+            <w:r>
+              <w:t>Boolean</w:t>
+            </w:r>
+          </w:p>
+        </w:tc>
+        <w:tc>
+          <w:tcPr>
+            <w:tcW w:w="992" w:type="dxa"/>
+          </w:tcPr>
+          <w:p>
+            <w:r>
+              <w:t>X</w:t>
+            </w:r>
+          </w:p>
+        </w:tc>
+        <w:tc>
+          <w:tcPr>
+            <w:tcW w:w="1276" w:type="dxa"/>
+          </w:tcPr>
+          <w:p>
+            <w:r>
+              <w:t>1</w:t>
+            </w:r>
+          </w:p>
+        </w:tc>
+        <w:tc>
+          <w:tcPr>
+            <w:tcW w:w="1275" w:type="dxa"/>
+          </w:tcPr>
+          <w:p>
+            <w:r>
+              <w:t>1</w:t>
+            </w:r>
+          </w:p>
+        </w:tc>
+        <w:tc>
+          <w:tcPr>
+            <w:tcW w:w="4820" w:type="dxa"/>
+          </w:tcPr>
+          <w:p>
+            <w:r>
+              <w:t>A parameter that allows toggling off and on the cover debug script</w:t>
+            </w:r>
+          </w:p>
+        </w:tc>
+        <w:tc>
+          <w:tcPr>
+            <w:tcW w:w="1559" w:type="dxa"/>
+          </w:tcPr>
+          <w:p>
+            <w:r>
+              <w:t>False</w:t>
+            </w:r>
+          </w:p>
+        </w:tc>
+        <w:tc>
+          <w:tcPr>
+            <w:tcW w:w="1389" w:type="dxa"/>
+          </w:tcPr>
+          <w:p/>
+        </w:tc>
+      </w:tr>
+      <w:tr>
+        <w:tc>
+          <w:tcPr>
+            <w:tcW w:w="1951" w:type="dxa"/>
+          </w:tcPr>
+          <w:p>
+            <w:r>
+              <w:t>Flagged</w:t>
+            </w:r>
+          </w:p>
+        </w:tc>
+        <w:tc>
+          <w:tcPr>
+            <w:tcW w:w="1418" w:type="dxa"/>
+          </w:tcPr>
+          <w:p>
+            <w:r>
+              <w:t>Boolean</w:t>
+            </w:r>
+          </w:p>
+        </w:tc>
+        <w:tc>
+          <w:tcPr>
+            <w:tcW w:w="992" w:type="dxa"/>
+          </w:tcPr>
+          <w:p/>
+        </w:tc>
+        <w:tc>
+          <w:tcPr>
+            <w:tcW w:w="1276" w:type="dxa"/>
+          </w:tcPr>
+          <w:p>
+            <w:r>
+              <w:t>1</w:t>
+            </w:r>
+          </w:p>
+        </w:tc>
+        <w:tc>
+          <w:tcPr>
+            <w:tcW w:w="1275" w:type="dxa"/>
+          </w:tcPr>
+          <w:p>
+            <w:r>
+              <w:t>1</w:t>
+            </w:r>
+          </w:p>
+        </w:tc>
+        <w:tc>
+          <w:tcPr>
+            <w:tcW w:w="4820" w:type="dxa"/>
+          </w:tcPr>
+          <w:p>
+            <w:r>
+              <w:t>A parameter that indicates to the game that the tile is currently f</w:t>
+            </w:r>
+            <w:r>
+              <w:t>lagged</w:t>
+            </w:r>
+          </w:p>
+        </w:tc>
+        <w:tc>
+          <w:tcPr>
+            <w:tcW w:w="1559" w:type="dxa"/>
+          </w:tcPr>
+          <w:p>
+            <w:r>
+              <w:t>True</w:t>
+            </w:r>
+          </w:p>
+        </w:tc>
+        <w:tc>
+          <w:tcPr>
+            <w:tcW w:w="1389" w:type="dxa"/>
+          </w:tcPr>
+          <w:p/>
+        </w:tc>
+      </w:tr>
+      <w:tr>
+        <w:tc>
+          <w:tcPr>
+            <w:tcW w:w="1951" w:type="dxa"/>
+          </w:tcPr>
+          <w:p>
+            <w:r>
+              <w:t>temp</w:t>
+            </w:r>
+          </w:p>
+        </w:tc>
+        <w:tc>
+          <w:tcPr>
+            <w:tcW w:w="1418" w:type="dxa"/>
+          </w:tcPr>
+          <w:p>
+            <w:r>
+              <w:t>Boolean</w:t>
+            </w:r>
+          </w:p>
+        </w:tc>
+        <w:tc>
+          <w:tcPr>
+            <w:tcW w:w="992" w:type="dxa"/>
+          </w:tcPr>
+          <w:p>
+            <w:r>
+              <w:t>X</w:t>
+            </w:r>
+          </w:p>
+        </w:tc>
+        <w:tc>
+          <w:tcPr>
+            <w:tcW w:w="1276" w:type="dxa"/>
+          </w:tcPr>
+          <w:p>
+            <w:r>
+              <w:t>1</w:t>
+            </w:r>
+          </w:p>
+        </w:tc>
+        <w:tc>
+          <w:tcPr>
+            <w:tcW w:w="1275" w:type="dxa"/>
+          </w:tcPr>
+          <w:p>
+            <w:r>
+              <w:t>1</w:t>
+            </w:r>
+          </w:p>
+        </w:tc>
+        <w:tc>
+          <w:tcPr>
+            <w:tcW w:w="4820" w:type="dxa"/>
+          </w:tcPr>
+          <w:p>
+            <w:r>
+              <w:t xml:space="preserve">A temporary variable to hold an array </w:t>
+            </w:r>
+          </w:p>
+        </w:tc>
+        <w:tc>
+          <w:tcPr>
+            <w:tcW w:w="1559" w:type="dxa"/>
+          </w:tcPr>
+          <w:p>
+            <w:r>
+              <w:t>[1,1]</w:t>
+            </w:r>
+          </w:p>
+        </w:tc>
+        <w:tc>
+          <w:tcPr>
+            <w:tcW w:w="1389" w:type="dxa"/>
+          </w:tcPr>
+          <w:p/>
+        </w:tc>
+      </w:tr>
+      <w:tr>
+        <w:tc>
+          <w:tcPr>
+            <w:tcW w:w="1951" w:type="dxa"/>
+          </w:tcPr>
+          <w:p>
+            <w:r>
+              <w:t>turn</w:t>
+            </w:r>
+          </w:p>
+        </w:tc>
+        <w:tc>
+          <w:tcPr>
+            <w:tcW w:w="1418" w:type="dxa"/>
+          </w:tcPr>
+          <w:p>
+            <w:r>
+              <w:t>Interger</w:t>
+            </w:r>
+          </w:p>
+        </w:tc>
+        <w:tc>
+          <w:tcPr>
+            <w:tcW w:w="992" w:type="dxa"/>
+          </w:tcPr>
+          <w:p/>
+        </w:tc>
+        <w:tc>
+          <w:tcPr>
+            <w:tcW w:w="1276" w:type="dxa"/>
+          </w:tcPr>
+          <w:p>
+            <w:r>
+              <w:t>1</w:t>
+            </w:r>
+          </w:p>
+        </w:tc>
+        <w:tc>
+          <w:tcPr>
+            <w:tcW w:w="1275" w:type="dxa"/>
+          </w:tcPr>
+          <w:p>
+            <w:r>
+              <w:t>1</w:t>
+            </w:r>
+          </w:p>
+        </w:tc>
+        <w:tc>
+          <w:tcPr>
+            <w:tcW w:w="4820" w:type="dxa"/>
+          </w:tcPr>
+          <w:p>
+            <w:r>
+              <w:t>A binary integer that determines if the sprite and nodes are flipped, these are not controlled by the player</w:t>
+            </w:r>
+          </w:p>
+        </w:tc>
+        <w:tc>
+          <w:tcPr>
+            <w:tcW w:w="1559" w:type="dxa"/>
+          </w:tcPr>
+          <w:p>
+            <w:r>
+              <w:t>1</w:t>
+            </w:r>
+          </w:p>
+        </w:tc>
+        <w:tc>
+          <w:tcPr>
+            <w:tcW w:w="1389" w:type="dxa"/>
+          </w:tcPr>
+          <w:p/>
+        </w:tc>
+      </w:tr>
+      <w:tr>
+        <w:tc>
+          <w:tcPr>
+            <w:tcW w:w="1951" w:type="dxa"/>
+          </w:tcPr>
+          <w:p>
+            <w:r>
+              <w:t>SurroundMineCount</w:t>
+            </w:r>
+          </w:p>
+        </w:tc>
+        <w:tc>
+          <w:tcPr>
+            <w:tcW w:w="1418" w:type="dxa"/>
+          </w:tcPr>
+          <w:p>
+            <w:r>
+              <w:t>Interger</w:t>
+            </w:r>
+          </w:p>
+        </w:tc>
+        <w:tc>
+          <w:tcPr>
+            <w:tcW w:w="992" w:type="dxa"/>
+          </w:tcPr>
+          <w:p/>
+        </w:tc>
+        <w:tc>
+          <w:tcPr>
+            <w:tcW w:w="1276" w:type="dxa"/>
+          </w:tcPr>
+          <w:p>
+            <w:r>
+              <w:t>1</w:t>
+            </w:r>
+          </w:p>
+        </w:tc>
+        <w:tc>
+          <w:tcPr>
+            <w:tcW w:w="1275" w:type="dxa"/>
+          </w:tcPr>
+          <w:p>
+            <w:r>
+              <w:t>1</w:t>
+            </w:r>
+          </w:p>
+        </w:tc>
+        <w:tc>
+          <w:tcPr>
+            <w:tcW w:w="4820" w:type="dxa"/>
+          </w:tcPr>
+          <w:p>
+            <w:r>
+              <w:t>A integer counts how many mine tiles are around a uncovered tile and is used to display the correct sprite</w:t>
+            </w:r>
+          </w:p>
+        </w:tc>
+        <w:tc>
+          <w:tcPr>
+            <w:tcW w:w="1559" w:type="dxa"/>
+          </w:tcPr>
+          <w:p>
+            <w:r>
+              <w:t>1</w:t>
             </w:r>
           </w:p>
         </w:tc>
@@ -13125,14 +15653,14 @@
         <w:pStyle w:val="Heading2"/>
       </w:pPr>
       <w:r>
-        <w:t>Destoryer</w:t>
-      </w:r>
-      <w:r>
-        <w:t>.gd</w:t>
-      </w:r>
-    </w:p>
-    <w:p>
-      <w:r>
+        <w:t>Destoryer.gd</w:t>
+      </w:r>
+    </w:p>
+    <w:p>
+      <w:r>
+        <w:rPr>
+          <w:noProof/>
+        </w:rPr>
         <w:drawing>
           <wp:inline distT="0" distB="0" distL="0" distR="0" wp14:anchorId="42CE2E3D" wp14:editId="3176EE1E">
             <wp:extent cx="4221846" cy="1089754"/>
@@ -13176,14 +15704,14 @@
       </w:pPr>
       <w:r>
         <w:lastRenderedPageBreak/>
-        <w:t>HUDStart</w:t>
-      </w:r>
-      <w:r>
-        <w:t>.gd</w:t>
-      </w:r>
-    </w:p>
-    <w:p>
-      <w:r>
+        <w:t>HUDStart.gd</w:t>
+      </w:r>
+    </w:p>
+    <w:p>
+      <w:r>
+        <w:rPr>
+          <w:noProof/>
+        </w:rPr>
         <w:drawing>
           <wp:inline distT="0" distB="0" distL="0" distR="0" wp14:anchorId="3B252E60" wp14:editId="2CAF86CE">
             <wp:extent cx="5943600" cy="3980815"/>
@@ -13233,17 +15761,14 @@
         <w:pStyle w:val="Heading2"/>
       </w:pPr>
       <w:r>
-        <w:t>HUD</w:t>
-      </w:r>
-      <w:r>
-        <w:t>Complete</w:t>
-      </w:r>
-      <w:r>
-        <w:t>.gd</w:t>
-      </w:r>
-    </w:p>
-    <w:p>
-      <w:r>
+        <w:t>HUDComplete.gd</w:t>
+      </w:r>
+    </w:p>
+    <w:p>
+      <w:r>
+        <w:rPr>
+          <w:noProof/>
+        </w:rPr>
         <w:drawing>
           <wp:inline distT="0" distB="0" distL="0" distR="0" wp14:anchorId="518363E6" wp14:editId="1F73868B">
             <wp:extent cx="5943600" cy="2555875"/>
@@ -13287,17 +15812,14 @@
       </w:pPr>
       <w:r>
         <w:lastRenderedPageBreak/>
-        <w:t>HUD</w:t>
-      </w:r>
-      <w:r>
-        <w:t>Over</w:t>
-      </w:r>
-      <w:r>
-        <w:t>.gd</w:t>
-      </w:r>
-    </w:p>
-    <w:p>
-      <w:r>
+        <w:t>HUDOver.gd</w:t>
+      </w:r>
+    </w:p>
+    <w:p>
+      <w:r>
+        <w:rPr>
+          <w:noProof/>
+        </w:rPr>
         <w:drawing>
           <wp:inline distT="0" distB="0" distL="0" distR="0" wp14:anchorId="61000CAD" wp14:editId="437250F7">
             <wp:extent cx="5943600" cy="5571490"/>
@@ -13337,6 +15859,9 @@
     </w:p>
     <w:p>
       <w:r>
+        <w:rPr>
+          <w:noProof/>
+        </w:rPr>
         <w:lastRenderedPageBreak/>
         <w:drawing>
           <wp:inline distT="0" distB="0" distL="0" distR="0" wp14:anchorId="6FEFC7EB" wp14:editId="20514F82">
@@ -13380,17 +15905,14 @@
         <w:pStyle w:val="Heading2"/>
       </w:pPr>
       <w:r>
-        <w:t>HUD</w:t>
-      </w:r>
-      <w:r>
-        <w:t>Score</w:t>
-      </w:r>
-      <w:r>
-        <w:t>.gd</w:t>
-      </w:r>
-    </w:p>
-    <w:p>
-      <w:r>
+        <w:t>HUDScore.gd</w:t>
+      </w:r>
+    </w:p>
+    <w:p>
+      <w:r>
+        <w:rPr>
+          <w:noProof/>
+        </w:rPr>
         <w:drawing>
           <wp:inline distT="0" distB="0" distL="0" distR="0" wp14:anchorId="253475CF" wp14:editId="20564E73">
             <wp:extent cx="5943600" cy="1562100"/>
@@ -13430,6 +15952,9 @@
     </w:p>
     <w:p>
       <w:r>
+        <w:rPr>
+          <w:noProof/>
+        </w:rPr>
         <w:drawing>
           <wp:inline distT="0" distB="0" distL="0" distR="0" wp14:anchorId="5148B789" wp14:editId="7DF35468">
             <wp:extent cx="5943600" cy="337820"/>
@@ -13473,14 +15998,14 @@
       </w:pPr>
       <w:r>
         <w:lastRenderedPageBreak/>
-        <w:t>Mechanics</w:t>
-      </w:r>
-      <w:r>
-        <w:t>.gd</w:t>
-      </w:r>
-    </w:p>
-    <w:p>
-      <w:r>
+        <w:t>Mechanics.gd</w:t>
+      </w:r>
+    </w:p>
+    <w:p>
+      <w:r>
+        <w:rPr>
+          <w:noProof/>
+        </w:rPr>
         <w:drawing>
           <wp:inline distT="0" distB="0" distL="0" distR="0" wp14:anchorId="455D88E7" wp14:editId="4D4D6C49">
             <wp:extent cx="5943600" cy="5734685"/>
@@ -13521,6 +16046,9 @@
     <w:p/>
     <w:p>
       <w:r>
+        <w:rPr>
+          <w:noProof/>
+        </w:rPr>
         <w:lastRenderedPageBreak/>
         <w:drawing>
           <wp:inline distT="0" distB="0" distL="0" distR="0" wp14:anchorId="33FCCF73" wp14:editId="28128E36">
@@ -13568,6 +16096,9 @@
     </w:p>
     <w:p>
       <w:r>
+        <w:rPr>
+          <w:noProof/>
+        </w:rPr>
         <w:lastRenderedPageBreak/>
         <w:drawing>
           <wp:inline distT="0" distB="0" distL="0" distR="0" wp14:anchorId="7DA89039" wp14:editId="6DB06C5C">
@@ -29176,6 +31707,18 @@
       <w:pPr>
         <w:pStyle w:val="ListParagraph"/>
         <w:numPr>
+          <w:ilvl w:val="1"/>
+          <w:numId w:val="22"/>
+        </w:numPr>
+      </w:pPr>
+      <w:r>
+        <w:t>completed</w:t>
+      </w:r>
+    </w:p>
+    <w:p>
+      <w:pPr>
+        <w:pStyle w:val="ListParagraph"/>
+        <w:numPr>
           <w:ilvl w:val="0"/>
           <w:numId w:val="22"/>
         </w:numPr>
@@ -29229,6 +31772,166 @@
         </w:numPr>
       </w:pPr>
       <w:r>
+        <w:t>On course</w:t>
+      </w:r>
+    </w:p>
+    <w:p>
+      <w:pPr>
+        <w:pStyle w:val="ListParagraph"/>
+        <w:numPr>
+          <w:ilvl w:val="1"/>
+          <w:numId w:val="22"/>
+        </w:numPr>
+      </w:pPr>
+      <w:r>
+        <w:t>Testing</w:t>
+      </w:r>
+    </w:p>
+    <w:p>
+      <w:pPr>
+        <w:pStyle w:val="ListParagraph"/>
+        <w:numPr>
+          <w:ilvl w:val="2"/>
+          <w:numId w:val="22"/>
+        </w:numPr>
+      </w:pPr>
+      <w:r>
+        <w:t xml:space="preserve">Behind on schedule </w:t>
+      </w:r>
+    </w:p>
+    <w:p>
+      <w:pPr>
+        <w:pStyle w:val="ListParagraph"/>
+        <w:numPr>
+          <w:ilvl w:val="1"/>
+          <w:numId w:val="22"/>
+        </w:numPr>
+      </w:pPr>
+      <w:r>
+        <w:t>Documentation</w:t>
+      </w:r>
+    </w:p>
+    <w:p>
+      <w:pPr>
+        <w:pStyle w:val="ListParagraph"/>
+        <w:numPr>
+          <w:ilvl w:val="2"/>
+          <w:numId w:val="22"/>
+        </w:numPr>
+      </w:pPr>
+      <w:r>
+        <w:t>On course</w:t>
+      </w:r>
+    </w:p>
+    <w:p>
+      <w:pPr>
+        <w:pStyle w:val="ListParagraph"/>
+        <w:numPr>
+          <w:ilvl w:val="0"/>
+          <w:numId w:val="22"/>
+        </w:numPr>
+      </w:pPr>
+      <w:r>
+        <w:rPr>
+          <w:lang w:val="en-US"/>
+        </w:rPr>
+        <w:t>Additional task tomorro</w:t>
+      </w:r>
+      <w:r>
+        <w:rPr>
+          <w:lang w:val="en-US"/>
+        </w:rPr>
+        <w:t>w</w:t>
+      </w:r>
+    </w:p>
+    <w:p>
+      <w:pPr>
+        <w:pStyle w:val="ListParagraph"/>
+        <w:numPr>
+          <w:ilvl w:val="1"/>
+          <w:numId w:val="22"/>
+        </w:numPr>
+      </w:pPr>
+      <w:r>
+        <w:rPr>
+          <w:lang w:val="en-US"/>
+        </w:rPr>
+        <w:t>Work on user manual</w:t>
+      </w:r>
+    </w:p>
+    <w:p>
+      <w:pPr>
+        <w:pStyle w:val="Heading3"/>
+        <w:ind w:firstLine="360"/>
+      </w:pPr>
+      <w:r>
+        <w:t>30</w:t>
+      </w:r>
+      <w:r>
+        <w:t>th of July</w:t>
+      </w:r>
+    </w:p>
+    <w:p>
+      <w:pPr>
+        <w:pStyle w:val="ListParagraph"/>
+        <w:numPr>
+          <w:ilvl w:val="0"/>
+          <w:numId w:val="22"/>
+        </w:numPr>
+      </w:pPr>
+      <w:r>
+        <w:t>Updating Technical Manual</w:t>
+      </w:r>
+    </w:p>
+    <w:p>
+      <w:pPr>
+        <w:pStyle w:val="ListParagraph"/>
+        <w:numPr>
+          <w:ilvl w:val="1"/>
+          <w:numId w:val="22"/>
+        </w:numPr>
+      </w:pPr>
+      <w:r>
+        <w:t>D</w:t>
+      </w:r>
+      <w:r>
+        <w:t>ata dictionary</w:t>
+      </w:r>
+    </w:p>
+    <w:p>
+      <w:pPr>
+        <w:pStyle w:val="ListParagraph"/>
+        <w:numPr>
+          <w:ilvl w:val="0"/>
+          <w:numId w:val="22"/>
+        </w:numPr>
+      </w:pPr>
+      <w:r>
+        <w:t>Gantt Chart Progress check</w:t>
+      </w:r>
+    </w:p>
+    <w:p>
+      <w:pPr>
+        <w:pStyle w:val="ListParagraph"/>
+        <w:numPr>
+          <w:ilvl w:val="1"/>
+          <w:numId w:val="22"/>
+        </w:numPr>
+      </w:pPr>
+      <w:r>
+        <w:t>Algorithm</w:t>
+      </w:r>
+    </w:p>
+    <w:p>
+      <w:pPr>
+        <w:pStyle w:val="ListParagraph"/>
+        <w:numPr>
+          <w:ilvl w:val="2"/>
+          <w:numId w:val="22"/>
+        </w:numPr>
+      </w:pPr>
+      <w:r>
+        <w:lastRenderedPageBreak/>
         <w:t>On course</w:t>
       </w:r>
     </w:p>
@@ -32644,7 +35347,6 @@
   <w:style w:type="character" w:default="1" w:styleId="DefaultParagraphFont">
     <w:name w:val="Default Paragraph Font"/>
     <w:uiPriority w:val="1"/>
-    <w:semiHidden/>
     <w:unhideWhenUsed/>
   </w:style>
   <w:style w:type="table" w:default="1" w:styleId="TableNormal">

</xml_diff>